<commit_message>
Añadida tabla de contenido para índice
</commit_message>
<xml_diff>
--- a/Memoria.docx
+++ b/Memoria.docx
@@ -25,7 +25,7 @@
                     </pic:cNvPicPr>
                   </pic:nvPicPr>
                   <pic:blipFill>
-                    <a:blip r:embed="rId5" cstate="print">
+                    <a:blip r:embed="rId8" cstate="print">
                       <a:extLst>
                         <a:ext uri="{28A0092B-C50C-407E-A947-70E740481C1C}">
                           <a14:useLocalDpi xmlns:a14="http://schemas.microsoft.com/office/drawing/2010/main" val="0"/>
@@ -210,34 +210,7 @@
                               <w:rPr>
                                 <w:rFonts w:ascii="Verdana" w:eastAsia="Calibri" w:hAnsi="Verdana" w:cs="Calibri"/>
                               </w:rPr>
-                              <w:t>Director(a)/tutor(a)</w:t>
-                            </w:r>
-                            <w:r>
-                              <w:rPr>
-                                <w:rFonts w:ascii="Verdana" w:eastAsia="Calibri" w:hAnsi="Verdana" w:cs="Calibri"/>
-                                <w:spacing w:val="-6"/>
-                              </w:rPr>
-                              <w:t xml:space="preserve"> </w:t>
-                            </w:r>
-                            <w:r>
-                              <w:rPr>
-                                <w:rFonts w:ascii="Verdana" w:eastAsia="Calibri" w:hAnsi="Verdana" w:cs="Calibri"/>
-                              </w:rPr>
-                              <w:t>del</w:t>
-                            </w:r>
-                            <w:r>
-                              <w:rPr>
-                                <w:rFonts w:ascii="Verdana" w:eastAsia="Calibri" w:hAnsi="Verdana" w:cs="Calibri"/>
-                                <w:spacing w:val="-8"/>
-                              </w:rPr>
-                              <w:t xml:space="preserve"> </w:t>
-                            </w:r>
-                            <w:r>
-                              <w:rPr>
-                                <w:rFonts w:ascii="Verdana" w:eastAsia="Calibri" w:hAnsi="Verdana" w:cs="Calibri"/>
-                                <w:spacing w:val="-2"/>
-                              </w:rPr>
-                              <w:t>proyecto.</w:t>
+                              <w:t>Francisco Javier Navazo Fernández</w:t>
                             </w:r>
                           </w:p>
                           <w:p>
@@ -325,7 +298,28 @@
                                 <w:rFonts w:ascii="Verdana" w:eastAsia="Calibri" w:hAnsi="Verdana" w:cs="Calibri"/>
                                 <w:spacing w:val="-4"/>
                               </w:rPr>
-                              <w:t>202572026</w:t>
+                              <w:t xml:space="preserve">Curso </w:t>
+                            </w:r>
+                            <w:r>
+                              <w:rPr>
+                                <w:rFonts w:ascii="Verdana" w:eastAsia="Calibri" w:hAnsi="Verdana" w:cs="Calibri"/>
+                                <w:spacing w:val="-4"/>
+                              </w:rPr>
+                              <w:t>2025</w:t>
+                            </w:r>
+                            <w:r>
+                              <w:rPr>
+                                <w:rFonts w:ascii="Verdana" w:eastAsia="Calibri" w:hAnsi="Verdana" w:cs="Calibri"/>
+                                <w:spacing w:val="-4"/>
+                              </w:rPr>
+                              <w:t>/</w:t>
+                            </w:r>
+                            <w:r>
+                              <w:rPr>
+                                <w:rFonts w:ascii="Verdana" w:eastAsia="Calibri" w:hAnsi="Verdana" w:cs="Calibri"/>
+                                <w:spacing w:val="-4"/>
+                              </w:rPr>
+                              <w:t>2026</w:t>
                             </w:r>
                           </w:p>
                           <w:p/>
@@ -455,34 +449,7 @@
                         <w:rPr>
                           <w:rFonts w:ascii="Verdana" w:eastAsia="Calibri" w:hAnsi="Verdana" w:cs="Calibri"/>
                         </w:rPr>
-                        <w:t>Director(a)/tutor(a)</w:t>
-                      </w:r>
-                      <w:r>
-                        <w:rPr>
-                          <w:rFonts w:ascii="Verdana" w:eastAsia="Calibri" w:hAnsi="Verdana" w:cs="Calibri"/>
-                          <w:spacing w:val="-6"/>
-                        </w:rPr>
-                        <w:t xml:space="preserve"> </w:t>
-                      </w:r>
-                      <w:r>
-                        <w:rPr>
-                          <w:rFonts w:ascii="Verdana" w:eastAsia="Calibri" w:hAnsi="Verdana" w:cs="Calibri"/>
-                        </w:rPr>
-                        <w:t>del</w:t>
-                      </w:r>
-                      <w:r>
-                        <w:rPr>
-                          <w:rFonts w:ascii="Verdana" w:eastAsia="Calibri" w:hAnsi="Verdana" w:cs="Calibri"/>
-                          <w:spacing w:val="-8"/>
-                        </w:rPr>
-                        <w:t xml:space="preserve"> </w:t>
-                      </w:r>
-                      <w:r>
-                        <w:rPr>
-                          <w:rFonts w:ascii="Verdana" w:eastAsia="Calibri" w:hAnsi="Verdana" w:cs="Calibri"/>
-                          <w:spacing w:val="-2"/>
-                        </w:rPr>
-                        <w:t>proyecto.</w:t>
+                        <w:t>Francisco Javier Navazo Fernández</w:t>
                       </w:r>
                     </w:p>
                     <w:p>
@@ -570,7 +537,28 @@
                           <w:rFonts w:ascii="Verdana" w:eastAsia="Calibri" w:hAnsi="Verdana" w:cs="Calibri"/>
                           <w:spacing w:val="-4"/>
                         </w:rPr>
-                        <w:t>202572026</w:t>
+                        <w:t xml:space="preserve">Curso </w:t>
+                      </w:r>
+                      <w:r>
+                        <w:rPr>
+                          <w:rFonts w:ascii="Verdana" w:eastAsia="Calibri" w:hAnsi="Verdana" w:cs="Calibri"/>
+                          <w:spacing w:val="-4"/>
+                        </w:rPr>
+                        <w:t>2025</w:t>
+                      </w:r>
+                      <w:r>
+                        <w:rPr>
+                          <w:rFonts w:ascii="Verdana" w:eastAsia="Calibri" w:hAnsi="Verdana" w:cs="Calibri"/>
+                          <w:spacing w:val="-4"/>
+                        </w:rPr>
+                        <w:t>/</w:t>
+                      </w:r>
+                      <w:r>
+                        <w:rPr>
+                          <w:rFonts w:ascii="Verdana" w:eastAsia="Calibri" w:hAnsi="Verdana" w:cs="Calibri"/>
+                          <w:spacing w:val="-4"/>
+                        </w:rPr>
+                        <w:t>2026</w:t>
                       </w:r>
                     </w:p>
                     <w:p/>
@@ -597,65 +585,1137 @@
     <w:p>
       <w:pPr>
         <w:pStyle w:val="Estilo1"/>
-        <w:rPr>
-          <w:color w:val="EE0000"/>
-        </w:rPr>
-      </w:pPr>
+        <w:jc w:val="both"/>
+        <w:rPr>
+          <w:color w:val="C00000"/>
+        </w:rPr>
+      </w:pPr>
+      <w:bookmarkStart w:id="0" w:name="_Toc220412676"/>
       <w:r>
         <w:rPr>
-          <w:color w:val="EE0000"/>
+          <w:color w:val="C00000"/>
         </w:rPr>
         <w:lastRenderedPageBreak/>
         <w:t>Agradecimientos</w:t>
       </w:r>
-    </w:p>
-    <w:p/>
-    <w:p/>
-    <w:p/>
-    <w:p/>
-    <w:p/>
-    <w:p/>
-    <w:p/>
-    <w:p/>
-    <w:p/>
-    <w:p/>
-    <w:p/>
-    <w:p/>
-    <w:p/>
-    <w:p/>
-    <w:p/>
-    <w:p/>
-    <w:p/>
-    <w:p/>
-    <w:p/>
-    <w:p/>
-    <w:p/>
-    <w:p/>
-    <w:p/>
-    <w:p/>
-    <w:p/>
-    <w:p/>
-    <w:p/>
-    <w:p/>
-    <w:p/>
-    <w:p/>
-    <w:p>
-      <w:pPr>
-        <w:pStyle w:val="Estilo1"/>
-        <w:rPr>
-          <w:color w:val="EE0000"/>
-        </w:rPr>
-      </w:pPr>
-      <w:r>
-        <w:rPr>
-          <w:color w:val="EE0000"/>
-        </w:rPr>
-        <w:lastRenderedPageBreak/>
-        <w:t>Índice</w:t>
-      </w:r>
-    </w:p>
-    <w:p>
-      <w:pPr>
+      <w:bookmarkEnd w:id="0"/>
+    </w:p>
+    <w:p>
+      <w:pPr>
+        <w:jc w:val="both"/>
+      </w:pPr>
+    </w:p>
+    <w:p>
+      <w:pPr>
+        <w:jc w:val="both"/>
+      </w:pPr>
+    </w:p>
+    <w:p>
+      <w:pPr>
+        <w:jc w:val="both"/>
+      </w:pPr>
+    </w:p>
+    <w:p>
+      <w:pPr>
+        <w:jc w:val="both"/>
+      </w:pPr>
+    </w:p>
+    <w:p>
+      <w:pPr>
+        <w:jc w:val="both"/>
+      </w:pPr>
+    </w:p>
+    <w:p>
+      <w:pPr>
+        <w:jc w:val="both"/>
+      </w:pPr>
+    </w:p>
+    <w:p>
+      <w:pPr>
+        <w:jc w:val="both"/>
+      </w:pPr>
+    </w:p>
+    <w:p>
+      <w:pPr>
+        <w:jc w:val="both"/>
+      </w:pPr>
+    </w:p>
+    <w:p>
+      <w:pPr>
+        <w:jc w:val="both"/>
+      </w:pPr>
+    </w:p>
+    <w:p>
+      <w:pPr>
+        <w:jc w:val="both"/>
+      </w:pPr>
+    </w:p>
+    <w:p>
+      <w:pPr>
+        <w:jc w:val="both"/>
+      </w:pPr>
+    </w:p>
+    <w:p>
+      <w:pPr>
+        <w:jc w:val="both"/>
+      </w:pPr>
+    </w:p>
+    <w:p>
+      <w:pPr>
+        <w:jc w:val="both"/>
+      </w:pPr>
+    </w:p>
+    <w:p>
+      <w:pPr>
+        <w:jc w:val="both"/>
+      </w:pPr>
+    </w:p>
+    <w:p>
+      <w:pPr>
+        <w:jc w:val="both"/>
+      </w:pPr>
+    </w:p>
+    <w:p>
+      <w:pPr>
+        <w:jc w:val="both"/>
+      </w:pPr>
+    </w:p>
+    <w:p>
+      <w:pPr>
+        <w:jc w:val="both"/>
+      </w:pPr>
+    </w:p>
+    <w:p>
+      <w:pPr>
+        <w:jc w:val="both"/>
+      </w:pPr>
+    </w:p>
+    <w:p>
+      <w:pPr>
+        <w:jc w:val="both"/>
+      </w:pPr>
+    </w:p>
+    <w:p>
+      <w:pPr>
+        <w:jc w:val="both"/>
+      </w:pPr>
+    </w:p>
+    <w:p>
+      <w:pPr>
+        <w:jc w:val="both"/>
+      </w:pPr>
+    </w:p>
+    <w:p>
+      <w:pPr>
+        <w:jc w:val="both"/>
+      </w:pPr>
+    </w:p>
+    <w:p>
+      <w:pPr>
+        <w:jc w:val="both"/>
+      </w:pPr>
+    </w:p>
+    <w:p>
+      <w:pPr>
+        <w:jc w:val="both"/>
+      </w:pPr>
+    </w:p>
+    <w:p>
+      <w:pPr>
+        <w:jc w:val="both"/>
+      </w:pPr>
+    </w:p>
+    <w:p>
+      <w:pPr>
+        <w:jc w:val="both"/>
+      </w:pPr>
+    </w:p>
+    <w:p>
+      <w:pPr>
+        <w:jc w:val="both"/>
+      </w:pPr>
+    </w:p>
+    <w:p>
+      <w:pPr>
+        <w:jc w:val="both"/>
+      </w:pPr>
+    </w:p>
+    <w:p>
+      <w:pPr>
+        <w:jc w:val="both"/>
+      </w:pPr>
+    </w:p>
+    <w:p>
+      <w:pPr>
+        <w:jc w:val="both"/>
+      </w:pPr>
+    </w:p>
+    <w:sdt>
+      <w:sdtPr>
+        <w:id w:val="2035150178"/>
+        <w:docPartObj>
+          <w:docPartGallery w:val="Table of Contents"/>
+          <w:docPartUnique/>
+        </w:docPartObj>
+      </w:sdtPr>
+      <w:sdtEndPr>
+        <w:rPr>
+          <w:rFonts w:asciiTheme="minorHAnsi" w:eastAsiaTheme="minorHAnsi" w:hAnsiTheme="minorHAnsi" w:cstheme="minorBidi"/>
+          <w:b/>
+          <w:bCs/>
+          <w:color w:val="auto"/>
+          <w:sz w:val="22"/>
+          <w:szCs w:val="22"/>
+          <w:lang w:eastAsia="en-US"/>
+        </w:rPr>
+      </w:sdtEndPr>
+      <w:sdtContent>
+        <w:p>
+          <w:pPr>
+            <w:pStyle w:val="TtuloTDC"/>
+            <w:rPr>
+              <w:rFonts w:ascii="Verdana" w:hAnsi="Verdana"/>
+              <w:color w:val="C00000"/>
+            </w:rPr>
+          </w:pPr>
+          <w:r>
+            <w:rPr>
+              <w:rFonts w:ascii="Verdana" w:hAnsi="Verdana"/>
+              <w:color w:val="C00000"/>
+            </w:rPr>
+            <w:t>Índice</w:t>
+          </w:r>
+        </w:p>
+        <w:p>
+          <w:pPr>
+            <w:rPr>
+              <w:lang w:eastAsia="es-ES"/>
+            </w:rPr>
+          </w:pPr>
+          <w:proofErr w:type="spellStart"/>
+          <w:r>
+            <w:rPr>
+              <w:lang w:eastAsia="es-ES"/>
+            </w:rPr>
+            <w:t>git</w:t>
+          </w:r>
+          <w:proofErr w:type="spellEnd"/>
+        </w:p>
+        <w:p>
+          <w:pPr>
+            <w:pStyle w:val="TDC1"/>
+            <w:tabs>
+              <w:tab w:val="right" w:leader="dot" w:pos="8494"/>
+            </w:tabs>
+            <w:rPr>
+              <w:rFonts w:ascii="Verdana" w:hAnsi="Verdana"/>
+              <w:noProof/>
+            </w:rPr>
+          </w:pPr>
+          <w:r>
+            <w:rPr>
+              <w:rFonts w:ascii="Verdana" w:hAnsi="Verdana"/>
+            </w:rPr>
+            <w:fldChar w:fldCharType="begin"/>
+          </w:r>
+          <w:r>
+            <w:rPr>
+              <w:rFonts w:ascii="Verdana" w:hAnsi="Verdana"/>
+            </w:rPr>
+            <w:instrText xml:space="preserve"> TOC \o "1-3" \h \z \u </w:instrText>
+          </w:r>
+          <w:r>
+            <w:rPr>
+              <w:rFonts w:ascii="Verdana" w:hAnsi="Verdana"/>
+            </w:rPr>
+            <w:fldChar w:fldCharType="separate"/>
+          </w:r>
+          <w:hyperlink w:anchor="_Toc220412676" w:history="1">
+            <w:r>
+              <w:rPr>
+                <w:rStyle w:val="Hipervnculo"/>
+                <w:rFonts w:ascii="Verdana" w:hAnsi="Verdana"/>
+                <w:noProof/>
+              </w:rPr>
+              <w:t>Agradecimientos</w:t>
+            </w:r>
+            <w:r>
+              <w:rPr>
+                <w:rFonts w:ascii="Verdana" w:hAnsi="Verdana"/>
+                <w:noProof/>
+                <w:webHidden/>
+              </w:rPr>
+              <w:tab/>
+            </w:r>
+            <w:r>
+              <w:rPr>
+                <w:rFonts w:ascii="Verdana" w:hAnsi="Verdana"/>
+                <w:noProof/>
+                <w:webHidden/>
+              </w:rPr>
+              <w:fldChar w:fldCharType="begin"/>
+            </w:r>
+            <w:r>
+              <w:rPr>
+                <w:rFonts w:ascii="Verdana" w:hAnsi="Verdana"/>
+                <w:noProof/>
+                <w:webHidden/>
+              </w:rPr>
+              <w:instrText xml:space="preserve"> PAGEREF _Toc220412676 \h </w:instrText>
+            </w:r>
+            <w:r>
+              <w:rPr>
+                <w:rFonts w:ascii="Verdana" w:hAnsi="Verdana"/>
+                <w:noProof/>
+                <w:webHidden/>
+              </w:rPr>
+            </w:r>
+            <w:r>
+              <w:rPr>
+                <w:rFonts w:ascii="Verdana" w:hAnsi="Verdana"/>
+                <w:noProof/>
+                <w:webHidden/>
+              </w:rPr>
+              <w:fldChar w:fldCharType="separate"/>
+            </w:r>
+            <w:r>
+              <w:rPr>
+                <w:rFonts w:ascii="Verdana" w:hAnsi="Verdana"/>
+                <w:noProof/>
+                <w:webHidden/>
+              </w:rPr>
+              <w:t>2</w:t>
+            </w:r>
+            <w:r>
+              <w:rPr>
+                <w:rFonts w:ascii="Verdana" w:hAnsi="Verdana"/>
+                <w:noProof/>
+                <w:webHidden/>
+              </w:rPr>
+              <w:fldChar w:fldCharType="end"/>
+            </w:r>
+          </w:hyperlink>
+        </w:p>
+        <w:p>
+          <w:pPr>
+            <w:pStyle w:val="TDC1"/>
+            <w:tabs>
+              <w:tab w:val="right" w:leader="dot" w:pos="8494"/>
+            </w:tabs>
+            <w:rPr>
+              <w:rFonts w:ascii="Verdana" w:hAnsi="Verdana"/>
+              <w:noProof/>
+            </w:rPr>
+          </w:pPr>
+          <w:hyperlink w:anchor="_Toc220412677" w:history="1">
+            <w:r>
+              <w:rPr>
+                <w:rStyle w:val="Hipervnculo"/>
+                <w:rFonts w:ascii="Verdana" w:hAnsi="Verdana"/>
+                <w:noProof/>
+              </w:rPr>
+              <w:t>Índice</w:t>
+            </w:r>
+            <w:r>
+              <w:rPr>
+                <w:rFonts w:ascii="Verdana" w:hAnsi="Verdana"/>
+                <w:noProof/>
+                <w:webHidden/>
+              </w:rPr>
+              <w:tab/>
+            </w:r>
+            <w:r>
+              <w:rPr>
+                <w:rFonts w:ascii="Verdana" w:hAnsi="Verdana"/>
+                <w:noProof/>
+                <w:webHidden/>
+              </w:rPr>
+              <w:fldChar w:fldCharType="begin"/>
+            </w:r>
+            <w:r>
+              <w:rPr>
+                <w:rFonts w:ascii="Verdana" w:hAnsi="Verdana"/>
+                <w:noProof/>
+                <w:webHidden/>
+              </w:rPr>
+              <w:instrText xml:space="preserve"> PAGEREF _Toc220412677 \h </w:instrText>
+            </w:r>
+            <w:r>
+              <w:rPr>
+                <w:rFonts w:ascii="Verdana" w:hAnsi="Verdana"/>
+                <w:noProof/>
+                <w:webHidden/>
+              </w:rPr>
+            </w:r>
+            <w:r>
+              <w:rPr>
+                <w:rFonts w:ascii="Verdana" w:hAnsi="Verdana"/>
+                <w:noProof/>
+                <w:webHidden/>
+              </w:rPr>
+              <w:fldChar w:fldCharType="separate"/>
+            </w:r>
+            <w:r>
+              <w:rPr>
+                <w:rFonts w:ascii="Verdana" w:hAnsi="Verdana"/>
+                <w:noProof/>
+                <w:webHidden/>
+              </w:rPr>
+              <w:t>3</w:t>
+            </w:r>
+            <w:r>
+              <w:rPr>
+                <w:rFonts w:ascii="Verdana" w:hAnsi="Verdana"/>
+                <w:noProof/>
+                <w:webHidden/>
+              </w:rPr>
+              <w:fldChar w:fldCharType="end"/>
+            </w:r>
+          </w:hyperlink>
+        </w:p>
+        <w:p>
+          <w:pPr>
+            <w:pStyle w:val="TDC1"/>
+            <w:tabs>
+              <w:tab w:val="left" w:pos="480"/>
+              <w:tab w:val="right" w:leader="dot" w:pos="8494"/>
+            </w:tabs>
+            <w:rPr>
+              <w:rFonts w:ascii="Verdana" w:hAnsi="Verdana"/>
+              <w:noProof/>
+            </w:rPr>
+          </w:pPr>
+          <w:hyperlink w:anchor="_Toc220412678" w:history="1">
+            <w:r>
+              <w:rPr>
+                <w:rStyle w:val="Hipervnculo"/>
+                <w:rFonts w:ascii="Verdana" w:hAnsi="Verdana"/>
+                <w:noProof/>
+              </w:rPr>
+              <w:t>1.</w:t>
+            </w:r>
+            <w:r>
+              <w:rPr>
+                <w:rFonts w:ascii="Verdana" w:hAnsi="Verdana"/>
+                <w:noProof/>
+              </w:rPr>
+              <w:tab/>
+            </w:r>
+            <w:r>
+              <w:rPr>
+                <w:rStyle w:val="Hipervnculo"/>
+                <w:rFonts w:ascii="Verdana" w:hAnsi="Verdana"/>
+                <w:noProof/>
+              </w:rPr>
+              <w:t>Resumen</w:t>
+            </w:r>
+            <w:r>
+              <w:rPr>
+                <w:rFonts w:ascii="Verdana" w:hAnsi="Verdana"/>
+                <w:noProof/>
+                <w:webHidden/>
+              </w:rPr>
+              <w:tab/>
+            </w:r>
+            <w:r>
+              <w:rPr>
+                <w:rFonts w:ascii="Verdana" w:hAnsi="Verdana"/>
+                <w:noProof/>
+                <w:webHidden/>
+              </w:rPr>
+              <w:fldChar w:fldCharType="begin"/>
+            </w:r>
+            <w:r>
+              <w:rPr>
+                <w:rFonts w:ascii="Verdana" w:hAnsi="Verdana"/>
+                <w:noProof/>
+                <w:webHidden/>
+              </w:rPr>
+              <w:instrText xml:space="preserve"> PAGEREF _Toc220412678 \h </w:instrText>
+            </w:r>
+            <w:r>
+              <w:rPr>
+                <w:rFonts w:ascii="Verdana" w:hAnsi="Verdana"/>
+                <w:noProof/>
+                <w:webHidden/>
+              </w:rPr>
+            </w:r>
+            <w:r>
+              <w:rPr>
+                <w:rFonts w:ascii="Verdana" w:hAnsi="Verdana"/>
+                <w:noProof/>
+                <w:webHidden/>
+              </w:rPr>
+              <w:fldChar w:fldCharType="separate"/>
+            </w:r>
+            <w:r>
+              <w:rPr>
+                <w:rFonts w:ascii="Verdana" w:hAnsi="Verdana"/>
+                <w:noProof/>
+                <w:webHidden/>
+              </w:rPr>
+              <w:t>4</w:t>
+            </w:r>
+            <w:r>
+              <w:rPr>
+                <w:rFonts w:ascii="Verdana" w:hAnsi="Verdana"/>
+                <w:noProof/>
+                <w:webHidden/>
+              </w:rPr>
+              <w:fldChar w:fldCharType="end"/>
+            </w:r>
+          </w:hyperlink>
+        </w:p>
+        <w:p>
+          <w:pPr>
+            <w:pStyle w:val="TDC1"/>
+            <w:tabs>
+              <w:tab w:val="left" w:pos="480"/>
+              <w:tab w:val="right" w:leader="dot" w:pos="8494"/>
+            </w:tabs>
+            <w:rPr>
+              <w:rFonts w:ascii="Verdana" w:hAnsi="Verdana"/>
+              <w:noProof/>
+            </w:rPr>
+          </w:pPr>
+          <w:hyperlink w:anchor="_Toc220412679" w:history="1">
+            <w:r>
+              <w:rPr>
+                <w:rStyle w:val="Hipervnculo"/>
+                <w:rFonts w:ascii="Verdana" w:hAnsi="Verdana"/>
+                <w:noProof/>
+              </w:rPr>
+              <w:t>2.</w:t>
+            </w:r>
+            <w:r>
+              <w:rPr>
+                <w:rFonts w:ascii="Verdana" w:hAnsi="Verdana"/>
+                <w:noProof/>
+              </w:rPr>
+              <w:tab/>
+            </w:r>
+            <w:r>
+              <w:rPr>
+                <w:rStyle w:val="Hipervnculo"/>
+                <w:rFonts w:ascii="Verdana" w:hAnsi="Verdana"/>
+                <w:noProof/>
+              </w:rPr>
+              <w:t>Abstract</w:t>
+            </w:r>
+            <w:r>
+              <w:rPr>
+                <w:rFonts w:ascii="Verdana" w:hAnsi="Verdana"/>
+                <w:noProof/>
+                <w:webHidden/>
+              </w:rPr>
+              <w:tab/>
+            </w:r>
+            <w:r>
+              <w:rPr>
+                <w:rFonts w:ascii="Verdana" w:hAnsi="Verdana"/>
+                <w:noProof/>
+                <w:webHidden/>
+              </w:rPr>
+              <w:fldChar w:fldCharType="begin"/>
+            </w:r>
+            <w:r>
+              <w:rPr>
+                <w:rFonts w:ascii="Verdana" w:hAnsi="Verdana"/>
+                <w:noProof/>
+                <w:webHidden/>
+              </w:rPr>
+              <w:instrText xml:space="preserve"> PAGEREF _Toc220412679 \h </w:instrText>
+            </w:r>
+            <w:r>
+              <w:rPr>
+                <w:rFonts w:ascii="Verdana" w:hAnsi="Verdana"/>
+                <w:noProof/>
+                <w:webHidden/>
+              </w:rPr>
+            </w:r>
+            <w:r>
+              <w:rPr>
+                <w:rFonts w:ascii="Verdana" w:hAnsi="Verdana"/>
+                <w:noProof/>
+                <w:webHidden/>
+              </w:rPr>
+              <w:fldChar w:fldCharType="separate"/>
+            </w:r>
+            <w:r>
+              <w:rPr>
+                <w:rFonts w:ascii="Verdana" w:hAnsi="Verdana"/>
+                <w:noProof/>
+                <w:webHidden/>
+              </w:rPr>
+              <w:t>4</w:t>
+            </w:r>
+            <w:r>
+              <w:rPr>
+                <w:rFonts w:ascii="Verdana" w:hAnsi="Verdana"/>
+                <w:noProof/>
+                <w:webHidden/>
+              </w:rPr>
+              <w:fldChar w:fldCharType="end"/>
+            </w:r>
+          </w:hyperlink>
+        </w:p>
+        <w:p>
+          <w:pPr>
+            <w:pStyle w:val="TDC1"/>
+            <w:tabs>
+              <w:tab w:val="left" w:pos="480"/>
+              <w:tab w:val="right" w:leader="dot" w:pos="8494"/>
+            </w:tabs>
+            <w:rPr>
+              <w:rFonts w:ascii="Verdana" w:hAnsi="Verdana"/>
+              <w:noProof/>
+            </w:rPr>
+          </w:pPr>
+          <w:hyperlink w:anchor="_Toc220412680" w:history="1">
+            <w:r>
+              <w:rPr>
+                <w:rStyle w:val="Hipervnculo"/>
+                <w:rFonts w:ascii="Verdana" w:hAnsi="Verdana"/>
+                <w:noProof/>
+              </w:rPr>
+              <w:t>3.</w:t>
+            </w:r>
+            <w:r>
+              <w:rPr>
+                <w:rFonts w:ascii="Verdana" w:hAnsi="Verdana"/>
+                <w:noProof/>
+              </w:rPr>
+              <w:tab/>
+            </w:r>
+            <w:r>
+              <w:rPr>
+                <w:rStyle w:val="Hipervnculo"/>
+                <w:rFonts w:ascii="Verdana" w:hAnsi="Verdana"/>
+                <w:noProof/>
+              </w:rPr>
+              <w:t>Justificación del proyecto</w:t>
+            </w:r>
+            <w:r>
+              <w:rPr>
+                <w:rFonts w:ascii="Verdana" w:hAnsi="Verdana"/>
+                <w:noProof/>
+                <w:webHidden/>
+              </w:rPr>
+              <w:tab/>
+            </w:r>
+            <w:r>
+              <w:rPr>
+                <w:rFonts w:ascii="Verdana" w:hAnsi="Verdana"/>
+                <w:noProof/>
+                <w:webHidden/>
+              </w:rPr>
+              <w:fldChar w:fldCharType="begin"/>
+            </w:r>
+            <w:r>
+              <w:rPr>
+                <w:rFonts w:ascii="Verdana" w:hAnsi="Verdana"/>
+                <w:noProof/>
+                <w:webHidden/>
+              </w:rPr>
+              <w:instrText xml:space="preserve"> PAGEREF _Toc220412680 \h </w:instrText>
+            </w:r>
+            <w:r>
+              <w:rPr>
+                <w:rFonts w:ascii="Verdana" w:hAnsi="Verdana"/>
+                <w:noProof/>
+                <w:webHidden/>
+              </w:rPr>
+            </w:r>
+            <w:r>
+              <w:rPr>
+                <w:rFonts w:ascii="Verdana" w:hAnsi="Verdana"/>
+                <w:noProof/>
+                <w:webHidden/>
+              </w:rPr>
+              <w:fldChar w:fldCharType="separate"/>
+            </w:r>
+            <w:r>
+              <w:rPr>
+                <w:rFonts w:ascii="Verdana" w:hAnsi="Verdana"/>
+                <w:noProof/>
+                <w:webHidden/>
+              </w:rPr>
+              <w:t>4</w:t>
+            </w:r>
+            <w:r>
+              <w:rPr>
+                <w:rFonts w:ascii="Verdana" w:hAnsi="Verdana"/>
+                <w:noProof/>
+                <w:webHidden/>
+              </w:rPr>
+              <w:fldChar w:fldCharType="end"/>
+            </w:r>
+          </w:hyperlink>
+        </w:p>
+        <w:p>
+          <w:pPr>
+            <w:pStyle w:val="TDC1"/>
+            <w:tabs>
+              <w:tab w:val="left" w:pos="480"/>
+              <w:tab w:val="right" w:leader="dot" w:pos="8494"/>
+            </w:tabs>
+            <w:rPr>
+              <w:rFonts w:ascii="Verdana" w:hAnsi="Verdana"/>
+              <w:noProof/>
+            </w:rPr>
+          </w:pPr>
+          <w:hyperlink w:anchor="_Toc220412681" w:history="1">
+            <w:r>
+              <w:rPr>
+                <w:rStyle w:val="Hipervnculo"/>
+                <w:rFonts w:ascii="Verdana" w:hAnsi="Verdana"/>
+                <w:noProof/>
+              </w:rPr>
+              <w:t>4.</w:t>
+            </w:r>
+            <w:r>
+              <w:rPr>
+                <w:rFonts w:ascii="Verdana" w:hAnsi="Verdana"/>
+                <w:noProof/>
+              </w:rPr>
+              <w:tab/>
+            </w:r>
+            <w:r>
+              <w:rPr>
+                <w:rStyle w:val="Hipervnculo"/>
+                <w:rFonts w:ascii="Verdana" w:hAnsi="Verdana"/>
+                <w:noProof/>
+              </w:rPr>
+              <w:t>Objetivos</w:t>
+            </w:r>
+            <w:r>
+              <w:rPr>
+                <w:rFonts w:ascii="Verdana" w:hAnsi="Verdana"/>
+                <w:noProof/>
+                <w:webHidden/>
+              </w:rPr>
+              <w:tab/>
+            </w:r>
+            <w:r>
+              <w:rPr>
+                <w:rFonts w:ascii="Verdana" w:hAnsi="Verdana"/>
+                <w:noProof/>
+                <w:webHidden/>
+              </w:rPr>
+              <w:fldChar w:fldCharType="begin"/>
+            </w:r>
+            <w:r>
+              <w:rPr>
+                <w:rFonts w:ascii="Verdana" w:hAnsi="Verdana"/>
+                <w:noProof/>
+                <w:webHidden/>
+              </w:rPr>
+              <w:instrText xml:space="preserve"> PAGEREF _Toc220412681 \h </w:instrText>
+            </w:r>
+            <w:r>
+              <w:rPr>
+                <w:rFonts w:ascii="Verdana" w:hAnsi="Verdana"/>
+                <w:noProof/>
+                <w:webHidden/>
+              </w:rPr>
+            </w:r>
+            <w:r>
+              <w:rPr>
+                <w:rFonts w:ascii="Verdana" w:hAnsi="Verdana"/>
+                <w:noProof/>
+                <w:webHidden/>
+              </w:rPr>
+              <w:fldChar w:fldCharType="separate"/>
+            </w:r>
+            <w:r>
+              <w:rPr>
+                <w:rFonts w:ascii="Verdana" w:hAnsi="Verdana"/>
+                <w:noProof/>
+                <w:webHidden/>
+              </w:rPr>
+              <w:t>4</w:t>
+            </w:r>
+            <w:r>
+              <w:rPr>
+                <w:rFonts w:ascii="Verdana" w:hAnsi="Verdana"/>
+                <w:noProof/>
+                <w:webHidden/>
+              </w:rPr>
+              <w:fldChar w:fldCharType="end"/>
+            </w:r>
+          </w:hyperlink>
+        </w:p>
+        <w:p>
+          <w:pPr>
+            <w:pStyle w:val="TDC1"/>
+            <w:tabs>
+              <w:tab w:val="left" w:pos="720"/>
+              <w:tab w:val="right" w:leader="dot" w:pos="8494"/>
+            </w:tabs>
+            <w:rPr>
+              <w:rFonts w:ascii="Verdana" w:hAnsi="Verdana"/>
+              <w:noProof/>
+            </w:rPr>
+          </w:pPr>
+          <w:hyperlink w:anchor="_Toc220412682" w:history="1">
+            <w:r>
+              <w:rPr>
+                <w:rStyle w:val="Hipervnculo"/>
+                <w:rFonts w:ascii="Verdana" w:hAnsi="Verdana"/>
+                <w:noProof/>
+              </w:rPr>
+              <w:t>4.1.</w:t>
+            </w:r>
+            <w:r>
+              <w:rPr>
+                <w:rFonts w:ascii="Verdana" w:hAnsi="Verdana"/>
+                <w:noProof/>
+              </w:rPr>
+              <w:tab/>
+            </w:r>
+            <w:r>
+              <w:rPr>
+                <w:rStyle w:val="Hipervnculo"/>
+                <w:rFonts w:ascii="Verdana" w:hAnsi="Verdana"/>
+                <w:noProof/>
+              </w:rPr>
+              <w:t>Objetivos generales</w:t>
+            </w:r>
+            <w:r>
+              <w:rPr>
+                <w:rFonts w:ascii="Verdana" w:hAnsi="Verdana"/>
+                <w:noProof/>
+                <w:webHidden/>
+              </w:rPr>
+              <w:tab/>
+            </w:r>
+            <w:r>
+              <w:rPr>
+                <w:rFonts w:ascii="Verdana" w:hAnsi="Verdana"/>
+                <w:noProof/>
+                <w:webHidden/>
+              </w:rPr>
+              <w:fldChar w:fldCharType="begin"/>
+            </w:r>
+            <w:r>
+              <w:rPr>
+                <w:rFonts w:ascii="Verdana" w:hAnsi="Verdana"/>
+                <w:noProof/>
+                <w:webHidden/>
+              </w:rPr>
+              <w:instrText xml:space="preserve"> PAGEREF _Toc220412682 \h </w:instrText>
+            </w:r>
+            <w:r>
+              <w:rPr>
+                <w:rFonts w:ascii="Verdana" w:hAnsi="Verdana"/>
+                <w:noProof/>
+                <w:webHidden/>
+              </w:rPr>
+            </w:r>
+            <w:r>
+              <w:rPr>
+                <w:rFonts w:ascii="Verdana" w:hAnsi="Verdana"/>
+                <w:noProof/>
+                <w:webHidden/>
+              </w:rPr>
+              <w:fldChar w:fldCharType="separate"/>
+            </w:r>
+            <w:r>
+              <w:rPr>
+                <w:rFonts w:ascii="Verdana" w:hAnsi="Verdana"/>
+                <w:noProof/>
+                <w:webHidden/>
+              </w:rPr>
+              <w:t>4</w:t>
+            </w:r>
+            <w:r>
+              <w:rPr>
+                <w:rFonts w:ascii="Verdana" w:hAnsi="Verdana"/>
+                <w:noProof/>
+                <w:webHidden/>
+              </w:rPr>
+              <w:fldChar w:fldCharType="end"/>
+            </w:r>
+          </w:hyperlink>
+        </w:p>
+        <w:p>
+          <w:pPr>
+            <w:pStyle w:val="TDC1"/>
+            <w:tabs>
+              <w:tab w:val="left" w:pos="720"/>
+              <w:tab w:val="right" w:leader="dot" w:pos="8494"/>
+            </w:tabs>
+            <w:rPr>
+              <w:rFonts w:ascii="Verdana" w:hAnsi="Verdana"/>
+              <w:noProof/>
+            </w:rPr>
+          </w:pPr>
+          <w:hyperlink w:anchor="_Toc220412683" w:history="1">
+            <w:r>
+              <w:rPr>
+                <w:rStyle w:val="Hipervnculo"/>
+                <w:rFonts w:ascii="Verdana" w:hAnsi="Verdana"/>
+                <w:noProof/>
+              </w:rPr>
+              <w:t>4.2.</w:t>
+            </w:r>
+            <w:r>
+              <w:rPr>
+                <w:rFonts w:ascii="Verdana" w:hAnsi="Verdana"/>
+                <w:noProof/>
+              </w:rPr>
+              <w:tab/>
+            </w:r>
+            <w:r>
+              <w:rPr>
+                <w:rStyle w:val="Hipervnculo"/>
+                <w:rFonts w:ascii="Verdana" w:hAnsi="Verdana"/>
+                <w:noProof/>
+              </w:rPr>
+              <w:t>Objetivos específicos</w:t>
+            </w:r>
+            <w:r>
+              <w:rPr>
+                <w:rFonts w:ascii="Verdana" w:hAnsi="Verdana"/>
+                <w:noProof/>
+                <w:webHidden/>
+              </w:rPr>
+              <w:tab/>
+            </w:r>
+            <w:r>
+              <w:rPr>
+                <w:rFonts w:ascii="Verdana" w:hAnsi="Verdana"/>
+                <w:noProof/>
+                <w:webHidden/>
+              </w:rPr>
+              <w:fldChar w:fldCharType="begin"/>
+            </w:r>
+            <w:r>
+              <w:rPr>
+                <w:rFonts w:ascii="Verdana" w:hAnsi="Verdana"/>
+                <w:noProof/>
+                <w:webHidden/>
+              </w:rPr>
+              <w:instrText xml:space="preserve"> PAGEREF _Toc220412683 \h </w:instrText>
+            </w:r>
+            <w:r>
+              <w:rPr>
+                <w:rFonts w:ascii="Verdana" w:hAnsi="Verdana"/>
+                <w:noProof/>
+                <w:webHidden/>
+              </w:rPr>
+            </w:r>
+            <w:r>
+              <w:rPr>
+                <w:rFonts w:ascii="Verdana" w:hAnsi="Verdana"/>
+                <w:noProof/>
+                <w:webHidden/>
+              </w:rPr>
+              <w:fldChar w:fldCharType="separate"/>
+            </w:r>
+            <w:r>
+              <w:rPr>
+                <w:rFonts w:ascii="Verdana" w:hAnsi="Verdana"/>
+                <w:noProof/>
+                <w:webHidden/>
+              </w:rPr>
+              <w:t>4</w:t>
+            </w:r>
+            <w:r>
+              <w:rPr>
+                <w:rFonts w:ascii="Verdana" w:hAnsi="Verdana"/>
+                <w:noProof/>
+                <w:webHidden/>
+              </w:rPr>
+              <w:fldChar w:fldCharType="end"/>
+            </w:r>
+          </w:hyperlink>
+        </w:p>
+        <w:p>
+          <w:pPr>
+            <w:pStyle w:val="TDC1"/>
+            <w:tabs>
+              <w:tab w:val="left" w:pos="480"/>
+              <w:tab w:val="right" w:leader="dot" w:pos="8494"/>
+            </w:tabs>
+            <w:rPr>
+              <w:rFonts w:ascii="Verdana" w:hAnsi="Verdana"/>
+              <w:noProof/>
+            </w:rPr>
+          </w:pPr>
+          <w:hyperlink w:anchor="_Toc220412684" w:history="1">
+            <w:r>
+              <w:rPr>
+                <w:rStyle w:val="Hipervnculo"/>
+                <w:rFonts w:ascii="Verdana" w:hAnsi="Verdana"/>
+                <w:noProof/>
+              </w:rPr>
+              <w:t>5.</w:t>
+            </w:r>
+            <w:r>
+              <w:rPr>
+                <w:rFonts w:ascii="Verdana" w:hAnsi="Verdana"/>
+                <w:noProof/>
+              </w:rPr>
+              <w:tab/>
+            </w:r>
+            <w:r>
+              <w:rPr>
+                <w:rStyle w:val="Hipervnculo"/>
+                <w:rFonts w:ascii="Verdana" w:hAnsi="Verdana"/>
+                <w:noProof/>
+              </w:rPr>
+              <w:t>Introducción</w:t>
+            </w:r>
+            <w:r>
+              <w:rPr>
+                <w:rFonts w:ascii="Verdana" w:hAnsi="Verdana"/>
+                <w:noProof/>
+                <w:webHidden/>
+              </w:rPr>
+              <w:tab/>
+            </w:r>
+            <w:r>
+              <w:rPr>
+                <w:rFonts w:ascii="Verdana" w:hAnsi="Verdana"/>
+                <w:noProof/>
+                <w:webHidden/>
+              </w:rPr>
+              <w:fldChar w:fldCharType="begin"/>
+            </w:r>
+            <w:r>
+              <w:rPr>
+                <w:rFonts w:ascii="Verdana" w:hAnsi="Verdana"/>
+                <w:noProof/>
+                <w:webHidden/>
+              </w:rPr>
+              <w:instrText xml:space="preserve"> PAGEREF _Toc220412684 \h </w:instrText>
+            </w:r>
+            <w:r>
+              <w:rPr>
+                <w:rFonts w:ascii="Verdana" w:hAnsi="Verdana"/>
+                <w:noProof/>
+                <w:webHidden/>
+              </w:rPr>
+            </w:r>
+            <w:r>
+              <w:rPr>
+                <w:rFonts w:ascii="Verdana" w:hAnsi="Verdana"/>
+                <w:noProof/>
+                <w:webHidden/>
+              </w:rPr>
+              <w:fldChar w:fldCharType="separate"/>
+            </w:r>
+            <w:r>
+              <w:rPr>
+                <w:rFonts w:ascii="Verdana" w:hAnsi="Verdana"/>
+                <w:noProof/>
+                <w:webHidden/>
+              </w:rPr>
+              <w:t>4</w:t>
+            </w:r>
+            <w:r>
+              <w:rPr>
+                <w:rFonts w:ascii="Verdana" w:hAnsi="Verdana"/>
+                <w:noProof/>
+                <w:webHidden/>
+              </w:rPr>
+              <w:fldChar w:fldCharType="end"/>
+            </w:r>
+          </w:hyperlink>
+        </w:p>
+        <w:p>
+          <w:pPr>
+            <w:pStyle w:val="TDC1"/>
+            <w:tabs>
+              <w:tab w:val="right" w:leader="dot" w:pos="8494"/>
+            </w:tabs>
+            <w:rPr>
+              <w:rFonts w:ascii="Verdana" w:hAnsi="Verdana"/>
+              <w:noProof/>
+            </w:rPr>
+          </w:pPr>
+          <w:hyperlink w:anchor="_Toc220412685" w:history="1">
+            <w:r>
+              <w:rPr>
+                <w:rStyle w:val="Hipervnculo"/>
+                <w:rFonts w:ascii="Verdana" w:hAnsi="Verdana"/>
+                <w:noProof/>
+              </w:rPr>
+              <w:t>6.</w:t>
+            </w:r>
+            <w:r>
+              <w:rPr>
+                <w:rFonts w:ascii="Verdana" w:hAnsi="Verdana"/>
+                <w:noProof/>
+                <w:webHidden/>
+              </w:rPr>
+              <w:tab/>
+            </w:r>
+            <w:r>
+              <w:rPr>
+                <w:rFonts w:ascii="Verdana" w:hAnsi="Verdana"/>
+                <w:noProof/>
+                <w:webHidden/>
+              </w:rPr>
+              <w:fldChar w:fldCharType="begin"/>
+            </w:r>
+            <w:r>
+              <w:rPr>
+                <w:rFonts w:ascii="Verdana" w:hAnsi="Verdana"/>
+                <w:noProof/>
+                <w:webHidden/>
+              </w:rPr>
+              <w:instrText xml:space="preserve"> PAGEREF _Toc220412685 \h </w:instrText>
+            </w:r>
+            <w:r>
+              <w:rPr>
+                <w:rFonts w:ascii="Verdana" w:hAnsi="Verdana"/>
+                <w:noProof/>
+                <w:webHidden/>
+              </w:rPr>
+            </w:r>
+            <w:r>
+              <w:rPr>
+                <w:rFonts w:ascii="Verdana" w:hAnsi="Verdana"/>
+                <w:noProof/>
+                <w:webHidden/>
+              </w:rPr>
+              <w:fldChar w:fldCharType="separate"/>
+            </w:r>
+            <w:r>
+              <w:rPr>
+                <w:rFonts w:ascii="Verdana" w:hAnsi="Verdana"/>
+                <w:noProof/>
+                <w:webHidden/>
+              </w:rPr>
+              <w:t>5</w:t>
+            </w:r>
+            <w:r>
+              <w:rPr>
+                <w:rFonts w:ascii="Verdana" w:hAnsi="Verdana"/>
+                <w:noProof/>
+                <w:webHidden/>
+              </w:rPr>
+              <w:fldChar w:fldCharType="end"/>
+            </w:r>
+          </w:hyperlink>
+        </w:p>
+        <w:p>
+          <w:r>
+            <w:rPr>
+              <w:rFonts w:ascii="Verdana" w:hAnsi="Verdana"/>
+              <w:b/>
+              <w:bCs/>
+            </w:rPr>
+            <w:fldChar w:fldCharType="end"/>
+          </w:r>
+        </w:p>
+      </w:sdtContent>
+    </w:sdt>
+    <w:p>
+      <w:pPr>
+        <w:jc w:val="both"/>
         <w:rPr>
           <w:rFonts w:ascii="Verdana" w:hAnsi="Verdana"/>
         </w:rPr>
@@ -663,221 +1723,139 @@
     </w:p>
     <w:p>
       <w:pPr>
-        <w:pStyle w:val="Prrafodelista"/>
-        <w:numPr>
-          <w:ilvl w:val="0"/>
-          <w:numId w:val="2"/>
-        </w:numPr>
+        <w:jc w:val="both"/>
         <w:rPr>
           <w:rFonts w:ascii="Verdana" w:hAnsi="Verdana"/>
         </w:rPr>
       </w:pPr>
-      <w:r>
+    </w:p>
+    <w:p>
+      <w:pPr>
+        <w:jc w:val="both"/>
         <w:rPr>
           <w:rFonts w:ascii="Verdana" w:hAnsi="Verdana"/>
         </w:rPr>
-        <w:t>Resumen</w:t>
-      </w:r>
-    </w:p>
-    <w:p>
-      <w:pPr>
-        <w:pStyle w:val="Prrafodelista"/>
-        <w:numPr>
-          <w:ilvl w:val="0"/>
-          <w:numId w:val="2"/>
-        </w:numPr>
+      </w:pPr>
+    </w:p>
+    <w:p>
+      <w:pPr>
+        <w:jc w:val="both"/>
         <w:rPr>
           <w:rFonts w:ascii="Verdana" w:hAnsi="Verdana"/>
         </w:rPr>
       </w:pPr>
-      <w:proofErr w:type="spellStart"/>
-      <w:r>
+    </w:p>
+    <w:p>
+      <w:pPr>
+        <w:jc w:val="both"/>
         <w:rPr>
           <w:rFonts w:ascii="Verdana" w:hAnsi="Verdana"/>
         </w:rPr>
-        <w:t>Abstract</w:t>
-      </w:r>
-      <w:proofErr w:type="spellEnd"/>
-    </w:p>
-    <w:p>
-      <w:pPr>
-        <w:pStyle w:val="Prrafodelista"/>
-        <w:numPr>
-          <w:ilvl w:val="0"/>
-          <w:numId w:val="2"/>
-        </w:numPr>
+      </w:pPr>
+    </w:p>
+    <w:p>
+      <w:pPr>
+        <w:jc w:val="both"/>
         <w:rPr>
           <w:rFonts w:ascii="Verdana" w:hAnsi="Verdana"/>
         </w:rPr>
       </w:pPr>
-      <w:r>
+    </w:p>
+    <w:p>
+      <w:pPr>
+        <w:jc w:val="both"/>
         <w:rPr>
           <w:rFonts w:ascii="Verdana" w:hAnsi="Verdana"/>
         </w:rPr>
-        <w:t>Justificación del proyecto</w:t>
-      </w:r>
-    </w:p>
-    <w:p>
-      <w:pPr>
-        <w:pStyle w:val="Prrafodelista"/>
-        <w:numPr>
-          <w:ilvl w:val="0"/>
-          <w:numId w:val="2"/>
-        </w:numPr>
+      </w:pPr>
+    </w:p>
+    <w:p>
+      <w:pPr>
+        <w:jc w:val="both"/>
         <w:rPr>
           <w:rFonts w:ascii="Verdana" w:hAnsi="Verdana"/>
         </w:rPr>
       </w:pPr>
-      <w:r>
+    </w:p>
+    <w:p>
+      <w:pPr>
+        <w:jc w:val="both"/>
         <w:rPr>
           <w:rFonts w:ascii="Verdana" w:hAnsi="Verdana"/>
         </w:rPr>
-        <w:t>Objetivos</w:t>
-      </w:r>
-    </w:p>
-    <w:p>
-      <w:pPr>
-        <w:pStyle w:val="Prrafodelista"/>
-        <w:numPr>
-          <w:ilvl w:val="1"/>
-          <w:numId w:val="2"/>
-        </w:numPr>
+      </w:pPr>
+    </w:p>
+    <w:p>
+      <w:pPr>
+        <w:jc w:val="both"/>
         <w:rPr>
           <w:rFonts w:ascii="Verdana" w:hAnsi="Verdana"/>
         </w:rPr>
       </w:pPr>
-      <w:r>
+    </w:p>
+    <w:p>
+      <w:pPr>
+        <w:jc w:val="both"/>
         <w:rPr>
           <w:rFonts w:ascii="Verdana" w:hAnsi="Verdana"/>
         </w:rPr>
-        <w:t>Objetivos generales</w:t>
-      </w:r>
-    </w:p>
-    <w:p>
-      <w:pPr>
-        <w:pStyle w:val="Prrafodelista"/>
-        <w:numPr>
-          <w:ilvl w:val="1"/>
-          <w:numId w:val="2"/>
-        </w:numPr>
+      </w:pPr>
+    </w:p>
+    <w:p>
+      <w:pPr>
+        <w:jc w:val="both"/>
         <w:rPr>
           <w:rFonts w:ascii="Verdana" w:hAnsi="Verdana"/>
         </w:rPr>
       </w:pPr>
-      <w:r>
+    </w:p>
+    <w:p>
+      <w:pPr>
+        <w:jc w:val="both"/>
         <w:rPr>
           <w:rFonts w:ascii="Verdana" w:hAnsi="Verdana"/>
         </w:rPr>
-        <w:t>Objetivos e</w:t>
-      </w:r>
-      <w:r>
+      </w:pPr>
+    </w:p>
+    <w:p>
+      <w:pPr>
+        <w:jc w:val="both"/>
         <w:rPr>
           <w:rFonts w:ascii="Verdana" w:hAnsi="Verdana"/>
         </w:rPr>
-        <w:t>specíficos</w:t>
-      </w:r>
-    </w:p>
-    <w:p>
-      <w:pPr>
-        <w:pStyle w:val="Prrafodelista"/>
-        <w:numPr>
-          <w:ilvl w:val="0"/>
-          <w:numId w:val="2"/>
-        </w:numPr>
+      </w:pPr>
+    </w:p>
+    <w:p>
+      <w:pPr>
+        <w:jc w:val="both"/>
         <w:rPr>
           <w:rFonts w:ascii="Verdana" w:hAnsi="Verdana"/>
         </w:rPr>
       </w:pPr>
-      <w:r>
+    </w:p>
+    <w:p>
+      <w:pPr>
+        <w:jc w:val="both"/>
         <w:rPr>
           <w:rFonts w:ascii="Verdana" w:hAnsi="Verdana"/>
         </w:rPr>
-        <w:t>Introducción</w:t>
-      </w:r>
-    </w:p>
-    <w:p>
-      <w:pPr>
-        <w:pStyle w:val="Prrafodelista"/>
-        <w:numPr>
-          <w:ilvl w:val="0"/>
-          <w:numId w:val="2"/>
-        </w:numPr>
+      </w:pPr>
+    </w:p>
+    <w:p>
+      <w:pPr>
+        <w:jc w:val="both"/>
         <w:rPr>
           <w:rFonts w:ascii="Verdana" w:hAnsi="Verdana"/>
         </w:rPr>
       </w:pPr>
-      <w:r>
+    </w:p>
+    <w:p>
+      <w:pPr>
+        <w:jc w:val="both"/>
         <w:rPr>
           <w:rFonts w:ascii="Verdana" w:hAnsi="Verdana"/>
         </w:rPr>
-        <w:t>Desarrollo</w:t>
-      </w:r>
-    </w:p>
-    <w:p>
-      <w:pPr>
-        <w:pStyle w:val="Prrafodelista"/>
-        <w:numPr>
-          <w:ilvl w:val="0"/>
-          <w:numId w:val="2"/>
-        </w:numPr>
-        <w:rPr>
-          <w:rFonts w:ascii="Verdana" w:hAnsi="Verdana"/>
-        </w:rPr>
-      </w:pPr>
-      <w:r>
-        <w:rPr>
-          <w:rFonts w:ascii="Verdana" w:hAnsi="Verdana"/>
-        </w:rPr>
-        <w:t>Conclusiones</w:t>
-      </w:r>
-    </w:p>
-    <w:p>
-      <w:pPr>
-        <w:pStyle w:val="Prrafodelista"/>
-        <w:numPr>
-          <w:ilvl w:val="0"/>
-          <w:numId w:val="2"/>
-        </w:numPr>
-        <w:rPr>
-          <w:rFonts w:ascii="Verdana" w:hAnsi="Verdana"/>
-        </w:rPr>
-      </w:pPr>
-      <w:r>
-        <w:rPr>
-          <w:rFonts w:ascii="Verdana" w:hAnsi="Verdana"/>
-        </w:rPr>
-        <w:t>Bibliografía</w:t>
-      </w:r>
-      <w:r>
-        <w:rPr>
-          <w:rFonts w:ascii="Verdana" w:hAnsi="Verdana"/>
-        </w:rPr>
-        <w:t xml:space="preserve"> y</w:t>
-      </w:r>
-      <w:r>
-        <w:rPr>
-          <w:rFonts w:ascii="Verdana" w:hAnsi="Verdana"/>
-        </w:rPr>
-        <w:t xml:space="preserve"> Webgrafía</w:t>
-      </w:r>
-    </w:p>
-    <w:p>
-      <w:pPr>
-        <w:pStyle w:val="Prrafodelista"/>
-        <w:numPr>
-          <w:ilvl w:val="0"/>
-          <w:numId w:val="2"/>
-        </w:numPr>
-        <w:rPr>
-          <w:rFonts w:ascii="Verdana" w:hAnsi="Verdana"/>
-        </w:rPr>
-      </w:pPr>
-      <w:r>
-        <w:rPr>
-          <w:rFonts w:ascii="Verdana" w:hAnsi="Verdana"/>
-        </w:rPr>
-        <w:t>Materiales y métodos</w:t>
-      </w:r>
+      </w:pPr>
     </w:p>
     <w:p>
       <w:pPr>
@@ -886,20 +1864,25 @@
           <w:ilvl w:val="0"/>
           <w:numId w:val="5"/>
         </w:numPr>
-        <w:rPr>
-          <w:color w:val="EE0000"/>
-        </w:rPr>
-      </w:pPr>
+        <w:jc w:val="both"/>
+        <w:rPr>
+          <w:color w:val="C00000"/>
+        </w:rPr>
+      </w:pPr>
+      <w:bookmarkStart w:id="1" w:name="_Toc220412678"/>
       <w:r>
         <w:rPr>
-          <w:color w:val="EE0000"/>
-        </w:rPr>
+          <w:color w:val="C00000"/>
+        </w:rPr>
+        <w:lastRenderedPageBreak/>
         <w:t>Resumen</w:t>
       </w:r>
+      <w:bookmarkEnd w:id="1"/>
     </w:p>
     <w:p>
       <w:pPr>
         <w:pStyle w:val="Textomemoria"/>
+        <w:jc w:val="both"/>
       </w:pPr>
       <w:r>
         <w:t>E</w:t>
@@ -911,6 +1894,7 @@
     <w:p>
       <w:pPr>
         <w:pStyle w:val="Textomemoria"/>
+        <w:jc w:val="both"/>
       </w:pPr>
     </w:p>
     <w:p>
@@ -920,24 +1904,28 @@
           <w:ilvl w:val="0"/>
           <w:numId w:val="5"/>
         </w:numPr>
-        <w:rPr>
-          <w:color w:val="EE0000"/>
-        </w:rPr>
-      </w:pPr>
+        <w:jc w:val="both"/>
+        <w:rPr>
+          <w:color w:val="C00000"/>
+        </w:rPr>
+      </w:pPr>
+      <w:bookmarkStart w:id="2" w:name="_Toc220412679"/>
       <w:proofErr w:type="spellStart"/>
       <w:r>
         <w:rPr>
-          <w:color w:val="EE0000"/>
+          <w:color w:val="C00000"/>
         </w:rPr>
         <w:t>Abstract</w:t>
       </w:r>
+      <w:bookmarkEnd w:id="2"/>
       <w:proofErr w:type="spellEnd"/>
     </w:p>
     <w:p>
       <w:pPr>
         <w:pStyle w:val="Estilo1"/>
-        <w:rPr>
-          <w:color w:val="EE0000"/>
+        <w:jc w:val="both"/>
+        <w:rPr>
+          <w:color w:val="C00000"/>
         </w:rPr>
       </w:pPr>
     </w:p>
@@ -948,16 +1936,19 @@
           <w:ilvl w:val="0"/>
           <w:numId w:val="5"/>
         </w:numPr>
-        <w:rPr>
-          <w:color w:val="EE0000"/>
-        </w:rPr>
-      </w:pPr>
+        <w:jc w:val="both"/>
+        <w:rPr>
+          <w:color w:val="C00000"/>
+        </w:rPr>
+      </w:pPr>
+      <w:bookmarkStart w:id="3" w:name="_Toc220412680"/>
       <w:r>
         <w:rPr>
-          <w:color w:val="EE0000"/>
+          <w:color w:val="C00000"/>
         </w:rPr>
         <w:t>Justificación del proyecto</w:t>
       </w:r>
+      <w:bookmarkEnd w:id="3"/>
     </w:p>
     <w:p>
       <w:pPr>
@@ -966,16 +1957,19 @@
           <w:ilvl w:val="0"/>
           <w:numId w:val="5"/>
         </w:numPr>
-        <w:rPr>
-          <w:color w:val="EE0000"/>
-        </w:rPr>
-      </w:pPr>
+        <w:jc w:val="both"/>
+        <w:rPr>
+          <w:color w:val="C00000"/>
+        </w:rPr>
+      </w:pPr>
+      <w:bookmarkStart w:id="4" w:name="_Toc220412681"/>
       <w:r>
         <w:rPr>
-          <w:color w:val="EE0000"/>
+          <w:color w:val="C00000"/>
         </w:rPr>
         <w:t>Objetivos</w:t>
       </w:r>
+      <w:bookmarkEnd w:id="4"/>
     </w:p>
     <w:p>
       <w:pPr>
@@ -984,16 +1978,19 @@
           <w:ilvl w:val="1"/>
           <w:numId w:val="5"/>
         </w:numPr>
-        <w:rPr>
-          <w:color w:val="EE0000"/>
-        </w:rPr>
-      </w:pPr>
+        <w:jc w:val="both"/>
+        <w:rPr>
+          <w:color w:val="C00000"/>
+        </w:rPr>
+      </w:pPr>
+      <w:bookmarkStart w:id="5" w:name="_Toc220412682"/>
       <w:r>
         <w:rPr>
-          <w:color w:val="EE0000"/>
+          <w:color w:val="C00000"/>
         </w:rPr>
         <w:t>Objetivos generales</w:t>
       </w:r>
+      <w:bookmarkEnd w:id="5"/>
     </w:p>
     <w:p>
       <w:pPr>
@@ -1002,22 +1999,26 @@
           <w:ilvl w:val="1"/>
           <w:numId w:val="5"/>
         </w:numPr>
-        <w:rPr>
-          <w:color w:val="EE0000"/>
-        </w:rPr>
-      </w:pPr>
+        <w:jc w:val="both"/>
+        <w:rPr>
+          <w:color w:val="C00000"/>
+        </w:rPr>
+      </w:pPr>
+      <w:bookmarkStart w:id="6" w:name="_Toc220412683"/>
       <w:r>
         <w:rPr>
-          <w:color w:val="EE0000"/>
+          <w:color w:val="C00000"/>
         </w:rPr>
         <w:t>Objetivos específicos</w:t>
       </w:r>
+      <w:bookmarkEnd w:id="6"/>
     </w:p>
     <w:p>
       <w:pPr>
         <w:pStyle w:val="Estilo1"/>
-        <w:rPr>
-          <w:color w:val="EE0000"/>
+        <w:jc w:val="both"/>
+        <w:rPr>
+          <w:color w:val="C00000"/>
         </w:rPr>
       </w:pPr>
     </w:p>
@@ -1028,21 +2029,25 @@
           <w:ilvl w:val="0"/>
           <w:numId w:val="5"/>
         </w:numPr>
-        <w:rPr>
-          <w:color w:val="EE0000"/>
-        </w:rPr>
-      </w:pPr>
+        <w:jc w:val="both"/>
+        <w:rPr>
+          <w:color w:val="C00000"/>
+        </w:rPr>
+      </w:pPr>
+      <w:bookmarkStart w:id="7" w:name="_Toc220412684"/>
       <w:r>
         <w:rPr>
-          <w:color w:val="EE0000"/>
+          <w:color w:val="C00000"/>
         </w:rPr>
         <w:t>Introducción</w:t>
       </w:r>
+      <w:bookmarkEnd w:id="7"/>
     </w:p>
     <w:p>
       <w:pPr>
         <w:pStyle w:val="Estilo1"/>
         <w:ind w:left="360"/>
+        <w:jc w:val="both"/>
         <w:rPr>
           <w:color w:val="EE0000"/>
         </w:rPr>
@@ -1052,6 +2057,7 @@
       <w:pPr>
         <w:pStyle w:val="Prrafodelista"/>
         <w:ind w:left="360"/>
+        <w:jc w:val="both"/>
       </w:pPr>
       <w:r>
         <w:t>Este proyecto versa sobre la creación de un aplicación móvil para gestionar las reparaciones de un servicio técnico especializado en reparaciones de portátiles y teléfonos.</w:t>
@@ -1061,6 +2067,7 @@
       <w:pPr>
         <w:pStyle w:val="Prrafodelista"/>
         <w:ind w:left="360"/>
+        <w:jc w:val="both"/>
       </w:pPr>
       <w:r>
         <w:t xml:space="preserve">Su elaboración surge de la necesidad de acercar la información en tiempo real al usuario, </w:t>
@@ -1081,9 +2088,9 @@
       <w:pPr>
         <w:pStyle w:val="Prrafodelista"/>
         <w:ind w:left="360"/>
+        <w:jc w:val="both"/>
       </w:pPr>
       <w:r>
-        <w:lastRenderedPageBreak/>
         <w:t>Creemos que esta aplicación animaría a los usuarios a decantarse por la reparaciones de sus dispositivos al hacer más accesible la información de precios, servicios.. y aumentar la transparencia del proceso. Al eliminar una queja clásica hacia el sector como es la falta de claridad en sobre las acciones que los técnicos realizan sobre los dispositivos y el desglose de precios. Además los autores del siguiente trabajo pensamos que la reparación y reutilización de elementos es una pieza fundamental para afrontar problemas como el cambio climático o la escasez de piezas, al igual que el incremento de precios de la las mismas.</w:t>
       </w:r>
     </w:p>
@@ -1091,6 +2098,7 @@
       <w:pPr>
         <w:pStyle w:val="Prrafodelista"/>
         <w:ind w:left="360"/>
+        <w:jc w:val="both"/>
       </w:pPr>
       <w:r>
         <w:t>Esta aplicación va dirigido al público general, de todas las edades. Motivo por el cual se han tomado iniciativas y decisiones de diseño dirigidas a crear una interfaz limpia</w:t>
@@ -1103,6 +2111,7 @@
       <w:pPr>
         <w:pStyle w:val="Prrafodelista"/>
         <w:ind w:left="360"/>
+        <w:jc w:val="both"/>
       </w:pPr>
     </w:p>
     <w:p>
@@ -1112,15 +2121,19 @@
           <w:ilvl w:val="0"/>
           <w:numId w:val="5"/>
         </w:numPr>
+        <w:jc w:val="both"/>
         <w:rPr>
           <w:color w:val="EE0000"/>
         </w:rPr>
       </w:pPr>
+      <w:bookmarkStart w:id="8" w:name="_Toc220412685"/>
+      <w:bookmarkEnd w:id="8"/>
     </w:p>
     <w:p>
       <w:pPr>
         <w:pStyle w:val="Estilo1"/>
         <w:ind w:left="360"/>
+        <w:jc w:val="both"/>
         <w:rPr>
           <w:color w:val="EE0000"/>
         </w:rPr>
@@ -1129,6 +2142,7 @@
     <w:p>
       <w:pPr>
         <w:pStyle w:val="Estilo1"/>
+        <w:jc w:val="both"/>
         <w:rPr>
           <w:color w:val="EE0000"/>
         </w:rPr>
@@ -1137,6 +2151,7 @@
     <w:p>
       <w:pPr>
         <w:pStyle w:val="Estilo1"/>
+        <w:jc w:val="both"/>
         <w:rPr>
           <w:color w:val="EE0000"/>
         </w:rPr>
@@ -1145,6 +2160,7 @@
     <w:p>
       <w:pPr>
         <w:pStyle w:val="Estilo1"/>
+        <w:jc w:val="both"/>
         <w:rPr>
           <w:color w:val="EE0000"/>
         </w:rPr>
@@ -1153,6 +2169,7 @@
     <w:p>
       <w:pPr>
         <w:pStyle w:val="Estilo1"/>
+        <w:jc w:val="both"/>
         <w:rPr>
           <w:color w:val="EE0000"/>
         </w:rPr>
@@ -1161,6 +2178,7 @@
     <w:p>
       <w:pPr>
         <w:pStyle w:val="Estilo1"/>
+        <w:jc w:val="both"/>
         <w:rPr>
           <w:color w:val="EE0000"/>
         </w:rPr>
@@ -1169,6 +2187,7 @@
     <w:p>
       <w:pPr>
         <w:pStyle w:val="Estilo1"/>
+        <w:jc w:val="both"/>
         <w:rPr>
           <w:color w:val="EE0000"/>
         </w:rPr>
@@ -1177,6 +2196,7 @@
     <w:p>
       <w:pPr>
         <w:pStyle w:val="Estilo1"/>
+        <w:jc w:val="both"/>
         <w:rPr>
           <w:color w:val="EE0000"/>
         </w:rPr>
@@ -1185,6 +2205,7 @@
     <w:p>
       <w:pPr>
         <w:pStyle w:val="Estilo1"/>
+        <w:jc w:val="both"/>
         <w:rPr>
           <w:color w:val="EE0000"/>
         </w:rPr>
@@ -1193,6 +2214,7 @@
     <w:p>
       <w:pPr>
         <w:pStyle w:val="Estilo1"/>
+        <w:jc w:val="both"/>
         <w:rPr>
           <w:color w:val="EE0000"/>
         </w:rPr>
@@ -1201,6 +2223,7 @@
     <w:p>
       <w:pPr>
         <w:pStyle w:val="Estilo1"/>
+        <w:jc w:val="both"/>
         <w:rPr>
           <w:color w:val="EE0000"/>
         </w:rPr>
@@ -1209,6 +2232,7 @@
     <w:p>
       <w:pPr>
         <w:pStyle w:val="Estilo1"/>
+        <w:jc w:val="both"/>
         <w:rPr>
           <w:color w:val="EE0000"/>
         </w:rPr>
@@ -1217,6 +2241,7 @@
     <w:p>
       <w:pPr>
         <w:pStyle w:val="Estilo1"/>
+        <w:jc w:val="both"/>
         <w:rPr>
           <w:color w:val="EE0000"/>
         </w:rPr>
@@ -1225,30 +2250,104 @@
     <w:p>
       <w:pPr>
         <w:pStyle w:val="Estilo1"/>
+        <w:jc w:val="both"/>
         <w:rPr>
           <w:color w:val="EE0000"/>
         </w:rPr>
       </w:pPr>
     </w:p>
-    <w:p/>
-    <w:p/>
-    <w:p/>
-    <w:p/>
-    <w:p/>
-    <w:p/>
-    <w:p/>
-    <w:p/>
-    <w:p/>
-    <w:p/>
-    <w:p/>
-    <w:p/>
-    <w:p/>
-    <w:p/>
-    <w:p/>
-    <w:p/>
-    <w:p/>
-    <w:p/>
+    <w:p>
+      <w:pPr>
+        <w:jc w:val="both"/>
+      </w:pPr>
+    </w:p>
+    <w:p>
+      <w:pPr>
+        <w:jc w:val="both"/>
+      </w:pPr>
+    </w:p>
+    <w:p>
+      <w:pPr>
+        <w:jc w:val="both"/>
+      </w:pPr>
+    </w:p>
+    <w:p>
+      <w:pPr>
+        <w:jc w:val="both"/>
+      </w:pPr>
+    </w:p>
+    <w:p>
+      <w:pPr>
+        <w:jc w:val="both"/>
+      </w:pPr>
+    </w:p>
+    <w:p>
+      <w:pPr>
+        <w:jc w:val="both"/>
+      </w:pPr>
+    </w:p>
+    <w:p>
+      <w:pPr>
+        <w:jc w:val="both"/>
+      </w:pPr>
+    </w:p>
+    <w:p>
+      <w:pPr>
+        <w:jc w:val="both"/>
+      </w:pPr>
+    </w:p>
+    <w:p>
+      <w:pPr>
+        <w:jc w:val="both"/>
+      </w:pPr>
+    </w:p>
+    <w:p>
+      <w:pPr>
+        <w:jc w:val="both"/>
+      </w:pPr>
+    </w:p>
+    <w:p>
+      <w:pPr>
+        <w:jc w:val="both"/>
+      </w:pPr>
+    </w:p>
+    <w:p>
+      <w:pPr>
+        <w:jc w:val="both"/>
+      </w:pPr>
+    </w:p>
+    <w:p>
+      <w:pPr>
+        <w:jc w:val="both"/>
+      </w:pPr>
+    </w:p>
+    <w:p>
+      <w:pPr>
+        <w:jc w:val="both"/>
+      </w:pPr>
+    </w:p>
+    <w:p>
+      <w:pPr>
+        <w:jc w:val="both"/>
+      </w:pPr>
+    </w:p>
+    <w:p>
+      <w:pPr>
+        <w:jc w:val="both"/>
+      </w:pPr>
+    </w:p>
+    <w:p>
+      <w:pPr>
+        <w:jc w:val="both"/>
+      </w:pPr>
+    </w:p>
+    <w:p>
+      <w:pPr>
+        <w:jc w:val="both"/>
+      </w:pPr>
+    </w:p>
     <w:sectPr>
+      <w:footerReference w:type="default" r:id="rId9"/>
       <w:pgSz w:w="11906" w:h="16838"/>
       <w:pgMar w:top="1417" w:right="1701" w:bottom="1417" w:left="1701" w:header="708" w:footer="708" w:gutter="0"/>
       <w:cols w:space="708"/>
@@ -1256,6 +2355,75 @@
     </w:sectPr>
   </w:body>
 </w:document>
+</file>
+
+<file path=word/endnotes.xml><?xml version="1.0" encoding="utf-8"?>
+<w:endnotes xmlns:wpc="http://schemas.microsoft.com/office/word/2010/wordprocessingCanvas" xmlns:cx="http://schemas.microsoft.com/office/drawing/2014/chartex" xmlns:cx1="http://schemas.microsoft.com/office/drawing/2015/9/8/chartex" xmlns:cx2="http://schemas.microsoft.com/office/drawing/2015/10/21/chartex" xmlns:cx3="http://schemas.microsoft.com/office/drawing/2016/5/9/chartex" xmlns:cx4="http://schemas.microsoft.com/office/drawing/2016/5/10/chartex" xmlns:cx5="http://schemas.microsoft.com/office/drawing/2016/5/11/chartex" xmlns:cx6="http://schemas.microsoft.com/office/drawing/2016/5/12/chartex" xmlns:cx7="http://schemas.microsoft.com/office/drawing/2016/5/13/chartex" xmlns:cx8="http://schemas.microsoft.com/office/drawing/2016/5/14/chartex" xmlns:mc="http://schemas.openxmlformats.org/markup-compatibility/2006" xmlns:aink="http://schemas.microsoft.com/office/drawing/2016/ink" xmlns:am3d="http://schemas.microsoft.com/office/drawing/2017/model3d" xmlns:o="urn:schemas-microsoft-com:office:office" xmlns:oel="http://schemas.microsoft.com/office/2019/extlst" xmlns:r="http://schemas.openxmlformats.org/officeDocument/2006/relationships" xmlns:m="http://schemas.openxmlformats.org/officeDocument/2006/math" xmlns:v="urn:schemas-microsoft-com:vml" xmlns:wp14="http://schemas.microsoft.com/office/word/2010/wordprocessingDrawing" xmlns:wp="http://schemas.openxmlformats.org/drawingml/2006/wordprocessingDrawing" xmlns:w10="urn:schemas-microsoft-com:office:word" xmlns:w="http://schemas.openxmlformats.org/wordprocessingml/2006/main" xmlns:w14="http://schemas.microsoft.com/office/word/2010/wordml" xmlns:w15="http://schemas.microsoft.com/office/word/2012/wordml" xmlns:w16cex="http://schemas.microsoft.com/office/word/2018/wordml/cex" xmlns:w16cid="http://schemas.microsoft.com/office/word/2016/wordml/cid" xmlns:w16="http://schemas.microsoft.com/office/word/2018/wordml" xmlns:w16du="http://schemas.microsoft.com/office/word/2023/wordml/word16du" xmlns:w16sdtdh="http://schemas.microsoft.com/office/word/2020/wordml/sdtdatahash" xmlns:w16sdtfl="http://schemas.microsoft.com/office/word/2024/wordml/sdtformatlock" xmlns:w16se="http://schemas.microsoft.com/office/word/2015/wordml/symex" xmlns:wpg="http://schemas.microsoft.com/office/word/2010/wordprocessingGroup" xmlns:wpi="http://schemas.microsoft.com/office/word/2010/wordprocessingInk" xmlns:wne="http://schemas.microsoft.com/office/word/2006/wordml" xmlns:wps="http://schemas.microsoft.com/office/word/2010/wordprocessingShape" mc:Ignorable="w14 w15 w16se w16cid w16 w16cex w16sdtdh w16sdtfl w16du wp14">
+  <w:endnote w:type="separator" w:id="-1">
+    <w:p>
+      <w:pPr>
+        <w:spacing w:after="0" w:line="240" w:lineRule="auto"/>
+      </w:pPr>
+      <w:r>
+        <w:separator/>
+      </w:r>
+    </w:p>
+  </w:endnote>
+  <w:endnote w:type="continuationSeparator" w:id="0">
+    <w:p>
+      <w:pPr>
+        <w:spacing w:after="0" w:line="240" w:lineRule="auto"/>
+      </w:pPr>
+      <w:r>
+        <w:continuationSeparator/>
+      </w:r>
+    </w:p>
+  </w:endnote>
+</w:endnotes>
+</file>
+
+<file path=word/footer1.xml><?xml version="1.0" encoding="utf-8"?>
+<w:ftr xmlns:wpc="http://schemas.microsoft.com/office/word/2010/wordprocessingCanvas" xmlns:cx="http://schemas.microsoft.com/office/drawing/2014/chartex" xmlns:cx1="http://schemas.microsoft.com/office/drawing/2015/9/8/chartex" xmlns:cx2="http://schemas.microsoft.com/office/drawing/2015/10/21/chartex" xmlns:cx3="http://schemas.microsoft.com/office/drawing/2016/5/9/chartex" xmlns:cx4="http://schemas.microsoft.com/office/drawing/2016/5/10/chartex" xmlns:cx5="http://schemas.microsoft.com/office/drawing/2016/5/11/chartex" xmlns:cx6="http://schemas.microsoft.com/office/drawing/2016/5/12/chartex" xmlns:cx7="http://schemas.microsoft.com/office/drawing/2016/5/13/chartex" xmlns:cx8="http://schemas.microsoft.com/office/drawing/2016/5/14/chartex" xmlns:mc="http://schemas.openxmlformats.org/markup-compatibility/2006" xmlns:aink="http://schemas.microsoft.com/office/drawing/2016/ink" xmlns:am3d="http://schemas.microsoft.com/office/drawing/2017/model3d" xmlns:o="urn:schemas-microsoft-com:office:office" xmlns:oel="http://schemas.microsoft.com/office/2019/extlst" xmlns:r="http://schemas.openxmlformats.org/officeDocument/2006/relationships" xmlns:m="http://schemas.openxmlformats.org/officeDocument/2006/math" xmlns:v="urn:schemas-microsoft-com:vml" xmlns:wp14="http://schemas.microsoft.com/office/word/2010/wordprocessingDrawing" xmlns:wp="http://schemas.openxmlformats.org/drawingml/2006/wordprocessingDrawing" xmlns:w10="urn:schemas-microsoft-com:office:word" xmlns:w="http://schemas.openxmlformats.org/wordprocessingml/2006/main" xmlns:w14="http://schemas.microsoft.com/office/word/2010/wordml" xmlns:w15="http://schemas.microsoft.com/office/word/2012/wordml" xmlns:w16cex="http://schemas.microsoft.com/office/word/2018/wordml/cex" xmlns:w16cid="http://schemas.microsoft.com/office/word/2016/wordml/cid" xmlns:w16="http://schemas.microsoft.com/office/word/2018/wordml" xmlns:w16du="http://schemas.microsoft.com/office/word/2023/wordml/word16du" xmlns:w16sdtdh="http://schemas.microsoft.com/office/word/2020/wordml/sdtdatahash" xmlns:w16sdtfl="http://schemas.microsoft.com/office/word/2024/wordml/sdtformatlock" xmlns:w16se="http://schemas.microsoft.com/office/word/2015/wordml/symex" xmlns:wpg="http://schemas.microsoft.com/office/word/2010/wordprocessingGroup" xmlns:wpi="http://schemas.microsoft.com/office/word/2010/wordprocessingInk" xmlns:wne="http://schemas.microsoft.com/office/word/2006/wordml" xmlns:wps="http://schemas.microsoft.com/office/word/2010/wordprocessingShape" mc:Ignorable="w14 w15 w16se w16cid w16 w16cex w16sdtdh w16sdtfl w16du wp14">
+  <w:p>
+    <w:pPr>
+      <w:pStyle w:val="Piedepgina"/>
+      <w:rPr>
+        <w:caps/>
+        <w:color w:val="4472C4" w:themeColor="accent1"/>
+      </w:rPr>
+    </w:pPr>
+  </w:p>
+  <w:p>
+    <w:pPr>
+      <w:pStyle w:val="Piedepgina"/>
+    </w:pPr>
+  </w:p>
+</w:ftr>
+</file>
+
+<file path=word/footnotes.xml><?xml version="1.0" encoding="utf-8"?>
+<w:footnotes xmlns:wpc="http://schemas.microsoft.com/office/word/2010/wordprocessingCanvas" xmlns:cx="http://schemas.microsoft.com/office/drawing/2014/chartex" xmlns:cx1="http://schemas.microsoft.com/office/drawing/2015/9/8/chartex" xmlns:cx2="http://schemas.microsoft.com/office/drawing/2015/10/21/chartex" xmlns:cx3="http://schemas.microsoft.com/office/drawing/2016/5/9/chartex" xmlns:cx4="http://schemas.microsoft.com/office/drawing/2016/5/10/chartex" xmlns:cx5="http://schemas.microsoft.com/office/drawing/2016/5/11/chartex" xmlns:cx6="http://schemas.microsoft.com/office/drawing/2016/5/12/chartex" xmlns:cx7="http://schemas.microsoft.com/office/drawing/2016/5/13/chartex" xmlns:cx8="http://schemas.microsoft.com/office/drawing/2016/5/14/chartex" xmlns:mc="http://schemas.openxmlformats.org/markup-compatibility/2006" xmlns:aink="http://schemas.microsoft.com/office/drawing/2016/ink" xmlns:am3d="http://schemas.microsoft.com/office/drawing/2017/model3d" xmlns:o="urn:schemas-microsoft-com:office:office" xmlns:oel="http://schemas.microsoft.com/office/2019/extlst" xmlns:r="http://schemas.openxmlformats.org/officeDocument/2006/relationships" xmlns:m="http://schemas.openxmlformats.org/officeDocument/2006/math" xmlns:v="urn:schemas-microsoft-com:vml" xmlns:wp14="http://schemas.microsoft.com/office/word/2010/wordprocessingDrawing" xmlns:wp="http://schemas.openxmlformats.org/drawingml/2006/wordprocessingDrawing" xmlns:w10="urn:schemas-microsoft-com:office:word" xmlns:w="http://schemas.openxmlformats.org/wordprocessingml/2006/main" xmlns:w14="http://schemas.microsoft.com/office/word/2010/wordml" xmlns:w15="http://schemas.microsoft.com/office/word/2012/wordml" xmlns:w16cex="http://schemas.microsoft.com/office/word/2018/wordml/cex" xmlns:w16cid="http://schemas.microsoft.com/office/word/2016/wordml/cid" xmlns:w16="http://schemas.microsoft.com/office/word/2018/wordml" xmlns:w16du="http://schemas.microsoft.com/office/word/2023/wordml/word16du" xmlns:w16sdtdh="http://schemas.microsoft.com/office/word/2020/wordml/sdtdatahash" xmlns:w16sdtfl="http://schemas.microsoft.com/office/word/2024/wordml/sdtformatlock" xmlns:w16se="http://schemas.microsoft.com/office/word/2015/wordml/symex" xmlns:wpg="http://schemas.microsoft.com/office/word/2010/wordprocessingGroup" xmlns:wpi="http://schemas.microsoft.com/office/word/2010/wordprocessingInk" xmlns:wne="http://schemas.microsoft.com/office/word/2006/wordml" xmlns:wps="http://schemas.microsoft.com/office/word/2010/wordprocessingShape" mc:Ignorable="w14 w15 w16se w16cid w16 w16cex w16sdtdh w16sdtfl w16du wp14">
+  <w:footnote w:type="separator" w:id="-1">
+    <w:p>
+      <w:pPr>
+        <w:spacing w:after="0" w:line="240" w:lineRule="auto"/>
+      </w:pPr>
+      <w:r>
+        <w:separator/>
+      </w:r>
+    </w:p>
+  </w:footnote>
+  <w:footnote w:type="continuationSeparator" w:id="0">
+    <w:p>
+      <w:pPr>
+        <w:spacing w:after="0" w:line="240" w:lineRule="auto"/>
+      </w:pPr>
+      <w:r>
+        <w:continuationSeparator/>
+      </w:r>
+    </w:p>
+  </w:footnote>
+</w:footnotes>
 </file>
 
 <file path=word/numbering.xml><?xml version="1.0" encoding="utf-8"?>
@@ -2408,6 +3576,88 @@
       <w:rFonts w:ascii="Verdana" w:hAnsi="Verdana"/>
     </w:rPr>
   </w:style>
+  <w:style w:type="paragraph" w:styleId="Encabezado">
+    <w:name w:val="header"/>
+    <w:basedOn w:val="Normal"/>
+    <w:link w:val="EncabezadoCar"/>
+    <w:uiPriority w:val="99"/>
+    <w:unhideWhenUsed/>
+    <w:rsid w:val="00B13784"/>
+    <w:pPr>
+      <w:tabs>
+        <w:tab w:val="center" w:pos="4252"/>
+        <w:tab w:val="right" w:pos="8504"/>
+      </w:tabs>
+      <w:spacing w:after="0" w:line="240" w:lineRule="auto"/>
+    </w:pPr>
+  </w:style>
+  <w:style w:type="character" w:customStyle="1" w:styleId="EncabezadoCar">
+    <w:name w:val="Encabezado Car"/>
+    <w:basedOn w:val="Fuentedeprrafopredeter"/>
+    <w:link w:val="Encabezado"/>
+    <w:uiPriority w:val="99"/>
+    <w:rsid w:val="00B13784"/>
+  </w:style>
+  <w:style w:type="paragraph" w:styleId="Piedepgina">
+    <w:name w:val="footer"/>
+    <w:basedOn w:val="Normal"/>
+    <w:link w:val="PiedepginaCar"/>
+    <w:uiPriority w:val="99"/>
+    <w:unhideWhenUsed/>
+    <w:rsid w:val="00B13784"/>
+    <w:pPr>
+      <w:tabs>
+        <w:tab w:val="center" w:pos="4252"/>
+        <w:tab w:val="right" w:pos="8504"/>
+      </w:tabs>
+      <w:spacing w:after="0" w:line="240" w:lineRule="auto"/>
+    </w:pPr>
+  </w:style>
+  <w:style w:type="character" w:customStyle="1" w:styleId="PiedepginaCar">
+    <w:name w:val="Pie de página Car"/>
+    <w:basedOn w:val="Fuentedeprrafopredeter"/>
+    <w:link w:val="Piedepgina"/>
+    <w:uiPriority w:val="99"/>
+    <w:rsid w:val="00B13784"/>
+  </w:style>
+  <w:style w:type="paragraph" w:styleId="TtuloTDC">
+    <w:name w:val="TOC Heading"/>
+    <w:basedOn w:val="Ttulo1"/>
+    <w:next w:val="Normal"/>
+    <w:uiPriority w:val="39"/>
+    <w:unhideWhenUsed/>
+    <w:qFormat/>
+    <w:rsid w:val="00B13784"/>
+    <w:pPr>
+      <w:outlineLvl w:val="9"/>
+    </w:pPr>
+    <w:rPr>
+      <w:lang w:eastAsia="es-ES"/>
+    </w:rPr>
+  </w:style>
+  <w:style w:type="paragraph" w:styleId="TDC1">
+    <w:name w:val="toc 1"/>
+    <w:basedOn w:val="Normal"/>
+    <w:next w:val="Normal"/>
+    <w:autoRedefine/>
+    <w:uiPriority w:val="39"/>
+    <w:unhideWhenUsed/>
+    <w:rsid w:val="00B13784"/>
+    <w:pPr>
+      <w:spacing w:after="100"/>
+    </w:pPr>
+  </w:style>
+  <w:style w:type="character" w:styleId="Hipervnculo">
+    <w:name w:val="Hyperlink"/>
+    <w:basedOn w:val="Fuentedeprrafopredeter"/>
+    <w:uiPriority w:val="99"/>
+    <w:unhideWhenUsed/>
+    <w:rsid w:val="00B13784"/>
+    <w:rPr>
+      <w:color w:val="0563C1" w:themeColor="hyperlink"/>
+      <w:u w:val="single"/>
+    </w:rPr>
+  </w:style>
 </w:styles>
 </file>
 
@@ -2704,4 +3954,16 @@
     </a:ext>
   </a:extLst>
 </a:theme>
+</file>
+
+<file path=customXml/item1.xml><?xml version="1.0" encoding="utf-8"?>
+<b:Sources xmlns:b="http://schemas.openxmlformats.org/officeDocument/2006/bibliography" xmlns="http://schemas.openxmlformats.org/officeDocument/2006/bibliography" SelectedStyle="\APASixthEditionOfficeOnline.xsl" StyleName="APA" Version="6"/>
+</file>
+
+<file path=customXml/itemProps1.xml><?xml version="1.0" encoding="utf-8"?>
+<ds:datastoreItem xmlns:ds="http://schemas.openxmlformats.org/officeDocument/2006/customXml" ds:itemID="{FC1D5B37-18E1-4E2A-A7EE-9B3817D860DE}">
+  <ds:schemaRefs>
+    <ds:schemaRef ds:uri="http://schemas.openxmlformats.org/officeDocument/2006/bibliography"/>
+  </ds:schemaRefs>
+</ds:datastoreItem>
 </file>
</xml_diff>

<commit_message>
update - abstract memoria
</commit_message>
<xml_diff>
--- a/Memoria.docx
+++ b/Memoria.docx
@@ -810,7 +810,7 @@
       <w:sdtContent>
         <w:p>
           <w:pPr>
-            <w:pStyle w:val="TtuloTDC"/>
+            <w:pStyle w:val="TOCHeading"/>
             <w:rPr>
               <w:rFonts w:ascii="Verdana" w:hAnsi="Verdana"/>
               <w:color w:val="C00000"/>
@@ -833,7 +833,7 @@
         </w:p>
         <w:p>
           <w:pPr>
-            <w:pStyle w:val="TDC1"/>
+            <w:pStyle w:val="TOC1"/>
             <w:tabs>
               <w:tab w:val="right" w:leader="dot" w:pos="8494"/>
             </w:tabs>
@@ -863,7 +863,7 @@
           <w:hyperlink w:anchor="_Toc220412676" w:history="1">
             <w:r>
               <w:rPr>
-                <w:rStyle w:val="Hipervnculo"/>
+                <w:rStyle w:val="Hyperlink"/>
                 <w:rFonts w:ascii="Verdana" w:hAnsi="Verdana"/>
                 <w:noProof/>
               </w:rPr>
@@ -928,7 +928,7 @@
         </w:p>
         <w:p>
           <w:pPr>
-            <w:pStyle w:val="TDC1"/>
+            <w:pStyle w:val="TOC1"/>
             <w:tabs>
               <w:tab w:val="right" w:leader="dot" w:pos="8494"/>
             </w:tabs>
@@ -940,7 +940,7 @@
           <w:hyperlink w:anchor="_Toc220412677" w:history="1">
             <w:r>
               <w:rPr>
-                <w:rStyle w:val="Hipervnculo"/>
+                <w:rStyle w:val="Hyperlink"/>
                 <w:rFonts w:ascii="Verdana" w:hAnsi="Verdana"/>
                 <w:noProof/>
               </w:rPr>
@@ -1005,7 +1005,7 @@
         </w:p>
         <w:p>
           <w:pPr>
-            <w:pStyle w:val="TDC1"/>
+            <w:pStyle w:val="TOC1"/>
             <w:tabs>
               <w:tab w:val="left" w:pos="480"/>
               <w:tab w:val="right" w:leader="dot" w:pos="8494"/>
@@ -1018,7 +1018,7 @@
           <w:hyperlink w:anchor="_Toc220412678" w:history="1">
             <w:r>
               <w:rPr>
-                <w:rStyle w:val="Hipervnculo"/>
+                <w:rStyle w:val="Hyperlink"/>
                 <w:rFonts w:ascii="Verdana" w:hAnsi="Verdana"/>
                 <w:noProof/>
               </w:rPr>
@@ -1033,7 +1033,7 @@
             </w:r>
             <w:r>
               <w:rPr>
-                <w:rStyle w:val="Hipervnculo"/>
+                <w:rStyle w:val="Hyperlink"/>
                 <w:rFonts w:ascii="Verdana" w:hAnsi="Verdana"/>
                 <w:noProof/>
               </w:rPr>
@@ -1098,7 +1098,7 @@
         </w:p>
         <w:p>
           <w:pPr>
-            <w:pStyle w:val="TDC1"/>
+            <w:pStyle w:val="TOC1"/>
             <w:tabs>
               <w:tab w:val="left" w:pos="480"/>
               <w:tab w:val="right" w:leader="dot" w:pos="8494"/>
@@ -1111,7 +1111,7 @@
           <w:hyperlink w:anchor="_Toc220412679" w:history="1">
             <w:r>
               <w:rPr>
-                <w:rStyle w:val="Hipervnculo"/>
+                <w:rStyle w:val="Hyperlink"/>
                 <w:rFonts w:ascii="Verdana" w:hAnsi="Verdana"/>
                 <w:noProof/>
               </w:rPr>
@@ -1126,7 +1126,7 @@
             </w:r>
             <w:r>
               <w:rPr>
-                <w:rStyle w:val="Hipervnculo"/>
+                <w:rStyle w:val="Hyperlink"/>
                 <w:rFonts w:ascii="Verdana" w:hAnsi="Verdana"/>
                 <w:noProof/>
               </w:rPr>
@@ -1191,7 +1191,7 @@
         </w:p>
         <w:p>
           <w:pPr>
-            <w:pStyle w:val="TDC1"/>
+            <w:pStyle w:val="TOC1"/>
             <w:tabs>
               <w:tab w:val="left" w:pos="480"/>
               <w:tab w:val="right" w:leader="dot" w:pos="8494"/>
@@ -1204,7 +1204,7 @@
           <w:hyperlink w:anchor="_Toc220412680" w:history="1">
             <w:r>
               <w:rPr>
-                <w:rStyle w:val="Hipervnculo"/>
+                <w:rStyle w:val="Hyperlink"/>
                 <w:rFonts w:ascii="Verdana" w:hAnsi="Verdana"/>
                 <w:noProof/>
               </w:rPr>
@@ -1219,7 +1219,7 @@
             </w:r>
             <w:r>
               <w:rPr>
-                <w:rStyle w:val="Hipervnculo"/>
+                <w:rStyle w:val="Hyperlink"/>
                 <w:rFonts w:ascii="Verdana" w:hAnsi="Verdana"/>
                 <w:noProof/>
               </w:rPr>
@@ -1284,7 +1284,7 @@
         </w:p>
         <w:p>
           <w:pPr>
-            <w:pStyle w:val="TDC1"/>
+            <w:pStyle w:val="TOC1"/>
             <w:tabs>
               <w:tab w:val="left" w:pos="480"/>
               <w:tab w:val="right" w:leader="dot" w:pos="8494"/>
@@ -1297,7 +1297,7 @@
           <w:hyperlink w:anchor="_Toc220412681" w:history="1">
             <w:r>
               <w:rPr>
-                <w:rStyle w:val="Hipervnculo"/>
+                <w:rStyle w:val="Hyperlink"/>
                 <w:rFonts w:ascii="Verdana" w:hAnsi="Verdana"/>
                 <w:noProof/>
               </w:rPr>
@@ -1312,7 +1312,7 @@
             </w:r>
             <w:r>
               <w:rPr>
-                <w:rStyle w:val="Hipervnculo"/>
+                <w:rStyle w:val="Hyperlink"/>
                 <w:rFonts w:ascii="Verdana" w:hAnsi="Verdana"/>
                 <w:noProof/>
               </w:rPr>
@@ -1377,7 +1377,7 @@
         </w:p>
         <w:p>
           <w:pPr>
-            <w:pStyle w:val="TDC1"/>
+            <w:pStyle w:val="TOC1"/>
             <w:tabs>
               <w:tab w:val="left" w:pos="720"/>
               <w:tab w:val="right" w:leader="dot" w:pos="8494"/>
@@ -1390,7 +1390,7 @@
           <w:hyperlink w:anchor="_Toc220412682" w:history="1">
             <w:r>
               <w:rPr>
-                <w:rStyle w:val="Hipervnculo"/>
+                <w:rStyle w:val="Hyperlink"/>
                 <w:rFonts w:ascii="Verdana" w:hAnsi="Verdana"/>
                 <w:noProof/>
               </w:rPr>
@@ -1405,7 +1405,7 @@
             </w:r>
             <w:r>
               <w:rPr>
-                <w:rStyle w:val="Hipervnculo"/>
+                <w:rStyle w:val="Hyperlink"/>
                 <w:rFonts w:ascii="Verdana" w:hAnsi="Verdana"/>
                 <w:noProof/>
               </w:rPr>
@@ -1470,7 +1470,7 @@
         </w:p>
         <w:p>
           <w:pPr>
-            <w:pStyle w:val="TDC1"/>
+            <w:pStyle w:val="TOC1"/>
             <w:tabs>
               <w:tab w:val="left" w:pos="720"/>
               <w:tab w:val="right" w:leader="dot" w:pos="8494"/>
@@ -1483,7 +1483,7 @@
           <w:hyperlink w:anchor="_Toc220412683" w:history="1">
             <w:r>
               <w:rPr>
-                <w:rStyle w:val="Hipervnculo"/>
+                <w:rStyle w:val="Hyperlink"/>
                 <w:rFonts w:ascii="Verdana" w:hAnsi="Verdana"/>
                 <w:noProof/>
               </w:rPr>
@@ -1498,7 +1498,7 @@
             </w:r>
             <w:r>
               <w:rPr>
-                <w:rStyle w:val="Hipervnculo"/>
+                <w:rStyle w:val="Hyperlink"/>
                 <w:rFonts w:ascii="Verdana" w:hAnsi="Verdana"/>
                 <w:noProof/>
               </w:rPr>
@@ -1563,7 +1563,7 @@
         </w:p>
         <w:p>
           <w:pPr>
-            <w:pStyle w:val="TDC1"/>
+            <w:pStyle w:val="TOC1"/>
             <w:tabs>
               <w:tab w:val="left" w:pos="480"/>
               <w:tab w:val="right" w:leader="dot" w:pos="8494"/>
@@ -1576,7 +1576,7 @@
           <w:hyperlink w:anchor="_Toc220412684" w:history="1">
             <w:r>
               <w:rPr>
-                <w:rStyle w:val="Hipervnculo"/>
+                <w:rStyle w:val="Hyperlink"/>
                 <w:rFonts w:ascii="Verdana" w:hAnsi="Verdana"/>
                 <w:noProof/>
               </w:rPr>
@@ -1591,7 +1591,7 @@
             </w:r>
             <w:r>
               <w:rPr>
-                <w:rStyle w:val="Hipervnculo"/>
+                <w:rStyle w:val="Hyperlink"/>
                 <w:rFonts w:ascii="Verdana" w:hAnsi="Verdana"/>
                 <w:noProof/>
               </w:rPr>
@@ -1656,7 +1656,7 @@
         </w:p>
         <w:p>
           <w:pPr>
-            <w:pStyle w:val="TDC1"/>
+            <w:pStyle w:val="TOC1"/>
             <w:tabs>
               <w:tab w:val="right" w:leader="dot" w:pos="8494"/>
             </w:tabs>
@@ -1668,7 +1668,7 @@
           <w:hyperlink w:anchor="_Toc220412685" w:history="1">
             <w:r>
               <w:rPr>
-                <w:rStyle w:val="Hipervnculo"/>
+                <w:rStyle w:val="Hyperlink"/>
                 <w:rFonts w:ascii="Verdana" w:hAnsi="Verdana"/>
                 <w:noProof/>
               </w:rPr>
@@ -1923,12 +1923,6 @@
     </w:p>
     <w:p>
       <w:pPr>
-        <w:pStyle w:val="Textomemoria"/>
-        <w:jc w:val="both"/>
-      </w:pPr>
-    </w:p>
-    <w:p>
-      <w:pPr>
         <w:pStyle w:val="Estilo1"/>
         <w:numPr>
           <w:ilvl w:val="0"/>
@@ -1940,6 +1934,7 @@
         </w:rPr>
       </w:pPr>
       <w:bookmarkStart w:id="2" w:name="_Toc220412679"/>
+      <w:proofErr w:type="spellStart"/>
       <w:r>
         <w:rPr>
           <w:color w:val="C00000"/>
@@ -1947,15 +1942,42 @@
         <w:t>Abstract</w:t>
       </w:r>
       <w:bookmarkEnd w:id="2"/>
-    </w:p>
-    <w:p>
-      <w:pPr>
-        <w:pStyle w:val="Estilo1"/>
-        <w:jc w:val="both"/>
-        <w:rPr>
-          <w:color w:val="C00000"/>
-        </w:rPr>
-      </w:pPr>
+      <w:proofErr w:type="spellEnd"/>
+    </w:p>
+    <w:p>
+      <w:pPr>
+        <w:pStyle w:val="Textomemoria"/>
+        <w:jc w:val="both"/>
+        <w:rPr>
+          <w:lang w:val="en-US"/>
+        </w:rPr>
+      </w:pPr>
+      <w:r>
+        <w:rPr>
+          <w:lang w:val="en-US"/>
+        </w:rPr>
+        <w:t xml:space="preserve">This project focuses on the development of a mobile application for managing repairs in a technical service </w:t>
+      </w:r>
+      <w:proofErr w:type="gramStart"/>
+      <w:r>
+        <w:rPr>
+          <w:lang w:val="en-US"/>
+        </w:rPr>
+        <w:t>specialized</w:t>
+      </w:r>
+      <w:proofErr w:type="gramEnd"/>
+      <w:r>
+        <w:rPr>
+          <w:lang w:val="en-US"/>
+        </w:rPr>
+        <w:t xml:space="preserve"> in laptops and mobile phones. The application allows both users and the technical service to monitor the status of repairs and devices</w:t>
+      </w:r>
+      <w:r>
+        <w:rPr>
+          <w:lang w:val="en-US"/>
+        </w:rPr>
+        <w:t>.</w:t>
+      </w:r>
     </w:p>
     <w:p>
       <w:pPr>
@@ -2091,17 +2113,25 @@
     </w:p>
     <w:p>
       <w:pPr>
-        <w:pStyle w:val="Prrafodelista"/>
+        <w:pStyle w:val="ListParagraph"/>
         <w:ind w:left="360"/>
         <w:jc w:val="both"/>
       </w:pPr>
       <w:r>
-        <w:t>Este proyecto versa sobre la creación de un aplicación móvil para gestionar las reparaciones de un servicio técnico especializado en reparaciones de portátiles y teléfonos.</w:t>
+        <w:t xml:space="preserve">Este proyecto versa sobre la creación de </w:t>
       </w:r>
-    </w:p>
-    <w:p>
-      <w:pPr>
-        <w:pStyle w:val="Prrafodelista"/>
+      <w:proofErr w:type="gramStart"/>
+      <w:r>
+        <w:t>un aplicación móvil</w:t>
+      </w:r>
+      <w:proofErr w:type="gramEnd"/>
+      <w:r>
+        <w:t xml:space="preserve"> para gestionar las reparaciones de un servicio técnico especializado en reparaciones de portátiles y teléfonos.</w:t>
+      </w:r>
+    </w:p>
+    <w:p>
+      <w:pPr>
+        <w:pStyle w:val="ListParagraph"/>
         <w:ind w:left="360"/>
         <w:jc w:val="both"/>
       </w:pPr>
@@ -2109,28 +2139,60 @@
         <w:t xml:space="preserve">Su elaboración surge de la necesidad de acercar la información en tiempo real al usuario, </w:t>
       </w:r>
       <w:r>
-        <w:t>aumentando la transparencia y el feedback que recibe, mejorando así la experiencia de usuario con respecto a un servicio técnico que no ofrezca esta alternativa.</w:t>
+        <w:t xml:space="preserve">aumentando la transparencia y el </w:t>
       </w:r>
-    </w:p>
-    <w:p>
-      <w:pPr>
-        <w:pStyle w:val="Prrafodelista"/>
+      <w:proofErr w:type="spellStart"/>
+      <w:r>
+        <w:t>feedback</w:t>
+      </w:r>
+      <w:proofErr w:type="spellEnd"/>
+      <w:r>
+        <w:t xml:space="preserve"> que recibe, mejorando así la experiencia de usuario con respecto a un servicio técnico que no ofrezca esta alternativa.</w:t>
+      </w:r>
+    </w:p>
+    <w:p>
+      <w:pPr>
+        <w:pStyle w:val="ListParagraph"/>
         <w:ind w:left="360"/>
         <w:jc w:val="both"/>
       </w:pPr>
       <w:r>
-        <w:t>Creemos que esta aplicación animaría a los usuarios a decantarse por la reparaciones de sus dispositivos al hacer más accesible la información de precios, servicios.. y aumentar la transparencia del proceso. Al eliminar una queja clásica hacia el sector como es la falta de claridad</w:t>
+        <w:t xml:space="preserve">Creemos que esta aplicación animaría a los usuarios a decantarse por </w:t>
+      </w:r>
+      <w:proofErr w:type="gramStart"/>
+      <w:r>
+        <w:t>la reparaciones</w:t>
+      </w:r>
+      <w:proofErr w:type="gramEnd"/>
+      <w:r>
+        <w:t xml:space="preserve"> de sus dispositivos al hacer más accesible la información de precios, </w:t>
+      </w:r>
+      <w:proofErr w:type="gramStart"/>
+      <w:r>
+        <w:t>servicios..</w:t>
+      </w:r>
+      <w:proofErr w:type="gramEnd"/>
+      <w:r>
+        <w:t xml:space="preserve"> y aumentar la transparencia del proceso. Al eliminar una queja clásica hacia el sector como es la falta de claridad</w:t>
       </w:r>
       <w:r>
         <w:t xml:space="preserve"> acerca de</w:t>
       </w:r>
       <w:r>
-        <w:t xml:space="preserve"> las acciones que los técnicos realizan sobre los dispositivos y el desglose de precios. Además los autores del siguiente trabajo pensamos que la reparación y reutilización de elementos es una pieza fundamental para afrontar problemas como el cambio climático o la escasez de piezas, al igual que el incremento de precios de la las mismas.</w:t>
+        <w:t xml:space="preserve"> las acciones que los técnicos realizan sobre los dispositivos y el desglose de precios. </w:t>
       </w:r>
-    </w:p>
-    <w:p>
-      <w:pPr>
-        <w:pStyle w:val="Prrafodelista"/>
+      <w:proofErr w:type="gramStart"/>
+      <w:r>
+        <w:t>Además</w:t>
+      </w:r>
+      <w:proofErr w:type="gramEnd"/>
+      <w:r>
+        <w:t xml:space="preserve"> los autores del siguiente trabajo pensamos que la reparación y reutilización de elementos es una pieza fundamental para afrontar problemas como el cambio climático o la escasez de piezas, al igual que el incremento de precios de la las mismas.</w:t>
+      </w:r>
+    </w:p>
+    <w:p>
+      <w:pPr>
+        <w:pStyle w:val="ListParagraph"/>
         <w:ind w:left="360"/>
         <w:jc w:val="both"/>
       </w:pPr>
@@ -2149,7 +2211,7 @@
     </w:p>
     <w:p>
       <w:pPr>
-        <w:pStyle w:val="Prrafodelista"/>
+        <w:pStyle w:val="ListParagraph"/>
         <w:ind w:left="360"/>
         <w:jc w:val="both"/>
       </w:pPr>
@@ -2427,7 +2489,7 @@
 <w:ftr xmlns:wpc="http://schemas.microsoft.com/office/word/2010/wordprocessingCanvas" xmlns:cx="http://schemas.microsoft.com/office/drawing/2014/chartex" xmlns:cx1="http://schemas.microsoft.com/office/drawing/2015/9/8/chartex" xmlns:cx2="http://schemas.microsoft.com/office/drawing/2015/10/21/chartex" xmlns:cx3="http://schemas.microsoft.com/office/drawing/2016/5/9/chartex" xmlns:cx4="http://schemas.microsoft.com/office/drawing/2016/5/10/chartex" xmlns:cx5="http://schemas.microsoft.com/office/drawing/2016/5/11/chartex" xmlns:cx6="http://schemas.microsoft.com/office/drawing/2016/5/12/chartex" xmlns:cx7="http://schemas.microsoft.com/office/drawing/2016/5/13/chartex" xmlns:cx8="http://schemas.microsoft.com/office/drawing/2016/5/14/chartex" xmlns:mc="http://schemas.openxmlformats.org/markup-compatibility/2006" xmlns:aink="http://schemas.microsoft.com/office/drawing/2016/ink" xmlns:am3d="http://schemas.microsoft.com/office/drawing/2017/model3d" xmlns:o="urn:schemas-microsoft-com:office:office" xmlns:oel="http://schemas.microsoft.com/office/2019/extlst" xmlns:r="http://schemas.openxmlformats.org/officeDocument/2006/relationships" xmlns:m="http://schemas.openxmlformats.org/officeDocument/2006/math" xmlns:v="urn:schemas-microsoft-com:vml" xmlns:wp14="http://schemas.microsoft.com/office/word/2010/wordprocessingDrawing" xmlns:wp="http://schemas.openxmlformats.org/drawingml/2006/wordprocessingDrawing" xmlns:w10="urn:schemas-microsoft-com:office:word" xmlns:w="http://schemas.openxmlformats.org/wordprocessingml/2006/main" xmlns:w14="http://schemas.microsoft.com/office/word/2010/wordml" xmlns:w15="http://schemas.microsoft.com/office/word/2012/wordml" xmlns:w16cex="http://schemas.microsoft.com/office/word/2018/wordml/cex" xmlns:w16cid="http://schemas.microsoft.com/office/word/2016/wordml/cid" xmlns:w16="http://schemas.microsoft.com/office/word/2018/wordml" xmlns:w16du="http://schemas.microsoft.com/office/word/2023/wordml/word16du" xmlns:w16sdtdh="http://schemas.microsoft.com/office/word/2020/wordml/sdtdatahash" xmlns:w16sdtfl="http://schemas.microsoft.com/office/word/2024/wordml/sdtformatlock" xmlns:w16se="http://schemas.microsoft.com/office/word/2015/wordml/symex" xmlns:wpg="http://schemas.microsoft.com/office/word/2010/wordprocessingGroup" xmlns:wpi="http://schemas.microsoft.com/office/word/2010/wordprocessingInk" xmlns:wne="http://schemas.microsoft.com/office/word/2006/wordml" xmlns:wps="http://schemas.microsoft.com/office/word/2010/wordprocessingShape" mc:Ignorable="w14 w15 w16se w16cid w16 w16cex w16sdtdh w16sdtfl w16du wp14">
   <w:p>
     <w:pPr>
-      <w:pStyle w:val="Piedepgina"/>
+      <w:pStyle w:val="Footer"/>
     </w:pPr>
   </w:p>
 </w:ftr>
@@ -2437,7 +2499,7 @@
 <w:ftr xmlns:wpc="http://schemas.microsoft.com/office/word/2010/wordprocessingCanvas" xmlns:cx="http://schemas.microsoft.com/office/drawing/2014/chartex" xmlns:cx1="http://schemas.microsoft.com/office/drawing/2015/9/8/chartex" xmlns:cx2="http://schemas.microsoft.com/office/drawing/2015/10/21/chartex" xmlns:cx3="http://schemas.microsoft.com/office/drawing/2016/5/9/chartex" xmlns:cx4="http://schemas.microsoft.com/office/drawing/2016/5/10/chartex" xmlns:cx5="http://schemas.microsoft.com/office/drawing/2016/5/11/chartex" xmlns:cx6="http://schemas.microsoft.com/office/drawing/2016/5/12/chartex" xmlns:cx7="http://schemas.microsoft.com/office/drawing/2016/5/13/chartex" xmlns:cx8="http://schemas.microsoft.com/office/drawing/2016/5/14/chartex" xmlns:mc="http://schemas.openxmlformats.org/markup-compatibility/2006" xmlns:aink="http://schemas.microsoft.com/office/drawing/2016/ink" xmlns:am3d="http://schemas.microsoft.com/office/drawing/2017/model3d" xmlns:o="urn:schemas-microsoft-com:office:office" xmlns:oel="http://schemas.microsoft.com/office/2019/extlst" xmlns:r="http://schemas.openxmlformats.org/officeDocument/2006/relationships" xmlns:m="http://schemas.openxmlformats.org/officeDocument/2006/math" xmlns:v="urn:schemas-microsoft-com:vml" xmlns:wp14="http://schemas.microsoft.com/office/word/2010/wordprocessingDrawing" xmlns:wp="http://schemas.openxmlformats.org/drawingml/2006/wordprocessingDrawing" xmlns:w10="urn:schemas-microsoft-com:office:word" xmlns:w="http://schemas.openxmlformats.org/wordprocessingml/2006/main" xmlns:w14="http://schemas.microsoft.com/office/word/2010/wordml" xmlns:w15="http://schemas.microsoft.com/office/word/2012/wordml" xmlns:w16cex="http://schemas.microsoft.com/office/word/2018/wordml/cex" xmlns:w16cid="http://schemas.microsoft.com/office/word/2016/wordml/cid" xmlns:w16="http://schemas.microsoft.com/office/word/2018/wordml" xmlns:w16du="http://schemas.microsoft.com/office/word/2023/wordml/word16du" xmlns:w16sdtdh="http://schemas.microsoft.com/office/word/2020/wordml/sdtdatahash" xmlns:w16sdtfl="http://schemas.microsoft.com/office/word/2024/wordml/sdtformatlock" xmlns:w16se="http://schemas.microsoft.com/office/word/2015/wordml/symex" xmlns:wpg="http://schemas.microsoft.com/office/word/2010/wordprocessingGroup" xmlns:wpi="http://schemas.microsoft.com/office/word/2010/wordprocessingInk" xmlns:wne="http://schemas.microsoft.com/office/word/2006/wordml" xmlns:wps="http://schemas.microsoft.com/office/word/2010/wordprocessingShape" mc:Ignorable="w14 w15 w16se w16cid w16 w16cex w16sdtdh w16sdtfl w16du wp14">
   <w:p>
     <w:pPr>
-      <w:pStyle w:val="Piedepgina"/>
+      <w:pStyle w:val="Footer"/>
     </w:pPr>
   </w:p>
 </w:ftr>
@@ -2447,7 +2509,7 @@
 <w:ftr xmlns:wpc="http://schemas.microsoft.com/office/word/2010/wordprocessingCanvas" xmlns:cx="http://schemas.microsoft.com/office/drawing/2014/chartex" xmlns:cx1="http://schemas.microsoft.com/office/drawing/2015/9/8/chartex" xmlns:cx2="http://schemas.microsoft.com/office/drawing/2015/10/21/chartex" xmlns:cx3="http://schemas.microsoft.com/office/drawing/2016/5/9/chartex" xmlns:cx4="http://schemas.microsoft.com/office/drawing/2016/5/10/chartex" xmlns:cx5="http://schemas.microsoft.com/office/drawing/2016/5/11/chartex" xmlns:cx6="http://schemas.microsoft.com/office/drawing/2016/5/12/chartex" xmlns:cx7="http://schemas.microsoft.com/office/drawing/2016/5/13/chartex" xmlns:cx8="http://schemas.microsoft.com/office/drawing/2016/5/14/chartex" xmlns:mc="http://schemas.openxmlformats.org/markup-compatibility/2006" xmlns:aink="http://schemas.microsoft.com/office/drawing/2016/ink" xmlns:am3d="http://schemas.microsoft.com/office/drawing/2017/model3d" xmlns:o="urn:schemas-microsoft-com:office:office" xmlns:oel="http://schemas.microsoft.com/office/2019/extlst" xmlns:r="http://schemas.openxmlformats.org/officeDocument/2006/relationships" xmlns:m="http://schemas.openxmlformats.org/officeDocument/2006/math" xmlns:v="urn:schemas-microsoft-com:vml" xmlns:wp14="http://schemas.microsoft.com/office/word/2010/wordprocessingDrawing" xmlns:wp="http://schemas.openxmlformats.org/drawingml/2006/wordprocessingDrawing" xmlns:w10="urn:schemas-microsoft-com:office:word" xmlns:w="http://schemas.openxmlformats.org/wordprocessingml/2006/main" xmlns:w14="http://schemas.microsoft.com/office/word/2010/wordml" xmlns:w15="http://schemas.microsoft.com/office/word/2012/wordml" xmlns:w16cex="http://schemas.microsoft.com/office/word/2018/wordml/cex" xmlns:w16cid="http://schemas.microsoft.com/office/word/2016/wordml/cid" xmlns:w16="http://schemas.microsoft.com/office/word/2018/wordml" xmlns:w16du="http://schemas.microsoft.com/office/word/2023/wordml/word16du" xmlns:w16sdtdh="http://schemas.microsoft.com/office/word/2020/wordml/sdtdatahash" xmlns:w16sdtfl="http://schemas.microsoft.com/office/word/2024/wordml/sdtformatlock" xmlns:w16se="http://schemas.microsoft.com/office/word/2015/wordml/symex" xmlns:wpg="http://schemas.microsoft.com/office/word/2010/wordprocessingGroup" xmlns:wpi="http://schemas.microsoft.com/office/word/2010/wordprocessingInk" xmlns:wne="http://schemas.microsoft.com/office/word/2006/wordml" xmlns:wps="http://schemas.microsoft.com/office/word/2010/wordprocessingShape" mc:Ignorable="w14 w15 w16se w16cid w16 w16cex w16sdtdh w16sdtfl w16du wp14">
   <w:p>
     <w:pPr>
-      <w:pStyle w:val="Piedepgina"/>
+      <w:pStyle w:val="Footer"/>
     </w:pPr>
   </w:p>
 </w:ftr>
@@ -2466,7 +2528,7 @@
     <w:sdtContent>
       <w:p>
         <w:pPr>
-          <w:pStyle w:val="Piedepgina"/>
+          <w:pStyle w:val="Footer"/>
           <w:jc w:val="center"/>
         </w:pPr>
         <w:r>
@@ -2489,7 +2551,7 @@
   </w:sdt>
   <w:p>
     <w:pPr>
-      <w:pStyle w:val="Piedepgina"/>
+      <w:pStyle w:val="Footer"/>
     </w:pPr>
   </w:p>
 </w:ftr>
@@ -2524,7 +2586,7 @@
 <w:hdr xmlns:wpc="http://schemas.microsoft.com/office/word/2010/wordprocessingCanvas" xmlns:cx="http://schemas.microsoft.com/office/drawing/2014/chartex" xmlns:cx1="http://schemas.microsoft.com/office/drawing/2015/9/8/chartex" xmlns:cx2="http://schemas.microsoft.com/office/drawing/2015/10/21/chartex" xmlns:cx3="http://schemas.microsoft.com/office/drawing/2016/5/9/chartex" xmlns:cx4="http://schemas.microsoft.com/office/drawing/2016/5/10/chartex" xmlns:cx5="http://schemas.microsoft.com/office/drawing/2016/5/11/chartex" xmlns:cx6="http://schemas.microsoft.com/office/drawing/2016/5/12/chartex" xmlns:cx7="http://schemas.microsoft.com/office/drawing/2016/5/13/chartex" xmlns:cx8="http://schemas.microsoft.com/office/drawing/2016/5/14/chartex" xmlns:mc="http://schemas.openxmlformats.org/markup-compatibility/2006" xmlns:aink="http://schemas.microsoft.com/office/drawing/2016/ink" xmlns:am3d="http://schemas.microsoft.com/office/drawing/2017/model3d" xmlns:o="urn:schemas-microsoft-com:office:office" xmlns:oel="http://schemas.microsoft.com/office/2019/extlst" xmlns:r="http://schemas.openxmlformats.org/officeDocument/2006/relationships" xmlns:m="http://schemas.openxmlformats.org/officeDocument/2006/math" xmlns:v="urn:schemas-microsoft-com:vml" xmlns:wp14="http://schemas.microsoft.com/office/word/2010/wordprocessingDrawing" xmlns:wp="http://schemas.openxmlformats.org/drawingml/2006/wordprocessingDrawing" xmlns:w10="urn:schemas-microsoft-com:office:word" xmlns:w="http://schemas.openxmlformats.org/wordprocessingml/2006/main" xmlns:w14="http://schemas.microsoft.com/office/word/2010/wordml" xmlns:w15="http://schemas.microsoft.com/office/word/2012/wordml" xmlns:w16cex="http://schemas.microsoft.com/office/word/2018/wordml/cex" xmlns:w16cid="http://schemas.microsoft.com/office/word/2016/wordml/cid" xmlns:w16="http://schemas.microsoft.com/office/word/2018/wordml" xmlns:w16du="http://schemas.microsoft.com/office/word/2023/wordml/word16du" xmlns:w16sdtdh="http://schemas.microsoft.com/office/word/2020/wordml/sdtdatahash" xmlns:w16sdtfl="http://schemas.microsoft.com/office/word/2024/wordml/sdtformatlock" xmlns:w16se="http://schemas.microsoft.com/office/word/2015/wordml/symex" xmlns:wpg="http://schemas.microsoft.com/office/word/2010/wordprocessingGroup" xmlns:wpi="http://schemas.microsoft.com/office/word/2010/wordprocessingInk" xmlns:wne="http://schemas.microsoft.com/office/word/2006/wordml" xmlns:wps="http://schemas.microsoft.com/office/word/2010/wordprocessingShape" mc:Ignorable="w14 w15 w16se w16cid w16 w16cex w16sdtdh w16sdtfl w16du wp14">
   <w:p>
     <w:pPr>
-      <w:pStyle w:val="Encabezado"/>
+      <w:pStyle w:val="Header"/>
     </w:pPr>
   </w:p>
 </w:hdr>
@@ -2534,7 +2596,7 @@
 <w:hdr xmlns:wpc="http://schemas.microsoft.com/office/word/2010/wordprocessingCanvas" xmlns:cx="http://schemas.microsoft.com/office/drawing/2014/chartex" xmlns:cx1="http://schemas.microsoft.com/office/drawing/2015/9/8/chartex" xmlns:cx2="http://schemas.microsoft.com/office/drawing/2015/10/21/chartex" xmlns:cx3="http://schemas.microsoft.com/office/drawing/2016/5/9/chartex" xmlns:cx4="http://schemas.microsoft.com/office/drawing/2016/5/10/chartex" xmlns:cx5="http://schemas.microsoft.com/office/drawing/2016/5/11/chartex" xmlns:cx6="http://schemas.microsoft.com/office/drawing/2016/5/12/chartex" xmlns:cx7="http://schemas.microsoft.com/office/drawing/2016/5/13/chartex" xmlns:cx8="http://schemas.microsoft.com/office/drawing/2016/5/14/chartex" xmlns:mc="http://schemas.openxmlformats.org/markup-compatibility/2006" xmlns:aink="http://schemas.microsoft.com/office/drawing/2016/ink" xmlns:am3d="http://schemas.microsoft.com/office/drawing/2017/model3d" xmlns:o="urn:schemas-microsoft-com:office:office" xmlns:oel="http://schemas.microsoft.com/office/2019/extlst" xmlns:r="http://schemas.openxmlformats.org/officeDocument/2006/relationships" xmlns:m="http://schemas.openxmlformats.org/officeDocument/2006/math" xmlns:v="urn:schemas-microsoft-com:vml" xmlns:wp14="http://schemas.microsoft.com/office/word/2010/wordprocessingDrawing" xmlns:wp="http://schemas.openxmlformats.org/drawingml/2006/wordprocessingDrawing" xmlns:w10="urn:schemas-microsoft-com:office:word" xmlns:w="http://schemas.openxmlformats.org/wordprocessingml/2006/main" xmlns:w14="http://schemas.microsoft.com/office/word/2010/wordml" xmlns:w15="http://schemas.microsoft.com/office/word/2012/wordml" xmlns:w16cex="http://schemas.microsoft.com/office/word/2018/wordml/cex" xmlns:w16cid="http://schemas.microsoft.com/office/word/2016/wordml/cid" xmlns:w16="http://schemas.microsoft.com/office/word/2018/wordml" xmlns:w16du="http://schemas.microsoft.com/office/word/2023/wordml/word16du" xmlns:w16sdtdh="http://schemas.microsoft.com/office/word/2020/wordml/sdtdatahash" xmlns:w16sdtfl="http://schemas.microsoft.com/office/word/2024/wordml/sdtformatlock" xmlns:w16se="http://schemas.microsoft.com/office/word/2015/wordml/symex" xmlns:wpg="http://schemas.microsoft.com/office/word/2010/wordprocessingGroup" xmlns:wpi="http://schemas.microsoft.com/office/word/2010/wordprocessingInk" xmlns:wne="http://schemas.microsoft.com/office/word/2006/wordml" xmlns:wps="http://schemas.microsoft.com/office/word/2010/wordprocessingShape" mc:Ignorable="w14 w15 w16se w16cid w16 w16cex w16sdtdh w16sdtfl w16du wp14">
   <w:p>
     <w:pPr>
-      <w:pStyle w:val="Encabezado"/>
+      <w:pStyle w:val="Header"/>
     </w:pPr>
   </w:p>
 </w:hdr>
@@ -2544,7 +2606,7 @@
 <w:hdr xmlns:wpc="http://schemas.microsoft.com/office/word/2010/wordprocessingCanvas" xmlns:cx="http://schemas.microsoft.com/office/drawing/2014/chartex" xmlns:cx1="http://schemas.microsoft.com/office/drawing/2015/9/8/chartex" xmlns:cx2="http://schemas.microsoft.com/office/drawing/2015/10/21/chartex" xmlns:cx3="http://schemas.microsoft.com/office/drawing/2016/5/9/chartex" xmlns:cx4="http://schemas.microsoft.com/office/drawing/2016/5/10/chartex" xmlns:cx5="http://schemas.microsoft.com/office/drawing/2016/5/11/chartex" xmlns:cx6="http://schemas.microsoft.com/office/drawing/2016/5/12/chartex" xmlns:cx7="http://schemas.microsoft.com/office/drawing/2016/5/13/chartex" xmlns:cx8="http://schemas.microsoft.com/office/drawing/2016/5/14/chartex" xmlns:mc="http://schemas.openxmlformats.org/markup-compatibility/2006" xmlns:aink="http://schemas.microsoft.com/office/drawing/2016/ink" xmlns:am3d="http://schemas.microsoft.com/office/drawing/2017/model3d" xmlns:o="urn:schemas-microsoft-com:office:office" xmlns:oel="http://schemas.microsoft.com/office/2019/extlst" xmlns:r="http://schemas.openxmlformats.org/officeDocument/2006/relationships" xmlns:m="http://schemas.openxmlformats.org/officeDocument/2006/math" xmlns:v="urn:schemas-microsoft-com:vml" xmlns:wp14="http://schemas.microsoft.com/office/word/2010/wordprocessingDrawing" xmlns:wp="http://schemas.openxmlformats.org/drawingml/2006/wordprocessingDrawing" xmlns:w10="urn:schemas-microsoft-com:office:word" xmlns:w="http://schemas.openxmlformats.org/wordprocessingml/2006/main" xmlns:w14="http://schemas.microsoft.com/office/word/2010/wordml" xmlns:w15="http://schemas.microsoft.com/office/word/2012/wordml" xmlns:w16cex="http://schemas.microsoft.com/office/word/2018/wordml/cex" xmlns:w16cid="http://schemas.microsoft.com/office/word/2016/wordml/cid" xmlns:w16="http://schemas.microsoft.com/office/word/2018/wordml" xmlns:w16du="http://schemas.microsoft.com/office/word/2023/wordml/word16du" xmlns:w16sdtdh="http://schemas.microsoft.com/office/word/2020/wordml/sdtdatahash" xmlns:w16sdtfl="http://schemas.microsoft.com/office/word/2024/wordml/sdtformatlock" xmlns:w16se="http://schemas.microsoft.com/office/word/2015/wordml/symex" xmlns:wpg="http://schemas.microsoft.com/office/word/2010/wordprocessingGroup" xmlns:wpi="http://schemas.microsoft.com/office/word/2010/wordprocessingInk" xmlns:wne="http://schemas.microsoft.com/office/word/2006/wordml" xmlns:wps="http://schemas.microsoft.com/office/word/2010/wordprocessingShape" mc:Ignorable="w14 w15 w16se w16cid w16 w16cex w16sdtdh w16sdtfl w16du wp14">
   <w:p>
     <w:pPr>
-      <w:pStyle w:val="Encabezado"/>
+      <w:pStyle w:val="Header"/>
     </w:pPr>
   </w:p>
 </w:hdr>
@@ -3587,11 +3649,11 @@
     <w:name w:val="Normal"/>
     <w:qFormat/>
   </w:style>
-  <w:style w:type="paragraph" w:styleId="Ttulo1">
+  <w:style w:type="paragraph" w:styleId="Heading1">
     <w:name w:val="heading 1"/>
     <w:basedOn w:val="Normal"/>
     <w:next w:val="Normal"/>
-    <w:link w:val="Ttulo1Car"/>
+    <w:link w:val="Heading1Char"/>
     <w:uiPriority w:val="9"/>
     <w:qFormat/>
     <w:rsid w:val="00014B39"/>
@@ -3608,13 +3670,12 @@
       <w:szCs w:val="32"/>
     </w:rPr>
   </w:style>
-  <w:style w:type="character" w:default="1" w:styleId="Fuentedeprrafopredeter">
+  <w:style w:type="character" w:default="1" w:styleId="DefaultParagraphFont">
     <w:name w:val="Default Paragraph Font"/>
     <w:uiPriority w:val="1"/>
-    <w:semiHidden/>
     <w:unhideWhenUsed/>
   </w:style>
-  <w:style w:type="table" w:default="1" w:styleId="Tablanormal">
+  <w:style w:type="table" w:default="1" w:styleId="TableNormal">
     <w:name w:val="Normal Table"/>
     <w:uiPriority w:val="99"/>
     <w:semiHidden/>
@@ -3629,16 +3690,16 @@
       </w:tblCellMar>
     </w:tblPr>
   </w:style>
-  <w:style w:type="numbering" w:default="1" w:styleId="Sinlista">
+  <w:style w:type="numbering" w:default="1" w:styleId="NoList">
     <w:name w:val="No List"/>
     <w:uiPriority w:val="99"/>
     <w:semiHidden/>
     <w:unhideWhenUsed/>
   </w:style>
-  <w:style w:type="character" w:customStyle="1" w:styleId="Ttulo1Car">
-    <w:name w:val="Título 1 Car"/>
-    <w:basedOn w:val="Fuentedeprrafopredeter"/>
-    <w:link w:val="Ttulo1"/>
+  <w:style w:type="character" w:customStyle="1" w:styleId="Heading1Char">
+    <w:name w:val="Heading 1 Char"/>
+    <w:basedOn w:val="DefaultParagraphFont"/>
+    <w:link w:val="Heading1"/>
     <w:uiPriority w:val="9"/>
     <w:rsid w:val="00014B39"/>
     <w:rPr>
@@ -3650,7 +3711,7 @@
   </w:style>
   <w:style w:type="paragraph" w:customStyle="1" w:styleId="Estilo1">
     <w:name w:val="Estilo1"/>
-    <w:basedOn w:val="Ttulo1"/>
+    <w:basedOn w:val="Heading1"/>
     <w:link w:val="Estilo1Car"/>
     <w:qFormat/>
     <w:rsid w:val="00014B39"/>
@@ -3660,7 +3721,7 @@
   </w:style>
   <w:style w:type="character" w:customStyle="1" w:styleId="Estilo1Car">
     <w:name w:val="Estilo1 Car"/>
-    <w:basedOn w:val="Ttulo1Car"/>
+    <w:basedOn w:val="Heading1Char"/>
     <w:link w:val="Estilo1"/>
     <w:rsid w:val="00014B39"/>
     <w:rPr>
@@ -3670,7 +3731,7 @@
       <w:szCs w:val="32"/>
     </w:rPr>
   </w:style>
-  <w:style w:type="paragraph" w:styleId="Prrafodelista">
+  <w:style w:type="paragraph" w:styleId="ListParagraph">
     <w:name w:val="List Paragraph"/>
     <w:basedOn w:val="Normal"/>
     <w:uiPriority w:val="34"/>
@@ -3693,17 +3754,17 @@
   </w:style>
   <w:style w:type="character" w:customStyle="1" w:styleId="TextomemoriaCar">
     <w:name w:val="Texto memoria Car"/>
-    <w:basedOn w:val="Fuentedeprrafopredeter"/>
+    <w:basedOn w:val="DefaultParagraphFont"/>
     <w:link w:val="Textomemoria"/>
     <w:rsid w:val="00310023"/>
     <w:rPr>
       <w:rFonts w:ascii="Verdana" w:hAnsi="Verdana"/>
     </w:rPr>
   </w:style>
-  <w:style w:type="paragraph" w:styleId="Encabezado">
+  <w:style w:type="paragraph" w:styleId="Header">
     <w:name w:val="header"/>
     <w:basedOn w:val="Normal"/>
-    <w:link w:val="EncabezadoCar"/>
+    <w:link w:val="HeaderChar"/>
     <w:uiPriority w:val="99"/>
     <w:unhideWhenUsed/>
     <w:rsid w:val="00B13784"/>
@@ -3715,17 +3776,17 @@
       <w:spacing w:after="0" w:line="240" w:lineRule="auto"/>
     </w:pPr>
   </w:style>
-  <w:style w:type="character" w:customStyle="1" w:styleId="EncabezadoCar">
-    <w:name w:val="Encabezado Car"/>
-    <w:basedOn w:val="Fuentedeprrafopredeter"/>
-    <w:link w:val="Encabezado"/>
+  <w:style w:type="character" w:customStyle="1" w:styleId="HeaderChar">
+    <w:name w:val="Header Char"/>
+    <w:basedOn w:val="DefaultParagraphFont"/>
+    <w:link w:val="Header"/>
     <w:uiPriority w:val="99"/>
     <w:rsid w:val="00B13784"/>
   </w:style>
-  <w:style w:type="paragraph" w:styleId="Piedepgina">
+  <w:style w:type="paragraph" w:styleId="Footer">
     <w:name w:val="footer"/>
     <w:basedOn w:val="Normal"/>
-    <w:link w:val="PiedepginaCar"/>
+    <w:link w:val="FooterChar"/>
     <w:uiPriority w:val="99"/>
     <w:unhideWhenUsed/>
     <w:rsid w:val="00B13784"/>
@@ -3737,16 +3798,16 @@
       <w:spacing w:after="0" w:line="240" w:lineRule="auto"/>
     </w:pPr>
   </w:style>
-  <w:style w:type="character" w:customStyle="1" w:styleId="PiedepginaCar">
-    <w:name w:val="Pie de página Car"/>
-    <w:basedOn w:val="Fuentedeprrafopredeter"/>
-    <w:link w:val="Piedepgina"/>
+  <w:style w:type="character" w:customStyle="1" w:styleId="FooterChar">
+    <w:name w:val="Footer Char"/>
+    <w:basedOn w:val="DefaultParagraphFont"/>
+    <w:link w:val="Footer"/>
     <w:uiPriority w:val="99"/>
     <w:rsid w:val="00B13784"/>
   </w:style>
-  <w:style w:type="paragraph" w:styleId="TtuloTDC">
+  <w:style w:type="paragraph" w:styleId="TOCHeading">
     <w:name w:val="TOC Heading"/>
-    <w:basedOn w:val="Ttulo1"/>
+    <w:basedOn w:val="Heading1"/>
     <w:next w:val="Normal"/>
     <w:uiPriority w:val="39"/>
     <w:unhideWhenUsed/>
@@ -3759,7 +3820,7 @@
       <w:lang w:eastAsia="es-ES"/>
     </w:rPr>
   </w:style>
-  <w:style w:type="paragraph" w:styleId="TDC1">
+  <w:style w:type="paragraph" w:styleId="TOC1">
     <w:name w:val="toc 1"/>
     <w:basedOn w:val="Normal"/>
     <w:next w:val="Normal"/>
@@ -3771,9 +3832,9 @@
       <w:spacing w:after="100"/>
     </w:pPr>
   </w:style>
-  <w:style w:type="character" w:styleId="Hipervnculo">
+  <w:style w:type="character" w:styleId="Hyperlink">
     <w:name w:val="Hyperlink"/>
-    <w:basedOn w:val="Fuentedeprrafopredeter"/>
+    <w:basedOn w:val="DefaultParagraphFont"/>
     <w:uiPriority w:val="99"/>
     <w:unhideWhenUsed/>
     <w:rsid w:val="00B13784"/>

</xml_diff>

<commit_message>
Guardo cambios locales (Memoria y diagramas)
</commit_message>
<xml_diff>
--- a/Memoria.docx
+++ b/Memoria.docx
@@ -243,7 +243,6 @@
                               </w:rPr>
                               <w:t xml:space="preserve">: </w:t>
                             </w:r>
-                            <w:proofErr w:type="spellStart"/>
                             <w:r>
                               <w:rPr>
                                 <w:rFonts w:ascii="Verdana" w:eastAsia="Calibri" w:hAnsi="Verdana" w:cs="Calibri"/>
@@ -251,7 +250,6 @@
                               </w:rPr>
                               <w:t>ClearRepair</w:t>
                             </w:r>
-                            <w:proofErr w:type="spellEnd"/>
                           </w:p>
                           <w:p>
                             <w:pPr>
@@ -589,7 +587,6 @@
                         </w:rPr>
                         <w:t xml:space="preserve">: </w:t>
                       </w:r>
-                      <w:proofErr w:type="spellStart"/>
                       <w:r>
                         <w:rPr>
                           <w:rFonts w:ascii="Verdana" w:eastAsia="Calibri" w:hAnsi="Verdana" w:cs="Calibri"/>
@@ -597,7 +594,6 @@
                         </w:rPr>
                         <w:t>ClearRepair</w:t>
                       </w:r>
-                      <w:proofErr w:type="spellEnd"/>
                     </w:p>
                     <w:p>
                       <w:pPr>
@@ -1113,54 +1109,6 @@
         <w:spacing w:after="0" w:line="360" w:lineRule="auto"/>
         <w:jc w:val="both"/>
       </w:pPr>
-      <w:r>
-        <w:t xml:space="preserve">La accesibilidad es importante </w:t>
-      </w:r>
-      <w:sdt>
-        <w:sdtPr>
-          <w:id w:val="-205874070"/>
-          <w:citation/>
-        </w:sdtPr>
-        <w:sdtContent>
-          <w:r>
-            <w:fldChar w:fldCharType="begin"/>
-          </w:r>
-          <w:r>
-            <w:instrText xml:space="preserve"> CITATION Jac25 \l 3082 </w:instrText>
-          </w:r>
-          <w:r>
-            <w:fldChar w:fldCharType="separate"/>
-          </w:r>
-          <w:r>
-            <w:rPr>
-              <w:noProof/>
-            </w:rPr>
-            <w:t>(Aragunde, 2025)</w:t>
-          </w:r>
-          <w:r>
-            <w:fldChar w:fldCharType="end"/>
-          </w:r>
-        </w:sdtContent>
-      </w:sdt>
-      <w:r>
-        <w:t xml:space="preserve"> </w:t>
-      </w:r>
-      <w:r>
-        <w:t xml:space="preserve">- </w:t>
-      </w:r>
-      <w:r>
-        <w:rPr>
-          <w:b/>
-          <w:bCs/>
-        </w:rPr>
-        <w:t>¿?</w:t>
-      </w:r>
-    </w:p>
-    <w:p>
-      <w:pPr>
-        <w:spacing w:after="0" w:line="360" w:lineRule="auto"/>
-        <w:jc w:val="both"/>
-      </w:pPr>
     </w:p>
     <w:p>
       <w:pPr>
@@ -1293,7 +1241,7 @@
       <w:sdtContent>
         <w:p>
           <w:pPr>
-            <w:pStyle w:val="TOCHeading"/>
+            <w:pStyle w:val="TtuloTDC"/>
             <w:spacing w:before="0" w:line="360" w:lineRule="auto"/>
             <w:rPr>
               <w:rFonts w:ascii="Verdana" w:hAnsi="Verdana"/>
@@ -1318,7 +1266,7 @@
         </w:p>
         <w:p>
           <w:pPr>
-            <w:pStyle w:val="TOC1"/>
+            <w:pStyle w:val="TDC1"/>
             <w:tabs>
               <w:tab w:val="left" w:pos="440"/>
               <w:tab w:val="right" w:leader="dot" w:pos="8494"/>
@@ -1351,10 +1299,10 @@
             </w:rPr>
             <w:fldChar w:fldCharType="separate"/>
           </w:r>
-          <w:hyperlink w:anchor="_Toc222860804" w:history="1">
-            <w:r>
-              <w:rPr>
-                <w:rStyle w:val="Hyperlink"/>
+          <w:hyperlink w:anchor="_Toc222910255" w:history="1">
+            <w:r>
+              <w:rPr>
+                <w:rStyle w:val="Hipervnculo"/>
                 <w:noProof/>
               </w:rPr>
               <w:t>1.</w:t>
@@ -1373,7 +1321,7 @@
             </w:r>
             <w:r>
               <w:rPr>
-                <w:rStyle w:val="Hyperlink"/>
+                <w:rStyle w:val="Hipervnculo"/>
                 <w:noProof/>
               </w:rPr>
               <w:t>Resumen</w:t>
@@ -1397,7 +1345,7 @@
                 <w:noProof/>
                 <w:webHidden/>
               </w:rPr>
-              <w:instrText xml:space="preserve"> PAGEREF _Toc222860804 \h </w:instrText>
+              <w:instrText xml:space="preserve"> PAGEREF _Toc222910255 \h </w:instrText>
             </w:r>
             <w:r>
               <w:rPr>
@@ -1430,7 +1378,7 @@
         </w:p>
         <w:p>
           <w:pPr>
-            <w:pStyle w:val="TOC1"/>
+            <w:pStyle w:val="TDC1"/>
             <w:tabs>
               <w:tab w:val="left" w:pos="440"/>
               <w:tab w:val="right" w:leader="dot" w:pos="8494"/>
@@ -1445,10 +1393,10 @@
               <w14:ligatures w14:val="standardContextual"/>
             </w:rPr>
           </w:pPr>
-          <w:hyperlink w:anchor="_Toc222860805" w:history="1">
-            <w:r>
-              <w:rPr>
-                <w:rStyle w:val="Hyperlink"/>
+          <w:hyperlink w:anchor="_Toc222910256" w:history="1">
+            <w:r>
+              <w:rPr>
+                <w:rStyle w:val="Hipervnculo"/>
                 <w:noProof/>
               </w:rPr>
               <w:t>2.</w:t>
@@ -1467,7 +1415,7 @@
             </w:r>
             <w:r>
               <w:rPr>
-                <w:rStyle w:val="Hyperlink"/>
+                <w:rStyle w:val="Hipervnculo"/>
                 <w:noProof/>
               </w:rPr>
               <w:t>Abstract</w:t>
@@ -1491,7 +1439,7 @@
                 <w:noProof/>
                 <w:webHidden/>
               </w:rPr>
-              <w:instrText xml:space="preserve"> PAGEREF _Toc222860805 \h </w:instrText>
+              <w:instrText xml:space="preserve"> PAGEREF _Toc222910256 \h </w:instrText>
             </w:r>
             <w:r>
               <w:rPr>
@@ -1524,7 +1472,7 @@
         </w:p>
         <w:p>
           <w:pPr>
-            <w:pStyle w:val="TOC1"/>
+            <w:pStyle w:val="TDC1"/>
             <w:tabs>
               <w:tab w:val="left" w:pos="440"/>
               <w:tab w:val="right" w:leader="dot" w:pos="8494"/>
@@ -1539,10 +1487,10 @@
               <w14:ligatures w14:val="standardContextual"/>
             </w:rPr>
           </w:pPr>
-          <w:hyperlink w:anchor="_Toc222860806" w:history="1">
-            <w:r>
-              <w:rPr>
-                <w:rStyle w:val="Hyperlink"/>
+          <w:hyperlink w:anchor="_Toc222910257" w:history="1">
+            <w:r>
+              <w:rPr>
+                <w:rStyle w:val="Hipervnculo"/>
                 <w:noProof/>
               </w:rPr>
               <w:t>3.</w:t>
@@ -1561,7 +1509,7 @@
             </w:r>
             <w:r>
               <w:rPr>
-                <w:rStyle w:val="Hyperlink"/>
+                <w:rStyle w:val="Hipervnculo"/>
                 <w:noProof/>
               </w:rPr>
               <w:t>Justificación del proyecto</w:t>
@@ -1585,7 +1533,7 @@
                 <w:noProof/>
                 <w:webHidden/>
               </w:rPr>
-              <w:instrText xml:space="preserve"> PAGEREF _Toc222860806 \h </w:instrText>
+              <w:instrText xml:space="preserve"> PAGEREF _Toc222910257 \h </w:instrText>
             </w:r>
             <w:r>
               <w:rPr>
@@ -1618,7 +1566,7 @@
         </w:p>
         <w:p>
           <w:pPr>
-            <w:pStyle w:val="TOC1"/>
+            <w:pStyle w:val="TDC1"/>
             <w:tabs>
               <w:tab w:val="left" w:pos="440"/>
               <w:tab w:val="right" w:leader="dot" w:pos="8494"/>
@@ -1633,10 +1581,10 @@
               <w14:ligatures w14:val="standardContextual"/>
             </w:rPr>
           </w:pPr>
-          <w:hyperlink w:anchor="_Toc222860807" w:history="1">
-            <w:r>
-              <w:rPr>
-                <w:rStyle w:val="Hyperlink"/>
+          <w:hyperlink w:anchor="_Toc222910258" w:history="1">
+            <w:r>
+              <w:rPr>
+                <w:rStyle w:val="Hipervnculo"/>
                 <w:noProof/>
               </w:rPr>
               <w:t>4.</w:t>
@@ -1655,7 +1603,7 @@
             </w:r>
             <w:r>
               <w:rPr>
-                <w:rStyle w:val="Hyperlink"/>
+                <w:rStyle w:val="Hipervnculo"/>
                 <w:noProof/>
               </w:rPr>
               <w:t>Objetivos</w:t>
@@ -1679,7 +1627,7 @@
                 <w:noProof/>
                 <w:webHidden/>
               </w:rPr>
-              <w:instrText xml:space="preserve"> PAGEREF _Toc222860807 \h </w:instrText>
+              <w:instrText xml:space="preserve"> PAGEREF _Toc222910258 \h </w:instrText>
             </w:r>
             <w:r>
               <w:rPr>
@@ -1712,8 +1660,9 @@
         </w:p>
         <w:p>
           <w:pPr>
-            <w:pStyle w:val="TOC2"/>
+            <w:pStyle w:val="TDC2"/>
             <w:tabs>
+              <w:tab w:val="left" w:pos="1200"/>
               <w:tab w:val="right" w:leader="dot" w:pos="8494"/>
             </w:tabs>
             <w:rPr>
@@ -1726,23 +1675,42 @@
               <w14:ligatures w14:val="standardContextual"/>
             </w:rPr>
           </w:pPr>
-          <w:hyperlink w:anchor="_Toc222860808" w:history="1">
-            <w:r>
-              <w:rPr>
-                <w:rStyle w:val="Hyperlink"/>
-                <w:noProof/>
-              </w:rPr>
-              <w:t>4.1 Objetivos generales</w:t>
-            </w:r>
-            <w:r>
-              <w:rPr>
-                <w:noProof/>
-                <w:webHidden/>
+          <w:hyperlink w:anchor="_Toc222910259" w:history="1">
+            <w:r>
+              <w:rPr>
+                <w:rStyle w:val="Hipervnculo"/>
+                <w:noProof/>
+              </w:rPr>
+              <w:t>4.1.</w:t>
+            </w:r>
+            <w:r>
+              <w:rPr>
+                <w:rFonts w:cstheme="minorBidi"/>
+                <w:noProof/>
+                <w:kern w:val="2"/>
+                <w:sz w:val="24"/>
+                <w:szCs w:val="24"/>
+                <w:lang w:val="es-ES" w:eastAsia="es-ES"/>
+                <w14:ligatures w14:val="standardContextual"/>
               </w:rPr>
               <w:tab/>
             </w:r>
             <w:r>
               <w:rPr>
+                <w:rStyle w:val="Hipervnculo"/>
+                <w:noProof/>
+              </w:rPr>
+              <w:t>Objetivos generales</w:t>
+            </w:r>
+            <w:r>
+              <w:rPr>
+                <w:noProof/>
+                <w:webHidden/>
+              </w:rPr>
+              <w:tab/>
+            </w:r>
+            <w:r>
+              <w:rPr>
                 <w:noProof/>
                 <w:webHidden/>
               </w:rPr>
@@ -1753,7 +1721,7 @@
                 <w:noProof/>
                 <w:webHidden/>
               </w:rPr>
-              <w:instrText xml:space="preserve"> PAGEREF _Toc222860808 \h </w:instrText>
+              <w:instrText xml:space="preserve"> PAGEREF _Toc222910259 \h </w:instrText>
             </w:r>
             <w:r>
               <w:rPr>
@@ -1786,8 +1754,9 @@
         </w:p>
         <w:p>
           <w:pPr>
-            <w:pStyle w:val="TOC2"/>
+            <w:pStyle w:val="TDC2"/>
             <w:tabs>
+              <w:tab w:val="left" w:pos="1200"/>
               <w:tab w:val="right" w:leader="dot" w:pos="8494"/>
             </w:tabs>
             <w:rPr>
@@ -1800,23 +1769,42 @@
               <w14:ligatures w14:val="standardContextual"/>
             </w:rPr>
           </w:pPr>
-          <w:hyperlink w:anchor="_Toc222860809" w:history="1">
-            <w:r>
-              <w:rPr>
-                <w:rStyle w:val="Hyperlink"/>
-                <w:noProof/>
-              </w:rPr>
-              <w:t>4.2 Objetivos específicos</w:t>
-            </w:r>
-            <w:r>
-              <w:rPr>
-                <w:noProof/>
-                <w:webHidden/>
+          <w:hyperlink w:anchor="_Toc222910260" w:history="1">
+            <w:r>
+              <w:rPr>
+                <w:rStyle w:val="Hipervnculo"/>
+                <w:noProof/>
+              </w:rPr>
+              <w:t>4.2.</w:t>
+            </w:r>
+            <w:r>
+              <w:rPr>
+                <w:rFonts w:cstheme="minorBidi"/>
+                <w:noProof/>
+                <w:kern w:val="2"/>
+                <w:sz w:val="24"/>
+                <w:szCs w:val="24"/>
+                <w:lang w:val="es-ES" w:eastAsia="es-ES"/>
+                <w14:ligatures w14:val="standardContextual"/>
               </w:rPr>
               <w:tab/>
             </w:r>
             <w:r>
               <w:rPr>
+                <w:rStyle w:val="Hipervnculo"/>
+                <w:noProof/>
+              </w:rPr>
+              <w:t>Objetivos específicos</w:t>
+            </w:r>
+            <w:r>
+              <w:rPr>
+                <w:noProof/>
+                <w:webHidden/>
+              </w:rPr>
+              <w:tab/>
+            </w:r>
+            <w:r>
+              <w:rPr>
                 <w:noProof/>
                 <w:webHidden/>
               </w:rPr>
@@ -1827,7 +1815,7 @@
                 <w:noProof/>
                 <w:webHidden/>
               </w:rPr>
-              <w:instrText xml:space="preserve"> PAGEREF _Toc222860809 \h </w:instrText>
+              <w:instrText xml:space="preserve"> PAGEREF _Toc222910260 \h </w:instrText>
             </w:r>
             <w:r>
               <w:rPr>
@@ -1860,7 +1848,7 @@
         </w:p>
         <w:p>
           <w:pPr>
-            <w:pStyle w:val="TOC1"/>
+            <w:pStyle w:val="TDC1"/>
             <w:tabs>
               <w:tab w:val="left" w:pos="440"/>
               <w:tab w:val="right" w:leader="dot" w:pos="8494"/>
@@ -1875,10 +1863,10 @@
               <w14:ligatures w14:val="standardContextual"/>
             </w:rPr>
           </w:pPr>
-          <w:hyperlink w:anchor="_Toc222860810" w:history="1">
-            <w:r>
-              <w:rPr>
-                <w:rStyle w:val="Hyperlink"/>
+          <w:hyperlink w:anchor="_Toc222910261" w:history="1">
+            <w:r>
+              <w:rPr>
+                <w:rStyle w:val="Hipervnculo"/>
                 <w:noProof/>
               </w:rPr>
               <w:t>5.</w:t>
@@ -1897,19 +1885,10 @@
             </w:r>
             <w:r>
               <w:rPr>
-                <w:rStyle w:val="Hyperlink"/>
-                <w:noProof/>
-              </w:rPr>
-              <w:t>Introducción (</w:t>
-            </w:r>
-            <w:r>
-              <w:rPr>
-                <w:rStyle w:val="Hyperlink"/>
-                <w:b/>
-                <w:bCs/>
-                <w:noProof/>
-              </w:rPr>
-              <w:t>la necesitamos??)</w:t>
+                <w:rStyle w:val="Hipervnculo"/>
+                <w:noProof/>
+              </w:rPr>
+              <w:t>Tecnologías empleadas</w:t>
             </w:r>
             <w:r>
               <w:rPr>
@@ -1930,7 +1909,7 @@
                 <w:noProof/>
                 <w:webHidden/>
               </w:rPr>
-              <w:instrText xml:space="preserve"> PAGEREF _Toc222860810 \h </w:instrText>
+              <w:instrText xml:space="preserve"> PAGEREF _Toc222910261 \h </w:instrText>
             </w:r>
             <w:r>
               <w:rPr>
@@ -1950,7 +1929,7 @@
                 <w:noProof/>
                 <w:webHidden/>
               </w:rPr>
-              <w:t>2</w:t>
+              <w:t>3</w:t>
             </w:r>
             <w:r>
               <w:rPr>
@@ -1963,7 +1942,195 @@
         </w:p>
         <w:p>
           <w:pPr>
-            <w:pStyle w:val="TOC1"/>
+            <w:pStyle w:val="TDC2"/>
+            <w:tabs>
+              <w:tab w:val="left" w:pos="1200"/>
+              <w:tab w:val="right" w:leader="dot" w:pos="8494"/>
+            </w:tabs>
+            <w:rPr>
+              <w:rFonts w:cstheme="minorBidi"/>
+              <w:noProof/>
+              <w:kern w:val="2"/>
+              <w:sz w:val="24"/>
+              <w:szCs w:val="24"/>
+              <w:lang w:val="es-ES" w:eastAsia="es-ES"/>
+              <w14:ligatures w14:val="standardContextual"/>
+            </w:rPr>
+          </w:pPr>
+          <w:hyperlink w:anchor="_Toc222910262" w:history="1">
+            <w:r>
+              <w:rPr>
+                <w:rStyle w:val="Hipervnculo"/>
+                <w:noProof/>
+              </w:rPr>
+              <w:t>5.1.</w:t>
+            </w:r>
+            <w:r>
+              <w:rPr>
+                <w:rFonts w:cstheme="minorBidi"/>
+                <w:noProof/>
+                <w:kern w:val="2"/>
+                <w:sz w:val="24"/>
+                <w:szCs w:val="24"/>
+                <w:lang w:val="es-ES" w:eastAsia="es-ES"/>
+                <w14:ligatures w14:val="standardContextual"/>
+              </w:rPr>
+              <w:tab/>
+            </w:r>
+            <w:r>
+              <w:rPr>
+                <w:rStyle w:val="Hipervnculo"/>
+                <w:noProof/>
+              </w:rPr>
+              <w:t>Tecnologías</w:t>
+            </w:r>
+            <w:r>
+              <w:rPr>
+                <w:noProof/>
+                <w:webHidden/>
+              </w:rPr>
+              <w:tab/>
+            </w:r>
+            <w:r>
+              <w:rPr>
+                <w:noProof/>
+                <w:webHidden/>
+              </w:rPr>
+              <w:fldChar w:fldCharType="begin"/>
+            </w:r>
+            <w:r>
+              <w:rPr>
+                <w:noProof/>
+                <w:webHidden/>
+              </w:rPr>
+              <w:instrText xml:space="preserve"> PAGEREF _Toc222910262 \h </w:instrText>
+            </w:r>
+            <w:r>
+              <w:rPr>
+                <w:noProof/>
+                <w:webHidden/>
+              </w:rPr>
+            </w:r>
+            <w:r>
+              <w:rPr>
+                <w:noProof/>
+                <w:webHidden/>
+              </w:rPr>
+              <w:fldChar w:fldCharType="separate"/>
+            </w:r>
+            <w:r>
+              <w:rPr>
+                <w:noProof/>
+                <w:webHidden/>
+              </w:rPr>
+              <w:t>3</w:t>
+            </w:r>
+            <w:r>
+              <w:rPr>
+                <w:noProof/>
+                <w:webHidden/>
+              </w:rPr>
+              <w:fldChar w:fldCharType="end"/>
+            </w:r>
+          </w:hyperlink>
+        </w:p>
+        <w:p>
+          <w:pPr>
+            <w:pStyle w:val="TDC2"/>
+            <w:tabs>
+              <w:tab w:val="left" w:pos="1200"/>
+              <w:tab w:val="right" w:leader="dot" w:pos="8494"/>
+            </w:tabs>
+            <w:rPr>
+              <w:rFonts w:cstheme="minorBidi"/>
+              <w:noProof/>
+              <w:kern w:val="2"/>
+              <w:sz w:val="24"/>
+              <w:szCs w:val="24"/>
+              <w:lang w:val="es-ES" w:eastAsia="es-ES"/>
+              <w14:ligatures w14:val="standardContextual"/>
+            </w:rPr>
+          </w:pPr>
+          <w:hyperlink w:anchor="_Toc222910263" w:history="1">
+            <w:r>
+              <w:rPr>
+                <w:rStyle w:val="Hipervnculo"/>
+                <w:noProof/>
+              </w:rPr>
+              <w:t>5.2.</w:t>
+            </w:r>
+            <w:r>
+              <w:rPr>
+                <w:rFonts w:cstheme="minorBidi"/>
+                <w:noProof/>
+                <w:kern w:val="2"/>
+                <w:sz w:val="24"/>
+                <w:szCs w:val="24"/>
+                <w:lang w:val="es-ES" w:eastAsia="es-ES"/>
+                <w14:ligatures w14:val="standardContextual"/>
+              </w:rPr>
+              <w:tab/>
+            </w:r>
+            <w:r>
+              <w:rPr>
+                <w:rStyle w:val="Hipervnculo"/>
+                <w:noProof/>
+              </w:rPr>
+              <w:t>Herramientas</w:t>
+            </w:r>
+            <w:r>
+              <w:rPr>
+                <w:noProof/>
+                <w:webHidden/>
+              </w:rPr>
+              <w:tab/>
+            </w:r>
+            <w:r>
+              <w:rPr>
+                <w:noProof/>
+                <w:webHidden/>
+              </w:rPr>
+              <w:fldChar w:fldCharType="begin"/>
+            </w:r>
+            <w:r>
+              <w:rPr>
+                <w:noProof/>
+                <w:webHidden/>
+              </w:rPr>
+              <w:instrText xml:space="preserve"> PAGEREF _Toc222910263 \h </w:instrText>
+            </w:r>
+            <w:r>
+              <w:rPr>
+                <w:noProof/>
+                <w:webHidden/>
+              </w:rPr>
+            </w:r>
+            <w:r>
+              <w:rPr>
+                <w:noProof/>
+                <w:webHidden/>
+              </w:rPr>
+              <w:fldChar w:fldCharType="separate"/>
+            </w:r>
+            <w:r>
+              <w:rPr>
+                <w:noProof/>
+                <w:webHidden/>
+              </w:rPr>
+              <w:t>3</w:t>
+            </w:r>
+            <w:r>
+              <w:rPr>
+                <w:noProof/>
+                <w:webHidden/>
+              </w:rPr>
+              <w:fldChar w:fldCharType="end"/>
+            </w:r>
+          </w:hyperlink>
+        </w:p>
+        <w:p>
+          <w:pPr>
+            <w:pStyle w:val="TDC1"/>
             <w:tabs>
               <w:tab w:val="left" w:pos="440"/>
               <w:tab w:val="right" w:leader="dot" w:pos="8494"/>
@@ -1978,10 +2145,10 @@
               <w14:ligatures w14:val="standardContextual"/>
             </w:rPr>
           </w:pPr>
-          <w:hyperlink w:anchor="_Toc222860811" w:history="1">
-            <w:r>
-              <w:rPr>
-                <w:rStyle w:val="Hyperlink"/>
+          <w:hyperlink w:anchor="_Toc222910264" w:history="1">
+            <w:r>
+              <w:rPr>
+                <w:rStyle w:val="Hipervnculo"/>
                 <w:noProof/>
               </w:rPr>
               <w:t>6.</w:t>
@@ -2000,10 +2167,10 @@
             </w:r>
             <w:r>
               <w:rPr>
-                <w:rStyle w:val="Hyperlink"/>
-                <w:noProof/>
-              </w:rPr>
-              <w:t>PRODUCTO MÍNIMO VIABLE</w:t>
+                <w:rStyle w:val="Hipervnculo"/>
+                <w:noProof/>
+              </w:rPr>
+              <w:t>Desarrollo</w:t>
             </w:r>
             <w:r>
               <w:rPr>
@@ -2024,7 +2191,7 @@
                 <w:noProof/>
                 <w:webHidden/>
               </w:rPr>
-              <w:instrText xml:space="preserve"> PAGEREF _Toc222860811 \h </w:instrText>
+              <w:instrText xml:space="preserve"> PAGEREF _Toc222910264 \h </w:instrText>
             </w:r>
             <w:r>
               <w:rPr>
@@ -2044,7 +2211,7 @@
                 <w:noProof/>
                 <w:webHidden/>
               </w:rPr>
-              <w:t>3</w:t>
+              <w:t>4</w:t>
             </w:r>
             <w:r>
               <w:rPr>
@@ -2057,102 +2224,9 @@
         </w:p>
         <w:p>
           <w:pPr>
-            <w:pStyle w:val="TOC1"/>
+            <w:pStyle w:val="TDC2"/>
             <w:tabs>
-              <w:tab w:val="left" w:pos="440"/>
-              <w:tab w:val="right" w:leader="dot" w:pos="8494"/>
-            </w:tabs>
-            <w:rPr>
-              <w:rFonts w:eastAsiaTheme="minorEastAsia"/>
-              <w:noProof/>
-              <w:kern w:val="2"/>
-              <w:sz w:val="24"/>
-              <w:szCs w:val="24"/>
-              <w:lang w:eastAsia="es-ES"/>
-              <w14:ligatures w14:val="standardContextual"/>
-            </w:rPr>
-          </w:pPr>
-          <w:hyperlink w:anchor="_Toc222860812" w:history="1">
-            <w:r>
-              <w:rPr>
-                <w:rStyle w:val="Hyperlink"/>
-                <w:noProof/>
-              </w:rPr>
-              <w:t>7.</w:t>
-            </w:r>
-            <w:r>
-              <w:rPr>
-                <w:rFonts w:eastAsiaTheme="minorEastAsia"/>
-                <w:noProof/>
-                <w:kern w:val="2"/>
-                <w:sz w:val="24"/>
-                <w:szCs w:val="24"/>
-                <w:lang w:eastAsia="es-ES"/>
-                <w14:ligatures w14:val="standardContextual"/>
-              </w:rPr>
-              <w:tab/>
-            </w:r>
-            <w:r>
-              <w:rPr>
-                <w:rStyle w:val="Hyperlink"/>
-                <w:noProof/>
-              </w:rPr>
-              <w:t>Tecnologías empleadas</w:t>
-            </w:r>
-            <w:r>
-              <w:rPr>
-                <w:noProof/>
-                <w:webHidden/>
-              </w:rPr>
-              <w:tab/>
-            </w:r>
-            <w:r>
-              <w:rPr>
-                <w:noProof/>
-                <w:webHidden/>
-              </w:rPr>
-              <w:fldChar w:fldCharType="begin"/>
-            </w:r>
-            <w:r>
-              <w:rPr>
-                <w:noProof/>
-                <w:webHidden/>
-              </w:rPr>
-              <w:instrText xml:space="preserve"> PAGEREF _Toc222860812 \h </w:instrText>
-            </w:r>
-            <w:r>
-              <w:rPr>
-                <w:noProof/>
-                <w:webHidden/>
-              </w:rPr>
-            </w:r>
-            <w:r>
-              <w:rPr>
-                <w:noProof/>
-                <w:webHidden/>
-              </w:rPr>
-              <w:fldChar w:fldCharType="separate"/>
-            </w:r>
-            <w:r>
-              <w:rPr>
-                <w:noProof/>
-                <w:webHidden/>
-              </w:rPr>
-              <w:t>4</w:t>
-            </w:r>
-            <w:r>
-              <w:rPr>
-                <w:noProof/>
-                <w:webHidden/>
-              </w:rPr>
-              <w:fldChar w:fldCharType="end"/>
-            </w:r>
-          </w:hyperlink>
-        </w:p>
-        <w:p>
-          <w:pPr>
-            <w:pStyle w:val="TOC2"/>
-            <w:tabs>
+              <w:tab w:val="left" w:pos="1200"/>
               <w:tab w:val="right" w:leader="dot" w:pos="8494"/>
             </w:tabs>
             <w:rPr>
@@ -2165,23 +2239,42 @@
               <w14:ligatures w14:val="standardContextual"/>
             </w:rPr>
           </w:pPr>
-          <w:hyperlink w:anchor="_Toc222860813" w:history="1">
-            <w:r>
-              <w:rPr>
-                <w:rStyle w:val="Hyperlink"/>
-                <w:noProof/>
-              </w:rPr>
-              <w:t>7.1 Tecnologías</w:t>
-            </w:r>
-            <w:r>
-              <w:rPr>
-                <w:noProof/>
-                <w:webHidden/>
+          <w:hyperlink w:anchor="_Toc222910265" w:history="1">
+            <w:r>
+              <w:rPr>
+                <w:rStyle w:val="Hipervnculo"/>
+                <w:noProof/>
+              </w:rPr>
+              <w:t>6.1.</w:t>
+            </w:r>
+            <w:r>
+              <w:rPr>
+                <w:rFonts w:cstheme="minorBidi"/>
+                <w:noProof/>
+                <w:kern w:val="2"/>
+                <w:sz w:val="24"/>
+                <w:szCs w:val="24"/>
+                <w:lang w:val="es-ES" w:eastAsia="es-ES"/>
+                <w14:ligatures w14:val="standardContextual"/>
               </w:rPr>
               <w:tab/>
             </w:r>
             <w:r>
               <w:rPr>
+                <w:rStyle w:val="Hipervnculo"/>
+                <w:noProof/>
+              </w:rPr>
+              <w:t>Enumeración de requisitos</w:t>
+            </w:r>
+            <w:r>
+              <w:rPr>
+                <w:noProof/>
+                <w:webHidden/>
+              </w:rPr>
+              <w:tab/>
+            </w:r>
+            <w:r>
+              <w:rPr>
                 <w:noProof/>
                 <w:webHidden/>
               </w:rPr>
@@ -2192,7 +2285,7 @@
                 <w:noProof/>
                 <w:webHidden/>
               </w:rPr>
-              <w:instrText xml:space="preserve"> PAGEREF _Toc222860813 \h </w:instrText>
+              <w:instrText xml:space="preserve"> PAGEREF _Toc222910265 \h </w:instrText>
             </w:r>
             <w:r>
               <w:rPr>
@@ -2225,8 +2318,9 @@
         </w:p>
         <w:p>
           <w:pPr>
-            <w:pStyle w:val="TOC2"/>
+            <w:pStyle w:val="TDC2"/>
             <w:tabs>
+              <w:tab w:val="left" w:pos="1200"/>
               <w:tab w:val="right" w:leader="dot" w:pos="8494"/>
             </w:tabs>
             <w:rPr>
@@ -2239,23 +2333,42 @@
               <w14:ligatures w14:val="standardContextual"/>
             </w:rPr>
           </w:pPr>
-          <w:hyperlink w:anchor="_Toc222860814" w:history="1">
-            <w:r>
-              <w:rPr>
-                <w:rStyle w:val="Hyperlink"/>
-                <w:noProof/>
-              </w:rPr>
-              <w:t>7.2 Herramientas</w:t>
-            </w:r>
-            <w:r>
-              <w:rPr>
-                <w:noProof/>
-                <w:webHidden/>
+          <w:hyperlink w:anchor="_Toc222910266" w:history="1">
+            <w:r>
+              <w:rPr>
+                <w:rStyle w:val="Hipervnculo"/>
+                <w:noProof/>
+              </w:rPr>
+              <w:t>6.2.</w:t>
+            </w:r>
+            <w:r>
+              <w:rPr>
+                <w:rFonts w:cstheme="minorBidi"/>
+                <w:noProof/>
+                <w:kern w:val="2"/>
+                <w:sz w:val="24"/>
+                <w:szCs w:val="24"/>
+                <w:lang w:val="es-ES" w:eastAsia="es-ES"/>
+                <w14:ligatures w14:val="standardContextual"/>
               </w:rPr>
               <w:tab/>
             </w:r>
             <w:r>
               <w:rPr>
+                <w:rStyle w:val="Hipervnculo"/>
+                <w:noProof/>
+              </w:rPr>
+              <w:t>Diseño de la base de datos</w:t>
+            </w:r>
+            <w:r>
+              <w:rPr>
+                <w:noProof/>
+                <w:webHidden/>
+              </w:rPr>
+              <w:tab/>
+            </w:r>
+            <w:r>
+              <w:rPr>
                 <w:noProof/>
                 <w:webHidden/>
               </w:rPr>
@@ -2266,7 +2379,7 @@
                 <w:noProof/>
                 <w:webHidden/>
               </w:rPr>
-              <w:instrText xml:space="preserve"> PAGEREF _Toc222860814 \h </w:instrText>
+              <w:instrText xml:space="preserve"> PAGEREF _Toc222910266 \h </w:instrText>
             </w:r>
             <w:r>
               <w:rPr>
@@ -2286,7 +2399,7 @@
                 <w:noProof/>
                 <w:webHidden/>
               </w:rPr>
-              <w:t>4</w:t>
+              <w:t>5</w:t>
             </w:r>
             <w:r>
               <w:rPr>
@@ -2299,102 +2412,9 @@
         </w:p>
         <w:p>
           <w:pPr>
-            <w:pStyle w:val="TOC1"/>
+            <w:pStyle w:val="TDC2"/>
             <w:tabs>
-              <w:tab w:val="left" w:pos="440"/>
-              <w:tab w:val="right" w:leader="dot" w:pos="8494"/>
-            </w:tabs>
-            <w:rPr>
-              <w:rFonts w:eastAsiaTheme="minorEastAsia"/>
-              <w:noProof/>
-              <w:kern w:val="2"/>
-              <w:sz w:val="24"/>
-              <w:szCs w:val="24"/>
-              <w:lang w:eastAsia="es-ES"/>
-              <w14:ligatures w14:val="standardContextual"/>
-            </w:rPr>
-          </w:pPr>
-          <w:hyperlink w:anchor="_Toc222860815" w:history="1">
-            <w:r>
-              <w:rPr>
-                <w:rStyle w:val="Hyperlink"/>
-                <w:noProof/>
-              </w:rPr>
-              <w:t>8.</w:t>
-            </w:r>
-            <w:r>
-              <w:rPr>
-                <w:rFonts w:eastAsiaTheme="minorEastAsia"/>
-                <w:noProof/>
-                <w:kern w:val="2"/>
-                <w:sz w:val="24"/>
-                <w:szCs w:val="24"/>
-                <w:lang w:eastAsia="es-ES"/>
-                <w14:ligatures w14:val="standardContextual"/>
-              </w:rPr>
-              <w:tab/>
-            </w:r>
-            <w:r>
-              <w:rPr>
-                <w:rStyle w:val="Hyperlink"/>
-                <w:noProof/>
-              </w:rPr>
-              <w:t>Desarrollo</w:t>
-            </w:r>
-            <w:r>
-              <w:rPr>
-                <w:noProof/>
-                <w:webHidden/>
-              </w:rPr>
-              <w:tab/>
-            </w:r>
-            <w:r>
-              <w:rPr>
-                <w:noProof/>
-                <w:webHidden/>
-              </w:rPr>
-              <w:fldChar w:fldCharType="begin"/>
-            </w:r>
-            <w:r>
-              <w:rPr>
-                <w:noProof/>
-                <w:webHidden/>
-              </w:rPr>
-              <w:instrText xml:space="preserve"> PAGEREF _Toc222860815 \h </w:instrText>
-            </w:r>
-            <w:r>
-              <w:rPr>
-                <w:noProof/>
-                <w:webHidden/>
-              </w:rPr>
-            </w:r>
-            <w:r>
-              <w:rPr>
-                <w:noProof/>
-                <w:webHidden/>
-              </w:rPr>
-              <w:fldChar w:fldCharType="separate"/>
-            </w:r>
-            <w:r>
-              <w:rPr>
-                <w:noProof/>
-                <w:webHidden/>
-              </w:rPr>
-              <w:t>5</w:t>
-            </w:r>
-            <w:r>
-              <w:rPr>
-                <w:noProof/>
-                <w:webHidden/>
-              </w:rPr>
-              <w:fldChar w:fldCharType="end"/>
-            </w:r>
-          </w:hyperlink>
-        </w:p>
-        <w:p>
-          <w:pPr>
-            <w:pStyle w:val="TOC2"/>
-            <w:tabs>
+              <w:tab w:val="left" w:pos="1200"/>
               <w:tab w:val="right" w:leader="dot" w:pos="8494"/>
             </w:tabs>
             <w:rPr>
@@ -2407,23 +2427,42 @@
               <w14:ligatures w14:val="standardContextual"/>
             </w:rPr>
           </w:pPr>
-          <w:hyperlink w:anchor="_Toc222860816" w:history="1">
-            <w:r>
-              <w:rPr>
-                <w:rStyle w:val="Hyperlink"/>
-                <w:noProof/>
-              </w:rPr>
-              <w:t>8.1 Enumeración de requisitos</w:t>
-            </w:r>
-            <w:r>
-              <w:rPr>
-                <w:noProof/>
-                <w:webHidden/>
+          <w:hyperlink w:anchor="_Toc222910267" w:history="1">
+            <w:r>
+              <w:rPr>
+                <w:rStyle w:val="Hipervnculo"/>
+                <w:noProof/>
+              </w:rPr>
+              <w:t>6.3.</w:t>
+            </w:r>
+            <w:r>
+              <w:rPr>
+                <w:rFonts w:cstheme="minorBidi"/>
+                <w:noProof/>
+                <w:kern w:val="2"/>
+                <w:sz w:val="24"/>
+                <w:szCs w:val="24"/>
+                <w:lang w:val="es-ES" w:eastAsia="es-ES"/>
+                <w14:ligatures w14:val="standardContextual"/>
               </w:rPr>
               <w:tab/>
             </w:r>
             <w:r>
               <w:rPr>
+                <w:rStyle w:val="Hipervnculo"/>
+                <w:noProof/>
+              </w:rPr>
+              <w:t>Diagrama de Gantt</w:t>
+            </w:r>
+            <w:r>
+              <w:rPr>
+                <w:noProof/>
+                <w:webHidden/>
+              </w:rPr>
+              <w:tab/>
+            </w:r>
+            <w:r>
+              <w:rPr>
                 <w:noProof/>
                 <w:webHidden/>
               </w:rPr>
@@ -2434,7 +2473,7 @@
                 <w:noProof/>
                 <w:webHidden/>
               </w:rPr>
-              <w:instrText xml:space="preserve"> PAGEREF _Toc222860816 \h </w:instrText>
+              <w:instrText xml:space="preserve"> PAGEREF _Toc222910267 \h </w:instrText>
             </w:r>
             <w:r>
               <w:rPr>
@@ -2454,7 +2493,7 @@
                 <w:noProof/>
                 <w:webHidden/>
               </w:rPr>
-              <w:t>5</w:t>
+              <w:t>6</w:t>
             </w:r>
             <w:r>
               <w:rPr>
@@ -2467,8 +2506,9 @@
         </w:p>
         <w:p>
           <w:pPr>
-            <w:pStyle w:val="TOC2"/>
+            <w:pStyle w:val="TDC2"/>
             <w:tabs>
+              <w:tab w:val="left" w:pos="1200"/>
               <w:tab w:val="right" w:leader="dot" w:pos="8494"/>
             </w:tabs>
             <w:rPr>
@@ -2481,23 +2521,42 @@
               <w14:ligatures w14:val="standardContextual"/>
             </w:rPr>
           </w:pPr>
-          <w:hyperlink w:anchor="_Toc222860817" w:history="1">
-            <w:r>
-              <w:rPr>
-                <w:rStyle w:val="Hyperlink"/>
-                <w:noProof/>
-              </w:rPr>
-              <w:t>8.2 Diseño de la base de datos</w:t>
-            </w:r>
-            <w:r>
-              <w:rPr>
-                <w:noProof/>
-                <w:webHidden/>
+          <w:hyperlink w:anchor="_Toc222910268" w:history="1">
+            <w:r>
+              <w:rPr>
+                <w:rStyle w:val="Hipervnculo"/>
+                <w:noProof/>
+              </w:rPr>
+              <w:t>6.4.</w:t>
+            </w:r>
+            <w:r>
+              <w:rPr>
+                <w:rFonts w:cstheme="minorBidi"/>
+                <w:noProof/>
+                <w:kern w:val="2"/>
+                <w:sz w:val="24"/>
+                <w:szCs w:val="24"/>
+                <w:lang w:val="es-ES" w:eastAsia="es-ES"/>
+                <w14:ligatures w14:val="standardContextual"/>
               </w:rPr>
               <w:tab/>
             </w:r>
             <w:r>
               <w:rPr>
+                <w:rStyle w:val="Hipervnculo"/>
+                <w:noProof/>
+              </w:rPr>
+              <w:t>Diagrama de casos de uso</w:t>
+            </w:r>
+            <w:r>
+              <w:rPr>
+                <w:noProof/>
+                <w:webHidden/>
+              </w:rPr>
+              <w:tab/>
+            </w:r>
+            <w:r>
+              <w:rPr>
                 <w:noProof/>
                 <w:webHidden/>
               </w:rPr>
@@ -2508,7 +2567,7 @@
                 <w:noProof/>
                 <w:webHidden/>
               </w:rPr>
-              <w:instrText xml:space="preserve"> PAGEREF _Toc222860817 \h </w:instrText>
+              <w:instrText xml:space="preserve"> PAGEREF _Toc222910268 \h </w:instrText>
             </w:r>
             <w:r>
               <w:rPr>
@@ -2528,7 +2587,7 @@
                 <w:noProof/>
                 <w:webHidden/>
               </w:rPr>
-              <w:t>5</w:t>
+              <w:t>7</w:t>
             </w:r>
             <w:r>
               <w:rPr>
@@ -2541,8 +2600,9 @@
         </w:p>
         <w:p>
           <w:pPr>
-            <w:pStyle w:val="TOC2"/>
+            <w:pStyle w:val="TDC2"/>
             <w:tabs>
+              <w:tab w:val="left" w:pos="1200"/>
               <w:tab w:val="right" w:leader="dot" w:pos="8494"/>
             </w:tabs>
             <w:rPr>
@@ -2555,23 +2615,42 @@
               <w14:ligatures w14:val="standardContextual"/>
             </w:rPr>
           </w:pPr>
-          <w:hyperlink w:anchor="_Toc222860818" w:history="1">
-            <w:r>
-              <w:rPr>
-                <w:rStyle w:val="Hyperlink"/>
-                <w:noProof/>
-              </w:rPr>
-              <w:t>8.3 Diagrama de Gantt</w:t>
-            </w:r>
-            <w:r>
-              <w:rPr>
-                <w:noProof/>
-                <w:webHidden/>
+          <w:hyperlink w:anchor="_Toc222910269" w:history="1">
+            <w:r>
+              <w:rPr>
+                <w:rStyle w:val="Hipervnculo"/>
+                <w:noProof/>
+              </w:rPr>
+              <w:t>6.5.</w:t>
+            </w:r>
+            <w:r>
+              <w:rPr>
+                <w:rFonts w:cstheme="minorBidi"/>
+                <w:noProof/>
+                <w:kern w:val="2"/>
+                <w:sz w:val="24"/>
+                <w:szCs w:val="24"/>
+                <w:lang w:val="es-ES" w:eastAsia="es-ES"/>
+                <w14:ligatures w14:val="standardContextual"/>
               </w:rPr>
               <w:tab/>
             </w:r>
             <w:r>
               <w:rPr>
+                <w:rStyle w:val="Hipervnculo"/>
+                <w:noProof/>
+              </w:rPr>
+              <w:t>Diagrama de clases UML de la base de datos</w:t>
+            </w:r>
+            <w:r>
+              <w:rPr>
+                <w:noProof/>
+                <w:webHidden/>
+              </w:rPr>
+              <w:tab/>
+            </w:r>
+            <w:r>
+              <w:rPr>
                 <w:noProof/>
                 <w:webHidden/>
               </w:rPr>
@@ -2582,7 +2661,7 @@
                 <w:noProof/>
                 <w:webHidden/>
               </w:rPr>
-              <w:instrText xml:space="preserve"> PAGEREF _Toc222860818 \h </w:instrText>
+              <w:instrText xml:space="preserve"> PAGEREF _Toc222910269 \h </w:instrText>
             </w:r>
             <w:r>
               <w:rPr>
@@ -2602,7 +2681,7 @@
                 <w:noProof/>
                 <w:webHidden/>
               </w:rPr>
-              <w:t>5</w:t>
+              <w:t>7</w:t>
             </w:r>
             <w:r>
               <w:rPr>
@@ -2615,8 +2694,9 @@
         </w:p>
         <w:p>
           <w:pPr>
-            <w:pStyle w:val="TOC2"/>
+            <w:pStyle w:val="TDC2"/>
             <w:tabs>
+              <w:tab w:val="left" w:pos="1200"/>
               <w:tab w:val="right" w:leader="dot" w:pos="8494"/>
             </w:tabs>
             <w:rPr>
@@ -2629,23 +2709,42 @@
               <w14:ligatures w14:val="standardContextual"/>
             </w:rPr>
           </w:pPr>
-          <w:hyperlink w:anchor="_Toc222860819" w:history="1">
-            <w:r>
-              <w:rPr>
-                <w:rStyle w:val="Hyperlink"/>
-                <w:noProof/>
-              </w:rPr>
-              <w:t>8.4 Diagrama de casos de uso</w:t>
-            </w:r>
-            <w:r>
-              <w:rPr>
-                <w:noProof/>
-                <w:webHidden/>
+          <w:hyperlink w:anchor="_Toc222910270" w:history="1">
+            <w:r>
+              <w:rPr>
+                <w:rStyle w:val="Hipervnculo"/>
+                <w:noProof/>
+              </w:rPr>
+              <w:t>6.6</w:t>
+            </w:r>
+            <w:r>
+              <w:rPr>
+                <w:rFonts w:cstheme="minorBidi"/>
+                <w:noProof/>
+                <w:kern w:val="2"/>
+                <w:sz w:val="24"/>
+                <w:szCs w:val="24"/>
+                <w:lang w:val="es-ES" w:eastAsia="es-ES"/>
+                <w14:ligatures w14:val="standardContextual"/>
               </w:rPr>
               <w:tab/>
             </w:r>
             <w:r>
               <w:rPr>
+                <w:rStyle w:val="Hipervnculo"/>
+                <w:noProof/>
+              </w:rPr>
+              <w:t>Diagrama de clases UML de la base de datos</w:t>
+            </w:r>
+            <w:r>
+              <w:rPr>
+                <w:noProof/>
+                <w:webHidden/>
+              </w:rPr>
+              <w:tab/>
+            </w:r>
+            <w:r>
+              <w:rPr>
                 <w:noProof/>
                 <w:webHidden/>
               </w:rPr>
@@ -2656,7 +2755,7 @@
                 <w:noProof/>
                 <w:webHidden/>
               </w:rPr>
-              <w:instrText xml:space="preserve"> PAGEREF _Toc222860819 \h </w:instrText>
+              <w:instrText xml:space="preserve"> PAGEREF _Toc222910270 \h </w:instrText>
             </w:r>
             <w:r>
               <w:rPr>
@@ -2676,7 +2775,7 @@
                 <w:noProof/>
                 <w:webHidden/>
               </w:rPr>
-              <w:t>5</w:t>
+              <w:t>8</w:t>
             </w:r>
             <w:r>
               <w:rPr>
@@ -2689,8 +2788,9 @@
         </w:p>
         <w:p>
           <w:pPr>
-            <w:pStyle w:val="TOC2"/>
+            <w:pStyle w:val="TDC2"/>
             <w:tabs>
+              <w:tab w:val="left" w:pos="1200"/>
               <w:tab w:val="right" w:leader="dot" w:pos="8494"/>
             </w:tabs>
             <w:rPr>
@@ -2703,23 +2803,51 @@
               <w14:ligatures w14:val="standardContextual"/>
             </w:rPr>
           </w:pPr>
-          <w:hyperlink w:anchor="_Toc222860820" w:history="1">
-            <w:r>
-              <w:rPr>
-                <w:rStyle w:val="Hyperlink"/>
-                <w:noProof/>
-              </w:rPr>
-              <w:t>8.5 Diagrama de clases UML</w:t>
-            </w:r>
-            <w:r>
-              <w:rPr>
-                <w:noProof/>
-                <w:webHidden/>
+          <w:hyperlink w:anchor="_Toc222910271" w:history="1">
+            <w:r>
+              <w:rPr>
+                <w:rStyle w:val="Hipervnculo"/>
+                <w:noProof/>
+              </w:rPr>
+              <w:t>1.1.</w:t>
+            </w:r>
+            <w:r>
+              <w:rPr>
+                <w:rFonts w:cstheme="minorBidi"/>
+                <w:noProof/>
+                <w:kern w:val="2"/>
+                <w:sz w:val="24"/>
+                <w:szCs w:val="24"/>
+                <w:lang w:val="es-ES" w:eastAsia="es-ES"/>
+                <w14:ligatures w14:val="standardContextual"/>
               </w:rPr>
               <w:tab/>
             </w:r>
             <w:r>
               <w:rPr>
+                <w:rStyle w:val="Hipervnculo"/>
+                <w:noProof/>
+              </w:rPr>
+              <w:t xml:space="preserve">Diagrama de flujo de navegación </w:t>
+            </w:r>
+            <w:r>
+              <w:rPr>
+                <w:rStyle w:val="Hipervnculo"/>
+                <w:b/>
+                <w:bCs/>
+                <w:noProof/>
+              </w:rPr>
+              <w:t>– POR HACER</w:t>
+            </w:r>
+            <w:r>
+              <w:rPr>
+                <w:noProof/>
+                <w:webHidden/>
+              </w:rPr>
+              <w:tab/>
+            </w:r>
+            <w:r>
+              <w:rPr>
                 <w:noProof/>
                 <w:webHidden/>
               </w:rPr>
@@ -2730,7 +2858,7 @@
                 <w:noProof/>
                 <w:webHidden/>
               </w:rPr>
-              <w:instrText xml:space="preserve"> PAGEREF _Toc222860820 \h </w:instrText>
+              <w:instrText xml:space="preserve"> PAGEREF _Toc222910271 \h </w:instrText>
             </w:r>
             <w:r>
               <w:rPr>
@@ -2750,81 +2878,7 @@
                 <w:noProof/>
                 <w:webHidden/>
               </w:rPr>
-              <w:t>5</w:t>
-            </w:r>
-            <w:r>
-              <w:rPr>
-                <w:noProof/>
-                <w:webHidden/>
-              </w:rPr>
-              <w:fldChar w:fldCharType="end"/>
-            </w:r>
-          </w:hyperlink>
-        </w:p>
-        <w:p>
-          <w:pPr>
-            <w:pStyle w:val="TOC2"/>
-            <w:tabs>
-              <w:tab w:val="right" w:leader="dot" w:pos="8494"/>
-            </w:tabs>
-            <w:rPr>
-              <w:rFonts w:cstheme="minorBidi"/>
-              <w:noProof/>
-              <w:kern w:val="2"/>
-              <w:sz w:val="24"/>
-              <w:szCs w:val="24"/>
-              <w:lang w:val="es-ES" w:eastAsia="es-ES"/>
-              <w14:ligatures w14:val="standardContextual"/>
-            </w:rPr>
-          </w:pPr>
-          <w:hyperlink w:anchor="_Toc222860821" w:history="1">
-            <w:r>
-              <w:rPr>
-                <w:rStyle w:val="Hyperlink"/>
-                <w:noProof/>
-              </w:rPr>
-              <w:t>8.6 Diagrama de flujo de navegación</w:t>
-            </w:r>
-            <w:r>
-              <w:rPr>
-                <w:noProof/>
-                <w:webHidden/>
-              </w:rPr>
-              <w:tab/>
-            </w:r>
-            <w:r>
-              <w:rPr>
-                <w:noProof/>
-                <w:webHidden/>
-              </w:rPr>
-              <w:fldChar w:fldCharType="begin"/>
-            </w:r>
-            <w:r>
-              <w:rPr>
-                <w:noProof/>
-                <w:webHidden/>
-              </w:rPr>
-              <w:instrText xml:space="preserve"> PAGEREF _Toc222860821 \h </w:instrText>
-            </w:r>
-            <w:r>
-              <w:rPr>
-                <w:noProof/>
-                <w:webHidden/>
-              </w:rPr>
-            </w:r>
-            <w:r>
-              <w:rPr>
-                <w:noProof/>
-                <w:webHidden/>
-              </w:rPr>
-              <w:fldChar w:fldCharType="separate"/>
-            </w:r>
-            <w:r>
-              <w:rPr>
-                <w:noProof/>
-                <w:webHidden/>
-              </w:rPr>
-              <w:t>5</w:t>
+              <w:t>9</w:t>
             </w:r>
             <w:r>
               <w:rPr>
@@ -2977,7 +3031,7 @@
           <w:color w:val="C00000"/>
         </w:rPr>
       </w:pPr>
-      <w:bookmarkStart w:id="0" w:name="_Toc222860804"/>
+      <w:bookmarkStart w:id="0" w:name="_Toc222910255"/>
       <w:r>
         <w:rPr>
           <w:color w:val="C00000"/>
@@ -3022,7 +3076,7 @@
           <w:color w:val="C00000"/>
         </w:rPr>
       </w:pPr>
-      <w:bookmarkStart w:id="1" w:name="_Toc222860805"/>
+      <w:bookmarkStart w:id="1" w:name="_Toc222910256"/>
       <w:proofErr w:type="spellStart"/>
       <w:r>
         <w:rPr>
@@ -3080,7 +3134,7 @@
           <w:color w:val="C00000"/>
         </w:rPr>
       </w:pPr>
-      <w:bookmarkStart w:id="2" w:name="_Toc222860806"/>
+      <w:bookmarkStart w:id="2" w:name="_Toc222910257"/>
       <w:r>
         <w:rPr>
           <w:color w:val="C00000"/>
@@ -3166,7 +3220,7 @@
           <w:color w:val="C00000"/>
         </w:rPr>
       </w:pPr>
-      <w:bookmarkStart w:id="3" w:name="_Toc222860807"/>
+      <w:bookmarkStart w:id="3" w:name="_Toc222910258"/>
       <w:r>
         <w:rPr>
           <w:color w:val="C00000"/>
@@ -3177,7 +3231,7 @@
     </w:p>
     <w:p>
       <w:pPr>
-        <w:pStyle w:val="Heading2"/>
+        <w:pStyle w:val="Ttulo2"/>
         <w:numPr>
           <w:ilvl w:val="1"/>
           <w:numId w:val="5"/>
@@ -3189,7 +3243,7 @@
         <w:ind w:left="284" w:hanging="7"/>
         <w:jc w:val="both"/>
       </w:pPr>
-      <w:bookmarkStart w:id="4" w:name="_Toc222860808"/>
+      <w:bookmarkStart w:id="4" w:name="_Toc222910259"/>
       <w:r>
         <w:t>Objetivos generales</w:t>
       </w:r>
@@ -3197,7 +3251,7 @@
     </w:p>
     <w:p>
       <w:pPr>
-        <w:pStyle w:val="ListParagraph"/>
+        <w:pStyle w:val="Prrafodelista"/>
         <w:spacing w:after="0" w:line="360" w:lineRule="auto"/>
         <w:ind w:left="360"/>
         <w:jc w:val="both"/>
@@ -3214,7 +3268,7 @@
     </w:p>
     <w:p>
       <w:pPr>
-        <w:pStyle w:val="Heading2"/>
+        <w:pStyle w:val="Ttulo2"/>
         <w:numPr>
           <w:ilvl w:val="1"/>
           <w:numId w:val="5"/>
@@ -3226,7 +3280,7 @@
         <w:ind w:left="284" w:hanging="7"/>
         <w:jc w:val="both"/>
       </w:pPr>
-      <w:bookmarkStart w:id="5" w:name="_Toc222860809"/>
+      <w:bookmarkStart w:id="5" w:name="_Toc222910260"/>
       <w:r>
         <w:t>Objetivos específicos</w:t>
       </w:r>
@@ -3234,7 +3288,7 @@
     </w:p>
     <w:p>
       <w:pPr>
-        <w:pStyle w:val="ListParagraph"/>
+        <w:pStyle w:val="Prrafodelista"/>
         <w:spacing w:after="0" w:line="360" w:lineRule="auto"/>
         <w:ind w:left="360"/>
         <w:jc w:val="both"/>
@@ -3262,7 +3316,7 @@
     </w:p>
     <w:p>
       <w:pPr>
-        <w:pStyle w:val="ListParagraph"/>
+        <w:pStyle w:val="Prrafodelista"/>
         <w:spacing w:after="0" w:line="360" w:lineRule="auto"/>
         <w:ind w:left="360"/>
         <w:jc w:val="both"/>
@@ -3281,7 +3335,7 @@
     </w:p>
     <w:p>
       <w:pPr>
-        <w:pStyle w:val="ListParagraph"/>
+        <w:pStyle w:val="Prrafodelista"/>
         <w:spacing w:after="0" w:line="360" w:lineRule="auto"/>
         <w:ind w:left="360"/>
         <w:jc w:val="both"/>
@@ -3300,7 +3354,7 @@
     </w:p>
     <w:p>
       <w:pPr>
-        <w:pStyle w:val="ListParagraph"/>
+        <w:pStyle w:val="Prrafodelista"/>
         <w:spacing w:after="0" w:line="360" w:lineRule="auto"/>
         <w:ind w:left="360"/>
         <w:jc w:val="both"/>
@@ -3319,7 +3373,7 @@
     </w:p>
     <w:p>
       <w:pPr>
-        <w:pStyle w:val="ListParagraph"/>
+        <w:pStyle w:val="Prrafodelista"/>
         <w:spacing w:after="0" w:line="360" w:lineRule="auto"/>
         <w:ind w:left="360"/>
         <w:jc w:val="both"/>
@@ -3386,7 +3440,7 @@
     </w:p>
     <w:p>
       <w:pPr>
-        <w:pStyle w:val="ListParagraph"/>
+        <w:pStyle w:val="Prrafodelista"/>
         <w:spacing w:after="0" w:line="360" w:lineRule="auto"/>
         <w:ind w:left="360"/>
         <w:jc w:val="both"/>
@@ -3468,7 +3522,7 @@
           <w:color w:val="C00000"/>
         </w:rPr>
       </w:pPr>
-      <w:bookmarkStart w:id="6" w:name="_Toc222860812"/>
+      <w:bookmarkStart w:id="6" w:name="_Toc222910261"/>
       <w:r>
         <w:rPr>
           <w:color w:val="C00000"/>
@@ -3480,7 +3534,7 @@
     </w:p>
     <w:p>
       <w:pPr>
-        <w:pStyle w:val="Heading2"/>
+        <w:pStyle w:val="Ttulo2"/>
         <w:numPr>
           <w:ilvl w:val="1"/>
           <w:numId w:val="5"/>
@@ -3492,7 +3546,7 @@
         <w:ind w:left="284" w:hanging="7"/>
         <w:jc w:val="both"/>
       </w:pPr>
-      <w:bookmarkStart w:id="7" w:name="_Toc222860813"/>
+      <w:bookmarkStart w:id="7" w:name="_Toc222910262"/>
       <w:r>
         <w:t>Tecnologías</w:t>
       </w:r>
@@ -3500,7 +3554,7 @@
     </w:p>
     <w:p>
       <w:pPr>
-        <w:pStyle w:val="ListParagraph"/>
+        <w:pStyle w:val="Prrafodelista"/>
         <w:spacing w:after="0" w:line="360" w:lineRule="auto"/>
         <w:ind w:left="360"/>
         <w:jc w:val="both"/>
@@ -3531,7 +3585,7 @@
     </w:p>
     <w:p>
       <w:pPr>
-        <w:pStyle w:val="ListParagraph"/>
+        <w:pStyle w:val="Prrafodelista"/>
         <w:spacing w:after="0" w:line="360" w:lineRule="auto"/>
         <w:ind w:left="360" w:firstLine="348"/>
         <w:jc w:val="both"/>
@@ -3562,7 +3616,7 @@
     </w:p>
     <w:p>
       <w:pPr>
-        <w:pStyle w:val="ListParagraph"/>
+        <w:pStyle w:val="Prrafodelista"/>
         <w:spacing w:after="0" w:line="360" w:lineRule="auto"/>
         <w:ind w:left="360" w:firstLine="348"/>
         <w:jc w:val="both"/>
@@ -3607,7 +3661,7 @@
     </w:p>
     <w:p>
       <w:pPr>
-        <w:pStyle w:val="ListParagraph"/>
+        <w:pStyle w:val="Prrafodelista"/>
         <w:spacing w:after="0" w:line="360" w:lineRule="auto"/>
         <w:ind w:left="360" w:firstLine="348"/>
         <w:jc w:val="both"/>
@@ -3619,6 +3673,66 @@
         <w:rPr>
           <w:rFonts w:ascii="Verdana" w:hAnsi="Verdana"/>
         </w:rPr>
+        <w:t xml:space="preserve">• </w:t>
+      </w:r>
+      <w:r>
+        <w:rPr>
+          <w:rFonts w:ascii="Verdana" w:hAnsi="Verdana"/>
+        </w:rPr>
+        <w:t>Entorno de desarrollo: Android Studio. Utilizado para el desarrollo del código por ser el IDE oficial para las aplicaciones Android.</w:t>
+      </w:r>
+    </w:p>
+    <w:p>
+      <w:pPr>
+        <w:pStyle w:val="Prrafodelista"/>
+        <w:spacing w:after="0" w:line="360" w:lineRule="auto"/>
+        <w:ind w:left="360" w:firstLine="348"/>
+        <w:jc w:val="both"/>
+        <w:rPr>
+          <w:rFonts w:ascii="Verdana" w:hAnsi="Verdana"/>
+        </w:rPr>
+      </w:pPr>
+      <w:r>
+        <w:rPr>
+          <w:rFonts w:ascii="Verdana" w:hAnsi="Verdana"/>
+        </w:rPr>
+        <w:t xml:space="preserve">• </w:t>
+      </w:r>
+      <w:r>
+        <w:rPr>
+          <w:rFonts w:ascii="Verdana" w:hAnsi="Verdana"/>
+        </w:rPr>
+        <w:t xml:space="preserve">Sistema de control de versiones: Git y </w:t>
+      </w:r>
+      <w:proofErr w:type="spellStart"/>
+      <w:r>
+        <w:rPr>
+          <w:rFonts w:ascii="Verdana" w:hAnsi="Verdana"/>
+        </w:rPr>
+        <w:t>Github</w:t>
+      </w:r>
+      <w:proofErr w:type="spellEnd"/>
+      <w:r>
+        <w:rPr>
+          <w:rFonts w:ascii="Verdana" w:hAnsi="Verdana"/>
+        </w:rPr>
+        <w:t>, utilizado para la puesta en común del código y para el control de las versiones del proyecto.</w:t>
+      </w:r>
+    </w:p>
+    <w:p>
+      <w:pPr>
+        <w:pStyle w:val="Prrafodelista"/>
+        <w:spacing w:after="0" w:line="360" w:lineRule="auto"/>
+        <w:ind w:left="360" w:firstLine="348"/>
+        <w:jc w:val="both"/>
+        <w:rPr>
+          <w:rFonts w:ascii="Verdana" w:hAnsi="Verdana"/>
+        </w:rPr>
+      </w:pPr>
+      <w:r>
+        <w:rPr>
+          <w:rFonts w:ascii="Verdana" w:hAnsi="Verdana"/>
+        </w:rPr>
         <w:t xml:space="preserve">• Base de datos: </w:t>
       </w:r>
       <w:proofErr w:type="spellStart"/>
@@ -3638,7 +3752,7 @@
     </w:p>
     <w:p>
       <w:pPr>
-        <w:pStyle w:val="ListParagraph"/>
+        <w:pStyle w:val="Prrafodelista"/>
         <w:spacing w:after="0" w:line="360" w:lineRule="auto"/>
         <w:ind w:left="360" w:firstLine="348"/>
         <w:jc w:val="both"/>
@@ -3652,18 +3766,30 @@
         </w:rPr>
         <w:t xml:space="preserve">• Almacenamiento de archivos: </w:t>
       </w:r>
-      <w:r>
-        <w:rPr>
-          <w:rFonts w:ascii="Verdana" w:hAnsi="Verdana"/>
-          <w:b/>
-          <w:bCs/>
-        </w:rPr>
-        <w:t>A ELEGIR Y RELLENAR</w:t>
-      </w:r>
-    </w:p>
-    <w:p>
-      <w:pPr>
-        <w:pStyle w:val="ListParagraph"/>
+      <w:proofErr w:type="spellStart"/>
+      <w:r>
+        <w:rPr>
+          <w:rFonts w:ascii="Verdana" w:hAnsi="Verdana"/>
+        </w:rPr>
+        <w:t>Firebase</w:t>
+      </w:r>
+      <w:proofErr w:type="spellEnd"/>
+      <w:r>
+        <w:rPr>
+          <w:rFonts w:ascii="Verdana" w:hAnsi="Verdana"/>
+        </w:rPr>
+        <w:t xml:space="preserve"> Storage</w:t>
+      </w:r>
+      <w:r>
+        <w:rPr>
+          <w:rFonts w:ascii="Verdana" w:hAnsi="Verdana"/>
+        </w:rPr>
+        <w:t>, permite guardar los archivos y se integra de forma nativa con la base de datos</w:t>
+      </w:r>
+    </w:p>
+    <w:p>
+      <w:pPr>
+        <w:pStyle w:val="Prrafodelista"/>
         <w:spacing w:after="0" w:line="360" w:lineRule="auto"/>
         <w:ind w:left="360" w:firstLine="348"/>
         <w:jc w:val="both"/>
@@ -3677,18 +3803,50 @@
         </w:rPr>
         <w:t xml:space="preserve">• Autenticación de usuarios: </w:t>
       </w:r>
-      <w:r>
-        <w:rPr>
-          <w:rFonts w:ascii="Verdana" w:hAnsi="Verdana"/>
-          <w:b/>
-          <w:bCs/>
-        </w:rPr>
-        <w:t>A ELEGIR Y RELLENAR</w:t>
-      </w:r>
-    </w:p>
-    <w:p>
-      <w:pPr>
-        <w:pStyle w:val="Heading2"/>
+      <w:proofErr w:type="spellStart"/>
+      <w:r>
+        <w:rPr>
+          <w:rFonts w:ascii="Verdana" w:hAnsi="Verdana"/>
+        </w:rPr>
+        <w:t>FirebaseAuthentication</w:t>
+      </w:r>
+      <w:proofErr w:type="spellEnd"/>
+      <w:r>
+        <w:rPr>
+          <w:rFonts w:ascii="Verdana" w:hAnsi="Verdana"/>
+        </w:rPr>
+        <w:t xml:space="preserve">, </w:t>
+      </w:r>
+      <w:r>
+        <w:rPr>
+          <w:rFonts w:ascii="Verdana" w:hAnsi="Verdana"/>
+        </w:rPr>
+        <w:t xml:space="preserve">utilizado para la realizar los registros de usuarios así como el inicio de sesión ya que ofrece un servicio de autenticación por email y contraseña, y facilita el </w:t>
+      </w:r>
+      <w:proofErr w:type="spellStart"/>
+      <w:r>
+        <w:rPr>
+          <w:rFonts w:ascii="Verdana" w:hAnsi="Verdana"/>
+        </w:rPr>
+        <w:t>logeo</w:t>
+      </w:r>
+      <w:proofErr w:type="spellEnd"/>
+      <w:r>
+        <w:rPr>
+          <w:rFonts w:ascii="Verdana" w:hAnsi="Verdana"/>
+        </w:rPr>
+        <w:t xml:space="preserve"> mediante</w:t>
+      </w:r>
+      <w:r>
+        <w:rPr>
+          <w:rFonts w:ascii="Verdana" w:hAnsi="Verdana"/>
+        </w:rPr>
+        <w:t xml:space="preserve"> inicio de sesión con Google.</w:t>
+      </w:r>
+    </w:p>
+    <w:p>
+      <w:pPr>
+        <w:pStyle w:val="Ttulo2"/>
         <w:numPr>
           <w:ilvl w:val="1"/>
           <w:numId w:val="5"/>
@@ -3700,7 +3858,7 @@
         <w:ind w:left="284" w:hanging="7"/>
         <w:jc w:val="both"/>
       </w:pPr>
-      <w:bookmarkStart w:id="8" w:name="_Toc222860814"/>
+      <w:bookmarkStart w:id="8" w:name="_Toc222910263"/>
       <w:r>
         <w:t>Herramientas</w:t>
       </w:r>
@@ -3729,7 +3887,7 @@
     </w:p>
     <w:p>
       <w:pPr>
-        <w:pStyle w:val="Heading4"/>
+        <w:pStyle w:val="Ttulo4"/>
         <w:spacing w:before="0" w:line="360" w:lineRule="auto"/>
         <w:ind w:firstLine="708"/>
         <w:jc w:val="both"/>
@@ -3800,7 +3958,7 @@
     </w:p>
     <w:p>
       <w:pPr>
-        <w:pStyle w:val="Heading4"/>
+        <w:pStyle w:val="Ttulo4"/>
         <w:spacing w:before="0" w:line="360" w:lineRule="auto"/>
         <w:ind w:firstLine="708"/>
         <w:jc w:val="both"/>
@@ -3818,6 +3976,7 @@
           <w:iCs w:val="0"/>
           <w:color w:val="auto"/>
         </w:rPr>
+        <w:lastRenderedPageBreak/>
         <w:t>Diseño y planificación</w:t>
       </w:r>
     </w:p>
@@ -3871,7 +4030,7 @@
     </w:p>
     <w:p>
       <w:pPr>
-        <w:pStyle w:val="Heading4"/>
+        <w:pStyle w:val="Ttulo4"/>
         <w:spacing w:before="0" w:line="360" w:lineRule="auto"/>
         <w:ind w:firstLine="708"/>
         <w:jc w:val="both"/>
@@ -3969,7 +4128,7 @@
     </w:p>
     <w:p>
       <w:pPr>
-        <w:pStyle w:val="Heading4"/>
+        <w:pStyle w:val="Ttulo4"/>
         <w:spacing w:before="0" w:line="360" w:lineRule="auto"/>
         <w:ind w:firstLine="708"/>
         <w:jc w:val="both"/>
@@ -3987,7 +4146,6 @@
           <w:iCs w:val="0"/>
           <w:color w:val="auto"/>
         </w:rPr>
-        <w:lastRenderedPageBreak/>
         <w:t>Control de versiones</w:t>
       </w:r>
     </w:p>
@@ -4047,7 +4205,7 @@
           <w:color w:val="C00000"/>
         </w:rPr>
       </w:pPr>
-      <w:bookmarkStart w:id="9" w:name="_Toc222860815"/>
+      <w:bookmarkStart w:id="9" w:name="_Toc222910264"/>
       <w:r>
         <w:rPr>
           <w:color w:val="C00000"/>
@@ -4058,7 +4216,7 @@
     </w:p>
     <w:p>
       <w:pPr>
-        <w:pStyle w:val="Heading2"/>
+        <w:pStyle w:val="Ttulo2"/>
         <w:numPr>
           <w:ilvl w:val="1"/>
           <w:numId w:val="5"/>
@@ -4070,7 +4228,7 @@
         <w:ind w:left="284" w:hanging="7"/>
         <w:jc w:val="both"/>
       </w:pPr>
-      <w:bookmarkStart w:id="10" w:name="_Toc222860816"/>
+      <w:bookmarkStart w:id="10" w:name="_Toc222910265"/>
       <w:r>
         <w:t>Enumeración de requisitos</w:t>
       </w:r>
@@ -4249,6 +4407,7 @@
         <w:rPr>
           <w:rFonts w:ascii="Verdana" w:hAnsi="Verdana"/>
         </w:rPr>
+        <w:lastRenderedPageBreak/>
         <w:t>• El sistema debe permitir la futura ampliación de funcionalidades sin necesidad de modificar completamente su estructura.</w:t>
       </w:r>
     </w:p>
@@ -4379,7 +4538,6 @@
         <w:rPr>
           <w:rFonts w:ascii="Verdana" w:hAnsi="Verdana"/>
         </w:rPr>
-        <w:lastRenderedPageBreak/>
         <w:t>• Se utilizará Git y GitHub para el control de versiones y trabajo colaborativo mediante ramas.</w:t>
       </w:r>
     </w:p>
@@ -4460,7 +4618,7 @@
     <w:p/>
     <w:p>
       <w:pPr>
-        <w:pStyle w:val="Heading2"/>
+        <w:pStyle w:val="Ttulo2"/>
         <w:numPr>
           <w:ilvl w:val="1"/>
           <w:numId w:val="5"/>
@@ -4472,7 +4630,7 @@
         <w:ind w:left="284" w:hanging="7"/>
         <w:jc w:val="both"/>
       </w:pPr>
-      <w:bookmarkStart w:id="11" w:name="_Toc222860817"/>
+      <w:bookmarkStart w:id="11" w:name="_Toc222910266"/>
       <w:r>
         <w:t>Diseño de la base de datos</w:t>
       </w:r>
@@ -4550,9 +4708,20 @@
     </w:p>
     <w:p>
       <w:pPr>
+        <w:ind w:left="284"/>
+        <w:rPr>
+          <w:rFonts w:ascii="Verdana" w:hAnsi="Verdana"/>
+        </w:rPr>
+      </w:pPr>
+    </w:p>
+    <w:p>
+      <w:pPr>
         <w:jc w:val="center"/>
       </w:pPr>
       <w:r>
+        <w:rPr>
+          <w:noProof/>
+        </w:rPr>
         <w:lastRenderedPageBreak/>
         <w:drawing>
           <wp:inline distT="0" distB="0" distL="0" distR="0" wp14:anchorId="4709B5E2" wp14:editId="499A1CB6">
@@ -4614,7 +4783,7 @@
     </w:p>
     <w:p>
       <w:pPr>
-        <w:pStyle w:val="Heading2"/>
+        <w:pStyle w:val="Ttulo2"/>
         <w:numPr>
           <w:ilvl w:val="1"/>
           <w:numId w:val="5"/>
@@ -4626,7 +4795,7 @@
         <w:ind w:left="284" w:hanging="7"/>
         <w:jc w:val="both"/>
       </w:pPr>
-      <w:bookmarkStart w:id="12" w:name="_Toc222860818"/>
+      <w:bookmarkStart w:id="12" w:name="_Toc222910267"/>
       <w:r>
         <w:t>Diagrama de Gantt</w:t>
       </w:r>
@@ -4637,6 +4806,9 @@
         <w:jc w:val="center"/>
       </w:pPr>
       <w:r>
+        <w:rPr>
+          <w:noProof/>
+        </w:rPr>
         <w:drawing>
           <wp:inline distT="0" distB="0" distL="0" distR="0" wp14:anchorId="0105C59E" wp14:editId="557AED74">
             <wp:extent cx="4023709" cy="2979678"/>
@@ -4688,7 +4860,7 @@
     </w:p>
     <w:p>
       <w:pPr>
-        <w:pStyle w:val="Heading2"/>
+        <w:pStyle w:val="Ttulo2"/>
         <w:numPr>
           <w:ilvl w:val="1"/>
           <w:numId w:val="5"/>
@@ -4700,18 +4872,22 @@
         <w:ind w:left="284" w:hanging="7"/>
         <w:jc w:val="both"/>
       </w:pPr>
-      <w:bookmarkStart w:id="13" w:name="_Toc222860819"/>
-      <w:r>
+      <w:bookmarkStart w:id="13" w:name="_Toc222910268"/>
+      <w:r>
+        <w:t>Diagrama de casos de uso</w:t>
+      </w:r>
+      <w:bookmarkEnd w:id="13"/>
+    </w:p>
+    <w:p/>
+    <w:p>
+      <w:pPr>
+        <w:jc w:val="center"/>
+      </w:pPr>
+      <w:r>
+        <w:rPr>
+          <w:noProof/>
+        </w:rPr>
         <w:lastRenderedPageBreak/>
-        <w:t>Diagrama de casos de uso</w:t>
-      </w:r>
-      <w:bookmarkEnd w:id="13"/>
-    </w:p>
-    <w:p>
-      <w:pPr>
-        <w:jc w:val="center"/>
-      </w:pPr>
-      <w:r>
         <w:drawing>
           <wp:inline distT="0" distB="0" distL="0" distR="0" wp14:anchorId="53FD1FA2" wp14:editId="75B975A4">
             <wp:extent cx="5362575" cy="3681850"/>
@@ -4772,7 +4948,7 @@
     </w:p>
     <w:p>
       <w:pPr>
-        <w:pStyle w:val="Heading2"/>
+        <w:pStyle w:val="Ttulo2"/>
         <w:numPr>
           <w:ilvl w:val="1"/>
           <w:numId w:val="5"/>
@@ -4784,10 +4960,13 @@
         <w:ind w:left="284" w:hanging="7"/>
         <w:jc w:val="both"/>
       </w:pPr>
-      <w:bookmarkStart w:id="14" w:name="_Toc222860820"/>
+      <w:bookmarkStart w:id="14" w:name="_Toc222910269"/>
       <w:r>
         <w:t>Diagrama de clases UML</w:t>
       </w:r>
+      <w:r>
+        <w:t xml:space="preserve"> de la base de datos</w:t>
+      </w:r>
       <w:bookmarkEnd w:id="14"/>
     </w:p>
     <w:p>
@@ -4795,6 +4974,9 @@
         <w:jc w:val="center"/>
       </w:pPr>
       <w:r>
+        <w:rPr>
+          <w:noProof/>
+        </w:rPr>
         <w:drawing>
           <wp:inline distT="0" distB="0" distL="0" distR="0" wp14:anchorId="6C643FF0" wp14:editId="58E73B15">
             <wp:extent cx="1962150" cy="3583057"/>
@@ -4835,35 +5017,301 @@
     <w:p>
       <w:pPr>
         <w:jc w:val="center"/>
-      </w:pPr>
-      <w:r>
         <w:rPr>
           <w:i/>
           <w:iCs/>
         </w:rPr>
-        <w:t>Figura 4 – Diagrama UML.</w:t>
-      </w:r>
-    </w:p>
-    <w:p>
-      <w:pPr>
-        <w:pStyle w:val="Heading2"/>
+      </w:pPr>
+      <w:r>
+        <w:rPr>
+          <w:i/>
+          <w:iCs/>
+        </w:rPr>
+        <w:t>Figura 4 – Diagrama</w:t>
+      </w:r>
+      <w:r>
+        <w:rPr>
+          <w:i/>
+          <w:iCs/>
+        </w:rPr>
+        <w:t xml:space="preserve"> de clases de la base de datos</w:t>
+      </w:r>
+      <w:r>
+        <w:rPr>
+          <w:i/>
+          <w:iCs/>
+        </w:rPr>
+        <w:t>.</w:t>
+      </w:r>
+    </w:p>
+    <w:p>
+      <w:pPr>
+        <w:jc w:val="center"/>
+        <w:rPr>
+          <w:i/>
+          <w:iCs/>
+        </w:rPr>
+      </w:pPr>
+    </w:p>
+    <w:p>
+      <w:pPr>
+        <w:pStyle w:val="Ttulo2"/>
         <w:numPr>
           <w:ilvl w:val="1"/>
-          <w:numId w:val="5"/>
+          <w:numId w:val="17"/>
         </w:numPr>
         <w:tabs>
           <w:tab w:val="left" w:pos="993"/>
         </w:tabs>
         <w:spacing w:before="0" w:line="360" w:lineRule="auto"/>
-        <w:ind w:left="284" w:hanging="7"/>
-        <w:jc w:val="both"/>
-      </w:pPr>
-      <w:bookmarkStart w:id="15" w:name="_Toc222860821"/>
+        <w:jc w:val="both"/>
+      </w:pPr>
+      <w:bookmarkStart w:id="15" w:name="_Toc222910270"/>
       <w:r>
         <w:lastRenderedPageBreak/>
+        <w:t>Diagrama de clases UML de la base de datos</w:t>
+      </w:r>
+      <w:bookmarkEnd w:id="15"/>
+    </w:p>
+    <w:p>
+      <w:pPr>
+        <w:jc w:val="center"/>
+        <w:rPr>
+          <w:i/>
+          <w:iCs/>
+        </w:rPr>
+      </w:pPr>
+    </w:p>
+    <w:p>
+      <w:pPr>
+        <w:keepNext/>
+        <w:jc w:val="center"/>
+      </w:pPr>
+      <w:r>
+        <w:rPr>
+          <w:i/>
+          <w:iCs/>
+          <w:noProof/>
+        </w:rPr>
+        <w:drawing>
+          <wp:inline distT="0" distB="0" distL="0" distR="0" wp14:anchorId="51FA45FE" wp14:editId="1FB40618">
+            <wp:extent cx="5197290" cy="6066046"/>
+            <wp:effectExtent l="0" t="0" r="3810" b="0"/>
+            <wp:docPr id="1010282031" name="Imagen 5" descr="Diagrama de clases de la aplicación&#10;"/>
+            <wp:cNvGraphicFramePr>
+              <a:graphicFrameLocks xmlns:a="http://schemas.openxmlformats.org/drawingml/2006/main" noChangeAspect="1"/>
+            </wp:cNvGraphicFramePr>
+            <a:graphic xmlns:a="http://schemas.openxmlformats.org/drawingml/2006/main">
+              <a:graphicData uri="http://schemas.openxmlformats.org/drawingml/2006/picture">
+                <pic:pic xmlns:pic="http://schemas.openxmlformats.org/drawingml/2006/picture">
+                  <pic:nvPicPr>
+                    <pic:cNvPr id="1010282031" name="Imagen 5" descr="Diagrama de clases de la aplicación&#10;"/>
+                    <pic:cNvPicPr/>
+                  </pic:nvPicPr>
+                  <pic:blipFill>
+                    <a:blip r:embed="rId14" cstate="print">
+                      <a:extLst>
+                        <a:ext uri="{28A0092B-C50C-407E-A947-70E740481C1C}">
+                          <a14:useLocalDpi xmlns:a14="http://schemas.microsoft.com/office/drawing/2010/main" val="0"/>
+                        </a:ext>
+                      </a:extLst>
+                    </a:blip>
+                    <a:stretch>
+                      <a:fillRect/>
+                    </a:stretch>
+                  </pic:blipFill>
+                  <pic:spPr>
+                    <a:xfrm>
+                      <a:off x="0" y="0"/>
+                      <a:ext cx="5197290" cy="6066046"/>
+                    </a:xfrm>
+                    <a:prstGeom prst="rect">
+                      <a:avLst/>
+                    </a:prstGeom>
+                  </pic:spPr>
+                </pic:pic>
+              </a:graphicData>
+            </a:graphic>
+          </wp:inline>
+        </w:drawing>
+      </w:r>
+    </w:p>
+    <w:p>
+      <w:pPr>
+        <w:pStyle w:val="Descripcin"/>
+        <w:jc w:val="center"/>
+      </w:pPr>
+      <w:r>
+        <w:t>Figura 5. Diagrama de clases de la aplicación</w:t>
+      </w:r>
+    </w:p>
+    <w:p/>
+    <w:p>
+      <w:pPr>
+        <w:jc w:val="center"/>
+        <w:rPr>
+          <w:i/>
+          <w:iCs/>
+        </w:rPr>
+      </w:pPr>
+    </w:p>
+    <w:p>
+      <w:pPr>
+        <w:jc w:val="center"/>
+        <w:rPr>
+          <w:i/>
+          <w:iCs/>
+        </w:rPr>
+      </w:pPr>
+    </w:p>
+    <w:p>
+      <w:pPr>
+        <w:jc w:val="center"/>
+        <w:rPr>
+          <w:i/>
+          <w:iCs/>
+        </w:rPr>
+      </w:pPr>
+    </w:p>
+    <w:p>
+      <w:pPr>
+        <w:jc w:val="center"/>
+        <w:rPr>
+          <w:i/>
+          <w:iCs/>
+        </w:rPr>
+      </w:pPr>
+    </w:p>
+    <w:p>
+      <w:pPr>
+        <w:jc w:val="center"/>
+        <w:rPr>
+          <w:i/>
+          <w:iCs/>
+        </w:rPr>
+      </w:pPr>
+    </w:p>
+    <w:p>
+      <w:pPr>
+        <w:jc w:val="center"/>
+        <w:rPr>
+          <w:i/>
+          <w:iCs/>
+        </w:rPr>
+      </w:pPr>
+    </w:p>
+    <w:p>
+      <w:pPr>
+        <w:jc w:val="center"/>
+        <w:rPr>
+          <w:i/>
+          <w:iCs/>
+        </w:rPr>
+      </w:pPr>
+    </w:p>
+    <w:p>
+      <w:pPr>
+        <w:jc w:val="center"/>
+        <w:rPr>
+          <w:i/>
+          <w:iCs/>
+        </w:rPr>
+      </w:pPr>
+    </w:p>
+    <w:p>
+      <w:pPr>
+        <w:jc w:val="center"/>
+        <w:rPr>
+          <w:i/>
+          <w:iCs/>
+        </w:rPr>
+      </w:pPr>
+    </w:p>
+    <w:p>
+      <w:pPr>
+        <w:jc w:val="center"/>
+        <w:rPr>
+          <w:i/>
+          <w:iCs/>
+        </w:rPr>
+      </w:pPr>
+    </w:p>
+    <w:p>
+      <w:pPr>
+        <w:jc w:val="center"/>
+        <w:rPr>
+          <w:i/>
+          <w:iCs/>
+        </w:rPr>
+      </w:pPr>
+    </w:p>
+    <w:p>
+      <w:pPr>
+        <w:jc w:val="center"/>
+        <w:rPr>
+          <w:i/>
+          <w:iCs/>
+        </w:rPr>
+      </w:pPr>
+    </w:p>
+    <w:p>
+      <w:pPr>
+        <w:jc w:val="center"/>
+        <w:rPr>
+          <w:i/>
+          <w:iCs/>
+        </w:rPr>
+      </w:pPr>
+    </w:p>
+    <w:p>
+      <w:pPr>
+        <w:jc w:val="center"/>
+        <w:rPr>
+          <w:i/>
+          <w:iCs/>
+        </w:rPr>
+      </w:pPr>
+    </w:p>
+    <w:p>
+      <w:pPr>
+        <w:jc w:val="center"/>
+        <w:rPr>
+          <w:i/>
+          <w:iCs/>
+        </w:rPr>
+      </w:pPr>
+    </w:p>
+    <w:p>
+      <w:pPr>
+        <w:jc w:val="center"/>
+        <w:rPr>
+          <w:i/>
+          <w:iCs/>
+        </w:rPr>
+      </w:pPr>
+    </w:p>
+    <w:p>
+      <w:pPr>
+        <w:jc w:val="center"/>
+      </w:pPr>
+    </w:p>
+    <w:p>
+      <w:pPr>
+        <w:pStyle w:val="Ttulo2"/>
+        <w:numPr>
+          <w:ilvl w:val="1"/>
+          <w:numId w:val="17"/>
+        </w:numPr>
+        <w:tabs>
+          <w:tab w:val="left" w:pos="993"/>
+        </w:tabs>
+        <w:spacing w:before="0" w:line="360" w:lineRule="auto"/>
+        <w:jc w:val="both"/>
+      </w:pPr>
+      <w:bookmarkStart w:id="16" w:name="_Toc222910271"/>
+      <w:r>
         <w:t>Diagrama de flujo de navegación</w:t>
       </w:r>
-      <w:bookmarkEnd w:id="15"/>
       <w:r>
         <w:t xml:space="preserve"> </w:t>
       </w:r>
@@ -4873,7 +5321,16 @@
           <w:bCs/>
           <w:color w:val="auto"/>
         </w:rPr>
-        <w:t>– POR HACER</w:t>
+        <w:t xml:space="preserve">– </w:t>
+      </w:r>
+      <w:bookmarkEnd w:id="16"/>
+      <w:r>
+        <w:rPr>
+          <w:b/>
+          <w:bCs/>
+          <w:color w:val="auto"/>
+        </w:rPr>
+        <w:t>pendiente</w:t>
       </w:r>
     </w:p>
     <w:p>
@@ -4901,7 +5358,7 @@
     </w:p>
     <w:p>
       <w:pPr>
-        <w:pStyle w:val="ListParagraph"/>
+        <w:pStyle w:val="Prrafodelista"/>
         <w:spacing w:after="0" w:line="360" w:lineRule="auto"/>
         <w:ind w:left="360"/>
         <w:jc w:val="both"/>
@@ -4927,11 +5384,872 @@
     <w:p>
       <w:pPr>
         <w:pStyle w:val="Estilo1"/>
+        <w:numPr>
+          <w:ilvl w:val="0"/>
+          <w:numId w:val="5"/>
+        </w:numPr>
         <w:spacing w:before="0" w:line="360" w:lineRule="auto"/>
         <w:jc w:val="both"/>
         <w:rPr>
           <w:color w:val="EE0000"/>
         </w:rPr>
+      </w:pPr>
+      <w:r>
+        <w:rPr>
+          <w:color w:val="EE0000"/>
+        </w:rPr>
+        <w:t>Bibliografía</w:t>
+      </w:r>
+    </w:p>
+    <w:p>
+      <w:pPr>
+        <w:pStyle w:val="Textomemoria"/>
+      </w:pPr>
+    </w:p>
+    <w:p>
+      <w:pPr>
+        <w:pStyle w:val="Textomemoria"/>
+      </w:pPr>
+      <w:r>
+        <w:t xml:space="preserve">Android </w:t>
+      </w:r>
+      <w:proofErr w:type="spellStart"/>
+      <w:r>
+        <w:t>Developers</w:t>
+      </w:r>
+      <w:proofErr w:type="spellEnd"/>
+      <w:r>
+        <w:t xml:space="preserve">. (s. f.). </w:t>
+      </w:r>
+      <w:proofErr w:type="spellStart"/>
+      <w:r>
+        <w:rPr>
+          <w:i/>
+          <w:iCs/>
+        </w:rPr>
+        <w:t>NavController</w:t>
+      </w:r>
+      <w:proofErr w:type="spellEnd"/>
+      <w:r>
+        <w:rPr>
+          <w:i/>
+          <w:iCs/>
+        </w:rPr>
+        <w:t>.</w:t>
+      </w:r>
+      <w:r>
+        <w:t xml:space="preserve"> Google. </w:t>
+      </w:r>
+      <w:hyperlink r:id="rId15" w:history="1">
+        <w:r>
+          <w:rPr>
+            <w:rStyle w:val="Hipervnculo"/>
+          </w:rPr>
+          <w:t>https://developer.android.com/guide/navigation/navcontroller?hl=es-419</w:t>
+        </w:r>
+      </w:hyperlink>
+    </w:p>
+    <w:p>
+      <w:pPr>
+        <w:pStyle w:val="Textomemoria"/>
+      </w:pPr>
+    </w:p>
+    <w:p>
+      <w:pPr>
+        <w:pStyle w:val="Textomemoria"/>
+      </w:pPr>
+      <w:r>
+        <w:t xml:space="preserve">Android </w:t>
+      </w:r>
+      <w:proofErr w:type="spellStart"/>
+      <w:r>
+        <w:t>Developers</w:t>
+      </w:r>
+      <w:proofErr w:type="spellEnd"/>
+      <w:r>
+        <w:t xml:space="preserve">. (s. f.). </w:t>
+      </w:r>
+      <w:proofErr w:type="spellStart"/>
+      <w:r>
+        <w:rPr>
+          <w:i/>
+          <w:iCs/>
+        </w:rPr>
+        <w:t>Navigation</w:t>
+      </w:r>
+      <w:proofErr w:type="spellEnd"/>
+      <w:r>
+        <w:rPr>
+          <w:i/>
+          <w:iCs/>
+        </w:rPr>
+        <w:t xml:space="preserve"> </w:t>
+      </w:r>
+      <w:proofErr w:type="spellStart"/>
+      <w:r>
+        <w:rPr>
+          <w:i/>
+          <w:iCs/>
+        </w:rPr>
+        <w:t>Compose</w:t>
+      </w:r>
+      <w:proofErr w:type="spellEnd"/>
+      <w:r>
+        <w:rPr>
+          <w:i/>
+          <w:iCs/>
+        </w:rPr>
+        <w:t xml:space="preserve"> tutorial</w:t>
+      </w:r>
+      <w:r>
+        <w:t xml:space="preserve"> [Vídeo]. YouTube. </w:t>
+      </w:r>
+      <w:hyperlink r:id="rId16" w:history="1">
+        <w:r>
+          <w:rPr>
+            <w:rStyle w:val="Hipervnculo"/>
+          </w:rPr>
+          <w:t>https://www.youtube.com/watch?v=flL3NcVNuJo</w:t>
+        </w:r>
+      </w:hyperlink>
+      <w:r>
+        <w:t xml:space="preserve"> </w:t>
+      </w:r>
+    </w:p>
+    <w:p>
+      <w:pPr>
+        <w:pStyle w:val="Textomemoria"/>
+      </w:pPr>
+    </w:p>
+    <w:p>
+      <w:pPr>
+        <w:pStyle w:val="Textomemoria"/>
+      </w:pPr>
+      <w:r>
+        <w:t xml:space="preserve">Android </w:t>
+      </w:r>
+      <w:proofErr w:type="spellStart"/>
+      <w:r>
+        <w:t>Developers</w:t>
+      </w:r>
+      <w:proofErr w:type="spellEnd"/>
+      <w:r>
+        <w:t xml:space="preserve">. (s. f.). </w:t>
+      </w:r>
+      <w:proofErr w:type="spellStart"/>
+      <w:r>
+        <w:rPr>
+          <w:i/>
+          <w:iCs/>
+        </w:rPr>
+        <w:t>Navigation</w:t>
+      </w:r>
+      <w:proofErr w:type="spellEnd"/>
+      <w:r>
+        <w:rPr>
+          <w:i/>
+          <w:iCs/>
+        </w:rPr>
+        <w:t xml:space="preserve"> con </w:t>
+      </w:r>
+      <w:proofErr w:type="spellStart"/>
+      <w:r>
+        <w:rPr>
+          <w:i/>
+          <w:iCs/>
+        </w:rPr>
+        <w:t>Compose</w:t>
+      </w:r>
+      <w:proofErr w:type="spellEnd"/>
+      <w:r>
+        <w:t xml:space="preserve">. Google. </w:t>
+      </w:r>
+      <w:r>
+        <w:t>https://developer.android.com/develop/ui/compose/navigation?hl=es-419</w:t>
+      </w:r>
+    </w:p>
+    <w:p>
+      <w:pPr>
+        <w:pStyle w:val="Textomemoria"/>
+      </w:pPr>
+    </w:p>
+    <w:p>
+      <w:pPr>
+        <w:pStyle w:val="Textomemoria"/>
+      </w:pPr>
+      <w:r>
+        <w:t xml:space="preserve">Android </w:t>
+      </w:r>
+      <w:proofErr w:type="spellStart"/>
+      <w:r>
+        <w:t>Developers</w:t>
+      </w:r>
+      <w:proofErr w:type="spellEnd"/>
+      <w:r>
+        <w:t xml:space="preserve">. (s. f.). </w:t>
+      </w:r>
+      <w:proofErr w:type="spellStart"/>
+      <w:r>
+        <w:rPr>
+          <w:i/>
+          <w:iCs/>
+        </w:rPr>
+        <w:t>NavController</w:t>
+      </w:r>
+      <w:proofErr w:type="spellEnd"/>
+      <w:r>
+        <w:rPr>
+          <w:i/>
+          <w:iCs/>
+        </w:rPr>
+        <w:t xml:space="preserve"> tutorial</w:t>
+      </w:r>
+      <w:r>
+        <w:t xml:space="preserve"> [Vídeo]. YouTube. </w:t>
+      </w:r>
+      <w:hyperlink r:id="rId17" w:history="1">
+        <w:r>
+          <w:rPr>
+            <w:rStyle w:val="Hipervnculo"/>
+          </w:rPr>
+          <w:t>https://www.youtube.com/watch?v=eNuaMn4ukdo</w:t>
+        </w:r>
+      </w:hyperlink>
+    </w:p>
+    <w:p>
+      <w:pPr>
+        <w:pStyle w:val="Textomemoria"/>
+      </w:pPr>
+    </w:p>
+    <w:p>
+      <w:pPr>
+        <w:pStyle w:val="Textomemoria"/>
+      </w:pPr>
+      <w:r>
+        <w:lastRenderedPageBreak/>
+        <w:t xml:space="preserve">Android </w:t>
+      </w:r>
+      <w:proofErr w:type="spellStart"/>
+      <w:r>
+        <w:t>Developers</w:t>
+      </w:r>
+      <w:proofErr w:type="spellEnd"/>
+      <w:r>
+        <w:t xml:space="preserve">. (s. f.). </w:t>
+      </w:r>
+      <w:r>
+        <w:rPr>
+          <w:i/>
+          <w:iCs/>
+        </w:rPr>
+        <w:t xml:space="preserve">State in </w:t>
+      </w:r>
+      <w:proofErr w:type="spellStart"/>
+      <w:r>
+        <w:rPr>
+          <w:i/>
+          <w:iCs/>
+        </w:rPr>
+        <w:t>Jetpack</w:t>
+      </w:r>
+      <w:proofErr w:type="spellEnd"/>
+      <w:r>
+        <w:rPr>
+          <w:i/>
+          <w:iCs/>
+        </w:rPr>
+        <w:t xml:space="preserve"> </w:t>
+      </w:r>
+      <w:proofErr w:type="spellStart"/>
+      <w:r>
+        <w:rPr>
+          <w:i/>
+          <w:iCs/>
+        </w:rPr>
+        <w:t>Compose</w:t>
+      </w:r>
+      <w:proofErr w:type="spellEnd"/>
+      <w:r>
+        <w:t xml:space="preserve">. Google. </w:t>
+      </w:r>
+      <w:hyperlink r:id="rId18" w:history="1">
+        <w:r>
+          <w:rPr>
+            <w:rStyle w:val="Hipervnculo"/>
+          </w:rPr>
+          <w:t>https://developer.android.com/develop/ui/compose/state?hl=es-419</w:t>
+        </w:r>
+      </w:hyperlink>
+    </w:p>
+    <w:p>
+      <w:pPr>
+        <w:pStyle w:val="Textomemoria"/>
+      </w:pPr>
+    </w:p>
+    <w:p>
+      <w:pPr>
+        <w:pStyle w:val="Textomemoria"/>
+      </w:pPr>
+      <w:r>
+        <w:t xml:space="preserve">Android </w:t>
+      </w:r>
+      <w:proofErr w:type="spellStart"/>
+      <w:r>
+        <w:t>Developers</w:t>
+      </w:r>
+      <w:proofErr w:type="spellEnd"/>
+      <w:r>
+        <w:t xml:space="preserve">. (s. f.). </w:t>
+      </w:r>
+      <w:r>
+        <w:rPr>
+          <w:i/>
+          <w:iCs/>
+        </w:rPr>
+        <w:t xml:space="preserve">Text </w:t>
+      </w:r>
+      <w:proofErr w:type="spellStart"/>
+      <w:r>
+        <w:rPr>
+          <w:i/>
+          <w:iCs/>
+        </w:rPr>
+        <w:t>fields</w:t>
+      </w:r>
+      <w:proofErr w:type="spellEnd"/>
+      <w:r>
+        <w:rPr>
+          <w:i/>
+          <w:iCs/>
+        </w:rPr>
+        <w:t xml:space="preserve"> in </w:t>
+      </w:r>
+      <w:proofErr w:type="spellStart"/>
+      <w:r>
+        <w:rPr>
+          <w:i/>
+          <w:iCs/>
+        </w:rPr>
+        <w:t>Compose</w:t>
+      </w:r>
+      <w:proofErr w:type="spellEnd"/>
+      <w:r>
+        <w:rPr>
+          <w:i/>
+          <w:iCs/>
+        </w:rPr>
+        <w:t xml:space="preserve"> (</w:t>
+      </w:r>
+      <w:proofErr w:type="spellStart"/>
+      <w:r>
+        <w:rPr>
+          <w:i/>
+          <w:iCs/>
+        </w:rPr>
+        <w:t>User</w:t>
+      </w:r>
+      <w:proofErr w:type="spellEnd"/>
+      <w:r>
+        <w:rPr>
+          <w:i/>
+          <w:iCs/>
+        </w:rPr>
+        <w:t xml:space="preserve"> input). </w:t>
+      </w:r>
+      <w:r>
+        <w:t xml:space="preserve">Google. </w:t>
+      </w:r>
+      <w:hyperlink r:id="rId19" w:history="1">
+        <w:r>
+          <w:rPr>
+            <w:rStyle w:val="Hipervnculo"/>
+          </w:rPr>
+          <w:t>https://developer.android.com/develop/ui/compose/text/user-input?hl=es-419&amp;textfield=state-based</w:t>
+        </w:r>
+      </w:hyperlink>
+    </w:p>
+    <w:p>
+      <w:pPr>
+        <w:pStyle w:val="Textomemoria"/>
+      </w:pPr>
+    </w:p>
+    <w:p>
+      <w:pPr>
+        <w:pStyle w:val="Textomemoria"/>
+      </w:pPr>
+      <w:proofErr w:type="spellStart"/>
+      <w:r>
+        <w:t>Firebase</w:t>
+      </w:r>
+      <w:proofErr w:type="spellEnd"/>
+      <w:r>
+        <w:t xml:space="preserve">. (s. f.). </w:t>
+      </w:r>
+      <w:proofErr w:type="spellStart"/>
+      <w:r>
+        <w:rPr>
+          <w:i/>
+          <w:iCs/>
+        </w:rPr>
+        <w:t>Authenticate</w:t>
+      </w:r>
+      <w:proofErr w:type="spellEnd"/>
+      <w:r>
+        <w:rPr>
+          <w:i/>
+          <w:iCs/>
+        </w:rPr>
+        <w:t xml:space="preserve"> </w:t>
+      </w:r>
+      <w:proofErr w:type="spellStart"/>
+      <w:r>
+        <w:rPr>
+          <w:i/>
+          <w:iCs/>
+        </w:rPr>
+        <w:t>with</w:t>
+      </w:r>
+      <w:proofErr w:type="spellEnd"/>
+      <w:r>
+        <w:rPr>
+          <w:i/>
+          <w:iCs/>
+        </w:rPr>
+        <w:t xml:space="preserve"> </w:t>
+      </w:r>
+      <w:proofErr w:type="spellStart"/>
+      <w:r>
+        <w:rPr>
+          <w:i/>
+          <w:iCs/>
+        </w:rPr>
+        <w:t>Firebase</w:t>
+      </w:r>
+      <w:proofErr w:type="spellEnd"/>
+      <w:r>
+        <w:rPr>
+          <w:i/>
+          <w:iCs/>
+        </w:rPr>
+        <w:t xml:space="preserve"> </w:t>
+      </w:r>
+      <w:proofErr w:type="spellStart"/>
+      <w:r>
+        <w:rPr>
+          <w:i/>
+          <w:iCs/>
+        </w:rPr>
+        <w:t>using</w:t>
+      </w:r>
+      <w:proofErr w:type="spellEnd"/>
+      <w:r>
+        <w:rPr>
+          <w:i/>
+          <w:iCs/>
+        </w:rPr>
+        <w:t xml:space="preserve"> </w:t>
+      </w:r>
+      <w:proofErr w:type="spellStart"/>
+      <w:r>
+        <w:rPr>
+          <w:i/>
+          <w:iCs/>
+        </w:rPr>
+        <w:t>password-based</w:t>
+      </w:r>
+      <w:proofErr w:type="spellEnd"/>
+      <w:r>
+        <w:rPr>
+          <w:i/>
+          <w:iCs/>
+        </w:rPr>
+        <w:t xml:space="preserve"> </w:t>
+      </w:r>
+      <w:proofErr w:type="spellStart"/>
+      <w:r>
+        <w:rPr>
+          <w:i/>
+          <w:iCs/>
+        </w:rPr>
+        <w:t>accounts</w:t>
+      </w:r>
+      <w:proofErr w:type="spellEnd"/>
+      <w:r>
+        <w:rPr>
+          <w:i/>
+          <w:iCs/>
+        </w:rPr>
+        <w:t xml:space="preserve"> </w:t>
+      </w:r>
+      <w:proofErr w:type="spellStart"/>
+      <w:r>
+        <w:rPr>
+          <w:i/>
+          <w:iCs/>
+        </w:rPr>
+        <w:t>on</w:t>
+      </w:r>
+      <w:proofErr w:type="spellEnd"/>
+      <w:r>
+        <w:rPr>
+          <w:i/>
+          <w:iCs/>
+        </w:rPr>
+        <w:t xml:space="preserve"> Android. </w:t>
+      </w:r>
+      <w:r>
+        <w:t xml:space="preserve">Google. </w:t>
+      </w:r>
+      <w:hyperlink r:id="rId20" w:history="1">
+        <w:r>
+          <w:rPr>
+            <w:rStyle w:val="Hipervnculo"/>
+          </w:rPr>
+          <w:t>https://firebase.google.com/docs/auth/android/password-auth</w:t>
+        </w:r>
+      </w:hyperlink>
+    </w:p>
+    <w:p>
+      <w:pPr>
+        <w:pStyle w:val="Textomemoria"/>
+      </w:pPr>
+    </w:p>
+    <w:p>
+      <w:pPr>
+        <w:pStyle w:val="Textomemoria"/>
+      </w:pPr>
+      <w:proofErr w:type="spellStart"/>
+      <w:r>
+        <w:t>Firebase</w:t>
+      </w:r>
+      <w:proofErr w:type="spellEnd"/>
+      <w:r>
+        <w:t xml:space="preserve">. (s. f.). </w:t>
+      </w:r>
+      <w:proofErr w:type="spellStart"/>
+      <w:r>
+        <w:rPr>
+          <w:i/>
+          <w:iCs/>
+        </w:rPr>
+        <w:t>Firebase</w:t>
+      </w:r>
+      <w:proofErr w:type="spellEnd"/>
+      <w:r>
+        <w:rPr>
+          <w:i/>
+          <w:iCs/>
+        </w:rPr>
+        <w:t xml:space="preserve"> </w:t>
+      </w:r>
+      <w:proofErr w:type="spellStart"/>
+      <w:r>
+        <w:rPr>
+          <w:i/>
+          <w:iCs/>
+        </w:rPr>
+        <w:t>Realtime</w:t>
+      </w:r>
+      <w:proofErr w:type="spellEnd"/>
+      <w:r>
+        <w:rPr>
+          <w:i/>
+          <w:iCs/>
+        </w:rPr>
+        <w:t xml:space="preserve"> </w:t>
+      </w:r>
+      <w:proofErr w:type="spellStart"/>
+      <w:r>
+        <w:rPr>
+          <w:i/>
+          <w:iCs/>
+        </w:rPr>
+        <w:t>Database</w:t>
+      </w:r>
+      <w:proofErr w:type="spellEnd"/>
+      <w:r>
+        <w:t xml:space="preserve">. Google. </w:t>
+      </w:r>
+      <w:hyperlink r:id="rId21" w:history="1">
+        <w:r>
+          <w:rPr>
+            <w:rStyle w:val="Hipervnculo"/>
+          </w:rPr>
+          <w:t>https://firebase.google.com/docs/database?hl=es-419</w:t>
+        </w:r>
+      </w:hyperlink>
+    </w:p>
+    <w:p>
+      <w:pPr>
+        <w:pStyle w:val="Textomemoria"/>
+      </w:pPr>
+    </w:p>
+    <w:p>
+      <w:pPr>
+        <w:pStyle w:val="Textomemoria"/>
+      </w:pPr>
+      <w:proofErr w:type="spellStart"/>
+      <w:r>
+        <w:t>Firebase</w:t>
+      </w:r>
+      <w:proofErr w:type="spellEnd"/>
+      <w:r>
+        <w:t xml:space="preserve">. (s. f.). </w:t>
+      </w:r>
+      <w:r>
+        <w:rPr>
+          <w:i/>
+          <w:iCs/>
+        </w:rPr>
+        <w:t xml:space="preserve">Introducción a </w:t>
+      </w:r>
+      <w:proofErr w:type="spellStart"/>
+      <w:r>
+        <w:rPr>
+          <w:i/>
+          <w:iCs/>
+        </w:rPr>
+        <w:t>Firebase</w:t>
+      </w:r>
+      <w:proofErr w:type="spellEnd"/>
+      <w:r>
+        <w:rPr>
+          <w:i/>
+          <w:iCs/>
+        </w:rPr>
+        <w:t xml:space="preserve"> </w:t>
+      </w:r>
+      <w:proofErr w:type="spellStart"/>
+      <w:r>
+        <w:rPr>
+          <w:i/>
+          <w:iCs/>
+        </w:rPr>
+        <w:t>Realtime</w:t>
+      </w:r>
+      <w:proofErr w:type="spellEnd"/>
+      <w:r>
+        <w:rPr>
+          <w:i/>
+          <w:iCs/>
+        </w:rPr>
+        <w:t xml:space="preserve"> </w:t>
+      </w:r>
+      <w:proofErr w:type="spellStart"/>
+      <w:r>
+        <w:rPr>
+          <w:i/>
+          <w:iCs/>
+        </w:rPr>
+        <w:t>Database</w:t>
+      </w:r>
+      <w:proofErr w:type="spellEnd"/>
+      <w:r>
+        <w:rPr>
+          <w:i/>
+          <w:iCs/>
+        </w:rPr>
+        <w:t xml:space="preserve"> en Android.</w:t>
+      </w:r>
+      <w:r>
+        <w:t xml:space="preserve"> Google. </w:t>
+      </w:r>
+      <w:hyperlink r:id="rId22" w:history="1">
+        <w:r>
+          <w:rPr>
+            <w:rStyle w:val="Hipervnculo"/>
+          </w:rPr>
+          <w:t>https://firebase.google.com/docs/database/android/start?hl=es-419</w:t>
+        </w:r>
+      </w:hyperlink>
+    </w:p>
+    <w:p>
+      <w:pPr>
+        <w:pStyle w:val="Textomemoria"/>
+      </w:pPr>
+    </w:p>
+    <w:p>
+      <w:pPr>
+        <w:pStyle w:val="Textomemoria"/>
+      </w:pPr>
+      <w:proofErr w:type="spellStart"/>
+      <w:r>
+        <w:t>Firebase</w:t>
+      </w:r>
+      <w:proofErr w:type="spellEnd"/>
+      <w:r>
+        <w:t xml:space="preserve">. (s. f.). </w:t>
+      </w:r>
+      <w:r>
+        <w:rPr>
+          <w:i/>
+          <w:iCs/>
+        </w:rPr>
+        <w:t>Leer y escribir datos en Android.</w:t>
+      </w:r>
+      <w:r>
+        <w:t xml:space="preserve"> Google. </w:t>
+      </w:r>
+      <w:hyperlink r:id="rId23" w:history="1">
+        <w:r>
+          <w:rPr>
+            <w:rStyle w:val="Hipervnculo"/>
+          </w:rPr>
+          <w:t>https://firebase.google.com/docs/database/android/read-and-write</w:t>
+        </w:r>
+      </w:hyperlink>
+    </w:p>
+    <w:p>
+      <w:pPr>
+        <w:pStyle w:val="Textomemoria"/>
+        <w:rPr>
+          <w:i/>
+          <w:iCs/>
+        </w:rPr>
+      </w:pPr>
+      <w:r>
+        <w:t xml:space="preserve">Tutoriales Programación Ya. (s. f.). </w:t>
+      </w:r>
+      <w:r>
+        <w:rPr>
+          <w:i/>
+          <w:iCs/>
+        </w:rPr>
+        <w:t xml:space="preserve">Componente </w:t>
+      </w:r>
+      <w:proofErr w:type="spellStart"/>
+      <w:r>
+        <w:rPr>
+          <w:i/>
+          <w:iCs/>
+        </w:rPr>
+        <w:t>Navigation</w:t>
+      </w:r>
+      <w:proofErr w:type="spellEnd"/>
+      <w:r>
+        <w:rPr>
+          <w:i/>
+          <w:iCs/>
+        </w:rPr>
+        <w:t xml:space="preserve"> (</w:t>
+      </w:r>
+      <w:proofErr w:type="spellStart"/>
+      <w:r>
+        <w:rPr>
+          <w:i/>
+          <w:iCs/>
+        </w:rPr>
+        <w:t>rememberNavController</w:t>
+      </w:r>
+      <w:proofErr w:type="spellEnd"/>
+      <w:r>
+        <w:rPr>
+          <w:i/>
+          <w:iCs/>
+        </w:rPr>
+        <w:t xml:space="preserve"> y </w:t>
+      </w:r>
+      <w:proofErr w:type="spellStart"/>
+      <w:r>
+        <w:rPr>
+          <w:i/>
+          <w:iCs/>
+        </w:rPr>
+        <w:t>NavHost</w:t>
+      </w:r>
+      <w:proofErr w:type="spellEnd"/>
+      <w:r>
+        <w:rPr>
+          <w:i/>
+          <w:iCs/>
+        </w:rPr>
+        <w:t xml:space="preserve">). </w:t>
+      </w:r>
+      <w:hyperlink r:id="rId24" w:history="1">
+        <w:r>
+          <w:rPr>
+            <w:rStyle w:val="Hipervnculo"/>
+          </w:rPr>
+          <w:t>https://www.tutorialesprogramacionya.com/composeya/detalleconcepto.php?punto=12&amp;codigo=12&amp;inicio=0</w:t>
+        </w:r>
+      </w:hyperlink>
+    </w:p>
+    <w:p>
+      <w:pPr>
+        <w:pStyle w:val="Textomemoria"/>
+      </w:pPr>
+      <w:r>
+        <w:t>Biblio pendiente de poner en Apa7:</w:t>
+      </w:r>
+    </w:p>
+    <w:p>
+      <w:pPr>
+        <w:pStyle w:val="Textomemoria"/>
+      </w:pPr>
+      <w:r>
+        <w:t>https://developer.android.com/develop/ui/compose/side-effects?hl=es-419</w:t>
+      </w:r>
+    </w:p>
+    <w:p>
+      <w:pPr>
+        <w:pStyle w:val="Textomemoria"/>
+      </w:pPr>
+    </w:p>
+    <w:sdt>
+      <w:sdtPr>
+        <w:rPr>
+          <w:rFonts w:asciiTheme="minorHAnsi" w:eastAsiaTheme="minorHAnsi" w:hAnsiTheme="minorHAnsi" w:cstheme="minorBidi"/>
+          <w:color w:val="auto"/>
+          <w:sz w:val="22"/>
+          <w:szCs w:val="22"/>
+        </w:rPr>
+        <w:id w:val="111145805"/>
+        <w:bibliography/>
+      </w:sdtPr>
+      <w:sdtContent>
+        <w:sdt>
+          <w:sdtPr>
+            <w:rPr>
+              <w:rFonts w:asciiTheme="minorHAnsi" w:eastAsiaTheme="minorHAnsi" w:hAnsiTheme="minorHAnsi" w:cstheme="minorBidi"/>
+              <w:color w:val="auto"/>
+              <w:sz w:val="22"/>
+              <w:szCs w:val="22"/>
+            </w:rPr>
+            <w:id w:val="-1248658148"/>
+            <w:docPartObj>
+              <w:docPartGallery w:val="Bibliographies"/>
+              <w:docPartUnique/>
+            </w:docPartObj>
+          </w:sdtPr>
+          <w:sdtContent>
+            <w:p>
+              <w:pPr>
+                <w:pStyle w:val="Ttulo1"/>
+              </w:pPr>
+            </w:p>
+            <w:p/>
+          </w:sdtContent>
+        </w:sdt>
+      </w:sdtContent>
+    </w:sdt>
+    <w:p>
+      <w:pPr>
+        <w:pStyle w:val="Textomemoria"/>
+      </w:pPr>
+    </w:p>
+    <w:p>
+      <w:pPr>
+        <w:pStyle w:val="Textomemoria"/>
+      </w:pPr>
+    </w:p>
+    <w:p>
+      <w:pPr>
+        <w:pStyle w:val="Textomemoria"/>
+      </w:pPr>
+    </w:p>
+    <w:p>
+      <w:pPr>
+        <w:pStyle w:val="Textomemoria"/>
       </w:pPr>
     </w:p>
     <w:p>
@@ -4976,32 +6294,12 @@
     </w:p>
     <w:p>
       <w:pPr>
-        <w:pStyle w:val="Estilo1"/>
-        <w:spacing w:before="0" w:line="360" w:lineRule="auto"/>
-        <w:jc w:val="both"/>
-        <w:rPr>
-          <w:color w:val="EE0000"/>
-        </w:rPr>
-      </w:pPr>
-    </w:p>
-    <w:p>
-      <w:pPr>
-        <w:pStyle w:val="Estilo1"/>
-        <w:spacing w:before="0" w:line="360" w:lineRule="auto"/>
-        <w:jc w:val="both"/>
-        <w:rPr>
-          <w:color w:val="EE0000"/>
-        </w:rPr>
-      </w:pPr>
-    </w:p>
-    <w:p>
-      <w:pPr>
         <w:spacing w:after="0" w:line="360" w:lineRule="auto"/>
         <w:jc w:val="both"/>
       </w:pPr>
     </w:p>
     <w:sectPr>
-      <w:footerReference w:type="default" r:id="rId14"/>
+      <w:footerReference w:type="default" r:id="rId25"/>
       <w:pgSz w:w="11906" w:h="16838"/>
       <w:pgMar w:top="1418" w:right="1418" w:bottom="1418" w:left="1701" w:header="709" w:footer="709" w:gutter="0"/>
       <w:pgNumType w:start="1"/>
@@ -5041,7 +6339,7 @@
 <w:ftr xmlns:wpc="http://schemas.microsoft.com/office/word/2010/wordprocessingCanvas" xmlns:cx="http://schemas.microsoft.com/office/drawing/2014/chartex" xmlns:cx1="http://schemas.microsoft.com/office/drawing/2015/9/8/chartex" xmlns:cx2="http://schemas.microsoft.com/office/drawing/2015/10/21/chartex" xmlns:cx3="http://schemas.microsoft.com/office/drawing/2016/5/9/chartex" xmlns:cx4="http://schemas.microsoft.com/office/drawing/2016/5/10/chartex" xmlns:cx5="http://schemas.microsoft.com/office/drawing/2016/5/11/chartex" xmlns:cx6="http://schemas.microsoft.com/office/drawing/2016/5/12/chartex" xmlns:cx7="http://schemas.microsoft.com/office/drawing/2016/5/13/chartex" xmlns:cx8="http://schemas.microsoft.com/office/drawing/2016/5/14/chartex" xmlns:mc="http://schemas.openxmlformats.org/markup-compatibility/2006" xmlns:aink="http://schemas.microsoft.com/office/drawing/2016/ink" xmlns:am3d="http://schemas.microsoft.com/office/drawing/2017/model3d" xmlns:o="urn:schemas-microsoft-com:office:office" xmlns:oel="http://schemas.microsoft.com/office/2019/extlst" xmlns:r="http://schemas.openxmlformats.org/officeDocument/2006/relationships" xmlns:m="http://schemas.openxmlformats.org/officeDocument/2006/math" xmlns:v="urn:schemas-microsoft-com:vml" xmlns:wp14="http://schemas.microsoft.com/office/word/2010/wordprocessingDrawing" xmlns:wp="http://schemas.openxmlformats.org/drawingml/2006/wordprocessingDrawing" xmlns:w10="urn:schemas-microsoft-com:office:word" xmlns:w="http://schemas.openxmlformats.org/wordprocessingml/2006/main" xmlns:w14="http://schemas.microsoft.com/office/word/2010/wordml" xmlns:w15="http://schemas.microsoft.com/office/word/2012/wordml" xmlns:w16cex="http://schemas.microsoft.com/office/word/2018/wordml/cex" xmlns:w16cid="http://schemas.microsoft.com/office/word/2016/wordml/cid" xmlns:w16="http://schemas.microsoft.com/office/word/2018/wordml" xmlns:w16du="http://schemas.microsoft.com/office/word/2023/wordml/word16du" xmlns:w16sdtdh="http://schemas.microsoft.com/office/word/2020/wordml/sdtdatahash" xmlns:w16sdtfl="http://schemas.microsoft.com/office/word/2024/wordml/sdtformatlock" xmlns:w16se="http://schemas.microsoft.com/office/word/2015/wordml/symex" xmlns:wpg="http://schemas.microsoft.com/office/word/2010/wordprocessingGroup" xmlns:wpi="http://schemas.microsoft.com/office/word/2010/wordprocessingInk" xmlns:wne="http://schemas.microsoft.com/office/word/2006/wordml" xmlns:wps="http://schemas.microsoft.com/office/word/2010/wordprocessingShape" mc:Ignorable="w14 w15 w16se w16cid w16 w16cex w16sdtdh w16sdtfl w16du wp14">
   <w:p>
     <w:pPr>
-      <w:pStyle w:val="Footer"/>
+      <w:pStyle w:val="Piedepgina"/>
     </w:pPr>
   </w:p>
 </w:ftr>
@@ -5065,7 +6363,7 @@
     <w:sdtContent>
       <w:p>
         <w:pPr>
-          <w:pStyle w:val="Footer"/>
+          <w:pStyle w:val="Piedepgina"/>
           <w:jc w:val="center"/>
         </w:pPr>
         <w:r>
@@ -5094,7 +6392,7 @@
   </w:sdt>
   <w:p>
     <w:pPr>
-      <w:pStyle w:val="Footer"/>
+      <w:pStyle w:val="Piedepgina"/>
     </w:pPr>
   </w:p>
 </w:ftr>
@@ -5415,6 +6713,92 @@
     </w:lvl>
   </w:abstractNum>
   <w:abstractNum w:abstractNumId="3" w15:restartNumberingAfterBreak="0">
+    <w:nsid w:val="08B255E1"/>
+    <w:multiLevelType w:val="multilevel"/>
+    <w:tmpl w:val="DAF8F170"/>
+    <w:lvl w:ilvl="0">
+      <w:start w:val="1"/>
+      <w:numFmt w:val="decimal"/>
+      <w:lvlText w:val="%1."/>
+      <w:lvlJc w:val="left"/>
+      <w:pPr>
+        <w:ind w:left="360" w:hanging="360"/>
+      </w:pPr>
+    </w:lvl>
+    <w:lvl w:ilvl="1">
+      <w:start w:val="1"/>
+      <w:numFmt w:val="decimal"/>
+      <w:lvlText w:val="%1.%2."/>
+      <w:lvlJc w:val="left"/>
+      <w:pPr>
+        <w:ind w:left="792" w:hanging="432"/>
+      </w:pPr>
+    </w:lvl>
+    <w:lvl w:ilvl="2">
+      <w:start w:val="1"/>
+      <w:numFmt w:val="decimal"/>
+      <w:lvlText w:val="%1.%2.%3."/>
+      <w:lvlJc w:val="left"/>
+      <w:pPr>
+        <w:ind w:left="1224" w:hanging="504"/>
+      </w:pPr>
+    </w:lvl>
+    <w:lvl w:ilvl="3">
+      <w:start w:val="1"/>
+      <w:numFmt w:val="decimal"/>
+      <w:lvlText w:val="%1.%2.%3.%4."/>
+      <w:lvlJc w:val="left"/>
+      <w:pPr>
+        <w:ind w:left="1728" w:hanging="648"/>
+      </w:pPr>
+    </w:lvl>
+    <w:lvl w:ilvl="4">
+      <w:start w:val="1"/>
+      <w:numFmt w:val="decimal"/>
+      <w:lvlText w:val="%1.%2.%3.%4.%5."/>
+      <w:lvlJc w:val="left"/>
+      <w:pPr>
+        <w:ind w:left="2232" w:hanging="792"/>
+      </w:pPr>
+    </w:lvl>
+    <w:lvl w:ilvl="5">
+      <w:start w:val="1"/>
+      <w:numFmt w:val="decimal"/>
+      <w:lvlText w:val="%1.%2.%3.%4.%5.%6."/>
+      <w:lvlJc w:val="left"/>
+      <w:pPr>
+        <w:ind w:left="2736" w:hanging="936"/>
+      </w:pPr>
+    </w:lvl>
+    <w:lvl w:ilvl="6">
+      <w:start w:val="1"/>
+      <w:numFmt w:val="decimal"/>
+      <w:lvlText w:val="%1.%2.%3.%4.%5.%6.%7."/>
+      <w:lvlJc w:val="left"/>
+      <w:pPr>
+        <w:ind w:left="3240" w:hanging="1080"/>
+      </w:pPr>
+    </w:lvl>
+    <w:lvl w:ilvl="7">
+      <w:start w:val="1"/>
+      <w:numFmt w:val="decimal"/>
+      <w:lvlText w:val="%1.%2.%3.%4.%5.%6.%7.%8."/>
+      <w:lvlJc w:val="left"/>
+      <w:pPr>
+        <w:ind w:left="3744" w:hanging="1224"/>
+      </w:pPr>
+    </w:lvl>
+    <w:lvl w:ilvl="8">
+      <w:start w:val="1"/>
+      <w:numFmt w:val="decimal"/>
+      <w:lvlText w:val="%1.%2.%3.%4.%5.%6.%7.%8.%9."/>
+      <w:lvlJc w:val="left"/>
+      <w:pPr>
+        <w:ind w:left="4320" w:hanging="1440"/>
+      </w:pPr>
+    </w:lvl>
+  </w:abstractNum>
+  <w:abstractNum w:abstractNumId="4" w15:restartNumberingAfterBreak="0">
     <w:nsid w:val="0AF9227D"/>
     <w:multiLevelType w:val="hybridMultilevel"/>
     <w:tmpl w:val="F39079C4"/>
@@ -5526,7 +6910,7 @@
       </w:rPr>
     </w:lvl>
   </w:abstractNum>
-  <w:abstractNum w:abstractNumId="4" w15:restartNumberingAfterBreak="0">
+  <w:abstractNum w:abstractNumId="5" w15:restartNumberingAfterBreak="0">
     <w:nsid w:val="0B027818"/>
     <w:multiLevelType w:val="multilevel"/>
     <w:tmpl w:val="0C0A001F"/>
@@ -5639,7 +7023,7 @@
       </w:rPr>
     </w:lvl>
   </w:abstractNum>
-  <w:abstractNum w:abstractNumId="5" w15:restartNumberingAfterBreak="0">
+  <w:abstractNum w:abstractNumId="6" w15:restartNumberingAfterBreak="0">
     <w:nsid w:val="0D774925"/>
     <w:multiLevelType w:val="multilevel"/>
     <w:tmpl w:val="0C0A001F"/>
@@ -5725,7 +7109,7 @@
       </w:pPr>
     </w:lvl>
   </w:abstractNum>
-  <w:abstractNum w:abstractNumId="6" w15:restartNumberingAfterBreak="0">
+  <w:abstractNum w:abstractNumId="7" w15:restartNumberingAfterBreak="0">
     <w:nsid w:val="10360ED3"/>
     <w:multiLevelType w:val="hybridMultilevel"/>
     <w:tmpl w:val="FC46B520"/>
@@ -5814,7 +7198,7 @@
       </w:pPr>
     </w:lvl>
   </w:abstractNum>
-  <w:abstractNum w:abstractNumId="7" w15:restartNumberingAfterBreak="0">
+  <w:abstractNum w:abstractNumId="8" w15:restartNumberingAfterBreak="0">
     <w:nsid w:val="16185900"/>
     <w:multiLevelType w:val="hybridMultilevel"/>
     <w:tmpl w:val="5F58324A"/>
@@ -5900,7 +7284,7 @@
       </w:pPr>
     </w:lvl>
   </w:abstractNum>
-  <w:abstractNum w:abstractNumId="8" w15:restartNumberingAfterBreak="0">
+  <w:abstractNum w:abstractNumId="9" w15:restartNumberingAfterBreak="0">
     <w:nsid w:val="24E17392"/>
     <w:multiLevelType w:val="multilevel"/>
     <w:tmpl w:val="B9E41576"/>
@@ -6021,7 +7405,7 @@
       </w:rPr>
     </w:lvl>
   </w:abstractNum>
-  <w:abstractNum w:abstractNumId="9" w15:restartNumberingAfterBreak="0">
+  <w:abstractNum w:abstractNumId="10" w15:restartNumberingAfterBreak="0">
     <w:nsid w:val="39801D78"/>
     <w:multiLevelType w:val="hybridMultilevel"/>
     <w:tmpl w:val="EB2CBD46"/>
@@ -6110,7 +7494,7 @@
       </w:pPr>
     </w:lvl>
   </w:abstractNum>
-  <w:abstractNum w:abstractNumId="10" w15:restartNumberingAfterBreak="0">
+  <w:abstractNum w:abstractNumId="11" w15:restartNumberingAfterBreak="0">
     <w:nsid w:val="3AC4255F"/>
     <w:multiLevelType w:val="hybridMultilevel"/>
     <w:tmpl w:val="14F202A4"/>
@@ -6199,7 +7583,7 @@
       </w:pPr>
     </w:lvl>
   </w:abstractNum>
-  <w:abstractNum w:abstractNumId="11" w15:restartNumberingAfterBreak="0">
+  <w:abstractNum w:abstractNumId="12" w15:restartNumberingAfterBreak="0">
     <w:nsid w:val="41360226"/>
     <w:multiLevelType w:val="hybridMultilevel"/>
     <w:tmpl w:val="98825662"/>
@@ -6311,7 +7695,7 @@
       </w:rPr>
     </w:lvl>
   </w:abstractNum>
-  <w:abstractNum w:abstractNumId="12" w15:restartNumberingAfterBreak="0">
+  <w:abstractNum w:abstractNumId="13" w15:restartNumberingAfterBreak="0">
     <w:nsid w:val="45AC27D2"/>
     <w:multiLevelType w:val="hybridMultilevel"/>
     <w:tmpl w:val="B6BAA71E"/>
@@ -6424,7 +7808,7 @@
       </w:rPr>
     </w:lvl>
   </w:abstractNum>
-  <w:abstractNum w:abstractNumId="13" w15:restartNumberingAfterBreak="0">
+  <w:abstractNum w:abstractNumId="14" w15:restartNumberingAfterBreak="0">
     <w:nsid w:val="46767291"/>
     <w:multiLevelType w:val="hybridMultilevel"/>
     <w:tmpl w:val="07B88058"/>
@@ -6510,7 +7894,7 @@
       </w:pPr>
     </w:lvl>
   </w:abstractNum>
-  <w:abstractNum w:abstractNumId="14" w15:restartNumberingAfterBreak="0">
+  <w:abstractNum w:abstractNumId="15" w15:restartNumberingAfterBreak="0">
     <w:nsid w:val="582D00AC"/>
     <w:multiLevelType w:val="hybridMultilevel"/>
     <w:tmpl w:val="FD124986"/>
@@ -6630,17 +8014,130 @@
       </w:rPr>
     </w:lvl>
   </w:abstractNum>
+  <w:abstractNum w:abstractNumId="16" w15:restartNumberingAfterBreak="0">
+    <w:nsid w:val="71E245E0"/>
+    <w:multiLevelType w:val="multilevel"/>
+    <w:tmpl w:val="EDB61152"/>
+    <w:lvl w:ilvl="0">
+      <w:start w:val="6"/>
+      <w:numFmt w:val="decimal"/>
+      <w:lvlText w:val="%1"/>
+      <w:lvlJc w:val="left"/>
+      <w:pPr>
+        <w:ind w:left="462" w:hanging="462"/>
+      </w:pPr>
+      <w:rPr>
+        <w:rFonts w:hint="default"/>
+      </w:rPr>
+    </w:lvl>
+    <w:lvl w:ilvl="1">
+      <w:start w:val="6"/>
+      <w:numFmt w:val="decimal"/>
+      <w:lvlText w:val="%1.%2"/>
+      <w:lvlJc w:val="left"/>
+      <w:pPr>
+        <w:ind w:left="1080" w:hanging="720"/>
+      </w:pPr>
+      <w:rPr>
+        <w:rFonts w:hint="default"/>
+      </w:rPr>
+    </w:lvl>
+    <w:lvl w:ilvl="2">
+      <w:start w:val="1"/>
+      <w:numFmt w:val="decimal"/>
+      <w:lvlText w:val="%1.%2.%3"/>
+      <w:lvlJc w:val="left"/>
+      <w:pPr>
+        <w:ind w:left="1800" w:hanging="1080"/>
+      </w:pPr>
+      <w:rPr>
+        <w:rFonts w:hint="default"/>
+      </w:rPr>
+    </w:lvl>
+    <w:lvl w:ilvl="3">
+      <w:start w:val="1"/>
+      <w:numFmt w:val="decimal"/>
+      <w:lvlText w:val="%1.%2.%3.%4"/>
+      <w:lvlJc w:val="left"/>
+      <w:pPr>
+        <w:ind w:left="2520" w:hanging="1440"/>
+      </w:pPr>
+      <w:rPr>
+        <w:rFonts w:hint="default"/>
+      </w:rPr>
+    </w:lvl>
+    <w:lvl w:ilvl="4">
+      <w:start w:val="1"/>
+      <w:numFmt w:val="decimal"/>
+      <w:lvlText w:val="%1.%2.%3.%4.%5"/>
+      <w:lvlJc w:val="left"/>
+      <w:pPr>
+        <w:ind w:left="3240" w:hanging="1800"/>
+      </w:pPr>
+      <w:rPr>
+        <w:rFonts w:hint="default"/>
+      </w:rPr>
+    </w:lvl>
+    <w:lvl w:ilvl="5">
+      <w:start w:val="1"/>
+      <w:numFmt w:val="decimal"/>
+      <w:lvlText w:val="%1.%2.%3.%4.%5.%6"/>
+      <w:lvlJc w:val="left"/>
+      <w:pPr>
+        <w:ind w:left="3960" w:hanging="2160"/>
+      </w:pPr>
+      <w:rPr>
+        <w:rFonts w:hint="default"/>
+      </w:rPr>
+    </w:lvl>
+    <w:lvl w:ilvl="6">
+      <w:start w:val="1"/>
+      <w:numFmt w:val="decimal"/>
+      <w:lvlText w:val="%1.%2.%3.%4.%5.%6.%7"/>
+      <w:lvlJc w:val="left"/>
+      <w:pPr>
+        <w:ind w:left="4680" w:hanging="2520"/>
+      </w:pPr>
+      <w:rPr>
+        <w:rFonts w:hint="default"/>
+      </w:rPr>
+    </w:lvl>
+    <w:lvl w:ilvl="7">
+      <w:start w:val="1"/>
+      <w:numFmt w:val="decimal"/>
+      <w:lvlText w:val="%1.%2.%3.%4.%5.%6.%7.%8"/>
+      <w:lvlJc w:val="left"/>
+      <w:pPr>
+        <w:ind w:left="5400" w:hanging="2880"/>
+      </w:pPr>
+      <w:rPr>
+        <w:rFonts w:hint="default"/>
+      </w:rPr>
+    </w:lvl>
+    <w:lvl w:ilvl="8">
+      <w:start w:val="1"/>
+      <w:numFmt w:val="decimal"/>
+      <w:lvlText w:val="%1.%2.%3.%4.%5.%6.%7.%8.%9"/>
+      <w:lvlJc w:val="left"/>
+      <w:pPr>
+        <w:ind w:left="5760" w:hanging="2880"/>
+      </w:pPr>
+      <w:rPr>
+        <w:rFonts w:hint="default"/>
+      </w:rPr>
+    </w:lvl>
+  </w:abstractNum>
   <w:num w:numId="1" w16cid:durableId="1917937008">
-    <w:abstractNumId w:val="14"/>
+    <w:abstractNumId w:val="15"/>
   </w:num>
   <w:num w:numId="2" w16cid:durableId="2057073281">
-    <w:abstractNumId w:val="8"/>
+    <w:abstractNumId w:val="9"/>
   </w:num>
   <w:num w:numId="3" w16cid:durableId="1868373036">
-    <w:abstractNumId w:val="4"/>
+    <w:abstractNumId w:val="5"/>
   </w:num>
   <w:num w:numId="4" w16cid:durableId="911045009">
-    <w:abstractNumId w:val="5"/>
+    <w:abstractNumId w:val="6"/>
   </w:num>
   <w:num w:numId="5" w16cid:durableId="1120874265">
     <w:abstractNumId w:val="2"/>
@@ -6649,31 +8146,37 @@
     <w:abstractNumId w:val="0"/>
   </w:num>
   <w:num w:numId="7" w16cid:durableId="1453088802">
-    <w:abstractNumId w:val="12"/>
+    <w:abstractNumId w:val="13"/>
   </w:num>
   <w:num w:numId="8" w16cid:durableId="1464690908">
-    <w:abstractNumId w:val="7"/>
+    <w:abstractNumId w:val="8"/>
   </w:num>
   <w:num w:numId="9" w16cid:durableId="1924947596">
     <w:abstractNumId w:val="1"/>
   </w:num>
   <w:num w:numId="10" w16cid:durableId="1341590872">
+    <w:abstractNumId w:val="12"/>
+  </w:num>
+  <w:num w:numId="11" w16cid:durableId="1028019830">
+    <w:abstractNumId w:val="4"/>
+  </w:num>
+  <w:num w:numId="12" w16cid:durableId="1327710450">
+    <w:abstractNumId w:val="7"/>
+  </w:num>
+  <w:num w:numId="13" w16cid:durableId="1602294469">
     <w:abstractNumId w:val="11"/>
   </w:num>
-  <w:num w:numId="11" w16cid:durableId="1028019830">
+  <w:num w:numId="14" w16cid:durableId="605893345">
+    <w:abstractNumId w:val="10"/>
+  </w:num>
+  <w:num w:numId="15" w16cid:durableId="2040469636">
+    <w:abstractNumId w:val="14"/>
+  </w:num>
+  <w:num w:numId="16" w16cid:durableId="1498840191">
     <w:abstractNumId w:val="3"/>
   </w:num>
-  <w:num w:numId="12" w16cid:durableId="1327710450">
-    <w:abstractNumId w:val="6"/>
-  </w:num>
-  <w:num w:numId="13" w16cid:durableId="1602294469">
-    <w:abstractNumId w:val="10"/>
-  </w:num>
-  <w:num w:numId="14" w16cid:durableId="605893345">
-    <w:abstractNumId w:val="9"/>
-  </w:num>
-  <w:num w:numId="15" w16cid:durableId="2040469636">
-    <w:abstractNumId w:val="13"/>
+  <w:num w:numId="17" w16cid:durableId="1764299614">
+    <w:abstractNumId w:val="16"/>
   </w:num>
 </w:numbering>
 </file>
@@ -7076,12 +8579,13 @@
   <w:style w:type="paragraph" w:default="1" w:styleId="Normal">
     <w:name w:val="Normal"/>
     <w:qFormat/>
+    <w:rsid w:val="00C82473"/>
   </w:style>
-  <w:style w:type="paragraph" w:styleId="Heading1">
+  <w:style w:type="paragraph" w:styleId="Ttulo1">
     <w:name w:val="heading 1"/>
     <w:basedOn w:val="Normal"/>
     <w:next w:val="Normal"/>
-    <w:link w:val="Heading1Char"/>
+    <w:link w:val="Ttulo1Car"/>
     <w:uiPriority w:val="9"/>
     <w:qFormat/>
     <w:rsid w:val="00014B39"/>
@@ -7098,11 +8602,11 @@
       <w:szCs w:val="32"/>
     </w:rPr>
   </w:style>
-  <w:style w:type="paragraph" w:styleId="Heading2">
+  <w:style w:type="paragraph" w:styleId="Ttulo2">
     <w:name w:val="heading 2"/>
     <w:basedOn w:val="Normal"/>
     <w:next w:val="Normal"/>
-    <w:link w:val="Heading2Char"/>
+    <w:link w:val="Ttulo2Car"/>
     <w:uiPriority w:val="9"/>
     <w:unhideWhenUsed/>
     <w:qFormat/>
@@ -7120,11 +8624,11 @@
       <w:szCs w:val="26"/>
     </w:rPr>
   </w:style>
-  <w:style w:type="paragraph" w:styleId="Heading3">
+  <w:style w:type="paragraph" w:styleId="Ttulo3">
     <w:name w:val="heading 3"/>
     <w:basedOn w:val="Normal"/>
     <w:next w:val="Normal"/>
-    <w:link w:val="Heading3Char"/>
+    <w:link w:val="Ttulo3Car"/>
     <w:uiPriority w:val="9"/>
     <w:semiHidden/>
     <w:unhideWhenUsed/>
@@ -7143,11 +8647,11 @@
       <w:szCs w:val="24"/>
     </w:rPr>
   </w:style>
-  <w:style w:type="paragraph" w:styleId="Heading4">
+  <w:style w:type="paragraph" w:styleId="Ttulo4">
     <w:name w:val="heading 4"/>
     <w:basedOn w:val="Normal"/>
     <w:next w:val="Normal"/>
-    <w:link w:val="Heading4Char"/>
+    <w:link w:val="Ttulo4Car"/>
     <w:uiPriority w:val="9"/>
     <w:semiHidden/>
     <w:unhideWhenUsed/>
@@ -7166,12 +8670,13 @@
       <w:color w:val="2F5496" w:themeColor="accent1" w:themeShade="BF"/>
     </w:rPr>
   </w:style>
-  <w:style w:type="character" w:default="1" w:styleId="DefaultParagraphFont">
+  <w:style w:type="character" w:default="1" w:styleId="Fuentedeprrafopredeter">
     <w:name w:val="Default Paragraph Font"/>
     <w:uiPriority w:val="1"/>
+    <w:semiHidden/>
     <w:unhideWhenUsed/>
   </w:style>
-  <w:style w:type="table" w:default="1" w:styleId="TableNormal">
+  <w:style w:type="table" w:default="1" w:styleId="Tablanormal">
     <w:name w:val="Normal Table"/>
     <w:uiPriority w:val="99"/>
     <w:semiHidden/>
@@ -7186,16 +8691,16 @@
       </w:tblCellMar>
     </w:tblPr>
   </w:style>
-  <w:style w:type="numbering" w:default="1" w:styleId="NoList">
+  <w:style w:type="numbering" w:default="1" w:styleId="Sinlista">
     <w:name w:val="No List"/>
     <w:uiPriority w:val="99"/>
     <w:semiHidden/>
     <w:unhideWhenUsed/>
   </w:style>
-  <w:style w:type="character" w:customStyle="1" w:styleId="Heading1Char">
-    <w:name w:val="Heading 1 Char"/>
-    <w:basedOn w:val="DefaultParagraphFont"/>
-    <w:link w:val="Heading1"/>
+  <w:style w:type="character" w:customStyle="1" w:styleId="Ttulo1Car">
+    <w:name w:val="Título 1 Car"/>
+    <w:basedOn w:val="Fuentedeprrafopredeter"/>
+    <w:link w:val="Ttulo1"/>
     <w:uiPriority w:val="9"/>
     <w:rsid w:val="00014B39"/>
     <w:rPr>
@@ -7207,7 +8712,7 @@
   </w:style>
   <w:style w:type="paragraph" w:customStyle="1" w:styleId="Estilo1">
     <w:name w:val="Estilo1"/>
-    <w:basedOn w:val="Heading1"/>
+    <w:basedOn w:val="Ttulo1"/>
     <w:link w:val="Estilo1Car"/>
     <w:qFormat/>
     <w:rsid w:val="00014B39"/>
@@ -7217,7 +8722,7 @@
   </w:style>
   <w:style w:type="character" w:customStyle="1" w:styleId="Estilo1Car">
     <w:name w:val="Estilo1 Car"/>
-    <w:basedOn w:val="Heading1Char"/>
+    <w:basedOn w:val="Ttulo1Car"/>
     <w:link w:val="Estilo1"/>
     <w:rsid w:val="00014B39"/>
     <w:rPr>
@@ -7227,7 +8732,7 @@
       <w:szCs w:val="32"/>
     </w:rPr>
   </w:style>
-  <w:style w:type="paragraph" w:styleId="ListParagraph">
+  <w:style w:type="paragraph" w:styleId="Prrafodelista">
     <w:name w:val="List Paragraph"/>
     <w:basedOn w:val="Normal"/>
     <w:uiPriority w:val="34"/>
@@ -7250,17 +8755,17 @@
   </w:style>
   <w:style w:type="character" w:customStyle="1" w:styleId="TextomemoriaCar">
     <w:name w:val="Texto memoria Car"/>
-    <w:basedOn w:val="DefaultParagraphFont"/>
+    <w:basedOn w:val="Fuentedeprrafopredeter"/>
     <w:link w:val="Textomemoria"/>
     <w:rsid w:val="00310023"/>
     <w:rPr>
       <w:rFonts w:ascii="Verdana" w:hAnsi="Verdana"/>
     </w:rPr>
   </w:style>
-  <w:style w:type="paragraph" w:styleId="Header">
+  <w:style w:type="paragraph" w:styleId="Encabezado">
     <w:name w:val="header"/>
     <w:basedOn w:val="Normal"/>
-    <w:link w:val="HeaderChar"/>
+    <w:link w:val="EncabezadoCar"/>
     <w:uiPriority w:val="99"/>
     <w:unhideWhenUsed/>
     <w:rsid w:val="00B13784"/>
@@ -7272,17 +8777,17 @@
       <w:spacing w:after="0" w:line="240" w:lineRule="auto"/>
     </w:pPr>
   </w:style>
-  <w:style w:type="character" w:customStyle="1" w:styleId="HeaderChar">
-    <w:name w:val="Header Char"/>
-    <w:basedOn w:val="DefaultParagraphFont"/>
-    <w:link w:val="Header"/>
+  <w:style w:type="character" w:customStyle="1" w:styleId="EncabezadoCar">
+    <w:name w:val="Encabezado Car"/>
+    <w:basedOn w:val="Fuentedeprrafopredeter"/>
+    <w:link w:val="Encabezado"/>
     <w:uiPriority w:val="99"/>
     <w:rsid w:val="00B13784"/>
   </w:style>
-  <w:style w:type="paragraph" w:styleId="Footer">
+  <w:style w:type="paragraph" w:styleId="Piedepgina">
     <w:name w:val="footer"/>
     <w:basedOn w:val="Normal"/>
-    <w:link w:val="FooterChar"/>
+    <w:link w:val="PiedepginaCar"/>
     <w:uiPriority w:val="99"/>
     <w:unhideWhenUsed/>
     <w:rsid w:val="00B13784"/>
@@ -7294,16 +8799,16 @@
       <w:spacing w:after="0" w:line="240" w:lineRule="auto"/>
     </w:pPr>
   </w:style>
-  <w:style w:type="character" w:customStyle="1" w:styleId="FooterChar">
-    <w:name w:val="Footer Char"/>
-    <w:basedOn w:val="DefaultParagraphFont"/>
-    <w:link w:val="Footer"/>
+  <w:style w:type="character" w:customStyle="1" w:styleId="PiedepginaCar">
+    <w:name w:val="Pie de página Car"/>
+    <w:basedOn w:val="Fuentedeprrafopredeter"/>
+    <w:link w:val="Piedepgina"/>
     <w:uiPriority w:val="99"/>
     <w:rsid w:val="00B13784"/>
   </w:style>
-  <w:style w:type="paragraph" w:styleId="TOCHeading">
+  <w:style w:type="paragraph" w:styleId="TtuloTDC">
     <w:name w:val="TOC Heading"/>
-    <w:basedOn w:val="Heading1"/>
+    <w:basedOn w:val="Ttulo1"/>
     <w:next w:val="Normal"/>
     <w:uiPriority w:val="39"/>
     <w:unhideWhenUsed/>
@@ -7316,7 +8821,7 @@
       <w:lang w:eastAsia="es-ES"/>
     </w:rPr>
   </w:style>
-  <w:style w:type="paragraph" w:styleId="TOC1">
+  <w:style w:type="paragraph" w:styleId="TDC1">
     <w:name w:val="toc 1"/>
     <w:basedOn w:val="Normal"/>
     <w:next w:val="Normal"/>
@@ -7328,9 +8833,9 @@
       <w:spacing w:after="100"/>
     </w:pPr>
   </w:style>
-  <w:style w:type="character" w:styleId="Hyperlink">
+  <w:style w:type="character" w:styleId="Hipervnculo">
     <w:name w:val="Hyperlink"/>
-    <w:basedOn w:val="DefaultParagraphFont"/>
+    <w:basedOn w:val="Fuentedeprrafopredeter"/>
     <w:uiPriority w:val="99"/>
     <w:unhideWhenUsed/>
     <w:rsid w:val="00B13784"/>
@@ -7352,9 +8857,9 @@
       <w:szCs w:val="24"/>
     </w:rPr>
   </w:style>
-  <w:style w:type="character" w:styleId="Strong">
+  <w:style w:type="character" w:styleId="Textoennegrita">
     <w:name w:val="Strong"/>
-    <w:basedOn w:val="DefaultParagraphFont"/>
+    <w:basedOn w:val="Fuentedeprrafopredeter"/>
     <w:uiPriority w:val="22"/>
     <w:qFormat/>
     <w:rsid w:val="00DC441B"/>
@@ -7363,10 +8868,10 @@
       <w:bCs/>
     </w:rPr>
   </w:style>
-  <w:style w:type="character" w:customStyle="1" w:styleId="Heading4Char">
-    <w:name w:val="Heading 4 Char"/>
-    <w:basedOn w:val="DefaultParagraphFont"/>
-    <w:link w:val="Heading4"/>
+  <w:style w:type="character" w:customStyle="1" w:styleId="Ttulo4Car">
+    <w:name w:val="Título 4 Car"/>
+    <w:basedOn w:val="Fuentedeprrafopredeter"/>
+    <w:link w:val="Ttulo4"/>
     <w:uiPriority w:val="9"/>
     <w:semiHidden/>
     <w:rsid w:val="00DC441B"/>
@@ -7377,7 +8882,7 @@
       <w:color w:val="2F5496" w:themeColor="accent1" w:themeShade="BF"/>
     </w:rPr>
   </w:style>
-  <w:style w:type="paragraph" w:styleId="TOC2">
+  <w:style w:type="paragraph" w:styleId="TDC2">
     <w:name w:val="toc 2"/>
     <w:basedOn w:val="Normal"/>
     <w:next w:val="Normal"/>
@@ -7394,7 +8899,7 @@
       <w:lang w:val="en-US"/>
     </w:rPr>
   </w:style>
-  <w:style w:type="paragraph" w:styleId="TOC3">
+  <w:style w:type="paragraph" w:styleId="TDC3">
     <w:name w:val="toc 3"/>
     <w:basedOn w:val="Normal"/>
     <w:next w:val="Normal"/>
@@ -7411,7 +8916,7 @@
       <w:lang w:val="en-US"/>
     </w:rPr>
   </w:style>
-  <w:style w:type="paragraph" w:styleId="TOC5">
+  <w:style w:type="paragraph" w:styleId="TDC5">
     <w:name w:val="toc 5"/>
     <w:basedOn w:val="Normal"/>
     <w:next w:val="Normal"/>
@@ -7425,10 +8930,10 @@
       <w:ind w:left="880"/>
     </w:pPr>
   </w:style>
-  <w:style w:type="character" w:customStyle="1" w:styleId="Heading2Char">
-    <w:name w:val="Heading 2 Char"/>
-    <w:basedOn w:val="DefaultParagraphFont"/>
-    <w:link w:val="Heading2"/>
+  <w:style w:type="character" w:customStyle="1" w:styleId="Ttulo2Car">
+    <w:name w:val="Título 2 Car"/>
+    <w:basedOn w:val="Fuentedeprrafopredeter"/>
+    <w:link w:val="Ttulo2"/>
     <w:uiPriority w:val="9"/>
     <w:rsid w:val="00FA3C79"/>
     <w:rPr>
@@ -7438,10 +8943,10 @@
       <w:szCs w:val="26"/>
     </w:rPr>
   </w:style>
-  <w:style w:type="character" w:customStyle="1" w:styleId="Heading3Char">
-    <w:name w:val="Heading 3 Char"/>
-    <w:basedOn w:val="DefaultParagraphFont"/>
-    <w:link w:val="Heading3"/>
+  <w:style w:type="character" w:customStyle="1" w:styleId="Ttulo3Car">
+    <w:name w:val="Título 3 Car"/>
+    <w:basedOn w:val="Fuentedeprrafopredeter"/>
+    <w:link w:val="Ttulo3"/>
     <w:uiPriority w:val="9"/>
     <w:semiHidden/>
     <w:rsid w:val="00D7623B"/>
@@ -7451,6 +8956,56 @@
       <w:sz w:val="24"/>
       <w:szCs w:val="24"/>
     </w:rPr>
+  </w:style>
+  <w:style w:type="paragraph" w:styleId="Descripcin">
+    <w:name w:val="caption"/>
+    <w:basedOn w:val="Normal"/>
+    <w:next w:val="Normal"/>
+    <w:uiPriority w:val="35"/>
+    <w:unhideWhenUsed/>
+    <w:qFormat/>
+    <w:rsid w:val="00FD45B4"/>
+    <w:pPr>
+      <w:spacing w:after="200" w:line="240" w:lineRule="auto"/>
+    </w:pPr>
+    <w:rPr>
+      <w:i/>
+      <w:iCs/>
+      <w:color w:val="44546A" w:themeColor="text2"/>
+      <w:sz w:val="18"/>
+      <w:szCs w:val="18"/>
+    </w:rPr>
+  </w:style>
+  <w:style w:type="character" w:styleId="nfasis">
+    <w:name w:val="Emphasis"/>
+    <w:basedOn w:val="Fuentedeprrafopredeter"/>
+    <w:uiPriority w:val="20"/>
+    <w:qFormat/>
+    <w:rsid w:val="00C82473"/>
+    <w:rPr>
+      <w:i/>
+      <w:iCs/>
+    </w:rPr>
+  </w:style>
+  <w:style w:type="character" w:styleId="Mencinsinresolver">
+    <w:name w:val="Unresolved Mention"/>
+    <w:basedOn w:val="Fuentedeprrafopredeter"/>
+    <w:uiPriority w:val="99"/>
+    <w:semiHidden/>
+    <w:unhideWhenUsed/>
+    <w:rsid w:val="00C82473"/>
+    <w:rPr>
+      <w:color w:val="605E5C"/>
+      <w:shd w:val="clear" w:color="auto" w:fill="E1DFDD"/>
+    </w:rPr>
+  </w:style>
+  <w:style w:type="paragraph" w:styleId="Bibliografa">
+    <w:name w:val="Bibliography"/>
+    <w:basedOn w:val="Normal"/>
+    <w:next w:val="Normal"/>
+    <w:uiPriority w:val="37"/>
+    <w:unhideWhenUsed/>
+    <w:rsid w:val="00BC3787"/>
   </w:style>
 </w:styles>
 </file>

</xml_diff>

<commit_message>
Update: Memoria with Logo
</commit_message>
<xml_diff>
--- a/Memoria.docx
+++ b/Memoria.docx
@@ -64,38 +64,61 @@
     <w:p>
       <w:pPr>
         <w:spacing w:after="0" w:line="360" w:lineRule="auto"/>
-        <w:jc w:val="both"/>
-      </w:pPr>
-    </w:p>
-    <w:p>
-      <w:pPr>
-        <w:spacing w:after="0" w:line="360" w:lineRule="auto"/>
-        <w:jc w:val="both"/>
-      </w:pPr>
-    </w:p>
-    <w:p>
-      <w:pPr>
-        <w:spacing w:after="0" w:line="360" w:lineRule="auto"/>
-        <w:jc w:val="both"/>
-      </w:pPr>
-    </w:p>
-    <w:p>
-      <w:pPr>
-        <w:spacing w:after="0" w:line="360" w:lineRule="auto"/>
-        <w:jc w:val="both"/>
-      </w:pPr>
-    </w:p>
-    <w:p>
-      <w:pPr>
-        <w:spacing w:after="0" w:line="360" w:lineRule="auto"/>
-        <w:jc w:val="both"/>
-      </w:pPr>
-    </w:p>
-    <w:p>
-      <w:pPr>
-        <w:spacing w:after="0" w:line="360" w:lineRule="auto"/>
-        <w:jc w:val="both"/>
-      </w:pPr>
+        <w:jc w:val="center"/>
+      </w:pPr>
+      <w:r>
+        <w:rPr>
+          <w:noProof/>
+        </w:rPr>
+        <w:drawing>
+          <wp:inline distT="0" distB="0" distL="0" distR="0" wp14:anchorId="65588DBC" wp14:editId="515B76D3">
+            <wp:extent cx="4305300" cy="4305300"/>
+            <wp:effectExtent l="0" t="0" r="0" b="0"/>
+            <wp:docPr id="2081133417" name="Picture 2"/>
+            <wp:cNvGraphicFramePr>
+              <a:graphicFrameLocks xmlns:a="http://schemas.openxmlformats.org/drawingml/2006/main" noChangeAspect="1"/>
+            </wp:cNvGraphicFramePr>
+            <a:graphic xmlns:a="http://schemas.openxmlformats.org/drawingml/2006/main">
+              <a:graphicData uri="http://schemas.openxmlformats.org/drawingml/2006/picture">
+                <pic:pic xmlns:pic="http://schemas.openxmlformats.org/drawingml/2006/picture">
+                  <pic:nvPicPr>
+                    <pic:cNvPr id="0" name="Picture 1"/>
+                    <pic:cNvPicPr>
+                      <a:picLocks noChangeAspect="1" noChangeArrowheads="1"/>
+                    </pic:cNvPicPr>
+                  </pic:nvPicPr>
+                  <pic:blipFill>
+                    <a:blip r:embed="rId9" cstate="print">
+                      <a:extLst>
+                        <a:ext uri="{28A0092B-C50C-407E-A947-70E740481C1C}">
+                          <a14:useLocalDpi xmlns:a14="http://schemas.microsoft.com/office/drawing/2010/main" val="0"/>
+                        </a:ext>
+                      </a:extLst>
+                    </a:blip>
+                    <a:srcRect/>
+                    <a:stretch>
+                      <a:fillRect/>
+                    </a:stretch>
+                  </pic:blipFill>
+                  <pic:spPr bwMode="auto">
+                    <a:xfrm>
+                      <a:off x="0" y="0"/>
+                      <a:ext cx="4305300" cy="4305300"/>
+                    </a:xfrm>
+                    <a:prstGeom prst="rect">
+                      <a:avLst/>
+                    </a:prstGeom>
+                    <a:noFill/>
+                    <a:ln>
+                      <a:noFill/>
+                    </a:ln>
+                  </pic:spPr>
+                </pic:pic>
+              </a:graphicData>
+            </a:graphic>
+          </wp:inline>
+        </w:drawing>
+      </w:r>
     </w:p>
     <w:p>
       <w:pPr>
@@ -833,88 +856,18 @@
       <w:pPr>
         <w:spacing w:after="0" w:line="360" w:lineRule="auto"/>
         <w:jc w:val="both"/>
+        <w:rPr>
+          <w:rFonts w:ascii="Verdana" w:hAnsi="Verdana"/>
+          <w:color w:val="C00000"/>
+          <w:sz w:val="32"/>
+          <w:szCs w:val="32"/>
+        </w:rPr>
       </w:pPr>
     </w:p>
     <w:p>
       <w:pPr>
         <w:spacing w:after="0" w:line="360" w:lineRule="auto"/>
         <w:jc w:val="both"/>
-      </w:pPr>
-    </w:p>
-    <w:p>
-      <w:pPr>
-        <w:spacing w:after="0" w:line="360" w:lineRule="auto"/>
-        <w:jc w:val="both"/>
-      </w:pPr>
-    </w:p>
-    <w:p>
-      <w:pPr>
-        <w:spacing w:after="0" w:line="360" w:lineRule="auto"/>
-        <w:jc w:val="both"/>
-      </w:pPr>
-    </w:p>
-    <w:p>
-      <w:pPr>
-        <w:spacing w:after="0" w:line="360" w:lineRule="auto"/>
-        <w:jc w:val="both"/>
-      </w:pPr>
-    </w:p>
-    <w:p>
-      <w:pPr>
-        <w:spacing w:after="0" w:line="360" w:lineRule="auto"/>
-        <w:jc w:val="both"/>
-      </w:pPr>
-    </w:p>
-    <w:p>
-      <w:pPr>
-        <w:spacing w:after="0" w:line="360" w:lineRule="auto"/>
-        <w:jc w:val="both"/>
-      </w:pPr>
-    </w:p>
-    <w:p>
-      <w:pPr>
-        <w:spacing w:after="0" w:line="360" w:lineRule="auto"/>
-        <w:jc w:val="both"/>
-      </w:pPr>
-    </w:p>
-    <w:p>
-      <w:pPr>
-        <w:spacing w:after="0" w:line="360" w:lineRule="auto"/>
-        <w:jc w:val="both"/>
-      </w:pPr>
-    </w:p>
-    <w:p>
-      <w:pPr>
-        <w:spacing w:after="0" w:line="360" w:lineRule="auto"/>
-        <w:jc w:val="both"/>
-      </w:pPr>
-    </w:p>
-    <w:p>
-      <w:pPr>
-        <w:spacing w:after="0" w:line="360" w:lineRule="auto"/>
-        <w:jc w:val="both"/>
-      </w:pPr>
-    </w:p>
-    <w:p>
-      <w:pPr>
-        <w:spacing w:after="0" w:line="360" w:lineRule="auto"/>
-        <w:jc w:val="both"/>
-      </w:pPr>
-    </w:p>
-    <w:p>
-      <w:pPr>
-        <w:spacing w:after="0" w:line="360" w:lineRule="auto"/>
-        <w:jc w:val="both"/>
-      </w:pPr>
-    </w:p>
-    <w:p>
-      <w:pPr>
-        <w:spacing w:after="0" w:line="360" w:lineRule="auto"/>
-        <w:rPr>
-          <w:color w:val="C00000"/>
-          <w:sz w:val="28"/>
-          <w:szCs w:val="28"/>
-        </w:rPr>
       </w:pPr>
       <w:r>
         <w:rPr>
@@ -1241,7 +1194,7 @@
       <w:sdtContent>
         <w:p>
           <w:pPr>
-            <w:pStyle w:val="TtuloTDC"/>
+            <w:pStyle w:val="TOCHeading"/>
             <w:spacing w:before="0" w:line="360" w:lineRule="auto"/>
             <w:rPr>
               <w:rFonts w:ascii="Verdana" w:hAnsi="Verdana"/>
@@ -1266,7 +1219,7 @@
         </w:p>
         <w:p>
           <w:pPr>
-            <w:pStyle w:val="TDC1"/>
+            <w:pStyle w:val="TOC1"/>
             <w:tabs>
               <w:tab w:val="left" w:pos="440"/>
               <w:tab w:val="right" w:leader="dot" w:pos="8494"/>
@@ -1302,7 +1255,7 @@
           <w:hyperlink w:anchor="_Toc222910255" w:history="1">
             <w:r>
               <w:rPr>
-                <w:rStyle w:val="Hipervnculo"/>
+                <w:rStyle w:val="Hyperlink"/>
                 <w:noProof/>
               </w:rPr>
               <w:t>1.</w:t>
@@ -1321,7 +1274,7 @@
             </w:r>
             <w:r>
               <w:rPr>
-                <w:rStyle w:val="Hipervnculo"/>
+                <w:rStyle w:val="Hyperlink"/>
                 <w:noProof/>
               </w:rPr>
               <w:t>Resumen</w:t>
@@ -1378,7 +1331,7 @@
         </w:p>
         <w:p>
           <w:pPr>
-            <w:pStyle w:val="TDC1"/>
+            <w:pStyle w:val="TOC1"/>
             <w:tabs>
               <w:tab w:val="left" w:pos="440"/>
               <w:tab w:val="right" w:leader="dot" w:pos="8494"/>
@@ -1396,7 +1349,7 @@
           <w:hyperlink w:anchor="_Toc222910256" w:history="1">
             <w:r>
               <w:rPr>
-                <w:rStyle w:val="Hipervnculo"/>
+                <w:rStyle w:val="Hyperlink"/>
                 <w:noProof/>
               </w:rPr>
               <w:t>2.</w:t>
@@ -1415,7 +1368,7 @@
             </w:r>
             <w:r>
               <w:rPr>
-                <w:rStyle w:val="Hipervnculo"/>
+                <w:rStyle w:val="Hyperlink"/>
                 <w:noProof/>
               </w:rPr>
               <w:t>Abstract</w:t>
@@ -1472,7 +1425,7 @@
         </w:p>
         <w:p>
           <w:pPr>
-            <w:pStyle w:val="TDC1"/>
+            <w:pStyle w:val="TOC1"/>
             <w:tabs>
               <w:tab w:val="left" w:pos="440"/>
               <w:tab w:val="right" w:leader="dot" w:pos="8494"/>
@@ -1490,7 +1443,7 @@
           <w:hyperlink w:anchor="_Toc222910257" w:history="1">
             <w:r>
               <w:rPr>
-                <w:rStyle w:val="Hipervnculo"/>
+                <w:rStyle w:val="Hyperlink"/>
                 <w:noProof/>
               </w:rPr>
               <w:t>3.</w:t>
@@ -1509,7 +1462,7 @@
             </w:r>
             <w:r>
               <w:rPr>
-                <w:rStyle w:val="Hipervnculo"/>
+                <w:rStyle w:val="Hyperlink"/>
                 <w:noProof/>
               </w:rPr>
               <w:t>Justificación del proyecto</w:t>
@@ -1566,7 +1519,7 @@
         </w:p>
         <w:p>
           <w:pPr>
-            <w:pStyle w:val="TDC1"/>
+            <w:pStyle w:val="TOC1"/>
             <w:tabs>
               <w:tab w:val="left" w:pos="440"/>
               <w:tab w:val="right" w:leader="dot" w:pos="8494"/>
@@ -1584,7 +1537,7 @@
           <w:hyperlink w:anchor="_Toc222910258" w:history="1">
             <w:r>
               <w:rPr>
-                <w:rStyle w:val="Hipervnculo"/>
+                <w:rStyle w:val="Hyperlink"/>
                 <w:noProof/>
               </w:rPr>
               <w:t>4.</w:t>
@@ -1603,7 +1556,7 @@
             </w:r>
             <w:r>
               <w:rPr>
-                <w:rStyle w:val="Hipervnculo"/>
+                <w:rStyle w:val="Hyperlink"/>
                 <w:noProof/>
               </w:rPr>
               <w:t>Objetivos</w:t>
@@ -1660,7 +1613,7 @@
         </w:p>
         <w:p>
           <w:pPr>
-            <w:pStyle w:val="TDC2"/>
+            <w:pStyle w:val="TOC2"/>
             <w:tabs>
               <w:tab w:val="left" w:pos="1200"/>
               <w:tab w:val="right" w:leader="dot" w:pos="8494"/>
@@ -1678,7 +1631,7 @@
           <w:hyperlink w:anchor="_Toc222910259" w:history="1">
             <w:r>
               <w:rPr>
-                <w:rStyle w:val="Hipervnculo"/>
+                <w:rStyle w:val="Hyperlink"/>
                 <w:noProof/>
               </w:rPr>
               <w:t>4.1.</w:t>
@@ -1697,7 +1650,7 @@
             </w:r>
             <w:r>
               <w:rPr>
-                <w:rStyle w:val="Hipervnculo"/>
+                <w:rStyle w:val="Hyperlink"/>
                 <w:noProof/>
               </w:rPr>
               <w:t>Objetivos generales</w:t>
@@ -1754,7 +1707,7 @@
         </w:p>
         <w:p>
           <w:pPr>
-            <w:pStyle w:val="TDC2"/>
+            <w:pStyle w:val="TOC2"/>
             <w:tabs>
               <w:tab w:val="left" w:pos="1200"/>
               <w:tab w:val="right" w:leader="dot" w:pos="8494"/>
@@ -1772,7 +1725,7 @@
           <w:hyperlink w:anchor="_Toc222910260" w:history="1">
             <w:r>
               <w:rPr>
-                <w:rStyle w:val="Hipervnculo"/>
+                <w:rStyle w:val="Hyperlink"/>
                 <w:noProof/>
               </w:rPr>
               <w:t>4.2.</w:t>
@@ -1791,7 +1744,7 @@
             </w:r>
             <w:r>
               <w:rPr>
-                <w:rStyle w:val="Hipervnculo"/>
+                <w:rStyle w:val="Hyperlink"/>
                 <w:noProof/>
               </w:rPr>
               <w:t>Objetivos específicos</w:t>
@@ -1848,7 +1801,7 @@
         </w:p>
         <w:p>
           <w:pPr>
-            <w:pStyle w:val="TDC1"/>
+            <w:pStyle w:val="TOC1"/>
             <w:tabs>
               <w:tab w:val="left" w:pos="440"/>
               <w:tab w:val="right" w:leader="dot" w:pos="8494"/>
@@ -1866,7 +1819,7 @@
           <w:hyperlink w:anchor="_Toc222910261" w:history="1">
             <w:r>
               <w:rPr>
-                <w:rStyle w:val="Hipervnculo"/>
+                <w:rStyle w:val="Hyperlink"/>
                 <w:noProof/>
               </w:rPr>
               <w:t>5.</w:t>
@@ -1885,7 +1838,7 @@
             </w:r>
             <w:r>
               <w:rPr>
-                <w:rStyle w:val="Hipervnculo"/>
+                <w:rStyle w:val="Hyperlink"/>
                 <w:noProof/>
               </w:rPr>
               <w:t>Tecnologías empleadas</w:t>
@@ -1942,7 +1895,7 @@
         </w:p>
         <w:p>
           <w:pPr>
-            <w:pStyle w:val="TDC2"/>
+            <w:pStyle w:val="TOC2"/>
             <w:tabs>
               <w:tab w:val="left" w:pos="1200"/>
               <w:tab w:val="right" w:leader="dot" w:pos="8494"/>
@@ -1960,7 +1913,7 @@
           <w:hyperlink w:anchor="_Toc222910262" w:history="1">
             <w:r>
               <w:rPr>
-                <w:rStyle w:val="Hipervnculo"/>
+                <w:rStyle w:val="Hyperlink"/>
                 <w:noProof/>
               </w:rPr>
               <w:t>5.1.</w:t>
@@ -1979,7 +1932,7 @@
             </w:r>
             <w:r>
               <w:rPr>
-                <w:rStyle w:val="Hipervnculo"/>
+                <w:rStyle w:val="Hyperlink"/>
                 <w:noProof/>
               </w:rPr>
               <w:t>Tecnologías</w:t>
@@ -2036,7 +1989,7 @@
         </w:p>
         <w:p>
           <w:pPr>
-            <w:pStyle w:val="TDC2"/>
+            <w:pStyle w:val="TOC2"/>
             <w:tabs>
               <w:tab w:val="left" w:pos="1200"/>
               <w:tab w:val="right" w:leader="dot" w:pos="8494"/>
@@ -2054,7 +2007,7 @@
           <w:hyperlink w:anchor="_Toc222910263" w:history="1">
             <w:r>
               <w:rPr>
-                <w:rStyle w:val="Hipervnculo"/>
+                <w:rStyle w:val="Hyperlink"/>
                 <w:noProof/>
               </w:rPr>
               <w:t>5.2.</w:t>
@@ -2073,7 +2026,7 @@
             </w:r>
             <w:r>
               <w:rPr>
-                <w:rStyle w:val="Hipervnculo"/>
+                <w:rStyle w:val="Hyperlink"/>
                 <w:noProof/>
               </w:rPr>
               <w:t>Herramientas</w:t>
@@ -2130,7 +2083,7 @@
         </w:p>
         <w:p>
           <w:pPr>
-            <w:pStyle w:val="TDC1"/>
+            <w:pStyle w:val="TOC1"/>
             <w:tabs>
               <w:tab w:val="left" w:pos="440"/>
               <w:tab w:val="right" w:leader="dot" w:pos="8494"/>
@@ -2148,7 +2101,7 @@
           <w:hyperlink w:anchor="_Toc222910264" w:history="1">
             <w:r>
               <w:rPr>
-                <w:rStyle w:val="Hipervnculo"/>
+                <w:rStyle w:val="Hyperlink"/>
                 <w:noProof/>
               </w:rPr>
               <w:t>6.</w:t>
@@ -2167,7 +2120,7 @@
             </w:r>
             <w:r>
               <w:rPr>
-                <w:rStyle w:val="Hipervnculo"/>
+                <w:rStyle w:val="Hyperlink"/>
                 <w:noProof/>
               </w:rPr>
               <w:t>Desarrollo</w:t>
@@ -2224,7 +2177,7 @@
         </w:p>
         <w:p>
           <w:pPr>
-            <w:pStyle w:val="TDC2"/>
+            <w:pStyle w:val="TOC2"/>
             <w:tabs>
               <w:tab w:val="left" w:pos="1200"/>
               <w:tab w:val="right" w:leader="dot" w:pos="8494"/>
@@ -2242,7 +2195,7 @@
           <w:hyperlink w:anchor="_Toc222910265" w:history="1">
             <w:r>
               <w:rPr>
-                <w:rStyle w:val="Hipervnculo"/>
+                <w:rStyle w:val="Hyperlink"/>
                 <w:noProof/>
               </w:rPr>
               <w:t>6.1.</w:t>
@@ -2261,7 +2214,7 @@
             </w:r>
             <w:r>
               <w:rPr>
-                <w:rStyle w:val="Hipervnculo"/>
+                <w:rStyle w:val="Hyperlink"/>
                 <w:noProof/>
               </w:rPr>
               <w:t>Enumeración de requisitos</w:t>
@@ -2318,7 +2271,7 @@
         </w:p>
         <w:p>
           <w:pPr>
-            <w:pStyle w:val="TDC2"/>
+            <w:pStyle w:val="TOC2"/>
             <w:tabs>
               <w:tab w:val="left" w:pos="1200"/>
               <w:tab w:val="right" w:leader="dot" w:pos="8494"/>
@@ -2336,7 +2289,7 @@
           <w:hyperlink w:anchor="_Toc222910266" w:history="1">
             <w:r>
               <w:rPr>
-                <w:rStyle w:val="Hipervnculo"/>
+                <w:rStyle w:val="Hyperlink"/>
                 <w:noProof/>
               </w:rPr>
               <w:t>6.2.</w:t>
@@ -2355,7 +2308,7 @@
             </w:r>
             <w:r>
               <w:rPr>
-                <w:rStyle w:val="Hipervnculo"/>
+                <w:rStyle w:val="Hyperlink"/>
                 <w:noProof/>
               </w:rPr>
               <w:t>Diseño de la base de datos</w:t>
@@ -2412,7 +2365,7 @@
         </w:p>
         <w:p>
           <w:pPr>
-            <w:pStyle w:val="TDC2"/>
+            <w:pStyle w:val="TOC2"/>
             <w:tabs>
               <w:tab w:val="left" w:pos="1200"/>
               <w:tab w:val="right" w:leader="dot" w:pos="8494"/>
@@ -2430,7 +2383,7 @@
           <w:hyperlink w:anchor="_Toc222910267" w:history="1">
             <w:r>
               <w:rPr>
-                <w:rStyle w:val="Hipervnculo"/>
+                <w:rStyle w:val="Hyperlink"/>
                 <w:noProof/>
               </w:rPr>
               <w:t>6.3.</w:t>
@@ -2449,7 +2402,7 @@
             </w:r>
             <w:r>
               <w:rPr>
-                <w:rStyle w:val="Hipervnculo"/>
+                <w:rStyle w:val="Hyperlink"/>
                 <w:noProof/>
               </w:rPr>
               <w:t>Diagrama de Gantt</w:t>
@@ -2506,7 +2459,7 @@
         </w:p>
         <w:p>
           <w:pPr>
-            <w:pStyle w:val="TDC2"/>
+            <w:pStyle w:val="TOC2"/>
             <w:tabs>
               <w:tab w:val="left" w:pos="1200"/>
               <w:tab w:val="right" w:leader="dot" w:pos="8494"/>
@@ -2524,7 +2477,7 @@
           <w:hyperlink w:anchor="_Toc222910268" w:history="1">
             <w:r>
               <w:rPr>
-                <w:rStyle w:val="Hipervnculo"/>
+                <w:rStyle w:val="Hyperlink"/>
                 <w:noProof/>
               </w:rPr>
               <w:t>6.4.</w:t>
@@ -2543,7 +2496,7 @@
             </w:r>
             <w:r>
               <w:rPr>
-                <w:rStyle w:val="Hipervnculo"/>
+                <w:rStyle w:val="Hyperlink"/>
                 <w:noProof/>
               </w:rPr>
               <w:t>Diagrama de casos de uso</w:t>
@@ -2587,7 +2540,7 @@
                 <w:noProof/>
                 <w:webHidden/>
               </w:rPr>
-              <w:t>7</w:t>
+              <w:t>6</w:t>
             </w:r>
             <w:r>
               <w:rPr>
@@ -2600,7 +2553,7 @@
         </w:p>
         <w:p>
           <w:pPr>
-            <w:pStyle w:val="TDC2"/>
+            <w:pStyle w:val="TOC2"/>
             <w:tabs>
               <w:tab w:val="left" w:pos="1200"/>
               <w:tab w:val="right" w:leader="dot" w:pos="8494"/>
@@ -2618,7 +2571,7 @@
           <w:hyperlink w:anchor="_Toc222910269" w:history="1">
             <w:r>
               <w:rPr>
-                <w:rStyle w:val="Hipervnculo"/>
+                <w:rStyle w:val="Hyperlink"/>
                 <w:noProof/>
               </w:rPr>
               <w:t>6.5.</w:t>
@@ -2637,7 +2590,7 @@
             </w:r>
             <w:r>
               <w:rPr>
-                <w:rStyle w:val="Hipervnculo"/>
+                <w:rStyle w:val="Hyperlink"/>
                 <w:noProof/>
               </w:rPr>
               <w:t>Diagrama de clases UML de la base de datos</w:t>
@@ -2694,7 +2647,7 @@
         </w:p>
         <w:p>
           <w:pPr>
-            <w:pStyle w:val="TDC2"/>
+            <w:pStyle w:val="TOC2"/>
             <w:tabs>
               <w:tab w:val="left" w:pos="1200"/>
               <w:tab w:val="right" w:leader="dot" w:pos="8494"/>
@@ -2712,7 +2665,7 @@
           <w:hyperlink w:anchor="_Toc222910270" w:history="1">
             <w:r>
               <w:rPr>
-                <w:rStyle w:val="Hipervnculo"/>
+                <w:rStyle w:val="Hyperlink"/>
                 <w:noProof/>
               </w:rPr>
               <w:t>6.6</w:t>
@@ -2731,7 +2684,7 @@
             </w:r>
             <w:r>
               <w:rPr>
-                <w:rStyle w:val="Hipervnculo"/>
+                <w:rStyle w:val="Hyperlink"/>
                 <w:noProof/>
               </w:rPr>
               <w:t>Diagrama de clases UML de la base de datos</w:t>
@@ -2788,7 +2741,7 @@
         </w:p>
         <w:p>
           <w:pPr>
-            <w:pStyle w:val="TDC2"/>
+            <w:pStyle w:val="TOC2"/>
             <w:tabs>
               <w:tab w:val="left" w:pos="1200"/>
               <w:tab w:val="right" w:leader="dot" w:pos="8494"/>
@@ -2806,7 +2759,7 @@
           <w:hyperlink w:anchor="_Toc222910271" w:history="1">
             <w:r>
               <w:rPr>
-                <w:rStyle w:val="Hipervnculo"/>
+                <w:rStyle w:val="Hyperlink"/>
                 <w:noProof/>
               </w:rPr>
               <w:t>1.1.</w:t>
@@ -2825,14 +2778,14 @@
             </w:r>
             <w:r>
               <w:rPr>
-                <w:rStyle w:val="Hipervnculo"/>
+                <w:rStyle w:val="Hyperlink"/>
                 <w:noProof/>
               </w:rPr>
               <w:t xml:space="preserve">Diagrama de flujo de navegación </w:t>
             </w:r>
             <w:r>
               <w:rPr>
-                <w:rStyle w:val="Hipervnculo"/>
+                <w:rStyle w:val="Hyperlink"/>
                 <w:b/>
                 <w:bCs/>
                 <w:noProof/>
@@ -3009,7 +2962,7 @@
           <w:rFonts w:ascii="Verdana" w:hAnsi="Verdana"/>
         </w:rPr>
         <w:sectPr>
-          <w:footerReference w:type="default" r:id="rId9"/>
+          <w:footerReference w:type="default" r:id="rId10"/>
           <w:pgSz w:w="11906" w:h="16838"/>
           <w:pgMar w:top="1417" w:right="1701" w:bottom="1417" w:left="1701" w:header="708" w:footer="708" w:gutter="0"/>
           <w:pgNumType w:start="1"/>
@@ -3101,7 +3054,21 @@
         <w:rPr>
           <w:lang w:val="en-US"/>
         </w:rPr>
-        <w:t>This project focuses on the development of a mobile application for managing repairs in a technical service specialized in laptops and mobile phones. The application allows both users and the technical service to monitor the status of repairs and devices</w:t>
+        <w:t xml:space="preserve">This project focuses on the development of a mobile application for managing repairs in a technical service </w:t>
+      </w:r>
+      <w:proofErr w:type="gramStart"/>
+      <w:r>
+        <w:rPr>
+          <w:lang w:val="en-US"/>
+        </w:rPr>
+        <w:t>specialized</w:t>
+      </w:r>
+      <w:proofErr w:type="gramEnd"/>
+      <w:r>
+        <w:rPr>
+          <w:lang w:val="en-US"/>
+        </w:rPr>
+        <w:t xml:space="preserve"> in laptops and mobile phones. The application allows both users and the technical service to monitor the status of repairs and devices</w:t>
       </w:r>
       <w:r>
         <w:rPr>
@@ -3231,7 +3198,7 @@
     </w:p>
     <w:p>
       <w:pPr>
-        <w:pStyle w:val="Ttulo2"/>
+        <w:pStyle w:val="Heading2"/>
         <w:numPr>
           <w:ilvl w:val="1"/>
           <w:numId w:val="5"/>
@@ -3251,7 +3218,7 @@
     </w:p>
     <w:p>
       <w:pPr>
-        <w:pStyle w:val="Prrafodelista"/>
+        <w:pStyle w:val="ListParagraph"/>
         <w:spacing w:after="0" w:line="360" w:lineRule="auto"/>
         <w:ind w:left="360"/>
         <w:jc w:val="both"/>
@@ -3268,7 +3235,7 @@
     </w:p>
     <w:p>
       <w:pPr>
-        <w:pStyle w:val="Ttulo2"/>
+        <w:pStyle w:val="Heading2"/>
         <w:numPr>
           <w:ilvl w:val="1"/>
           <w:numId w:val="5"/>
@@ -3288,7 +3255,7 @@
     </w:p>
     <w:p>
       <w:pPr>
-        <w:pStyle w:val="Prrafodelista"/>
+        <w:pStyle w:val="ListParagraph"/>
         <w:spacing w:after="0" w:line="360" w:lineRule="auto"/>
         <w:ind w:left="360"/>
         <w:jc w:val="both"/>
@@ -3316,7 +3283,7 @@
     </w:p>
     <w:p>
       <w:pPr>
-        <w:pStyle w:val="Prrafodelista"/>
+        <w:pStyle w:val="ListParagraph"/>
         <w:spacing w:after="0" w:line="360" w:lineRule="auto"/>
         <w:ind w:left="360"/>
         <w:jc w:val="both"/>
@@ -3335,7 +3302,7 @@
     </w:p>
     <w:p>
       <w:pPr>
-        <w:pStyle w:val="Prrafodelista"/>
+        <w:pStyle w:val="ListParagraph"/>
         <w:spacing w:after="0" w:line="360" w:lineRule="auto"/>
         <w:ind w:left="360"/>
         <w:jc w:val="both"/>
@@ -3354,7 +3321,7 @@
     </w:p>
     <w:p>
       <w:pPr>
-        <w:pStyle w:val="Prrafodelista"/>
+        <w:pStyle w:val="ListParagraph"/>
         <w:spacing w:after="0" w:line="360" w:lineRule="auto"/>
         <w:ind w:left="360"/>
         <w:jc w:val="both"/>
@@ -3373,7 +3340,7 @@
     </w:p>
     <w:p>
       <w:pPr>
-        <w:pStyle w:val="Prrafodelista"/>
+        <w:pStyle w:val="ListParagraph"/>
         <w:spacing w:after="0" w:line="360" w:lineRule="auto"/>
         <w:ind w:left="360"/>
         <w:jc w:val="both"/>
@@ -3440,7 +3407,7 @@
     </w:p>
     <w:p>
       <w:pPr>
-        <w:pStyle w:val="Prrafodelista"/>
+        <w:pStyle w:val="ListParagraph"/>
         <w:spacing w:after="0" w:line="360" w:lineRule="auto"/>
         <w:ind w:left="360"/>
         <w:jc w:val="both"/>
@@ -3534,7 +3501,7 @@
     </w:p>
     <w:p>
       <w:pPr>
-        <w:pStyle w:val="Ttulo2"/>
+        <w:pStyle w:val="Heading2"/>
         <w:numPr>
           <w:ilvl w:val="1"/>
           <w:numId w:val="5"/>
@@ -3554,7 +3521,7 @@
     </w:p>
     <w:p>
       <w:pPr>
-        <w:pStyle w:val="Prrafodelista"/>
+        <w:pStyle w:val="ListParagraph"/>
         <w:spacing w:after="0" w:line="360" w:lineRule="auto"/>
         <w:ind w:left="360"/>
         <w:jc w:val="both"/>
@@ -3585,7 +3552,7 @@
     </w:p>
     <w:p>
       <w:pPr>
-        <w:pStyle w:val="Prrafodelista"/>
+        <w:pStyle w:val="ListParagraph"/>
         <w:spacing w:after="0" w:line="360" w:lineRule="auto"/>
         <w:ind w:left="360" w:firstLine="348"/>
         <w:jc w:val="both"/>
@@ -3616,7 +3583,7 @@
     </w:p>
     <w:p>
       <w:pPr>
-        <w:pStyle w:val="Prrafodelista"/>
+        <w:pStyle w:val="ListParagraph"/>
         <w:spacing w:after="0" w:line="360" w:lineRule="auto"/>
         <w:ind w:left="360" w:firstLine="348"/>
         <w:jc w:val="both"/>
@@ -3661,7 +3628,7 @@
     </w:p>
     <w:p>
       <w:pPr>
-        <w:pStyle w:val="Prrafodelista"/>
+        <w:pStyle w:val="ListParagraph"/>
         <w:spacing w:after="0" w:line="360" w:lineRule="auto"/>
         <w:ind w:left="360" w:firstLine="348"/>
         <w:jc w:val="both"/>
@@ -3684,7 +3651,7 @@
     </w:p>
     <w:p>
       <w:pPr>
-        <w:pStyle w:val="Prrafodelista"/>
+        <w:pStyle w:val="ListParagraph"/>
         <w:spacing w:after="0" w:line="360" w:lineRule="auto"/>
         <w:ind w:left="360" w:firstLine="348"/>
         <w:jc w:val="both"/>
@@ -3721,7 +3688,7 @@
     </w:p>
     <w:p>
       <w:pPr>
-        <w:pStyle w:val="Prrafodelista"/>
+        <w:pStyle w:val="ListParagraph"/>
         <w:spacing w:after="0" w:line="360" w:lineRule="auto"/>
         <w:ind w:left="360" w:firstLine="348"/>
         <w:jc w:val="both"/>
@@ -3752,7 +3719,7 @@
     </w:p>
     <w:p>
       <w:pPr>
-        <w:pStyle w:val="Prrafodelista"/>
+        <w:pStyle w:val="ListParagraph"/>
         <w:spacing w:after="0" w:line="360" w:lineRule="auto"/>
         <w:ind w:left="360" w:firstLine="348"/>
         <w:jc w:val="both"/>
@@ -3789,7 +3756,7 @@
     </w:p>
     <w:p>
       <w:pPr>
-        <w:pStyle w:val="Prrafodelista"/>
+        <w:pStyle w:val="ListParagraph"/>
         <w:spacing w:after="0" w:line="360" w:lineRule="auto"/>
         <w:ind w:left="360" w:firstLine="348"/>
         <w:jc w:val="both"/>
@@ -3821,7 +3788,21 @@
         <w:rPr>
           <w:rFonts w:ascii="Verdana" w:hAnsi="Verdana"/>
         </w:rPr>
-        <w:t xml:space="preserve">utilizado para la realizar los registros de usuarios así como el inicio de sesión ya que ofrece un servicio de autenticación por email y contraseña, y facilita el </w:t>
+        <w:t xml:space="preserve">utilizado para la realizar los registros de </w:t>
+      </w:r>
+      <w:proofErr w:type="gramStart"/>
+      <w:r>
+        <w:rPr>
+          <w:rFonts w:ascii="Verdana" w:hAnsi="Verdana"/>
+        </w:rPr>
+        <w:t>usuarios</w:t>
+      </w:r>
+      <w:proofErr w:type="gramEnd"/>
+      <w:r>
+        <w:rPr>
+          <w:rFonts w:ascii="Verdana" w:hAnsi="Verdana"/>
+        </w:rPr>
+        <w:t xml:space="preserve"> así como el inicio de sesión ya que ofrece un servicio de autenticación por email y contraseña, y facilita el </w:t>
       </w:r>
       <w:proofErr w:type="spellStart"/>
       <w:r>
@@ -3846,7 +3827,7 @@
     </w:p>
     <w:p>
       <w:pPr>
-        <w:pStyle w:val="Ttulo2"/>
+        <w:pStyle w:val="Heading2"/>
         <w:numPr>
           <w:ilvl w:val="1"/>
           <w:numId w:val="5"/>
@@ -3887,7 +3868,7 @@
     </w:p>
     <w:p>
       <w:pPr>
-        <w:pStyle w:val="Ttulo4"/>
+        <w:pStyle w:val="Heading4"/>
         <w:spacing w:before="0" w:line="360" w:lineRule="auto"/>
         <w:ind w:firstLine="708"/>
         <w:jc w:val="both"/>
@@ -3958,7 +3939,7 @@
     </w:p>
     <w:p>
       <w:pPr>
-        <w:pStyle w:val="Ttulo4"/>
+        <w:pStyle w:val="Heading4"/>
         <w:spacing w:before="0" w:line="360" w:lineRule="auto"/>
         <w:ind w:firstLine="708"/>
         <w:jc w:val="both"/>
@@ -4030,7 +4011,7 @@
     </w:p>
     <w:p>
       <w:pPr>
-        <w:pStyle w:val="Ttulo4"/>
+        <w:pStyle w:val="Heading4"/>
         <w:spacing w:before="0" w:line="360" w:lineRule="auto"/>
         <w:ind w:firstLine="708"/>
         <w:jc w:val="both"/>
@@ -4128,7 +4109,7 @@
     </w:p>
     <w:p>
       <w:pPr>
-        <w:pStyle w:val="Ttulo4"/>
+        <w:pStyle w:val="Heading4"/>
         <w:spacing w:before="0" w:line="360" w:lineRule="auto"/>
         <w:ind w:firstLine="708"/>
         <w:jc w:val="both"/>
@@ -4216,7 +4197,7 @@
     </w:p>
     <w:p>
       <w:pPr>
-        <w:pStyle w:val="Ttulo2"/>
+        <w:pStyle w:val="Heading2"/>
         <w:numPr>
           <w:ilvl w:val="1"/>
           <w:numId w:val="5"/>
@@ -4618,7 +4599,7 @@
     <w:p/>
     <w:p>
       <w:pPr>
-        <w:pStyle w:val="Ttulo2"/>
+        <w:pStyle w:val="Heading2"/>
         <w:numPr>
           <w:ilvl w:val="1"/>
           <w:numId w:val="5"/>
@@ -4739,7 +4720,7 @@
                     <pic:cNvPicPr/>
                   </pic:nvPicPr>
                   <pic:blipFill>
-                    <a:blip r:embed="rId10"/>
+                    <a:blip r:embed="rId11"/>
                     <a:stretch>
                       <a:fillRect/>
                     </a:stretch>
@@ -4783,7 +4764,7 @@
     </w:p>
     <w:p>
       <w:pPr>
-        <w:pStyle w:val="Ttulo2"/>
+        <w:pStyle w:val="Heading2"/>
         <w:numPr>
           <w:ilvl w:val="1"/>
           <w:numId w:val="5"/>
@@ -4825,7 +4806,7 @@
                     <pic:cNvPicPr/>
                   </pic:nvPicPr>
                   <pic:blipFill>
-                    <a:blip r:embed="rId11"/>
+                    <a:blip r:embed="rId12"/>
                     <a:stretch>
                       <a:fillRect/>
                     </a:stretch>
@@ -4860,7 +4841,7 @@
     </w:p>
     <w:p>
       <w:pPr>
-        <w:pStyle w:val="Ttulo2"/>
+        <w:pStyle w:val="Heading2"/>
         <w:numPr>
           <w:ilvl w:val="1"/>
           <w:numId w:val="5"/>
@@ -4904,7 +4885,7 @@
                     <pic:cNvPicPr/>
                   </pic:nvPicPr>
                   <pic:blipFill>
-                    <a:blip r:embed="rId12"/>
+                    <a:blip r:embed="rId13"/>
                     <a:stretch>
                       <a:fillRect/>
                     </a:stretch>
@@ -4948,7 +4929,7 @@
     </w:p>
     <w:p>
       <w:pPr>
-        <w:pStyle w:val="Ttulo2"/>
+        <w:pStyle w:val="Heading2"/>
         <w:numPr>
           <w:ilvl w:val="1"/>
           <w:numId w:val="5"/>
@@ -4993,7 +4974,7 @@
                     <pic:cNvPicPr/>
                   </pic:nvPicPr>
                   <pic:blipFill>
-                    <a:blip r:embed="rId13"/>
+                    <a:blip r:embed="rId14"/>
                     <a:stretch>
                       <a:fillRect/>
                     </a:stretch>
@@ -5055,7 +5036,7 @@
     </w:p>
     <w:p>
       <w:pPr>
-        <w:pStyle w:val="Ttulo2"/>
+        <w:pStyle w:val="Heading2"/>
         <w:numPr>
           <w:ilvl w:val="1"/>
           <w:numId w:val="17"/>
@@ -5094,7 +5075,7 @@
           <w:noProof/>
         </w:rPr>
         <w:drawing>
-          <wp:inline distT="0" distB="0" distL="0" distR="0" wp14:anchorId="51FA45FE" wp14:editId="1FB40618">
+          <wp:inline distT="0" distB="0" distL="0" distR="0" wp14:anchorId="51FA45FE" wp14:editId="6C609C5C">
             <wp:extent cx="5197290" cy="6066046"/>
             <wp:effectExtent l="0" t="0" r="3810" b="0"/>
             <wp:docPr id="1010282031" name="Imagen 5" descr="Diagrama de clases de la aplicación&#10;"/>
@@ -5109,7 +5090,7 @@
                     <pic:cNvPicPr/>
                   </pic:nvPicPr>
                   <pic:blipFill>
-                    <a:blip r:embed="rId14" cstate="print">
+                    <a:blip r:embed="rId15" cstate="print">
                       <a:extLst>
                         <a:ext uri="{28A0092B-C50C-407E-A947-70E740481C1C}">
                           <a14:useLocalDpi xmlns:a14="http://schemas.microsoft.com/office/drawing/2010/main" val="0"/>
@@ -5138,7 +5119,7 @@
     </w:p>
     <w:p>
       <w:pPr>
-        <w:pStyle w:val="Descripcin"/>
+        <w:pStyle w:val="Caption"/>
         <w:jc w:val="center"/>
       </w:pPr>
       <w:r>
@@ -5297,7 +5278,7 @@
     </w:p>
     <w:p>
       <w:pPr>
-        <w:pStyle w:val="Ttulo2"/>
+        <w:pStyle w:val="Heading2"/>
         <w:numPr>
           <w:ilvl w:val="1"/>
           <w:numId w:val="17"/>
@@ -5358,7 +5339,7 @@
     </w:p>
     <w:p>
       <w:pPr>
-        <w:pStyle w:val="Prrafodelista"/>
+        <w:pStyle w:val="ListParagraph"/>
         <w:spacing w:after="0" w:line="360" w:lineRule="auto"/>
         <w:ind w:left="360"/>
         <w:jc w:val="both"/>
@@ -5409,23 +5390,22 @@
     <w:p>
       <w:pPr>
         <w:pStyle w:val="Textomemoria"/>
-      </w:pPr>
-      <w:r>
-        <w:t xml:space="preserve">Android </w:t>
-      </w:r>
-      <w:proofErr w:type="spellStart"/>
-      <w:r>
-        <w:t>Developers</w:t>
-      </w:r>
-      <w:proofErr w:type="spellEnd"/>
-      <w:r>
-        <w:t xml:space="preserve">. (s. f.). </w:t>
+        <w:rPr>
+          <w:lang w:val="en-US"/>
+        </w:rPr>
+      </w:pPr>
+      <w:r>
+        <w:rPr>
+          <w:lang w:val="en-US"/>
+        </w:rPr>
+        <w:t xml:space="preserve">Android Developers. (s. f.). </w:t>
       </w:r>
       <w:proofErr w:type="spellStart"/>
       <w:r>
         <w:rPr>
           <w:i/>
           <w:iCs/>
+          <w:lang w:val="en-US"/>
         </w:rPr>
         <w:t>NavController</w:t>
       </w:r>
@@ -5434,16 +5414,21 @@
         <w:rPr>
           <w:i/>
           <w:iCs/>
+          <w:lang w:val="en-US"/>
         </w:rPr>
         <w:t>.</w:t>
       </w:r>
       <w:r>
+        <w:rPr>
+          <w:lang w:val="en-US"/>
+        </w:rPr>
         <w:t xml:space="preserve"> Google. </w:t>
       </w:r>
-      <w:hyperlink r:id="rId15" w:history="1">
+      <w:hyperlink r:id="rId16" w:history="1">
         <w:r>
           <w:rPr>
-            <w:rStyle w:val="Hipervnculo"/>
+            <w:rStyle w:val="Hyperlink"/>
+            <w:lang w:val="en-US"/>
           </w:rPr>
           <w:t>https://developer.android.com/guide/navigation/navcontroller?hl=es-419</w:t>
         </w:r>
@@ -5452,165 +5437,164 @@
     <w:p>
       <w:pPr>
         <w:pStyle w:val="Textomemoria"/>
+        <w:rPr>
+          <w:lang w:val="en-US"/>
+        </w:rPr>
       </w:pPr>
     </w:p>
     <w:p>
       <w:pPr>
         <w:pStyle w:val="Textomemoria"/>
-      </w:pPr>
-      <w:r>
-        <w:t xml:space="preserve">Android </w:t>
-      </w:r>
-      <w:proofErr w:type="spellStart"/>
-      <w:r>
-        <w:t>Developers</w:t>
-      </w:r>
-      <w:proofErr w:type="spellEnd"/>
-      <w:r>
-        <w:t xml:space="preserve">. (s. f.). </w:t>
-      </w:r>
-      <w:proofErr w:type="spellStart"/>
+        <w:rPr>
+          <w:lang w:val="en-US"/>
+        </w:rPr>
+      </w:pPr>
+      <w:r>
+        <w:rPr>
+          <w:lang w:val="en-US"/>
+        </w:rPr>
+        <w:t xml:space="preserve">Android Developers. (s. f.). </w:t>
+      </w:r>
       <w:r>
         <w:rPr>
           <w:i/>
           <w:iCs/>
-        </w:rPr>
-        <w:t>Navigation</w:t>
+          <w:lang w:val="en-US"/>
+        </w:rPr>
+        <w:t>Navigation Compose tutorial</w:t>
+      </w:r>
+      <w:r>
+        <w:rPr>
+          <w:lang w:val="en-US"/>
+        </w:rPr>
+        <w:t xml:space="preserve"> [</w:t>
+      </w:r>
+      <w:proofErr w:type="spellStart"/>
+      <w:r>
+        <w:rPr>
+          <w:lang w:val="en-US"/>
+        </w:rPr>
+        <w:t>Vídeo</w:t>
       </w:r>
       <w:proofErr w:type="spellEnd"/>
       <w:r>
         <w:rPr>
-          <w:i/>
-          <w:iCs/>
-        </w:rPr>
-        <w:t xml:space="preserve"> </w:t>
-      </w:r>
-      <w:proofErr w:type="spellStart"/>
-      <w:r>
-        <w:rPr>
-          <w:i/>
-          <w:iCs/>
-        </w:rPr>
-        <w:t>Compose</w:t>
-      </w:r>
-      <w:proofErr w:type="spellEnd"/>
-      <w:r>
-        <w:rPr>
-          <w:i/>
-          <w:iCs/>
-        </w:rPr>
-        <w:t xml:space="preserve"> tutorial</w:t>
-      </w:r>
-      <w:r>
-        <w:t xml:space="preserve"> [Vídeo]. YouTube. </w:t>
-      </w:r>
-      <w:hyperlink r:id="rId16" w:history="1">
+          <w:lang w:val="en-US"/>
+        </w:rPr>
+        <w:t xml:space="preserve">]. YouTube. </w:t>
+      </w:r>
+      <w:hyperlink r:id="rId17" w:history="1">
         <w:r>
           <w:rPr>
-            <w:rStyle w:val="Hipervnculo"/>
+            <w:rStyle w:val="Hyperlink"/>
+            <w:lang w:val="en-US"/>
           </w:rPr>
           <w:t>https://www.youtube.com/watch?v=flL3NcVNuJo</w:t>
         </w:r>
       </w:hyperlink>
       <w:r>
+        <w:rPr>
+          <w:lang w:val="en-US"/>
+        </w:rPr>
         <w:t xml:space="preserve"> </w:t>
       </w:r>
     </w:p>
     <w:p>
       <w:pPr>
         <w:pStyle w:val="Textomemoria"/>
+        <w:rPr>
+          <w:lang w:val="en-US"/>
+        </w:rPr>
       </w:pPr>
     </w:p>
     <w:p>
       <w:pPr>
         <w:pStyle w:val="Textomemoria"/>
-      </w:pPr>
-      <w:r>
-        <w:t xml:space="preserve">Android </w:t>
-      </w:r>
-      <w:proofErr w:type="spellStart"/>
-      <w:r>
-        <w:t>Developers</w:t>
-      </w:r>
-      <w:proofErr w:type="spellEnd"/>
-      <w:r>
-        <w:t xml:space="preserve">. (s. f.). </w:t>
-      </w:r>
-      <w:proofErr w:type="spellStart"/>
+        <w:rPr>
+          <w:lang w:val="en-US"/>
+        </w:rPr>
+      </w:pPr>
+      <w:r>
+        <w:rPr>
+          <w:lang w:val="en-US"/>
+        </w:rPr>
+        <w:t xml:space="preserve">Android Developers. (s. f.). </w:t>
+      </w:r>
       <w:r>
         <w:rPr>
           <w:i/>
           <w:iCs/>
-        </w:rPr>
-        <w:t>Navigation</w:t>
-      </w:r>
-      <w:proofErr w:type="spellEnd"/>
+          <w:lang w:val="en-US"/>
+        </w:rPr>
+        <w:t>Navigation con Compose</w:t>
+      </w:r>
+      <w:r>
+        <w:rPr>
+          <w:lang w:val="en-US"/>
+        </w:rPr>
+        <w:t xml:space="preserve">. Google. </w:t>
+      </w:r>
+      <w:r>
+        <w:rPr>
+          <w:lang w:val="en-US"/>
+        </w:rPr>
+        <w:t>https://developer.android.com/develop/ui/compose/navigation?hl=es-419</w:t>
+      </w:r>
+    </w:p>
+    <w:p>
+      <w:pPr>
+        <w:pStyle w:val="Textomemoria"/>
+        <w:rPr>
+          <w:lang w:val="en-US"/>
+        </w:rPr>
+      </w:pPr>
+    </w:p>
+    <w:p>
+      <w:pPr>
+        <w:pStyle w:val="Textomemoria"/>
+        <w:rPr>
+          <w:lang w:val="en-US"/>
+        </w:rPr>
+      </w:pPr>
+      <w:r>
+        <w:rPr>
+          <w:lang w:val="en-US"/>
+        </w:rPr>
+        <w:t xml:space="preserve">Android Developers. </w:t>
+      </w:r>
+      <w:r>
+        <w:t xml:space="preserve">(s. f.). </w:t>
+      </w:r>
+      <w:proofErr w:type="spellStart"/>
       <w:r>
         <w:rPr>
           <w:i/>
           <w:iCs/>
         </w:rPr>
-        <w:t xml:space="preserve"> con </w:t>
-      </w:r>
-      <w:proofErr w:type="spellStart"/>
+        <w:t>NavController</w:t>
+      </w:r>
+      <w:proofErr w:type="spellEnd"/>
       <w:r>
         <w:rPr>
           <w:i/>
           <w:iCs/>
         </w:rPr>
-        <w:t>Compose</w:t>
-      </w:r>
-      <w:proofErr w:type="spellEnd"/>
-      <w:r>
-        <w:t xml:space="preserve">. Google. </w:t>
-      </w:r>
-      <w:r>
-        <w:t>https://developer.android.com/develop/ui/compose/navigation?hl=es-419</w:t>
-      </w:r>
-    </w:p>
-    <w:p>
-      <w:pPr>
-        <w:pStyle w:val="Textomemoria"/>
-      </w:pPr>
-    </w:p>
-    <w:p>
-      <w:pPr>
-        <w:pStyle w:val="Textomemoria"/>
-      </w:pPr>
-      <w:r>
-        <w:t xml:space="preserve">Android </w:t>
-      </w:r>
-      <w:proofErr w:type="spellStart"/>
-      <w:r>
-        <w:t>Developers</w:t>
-      </w:r>
-      <w:proofErr w:type="spellEnd"/>
-      <w:r>
-        <w:t xml:space="preserve">. (s. f.). </w:t>
-      </w:r>
-      <w:proofErr w:type="spellStart"/>
-      <w:r>
-        <w:rPr>
-          <w:i/>
-          <w:iCs/>
-        </w:rPr>
-        <w:t>NavController</w:t>
-      </w:r>
-      <w:proofErr w:type="spellEnd"/>
-      <w:r>
-        <w:rPr>
-          <w:i/>
-          <w:iCs/>
-        </w:rPr>
         <w:t xml:space="preserve"> tutorial</w:t>
       </w:r>
       <w:r>
-        <w:t xml:space="preserve"> [Vídeo]. YouTube. </w:t>
-      </w:r>
-      <w:hyperlink r:id="rId17" w:history="1">
+        <w:t xml:space="preserve"> [Vídeo]. </w:t>
+      </w:r>
+      <w:r>
+        <w:rPr>
+          <w:lang w:val="en-US"/>
+        </w:rPr>
+        <w:t xml:space="preserve">YouTube. </w:t>
+      </w:r>
+      <w:hyperlink r:id="rId18" w:history="1">
         <w:r>
           <w:rPr>
-            <w:rStyle w:val="Hipervnculo"/>
+            <w:rStyle w:val="Hyperlink"/>
+            <w:lang w:val="en-US"/>
           </w:rPr>
           <w:t>https://www.youtube.com/watch?v=eNuaMn4ukdo</w:t>
         </w:r>
@@ -5619,63 +5603,44 @@
     <w:p>
       <w:pPr>
         <w:pStyle w:val="Textomemoria"/>
+        <w:rPr>
+          <w:lang w:val="en-US"/>
+        </w:rPr>
       </w:pPr>
     </w:p>
     <w:p>
       <w:pPr>
         <w:pStyle w:val="Textomemoria"/>
-      </w:pPr>
-      <w:r>
+        <w:rPr>
+          <w:lang w:val="en-US"/>
+        </w:rPr>
+      </w:pPr>
+      <w:r>
+        <w:rPr>
+          <w:lang w:val="en-US"/>
+        </w:rPr>
         <w:lastRenderedPageBreak/>
-        <w:t xml:space="preserve">Android </w:t>
-      </w:r>
-      <w:proofErr w:type="spellStart"/>
-      <w:r>
-        <w:t>Developers</w:t>
-      </w:r>
-      <w:proofErr w:type="spellEnd"/>
-      <w:r>
-        <w:t xml:space="preserve">. (s. f.). </w:t>
+        <w:t xml:space="preserve">Android Developers. (s. f.). </w:t>
       </w:r>
       <w:r>
         <w:rPr>
           <w:i/>
           <w:iCs/>
-        </w:rPr>
-        <w:t xml:space="preserve">State in </w:t>
-      </w:r>
-      <w:proofErr w:type="spellStart"/>
-      <w:r>
-        <w:rPr>
-          <w:i/>
-          <w:iCs/>
-        </w:rPr>
-        <w:t>Jetpack</w:t>
-      </w:r>
-      <w:proofErr w:type="spellEnd"/>
-      <w:r>
-        <w:rPr>
-          <w:i/>
-          <w:iCs/>
-        </w:rPr>
-        <w:t xml:space="preserve"> </w:t>
-      </w:r>
-      <w:proofErr w:type="spellStart"/>
-      <w:r>
-        <w:rPr>
-          <w:i/>
-          <w:iCs/>
-        </w:rPr>
-        <w:t>Compose</w:t>
-      </w:r>
-      <w:proofErr w:type="spellEnd"/>
-      <w:r>
+          <w:lang w:val="en-US"/>
+        </w:rPr>
+        <w:t>State in Jetpack Compose</w:t>
+      </w:r>
+      <w:r>
+        <w:rPr>
+          <w:lang w:val="en-US"/>
+        </w:rPr>
         <w:t xml:space="preserve">. Google. </w:t>
       </w:r>
-      <w:hyperlink r:id="rId18" w:history="1">
+      <w:hyperlink r:id="rId19" w:history="1">
         <w:r>
           <w:rPr>
-            <w:rStyle w:val="Hipervnculo"/>
+            <w:rStyle w:val="Hyperlink"/>
+            <w:lang w:val="en-US"/>
           </w:rPr>
           <w:t>https://developer.android.com/develop/ui/compose/state?hl=es-419</w:t>
         </w:r>
@@ -5684,85 +5649,43 @@
     <w:p>
       <w:pPr>
         <w:pStyle w:val="Textomemoria"/>
+        <w:rPr>
+          <w:lang w:val="en-US"/>
+        </w:rPr>
       </w:pPr>
     </w:p>
     <w:p>
       <w:pPr>
         <w:pStyle w:val="Textomemoria"/>
-      </w:pPr>
-      <w:r>
-        <w:t xml:space="preserve">Android </w:t>
-      </w:r>
-      <w:proofErr w:type="spellStart"/>
-      <w:r>
-        <w:t>Developers</w:t>
-      </w:r>
-      <w:proofErr w:type="spellEnd"/>
-      <w:r>
-        <w:t xml:space="preserve">. (s. f.). </w:t>
+        <w:rPr>
+          <w:lang w:val="en-US"/>
+        </w:rPr>
+      </w:pPr>
+      <w:r>
+        <w:rPr>
+          <w:lang w:val="en-US"/>
+        </w:rPr>
+        <w:t xml:space="preserve">Android Developers. (s. f.). </w:t>
       </w:r>
       <w:r>
         <w:rPr>
           <w:i/>
           <w:iCs/>
-        </w:rPr>
-        <w:t xml:space="preserve">Text </w:t>
-      </w:r>
-      <w:proofErr w:type="spellStart"/>
-      <w:r>
-        <w:rPr>
-          <w:i/>
-          <w:iCs/>
-        </w:rPr>
-        <w:t>fields</w:t>
-      </w:r>
-      <w:proofErr w:type="spellEnd"/>
-      <w:r>
-        <w:rPr>
-          <w:i/>
-          <w:iCs/>
-        </w:rPr>
-        <w:t xml:space="preserve"> in </w:t>
-      </w:r>
-      <w:proofErr w:type="spellStart"/>
-      <w:r>
-        <w:rPr>
-          <w:i/>
-          <w:iCs/>
-        </w:rPr>
-        <w:t>Compose</w:t>
-      </w:r>
-      <w:proofErr w:type="spellEnd"/>
-      <w:r>
-        <w:rPr>
-          <w:i/>
-          <w:iCs/>
-        </w:rPr>
-        <w:t xml:space="preserve"> (</w:t>
-      </w:r>
-      <w:proofErr w:type="spellStart"/>
-      <w:r>
-        <w:rPr>
-          <w:i/>
-          <w:iCs/>
-        </w:rPr>
-        <w:t>User</w:t>
-      </w:r>
-      <w:proofErr w:type="spellEnd"/>
-      <w:r>
-        <w:rPr>
-          <w:i/>
-          <w:iCs/>
-        </w:rPr>
-        <w:t xml:space="preserve"> input). </w:t>
-      </w:r>
-      <w:r>
+          <w:lang w:val="en-US"/>
+        </w:rPr>
+        <w:t xml:space="preserve">Text fields in Compose (User input). </w:t>
+      </w:r>
+      <w:r>
+        <w:rPr>
+          <w:lang w:val="en-US"/>
+        </w:rPr>
         <w:t xml:space="preserve">Google. </w:t>
       </w:r>
-      <w:hyperlink r:id="rId19" w:history="1">
+      <w:hyperlink r:id="rId20" w:history="1">
         <w:r>
           <w:rPr>
-            <w:rStyle w:val="Hipervnculo"/>
+            <w:rStyle w:val="Hyperlink"/>
+            <w:lang w:val="en-US"/>
           </w:rPr>
           <w:t>https://developer.android.com/develop/ui/compose/text/user-input?hl=es-419&amp;textfield=state-based</w:t>
         </w:r>
@@ -5771,139 +5694,43 @@
     <w:p>
       <w:pPr>
         <w:pStyle w:val="Textomemoria"/>
+        <w:rPr>
+          <w:lang w:val="en-US"/>
+        </w:rPr>
       </w:pPr>
     </w:p>
     <w:p>
       <w:pPr>
         <w:pStyle w:val="Textomemoria"/>
-      </w:pPr>
-      <w:proofErr w:type="spellStart"/>
-      <w:r>
-        <w:t>Firebase</w:t>
-      </w:r>
-      <w:proofErr w:type="spellEnd"/>
-      <w:r>
-        <w:t xml:space="preserve">. (s. f.). </w:t>
-      </w:r>
-      <w:proofErr w:type="spellStart"/>
+        <w:rPr>
+          <w:lang w:val="en-US"/>
+        </w:rPr>
+      </w:pPr>
+      <w:r>
+        <w:rPr>
+          <w:lang w:val="en-US"/>
+        </w:rPr>
+        <w:t xml:space="preserve">Firebase. (s. f.). </w:t>
+      </w:r>
       <w:r>
         <w:rPr>
           <w:i/>
           <w:iCs/>
-        </w:rPr>
-        <w:t>Authenticate</w:t>
-      </w:r>
-      <w:proofErr w:type="spellEnd"/>
-      <w:r>
-        <w:rPr>
-          <w:i/>
-          <w:iCs/>
-        </w:rPr>
-        <w:t xml:space="preserve"> </w:t>
-      </w:r>
-      <w:proofErr w:type="spellStart"/>
-      <w:r>
-        <w:rPr>
-          <w:i/>
-          <w:iCs/>
-        </w:rPr>
-        <w:t>with</w:t>
-      </w:r>
-      <w:proofErr w:type="spellEnd"/>
-      <w:r>
-        <w:rPr>
-          <w:i/>
-          <w:iCs/>
-        </w:rPr>
-        <w:t xml:space="preserve"> </w:t>
-      </w:r>
-      <w:proofErr w:type="spellStart"/>
-      <w:r>
-        <w:rPr>
-          <w:i/>
-          <w:iCs/>
-        </w:rPr>
-        <w:t>Firebase</w:t>
-      </w:r>
-      <w:proofErr w:type="spellEnd"/>
-      <w:r>
-        <w:rPr>
-          <w:i/>
-          <w:iCs/>
-        </w:rPr>
-        <w:t xml:space="preserve"> </w:t>
-      </w:r>
-      <w:proofErr w:type="spellStart"/>
-      <w:r>
-        <w:rPr>
-          <w:i/>
-          <w:iCs/>
-        </w:rPr>
-        <w:t>using</w:t>
-      </w:r>
-      <w:proofErr w:type="spellEnd"/>
-      <w:r>
-        <w:rPr>
-          <w:i/>
-          <w:iCs/>
-        </w:rPr>
-        <w:t xml:space="preserve"> </w:t>
-      </w:r>
-      <w:proofErr w:type="spellStart"/>
-      <w:r>
-        <w:rPr>
-          <w:i/>
-          <w:iCs/>
-        </w:rPr>
-        <w:t>password-based</w:t>
-      </w:r>
-      <w:proofErr w:type="spellEnd"/>
-      <w:r>
-        <w:rPr>
-          <w:i/>
-          <w:iCs/>
-        </w:rPr>
-        <w:t xml:space="preserve"> </w:t>
-      </w:r>
-      <w:proofErr w:type="spellStart"/>
-      <w:r>
-        <w:rPr>
-          <w:i/>
-          <w:iCs/>
-        </w:rPr>
-        <w:t>accounts</w:t>
-      </w:r>
-      <w:proofErr w:type="spellEnd"/>
-      <w:r>
-        <w:rPr>
-          <w:i/>
-          <w:iCs/>
-        </w:rPr>
-        <w:t xml:space="preserve"> </w:t>
-      </w:r>
-      <w:proofErr w:type="spellStart"/>
-      <w:r>
-        <w:rPr>
-          <w:i/>
-          <w:iCs/>
-        </w:rPr>
-        <w:t>on</w:t>
-      </w:r>
-      <w:proofErr w:type="spellEnd"/>
-      <w:r>
-        <w:rPr>
-          <w:i/>
-          <w:iCs/>
-        </w:rPr>
-        <w:t xml:space="preserve"> Android. </w:t>
-      </w:r>
-      <w:r>
+          <w:lang w:val="en-US"/>
+        </w:rPr>
+        <w:t xml:space="preserve">Authenticate with Firebase using password-based accounts on Android. </w:t>
+      </w:r>
+      <w:r>
+        <w:rPr>
+          <w:lang w:val="en-US"/>
+        </w:rPr>
         <w:t xml:space="preserve">Google. </w:t>
       </w:r>
-      <w:hyperlink r:id="rId20" w:history="1">
+      <w:hyperlink r:id="rId21" w:history="1">
         <w:r>
           <w:rPr>
-            <w:rStyle w:val="Hipervnculo"/>
+            <w:rStyle w:val="Hyperlink"/>
+            <w:lang w:val="en-US"/>
           </w:rPr>
           <w:t>https://firebase.google.com/docs/auth/android/password-auth</w:t>
         </w:r>
@@ -5912,68 +5739,39 @@
     <w:p>
       <w:pPr>
         <w:pStyle w:val="Textomemoria"/>
+        <w:rPr>
+          <w:lang w:val="en-US"/>
+        </w:rPr>
       </w:pPr>
     </w:p>
     <w:p>
       <w:pPr>
         <w:pStyle w:val="Textomemoria"/>
       </w:pPr>
-      <w:proofErr w:type="spellStart"/>
-      <w:r>
-        <w:t>Firebase</w:t>
-      </w:r>
-      <w:proofErr w:type="spellEnd"/>
-      <w:r>
-        <w:t xml:space="preserve">. (s. f.). </w:t>
-      </w:r>
-      <w:proofErr w:type="spellStart"/>
+      <w:r>
+        <w:rPr>
+          <w:lang w:val="en-US"/>
+        </w:rPr>
+        <w:t xml:space="preserve">Firebase. (s. f.). </w:t>
+      </w:r>
       <w:r>
         <w:rPr>
           <w:i/>
           <w:iCs/>
-        </w:rPr>
-        <w:t>Firebase</w:t>
-      </w:r>
-      <w:proofErr w:type="spellEnd"/>
-      <w:r>
-        <w:rPr>
-          <w:i/>
-          <w:iCs/>
-        </w:rPr>
-        <w:t xml:space="preserve"> </w:t>
-      </w:r>
-      <w:proofErr w:type="spellStart"/>
-      <w:r>
-        <w:rPr>
-          <w:i/>
-          <w:iCs/>
-        </w:rPr>
-        <w:t>Realtime</w:t>
-      </w:r>
-      <w:proofErr w:type="spellEnd"/>
-      <w:r>
-        <w:rPr>
-          <w:i/>
-          <w:iCs/>
-        </w:rPr>
-        <w:t xml:space="preserve"> </w:t>
-      </w:r>
-      <w:proofErr w:type="spellStart"/>
-      <w:r>
-        <w:rPr>
-          <w:i/>
-          <w:iCs/>
-        </w:rPr>
-        <w:t>Database</w:t>
-      </w:r>
-      <w:proofErr w:type="spellEnd"/>
-      <w:r>
+          <w:lang w:val="en-US"/>
+        </w:rPr>
+        <w:t>Firebase Realtime Database</w:t>
+      </w:r>
+      <w:r>
+        <w:rPr>
+          <w:lang w:val="en-US"/>
+        </w:rPr>
         <w:t xml:space="preserve">. Google. </w:t>
       </w:r>
-      <w:hyperlink r:id="rId21" w:history="1">
+      <w:hyperlink r:id="rId22" w:history="1">
         <w:r>
           <w:rPr>
-            <w:rStyle w:val="Hipervnculo"/>
+            <w:rStyle w:val="Hyperlink"/>
           </w:rPr>
           <w:t>https://firebase.google.com/docs/database?hl=es-419</w:t>
         </w:r>
@@ -5987,6 +5785,9 @@
     <w:p>
       <w:pPr>
         <w:pStyle w:val="Textomemoria"/>
+        <w:rPr>
+          <w:lang w:val="en-US"/>
+        </w:rPr>
       </w:pPr>
       <w:proofErr w:type="spellStart"/>
       <w:r>
@@ -6052,12 +5853,19 @@
         <w:t xml:space="preserve"> en Android.</w:t>
       </w:r>
       <w:r>
-        <w:t xml:space="preserve"> Google. </w:t>
-      </w:r>
-      <w:hyperlink r:id="rId22" w:history="1">
+        <w:t xml:space="preserve"> </w:t>
+      </w:r>
+      <w:r>
+        <w:rPr>
+          <w:lang w:val="en-US"/>
+        </w:rPr>
+        <w:t xml:space="preserve">Google. </w:t>
+      </w:r>
+      <w:hyperlink r:id="rId23" w:history="1">
         <w:r>
           <w:rPr>
-            <w:rStyle w:val="Hipervnculo"/>
+            <w:rStyle w:val="Hyperlink"/>
+            <w:lang w:val="en-US"/>
           </w:rPr>
           <w:t>https://firebase.google.com/docs/database/android/start?hl=es-419</w:t>
         </w:r>
@@ -6066,11 +5874,17 @@
     <w:p>
       <w:pPr>
         <w:pStyle w:val="Textomemoria"/>
+        <w:rPr>
+          <w:lang w:val="en-US"/>
+        </w:rPr>
       </w:pPr>
     </w:p>
     <w:p>
       <w:pPr>
         <w:pStyle w:val="Textomemoria"/>
+        <w:rPr>
+          <w:lang w:val="en-US"/>
+        </w:rPr>
       </w:pPr>
       <w:proofErr w:type="spellStart"/>
       <w:r>
@@ -6088,12 +5902,19 @@
         <w:t>Leer y escribir datos en Android.</w:t>
       </w:r>
       <w:r>
-        <w:t xml:space="preserve"> Google. </w:t>
-      </w:r>
-      <w:hyperlink r:id="rId23" w:history="1">
+        <w:t xml:space="preserve"> </w:t>
+      </w:r>
+      <w:r>
+        <w:rPr>
+          <w:lang w:val="en-US"/>
+        </w:rPr>
+        <w:t xml:space="preserve">Google. </w:t>
+      </w:r>
+      <w:hyperlink r:id="rId24" w:history="1">
         <w:r>
           <w:rPr>
-            <w:rStyle w:val="Hipervnculo"/>
+            <w:rStyle w:val="Hyperlink"/>
+            <w:lang w:val="en-US"/>
           </w:rPr>
           <w:t>https://firebase.google.com/docs/database/android/read-and-write</w:t>
         </w:r>
@@ -6165,10 +5986,10 @@
         </w:rPr>
         <w:t xml:space="preserve">). </w:t>
       </w:r>
-      <w:hyperlink r:id="rId24" w:history="1">
+      <w:hyperlink r:id="rId25" w:history="1">
         <w:r>
           <w:rPr>
-            <w:rStyle w:val="Hipervnculo"/>
+            <w:rStyle w:val="Hyperlink"/>
           </w:rPr>
           <w:t>https://www.tutorialesprogramacionya.com/composeya/detalleconcepto.php?punto=12&amp;codigo=12&amp;inicio=0</w:t>
         </w:r>
@@ -6224,7 +6045,7 @@
           <w:sdtContent>
             <w:p>
               <w:pPr>
-                <w:pStyle w:val="Ttulo1"/>
+                <w:pStyle w:val="Heading1"/>
               </w:pPr>
             </w:p>
             <w:p/>
@@ -6299,7 +6120,7 @@
       </w:pPr>
     </w:p>
     <w:sectPr>
-      <w:footerReference w:type="default" r:id="rId25"/>
+      <w:footerReference w:type="default" r:id="rId26"/>
       <w:pgSz w:w="11906" w:h="16838"/>
       <w:pgMar w:top="1418" w:right="1418" w:bottom="1418" w:left="1701" w:header="709" w:footer="709" w:gutter="0"/>
       <w:pgNumType w:start="1"/>
@@ -6339,7 +6160,7 @@
 <w:ftr xmlns:wpc="http://schemas.microsoft.com/office/word/2010/wordprocessingCanvas" xmlns:cx="http://schemas.microsoft.com/office/drawing/2014/chartex" xmlns:cx1="http://schemas.microsoft.com/office/drawing/2015/9/8/chartex" xmlns:cx2="http://schemas.microsoft.com/office/drawing/2015/10/21/chartex" xmlns:cx3="http://schemas.microsoft.com/office/drawing/2016/5/9/chartex" xmlns:cx4="http://schemas.microsoft.com/office/drawing/2016/5/10/chartex" xmlns:cx5="http://schemas.microsoft.com/office/drawing/2016/5/11/chartex" xmlns:cx6="http://schemas.microsoft.com/office/drawing/2016/5/12/chartex" xmlns:cx7="http://schemas.microsoft.com/office/drawing/2016/5/13/chartex" xmlns:cx8="http://schemas.microsoft.com/office/drawing/2016/5/14/chartex" xmlns:mc="http://schemas.openxmlformats.org/markup-compatibility/2006" xmlns:aink="http://schemas.microsoft.com/office/drawing/2016/ink" xmlns:am3d="http://schemas.microsoft.com/office/drawing/2017/model3d" xmlns:o="urn:schemas-microsoft-com:office:office" xmlns:oel="http://schemas.microsoft.com/office/2019/extlst" xmlns:r="http://schemas.openxmlformats.org/officeDocument/2006/relationships" xmlns:m="http://schemas.openxmlformats.org/officeDocument/2006/math" xmlns:v="urn:schemas-microsoft-com:vml" xmlns:wp14="http://schemas.microsoft.com/office/word/2010/wordprocessingDrawing" xmlns:wp="http://schemas.openxmlformats.org/drawingml/2006/wordprocessingDrawing" xmlns:w10="urn:schemas-microsoft-com:office:word" xmlns:w="http://schemas.openxmlformats.org/wordprocessingml/2006/main" xmlns:w14="http://schemas.microsoft.com/office/word/2010/wordml" xmlns:w15="http://schemas.microsoft.com/office/word/2012/wordml" xmlns:w16cex="http://schemas.microsoft.com/office/word/2018/wordml/cex" xmlns:w16cid="http://schemas.microsoft.com/office/word/2016/wordml/cid" xmlns:w16="http://schemas.microsoft.com/office/word/2018/wordml" xmlns:w16du="http://schemas.microsoft.com/office/word/2023/wordml/word16du" xmlns:w16sdtdh="http://schemas.microsoft.com/office/word/2020/wordml/sdtdatahash" xmlns:w16sdtfl="http://schemas.microsoft.com/office/word/2024/wordml/sdtformatlock" xmlns:w16se="http://schemas.microsoft.com/office/word/2015/wordml/symex" xmlns:wpg="http://schemas.microsoft.com/office/word/2010/wordprocessingGroup" xmlns:wpi="http://schemas.microsoft.com/office/word/2010/wordprocessingInk" xmlns:wne="http://schemas.microsoft.com/office/word/2006/wordml" xmlns:wps="http://schemas.microsoft.com/office/word/2010/wordprocessingShape" mc:Ignorable="w14 w15 w16se w16cid w16 w16cex w16sdtdh w16sdtfl w16du wp14">
   <w:p>
     <w:pPr>
-      <w:pStyle w:val="Piedepgina"/>
+      <w:pStyle w:val="Footer"/>
     </w:pPr>
   </w:p>
 </w:ftr>
@@ -6363,7 +6184,7 @@
     <w:sdtContent>
       <w:p>
         <w:pPr>
-          <w:pStyle w:val="Piedepgina"/>
+          <w:pStyle w:val="Footer"/>
           <w:jc w:val="center"/>
         </w:pPr>
         <w:r>
@@ -6392,7 +6213,7 @@
   </w:sdt>
   <w:p>
     <w:pPr>
-      <w:pStyle w:val="Piedepgina"/>
+      <w:pStyle w:val="Footer"/>
     </w:pPr>
   </w:p>
 </w:ftr>
@@ -8581,11 +8402,11 @@
     <w:qFormat/>
     <w:rsid w:val="00C82473"/>
   </w:style>
-  <w:style w:type="paragraph" w:styleId="Ttulo1">
+  <w:style w:type="paragraph" w:styleId="Heading1">
     <w:name w:val="heading 1"/>
     <w:basedOn w:val="Normal"/>
     <w:next w:val="Normal"/>
-    <w:link w:val="Ttulo1Car"/>
+    <w:link w:val="Heading1Char"/>
     <w:uiPriority w:val="9"/>
     <w:qFormat/>
     <w:rsid w:val="00014B39"/>
@@ -8602,11 +8423,11 @@
       <w:szCs w:val="32"/>
     </w:rPr>
   </w:style>
-  <w:style w:type="paragraph" w:styleId="Ttulo2">
+  <w:style w:type="paragraph" w:styleId="Heading2">
     <w:name w:val="heading 2"/>
     <w:basedOn w:val="Normal"/>
     <w:next w:val="Normal"/>
-    <w:link w:val="Ttulo2Car"/>
+    <w:link w:val="Heading2Char"/>
     <w:uiPriority w:val="9"/>
     <w:unhideWhenUsed/>
     <w:qFormat/>
@@ -8624,11 +8445,11 @@
       <w:szCs w:val="26"/>
     </w:rPr>
   </w:style>
-  <w:style w:type="paragraph" w:styleId="Ttulo3">
+  <w:style w:type="paragraph" w:styleId="Heading3">
     <w:name w:val="heading 3"/>
     <w:basedOn w:val="Normal"/>
     <w:next w:val="Normal"/>
-    <w:link w:val="Ttulo3Car"/>
+    <w:link w:val="Heading3Char"/>
     <w:uiPriority w:val="9"/>
     <w:semiHidden/>
     <w:unhideWhenUsed/>
@@ -8647,11 +8468,11 @@
       <w:szCs w:val="24"/>
     </w:rPr>
   </w:style>
-  <w:style w:type="paragraph" w:styleId="Ttulo4">
+  <w:style w:type="paragraph" w:styleId="Heading4">
     <w:name w:val="heading 4"/>
     <w:basedOn w:val="Normal"/>
     <w:next w:val="Normal"/>
-    <w:link w:val="Ttulo4Car"/>
+    <w:link w:val="Heading4Char"/>
     <w:uiPriority w:val="9"/>
     <w:semiHidden/>
     <w:unhideWhenUsed/>
@@ -8670,13 +8491,13 @@
       <w:color w:val="2F5496" w:themeColor="accent1" w:themeShade="BF"/>
     </w:rPr>
   </w:style>
-  <w:style w:type="character" w:default="1" w:styleId="Fuentedeprrafopredeter">
+  <w:style w:type="character" w:default="1" w:styleId="DefaultParagraphFont">
     <w:name w:val="Default Paragraph Font"/>
     <w:uiPriority w:val="1"/>
     <w:semiHidden/>
     <w:unhideWhenUsed/>
   </w:style>
-  <w:style w:type="table" w:default="1" w:styleId="Tablanormal">
+  <w:style w:type="table" w:default="1" w:styleId="TableNormal">
     <w:name w:val="Normal Table"/>
     <w:uiPriority w:val="99"/>
     <w:semiHidden/>
@@ -8691,16 +8512,16 @@
       </w:tblCellMar>
     </w:tblPr>
   </w:style>
-  <w:style w:type="numbering" w:default="1" w:styleId="Sinlista">
+  <w:style w:type="numbering" w:default="1" w:styleId="NoList">
     <w:name w:val="No List"/>
     <w:uiPriority w:val="99"/>
     <w:semiHidden/>
     <w:unhideWhenUsed/>
   </w:style>
-  <w:style w:type="character" w:customStyle="1" w:styleId="Ttulo1Car">
-    <w:name w:val="Título 1 Car"/>
-    <w:basedOn w:val="Fuentedeprrafopredeter"/>
-    <w:link w:val="Ttulo1"/>
+  <w:style w:type="character" w:customStyle="1" w:styleId="Heading1Char">
+    <w:name w:val="Heading 1 Char"/>
+    <w:basedOn w:val="DefaultParagraphFont"/>
+    <w:link w:val="Heading1"/>
     <w:uiPriority w:val="9"/>
     <w:rsid w:val="00014B39"/>
     <w:rPr>
@@ -8712,7 +8533,7 @@
   </w:style>
   <w:style w:type="paragraph" w:customStyle="1" w:styleId="Estilo1">
     <w:name w:val="Estilo1"/>
-    <w:basedOn w:val="Ttulo1"/>
+    <w:basedOn w:val="Heading1"/>
     <w:link w:val="Estilo1Car"/>
     <w:qFormat/>
     <w:rsid w:val="00014B39"/>
@@ -8722,7 +8543,7 @@
   </w:style>
   <w:style w:type="character" w:customStyle="1" w:styleId="Estilo1Car">
     <w:name w:val="Estilo1 Car"/>
-    <w:basedOn w:val="Ttulo1Car"/>
+    <w:basedOn w:val="Heading1Char"/>
     <w:link w:val="Estilo1"/>
     <w:rsid w:val="00014B39"/>
     <w:rPr>
@@ -8732,7 +8553,7 @@
       <w:szCs w:val="32"/>
     </w:rPr>
   </w:style>
-  <w:style w:type="paragraph" w:styleId="Prrafodelista">
+  <w:style w:type="paragraph" w:styleId="ListParagraph">
     <w:name w:val="List Paragraph"/>
     <w:basedOn w:val="Normal"/>
     <w:uiPriority w:val="34"/>
@@ -8755,17 +8576,17 @@
   </w:style>
   <w:style w:type="character" w:customStyle="1" w:styleId="TextomemoriaCar">
     <w:name w:val="Texto memoria Car"/>
-    <w:basedOn w:val="Fuentedeprrafopredeter"/>
+    <w:basedOn w:val="DefaultParagraphFont"/>
     <w:link w:val="Textomemoria"/>
     <w:rsid w:val="00310023"/>
     <w:rPr>
       <w:rFonts w:ascii="Verdana" w:hAnsi="Verdana"/>
     </w:rPr>
   </w:style>
-  <w:style w:type="paragraph" w:styleId="Encabezado">
+  <w:style w:type="paragraph" w:styleId="Header">
     <w:name w:val="header"/>
     <w:basedOn w:val="Normal"/>
-    <w:link w:val="EncabezadoCar"/>
+    <w:link w:val="HeaderChar"/>
     <w:uiPriority w:val="99"/>
     <w:unhideWhenUsed/>
     <w:rsid w:val="00B13784"/>
@@ -8777,17 +8598,17 @@
       <w:spacing w:after="0" w:line="240" w:lineRule="auto"/>
     </w:pPr>
   </w:style>
-  <w:style w:type="character" w:customStyle="1" w:styleId="EncabezadoCar">
-    <w:name w:val="Encabezado Car"/>
-    <w:basedOn w:val="Fuentedeprrafopredeter"/>
-    <w:link w:val="Encabezado"/>
+  <w:style w:type="character" w:customStyle="1" w:styleId="HeaderChar">
+    <w:name w:val="Header Char"/>
+    <w:basedOn w:val="DefaultParagraphFont"/>
+    <w:link w:val="Header"/>
     <w:uiPriority w:val="99"/>
     <w:rsid w:val="00B13784"/>
   </w:style>
-  <w:style w:type="paragraph" w:styleId="Piedepgina">
+  <w:style w:type="paragraph" w:styleId="Footer">
     <w:name w:val="footer"/>
     <w:basedOn w:val="Normal"/>
-    <w:link w:val="PiedepginaCar"/>
+    <w:link w:val="FooterChar"/>
     <w:uiPriority w:val="99"/>
     <w:unhideWhenUsed/>
     <w:rsid w:val="00B13784"/>
@@ -8799,16 +8620,16 @@
       <w:spacing w:after="0" w:line="240" w:lineRule="auto"/>
     </w:pPr>
   </w:style>
-  <w:style w:type="character" w:customStyle="1" w:styleId="PiedepginaCar">
-    <w:name w:val="Pie de página Car"/>
-    <w:basedOn w:val="Fuentedeprrafopredeter"/>
-    <w:link w:val="Piedepgina"/>
+  <w:style w:type="character" w:customStyle="1" w:styleId="FooterChar">
+    <w:name w:val="Footer Char"/>
+    <w:basedOn w:val="DefaultParagraphFont"/>
+    <w:link w:val="Footer"/>
     <w:uiPriority w:val="99"/>
     <w:rsid w:val="00B13784"/>
   </w:style>
-  <w:style w:type="paragraph" w:styleId="TtuloTDC">
+  <w:style w:type="paragraph" w:styleId="TOCHeading">
     <w:name w:val="TOC Heading"/>
-    <w:basedOn w:val="Ttulo1"/>
+    <w:basedOn w:val="Heading1"/>
     <w:next w:val="Normal"/>
     <w:uiPriority w:val="39"/>
     <w:unhideWhenUsed/>
@@ -8821,7 +8642,7 @@
       <w:lang w:eastAsia="es-ES"/>
     </w:rPr>
   </w:style>
-  <w:style w:type="paragraph" w:styleId="TDC1">
+  <w:style w:type="paragraph" w:styleId="TOC1">
     <w:name w:val="toc 1"/>
     <w:basedOn w:val="Normal"/>
     <w:next w:val="Normal"/>
@@ -8833,9 +8654,9 @@
       <w:spacing w:after="100"/>
     </w:pPr>
   </w:style>
-  <w:style w:type="character" w:styleId="Hipervnculo">
+  <w:style w:type="character" w:styleId="Hyperlink">
     <w:name w:val="Hyperlink"/>
-    <w:basedOn w:val="Fuentedeprrafopredeter"/>
+    <w:basedOn w:val="DefaultParagraphFont"/>
     <w:uiPriority w:val="99"/>
     <w:unhideWhenUsed/>
     <w:rsid w:val="00B13784"/>
@@ -8857,9 +8678,9 @@
       <w:szCs w:val="24"/>
     </w:rPr>
   </w:style>
-  <w:style w:type="character" w:styleId="Textoennegrita">
+  <w:style w:type="character" w:styleId="Strong">
     <w:name w:val="Strong"/>
-    <w:basedOn w:val="Fuentedeprrafopredeter"/>
+    <w:basedOn w:val="DefaultParagraphFont"/>
     <w:uiPriority w:val="22"/>
     <w:qFormat/>
     <w:rsid w:val="00DC441B"/>
@@ -8868,10 +8689,10 @@
       <w:bCs/>
     </w:rPr>
   </w:style>
-  <w:style w:type="character" w:customStyle="1" w:styleId="Ttulo4Car">
-    <w:name w:val="Título 4 Car"/>
-    <w:basedOn w:val="Fuentedeprrafopredeter"/>
-    <w:link w:val="Ttulo4"/>
+  <w:style w:type="character" w:customStyle="1" w:styleId="Heading4Char">
+    <w:name w:val="Heading 4 Char"/>
+    <w:basedOn w:val="DefaultParagraphFont"/>
+    <w:link w:val="Heading4"/>
     <w:uiPriority w:val="9"/>
     <w:semiHidden/>
     <w:rsid w:val="00DC441B"/>
@@ -8882,7 +8703,7 @@
       <w:color w:val="2F5496" w:themeColor="accent1" w:themeShade="BF"/>
     </w:rPr>
   </w:style>
-  <w:style w:type="paragraph" w:styleId="TDC2">
+  <w:style w:type="paragraph" w:styleId="TOC2">
     <w:name w:val="toc 2"/>
     <w:basedOn w:val="Normal"/>
     <w:next w:val="Normal"/>
@@ -8899,7 +8720,7 @@
       <w:lang w:val="en-US"/>
     </w:rPr>
   </w:style>
-  <w:style w:type="paragraph" w:styleId="TDC3">
+  <w:style w:type="paragraph" w:styleId="TOC3">
     <w:name w:val="toc 3"/>
     <w:basedOn w:val="Normal"/>
     <w:next w:val="Normal"/>
@@ -8916,7 +8737,7 @@
       <w:lang w:val="en-US"/>
     </w:rPr>
   </w:style>
-  <w:style w:type="paragraph" w:styleId="TDC5">
+  <w:style w:type="paragraph" w:styleId="TOC5">
     <w:name w:val="toc 5"/>
     <w:basedOn w:val="Normal"/>
     <w:next w:val="Normal"/>
@@ -8930,10 +8751,10 @@
       <w:ind w:left="880"/>
     </w:pPr>
   </w:style>
-  <w:style w:type="character" w:customStyle="1" w:styleId="Ttulo2Car">
-    <w:name w:val="Título 2 Car"/>
-    <w:basedOn w:val="Fuentedeprrafopredeter"/>
-    <w:link w:val="Ttulo2"/>
+  <w:style w:type="character" w:customStyle="1" w:styleId="Heading2Char">
+    <w:name w:val="Heading 2 Char"/>
+    <w:basedOn w:val="DefaultParagraphFont"/>
+    <w:link w:val="Heading2"/>
     <w:uiPriority w:val="9"/>
     <w:rsid w:val="00FA3C79"/>
     <w:rPr>
@@ -8943,10 +8764,10 @@
       <w:szCs w:val="26"/>
     </w:rPr>
   </w:style>
-  <w:style w:type="character" w:customStyle="1" w:styleId="Ttulo3Car">
-    <w:name w:val="Título 3 Car"/>
-    <w:basedOn w:val="Fuentedeprrafopredeter"/>
-    <w:link w:val="Ttulo3"/>
+  <w:style w:type="character" w:customStyle="1" w:styleId="Heading3Char">
+    <w:name w:val="Heading 3 Char"/>
+    <w:basedOn w:val="DefaultParagraphFont"/>
+    <w:link w:val="Heading3"/>
     <w:uiPriority w:val="9"/>
     <w:semiHidden/>
     <w:rsid w:val="00D7623B"/>
@@ -8957,7 +8778,7 @@
       <w:szCs w:val="24"/>
     </w:rPr>
   </w:style>
-  <w:style w:type="paragraph" w:styleId="Descripcin">
+  <w:style w:type="paragraph" w:styleId="Caption">
     <w:name w:val="caption"/>
     <w:basedOn w:val="Normal"/>
     <w:next w:val="Normal"/>
@@ -8976,9 +8797,9 @@
       <w:szCs w:val="18"/>
     </w:rPr>
   </w:style>
-  <w:style w:type="character" w:styleId="nfasis">
+  <w:style w:type="character" w:styleId="Emphasis">
     <w:name w:val="Emphasis"/>
-    <w:basedOn w:val="Fuentedeprrafopredeter"/>
+    <w:basedOn w:val="DefaultParagraphFont"/>
     <w:uiPriority w:val="20"/>
     <w:qFormat/>
     <w:rsid w:val="00C82473"/>
@@ -8987,9 +8808,9 @@
       <w:iCs/>
     </w:rPr>
   </w:style>
-  <w:style w:type="character" w:styleId="Mencinsinresolver">
+  <w:style w:type="character" w:styleId="UnresolvedMention">
     <w:name w:val="Unresolved Mention"/>
-    <w:basedOn w:val="Fuentedeprrafopredeter"/>
+    <w:basedOn w:val="DefaultParagraphFont"/>
     <w:uiPriority w:val="99"/>
     <w:semiHidden/>
     <w:unhideWhenUsed/>
@@ -8999,7 +8820,7 @@
       <w:shd w:val="clear" w:color="auto" w:fill="E1DFDD"/>
     </w:rPr>
   </w:style>
-  <w:style w:type="paragraph" w:styleId="Bibliografa">
+  <w:style w:type="paragraph" w:styleId="Bibliography">
     <w:name w:val="Bibliography"/>
     <w:basedOn w:val="Normal"/>
     <w:next w:val="Normal"/>

</xml_diff>

<commit_message>
Fix: Admin no se actualizan los estados + cambio colores presupuesto
</commit_message>
<xml_diff>
--- a/Memoria.docx
+++ b/Memoria.docx
@@ -1194,7 +1194,7 @@
       <w:sdtContent>
         <w:p>
           <w:pPr>
-            <w:pStyle w:val="TOCHeading"/>
+            <w:pStyle w:val="TtuloTDC"/>
             <w:spacing w:before="0" w:line="360" w:lineRule="auto"/>
             <w:rPr>
               <w:rFonts w:ascii="Verdana" w:hAnsi="Verdana"/>
@@ -1219,7 +1219,7 @@
         </w:p>
         <w:p>
           <w:pPr>
-            <w:pStyle w:val="TOC1"/>
+            <w:pStyle w:val="TDC1"/>
             <w:tabs>
               <w:tab w:val="left" w:pos="440"/>
               <w:tab w:val="right" w:leader="dot" w:pos="8494"/>
@@ -1255,7 +1255,7 @@
           <w:hyperlink w:anchor="_Toc222910255" w:history="1">
             <w:r>
               <w:rPr>
-                <w:rStyle w:val="Hyperlink"/>
+                <w:rStyle w:val="Hipervnculo"/>
                 <w:noProof/>
               </w:rPr>
               <w:t>1.</w:t>
@@ -1274,7 +1274,7 @@
             </w:r>
             <w:r>
               <w:rPr>
-                <w:rStyle w:val="Hyperlink"/>
+                <w:rStyle w:val="Hipervnculo"/>
                 <w:noProof/>
               </w:rPr>
               <w:t>Resumen</w:t>
@@ -1331,7 +1331,7 @@
         </w:p>
         <w:p>
           <w:pPr>
-            <w:pStyle w:val="TOC1"/>
+            <w:pStyle w:val="TDC1"/>
             <w:tabs>
               <w:tab w:val="left" w:pos="440"/>
               <w:tab w:val="right" w:leader="dot" w:pos="8494"/>
@@ -1349,7 +1349,7 @@
           <w:hyperlink w:anchor="_Toc222910256" w:history="1">
             <w:r>
               <w:rPr>
-                <w:rStyle w:val="Hyperlink"/>
+                <w:rStyle w:val="Hipervnculo"/>
                 <w:noProof/>
               </w:rPr>
               <w:t>2.</w:t>
@@ -1368,7 +1368,7 @@
             </w:r>
             <w:r>
               <w:rPr>
-                <w:rStyle w:val="Hyperlink"/>
+                <w:rStyle w:val="Hipervnculo"/>
                 <w:noProof/>
               </w:rPr>
               <w:t>Abstract</w:t>
@@ -1425,7 +1425,7 @@
         </w:p>
         <w:p>
           <w:pPr>
-            <w:pStyle w:val="TOC1"/>
+            <w:pStyle w:val="TDC1"/>
             <w:tabs>
               <w:tab w:val="left" w:pos="440"/>
               <w:tab w:val="right" w:leader="dot" w:pos="8494"/>
@@ -1443,7 +1443,7 @@
           <w:hyperlink w:anchor="_Toc222910257" w:history="1">
             <w:r>
               <w:rPr>
-                <w:rStyle w:val="Hyperlink"/>
+                <w:rStyle w:val="Hipervnculo"/>
                 <w:noProof/>
               </w:rPr>
               <w:t>3.</w:t>
@@ -1462,7 +1462,7 @@
             </w:r>
             <w:r>
               <w:rPr>
-                <w:rStyle w:val="Hyperlink"/>
+                <w:rStyle w:val="Hipervnculo"/>
                 <w:noProof/>
               </w:rPr>
               <w:t>Justificación del proyecto</w:t>
@@ -1519,7 +1519,7 @@
         </w:p>
         <w:p>
           <w:pPr>
-            <w:pStyle w:val="TOC1"/>
+            <w:pStyle w:val="TDC1"/>
             <w:tabs>
               <w:tab w:val="left" w:pos="440"/>
               <w:tab w:val="right" w:leader="dot" w:pos="8494"/>
@@ -1537,7 +1537,7 @@
           <w:hyperlink w:anchor="_Toc222910258" w:history="1">
             <w:r>
               <w:rPr>
-                <w:rStyle w:val="Hyperlink"/>
+                <w:rStyle w:val="Hipervnculo"/>
                 <w:noProof/>
               </w:rPr>
               <w:t>4.</w:t>
@@ -1556,7 +1556,7 @@
             </w:r>
             <w:r>
               <w:rPr>
-                <w:rStyle w:val="Hyperlink"/>
+                <w:rStyle w:val="Hipervnculo"/>
                 <w:noProof/>
               </w:rPr>
               <w:t>Objetivos</w:t>
@@ -1613,7 +1613,7 @@
         </w:p>
         <w:p>
           <w:pPr>
-            <w:pStyle w:val="TOC2"/>
+            <w:pStyle w:val="TDC2"/>
             <w:tabs>
               <w:tab w:val="left" w:pos="1200"/>
               <w:tab w:val="right" w:leader="dot" w:pos="8494"/>
@@ -1631,7 +1631,7 @@
           <w:hyperlink w:anchor="_Toc222910259" w:history="1">
             <w:r>
               <w:rPr>
-                <w:rStyle w:val="Hyperlink"/>
+                <w:rStyle w:val="Hipervnculo"/>
                 <w:noProof/>
               </w:rPr>
               <w:t>4.1.</w:t>
@@ -1650,7 +1650,7 @@
             </w:r>
             <w:r>
               <w:rPr>
-                <w:rStyle w:val="Hyperlink"/>
+                <w:rStyle w:val="Hipervnculo"/>
                 <w:noProof/>
               </w:rPr>
               <w:t>Objetivos generales</w:t>
@@ -1707,7 +1707,7 @@
         </w:p>
         <w:p>
           <w:pPr>
-            <w:pStyle w:val="TOC2"/>
+            <w:pStyle w:val="TDC2"/>
             <w:tabs>
               <w:tab w:val="left" w:pos="1200"/>
               <w:tab w:val="right" w:leader="dot" w:pos="8494"/>
@@ -1725,7 +1725,7 @@
           <w:hyperlink w:anchor="_Toc222910260" w:history="1">
             <w:r>
               <w:rPr>
-                <w:rStyle w:val="Hyperlink"/>
+                <w:rStyle w:val="Hipervnculo"/>
                 <w:noProof/>
               </w:rPr>
               <w:t>4.2.</w:t>
@@ -1744,7 +1744,7 @@
             </w:r>
             <w:r>
               <w:rPr>
-                <w:rStyle w:val="Hyperlink"/>
+                <w:rStyle w:val="Hipervnculo"/>
                 <w:noProof/>
               </w:rPr>
               <w:t>Objetivos específicos</w:t>
@@ -1801,7 +1801,7 @@
         </w:p>
         <w:p>
           <w:pPr>
-            <w:pStyle w:val="TOC1"/>
+            <w:pStyle w:val="TDC1"/>
             <w:tabs>
               <w:tab w:val="left" w:pos="440"/>
               <w:tab w:val="right" w:leader="dot" w:pos="8494"/>
@@ -1819,7 +1819,7 @@
           <w:hyperlink w:anchor="_Toc222910261" w:history="1">
             <w:r>
               <w:rPr>
-                <w:rStyle w:val="Hyperlink"/>
+                <w:rStyle w:val="Hipervnculo"/>
                 <w:noProof/>
               </w:rPr>
               <w:t>5.</w:t>
@@ -1838,7 +1838,7 @@
             </w:r>
             <w:r>
               <w:rPr>
-                <w:rStyle w:val="Hyperlink"/>
+                <w:rStyle w:val="Hipervnculo"/>
                 <w:noProof/>
               </w:rPr>
               <w:t>Tecnologías empleadas</w:t>
@@ -1895,7 +1895,7 @@
         </w:p>
         <w:p>
           <w:pPr>
-            <w:pStyle w:val="TOC2"/>
+            <w:pStyle w:val="TDC2"/>
             <w:tabs>
               <w:tab w:val="left" w:pos="1200"/>
               <w:tab w:val="right" w:leader="dot" w:pos="8494"/>
@@ -1913,7 +1913,7 @@
           <w:hyperlink w:anchor="_Toc222910262" w:history="1">
             <w:r>
               <w:rPr>
-                <w:rStyle w:val="Hyperlink"/>
+                <w:rStyle w:val="Hipervnculo"/>
                 <w:noProof/>
               </w:rPr>
               <w:t>5.1.</w:t>
@@ -1932,7 +1932,7 @@
             </w:r>
             <w:r>
               <w:rPr>
-                <w:rStyle w:val="Hyperlink"/>
+                <w:rStyle w:val="Hipervnculo"/>
                 <w:noProof/>
               </w:rPr>
               <w:t>Tecnologías</w:t>
@@ -1989,7 +1989,7 @@
         </w:p>
         <w:p>
           <w:pPr>
-            <w:pStyle w:val="TOC2"/>
+            <w:pStyle w:val="TDC2"/>
             <w:tabs>
               <w:tab w:val="left" w:pos="1200"/>
               <w:tab w:val="right" w:leader="dot" w:pos="8494"/>
@@ -2007,7 +2007,7 @@
           <w:hyperlink w:anchor="_Toc222910263" w:history="1">
             <w:r>
               <w:rPr>
-                <w:rStyle w:val="Hyperlink"/>
+                <w:rStyle w:val="Hipervnculo"/>
                 <w:noProof/>
               </w:rPr>
               <w:t>5.2.</w:t>
@@ -2026,7 +2026,7 @@
             </w:r>
             <w:r>
               <w:rPr>
-                <w:rStyle w:val="Hyperlink"/>
+                <w:rStyle w:val="Hipervnculo"/>
                 <w:noProof/>
               </w:rPr>
               <w:t>Herramientas</w:t>
@@ -2083,7 +2083,7 @@
         </w:p>
         <w:p>
           <w:pPr>
-            <w:pStyle w:val="TOC1"/>
+            <w:pStyle w:val="TDC1"/>
             <w:tabs>
               <w:tab w:val="left" w:pos="440"/>
               <w:tab w:val="right" w:leader="dot" w:pos="8494"/>
@@ -2101,7 +2101,7 @@
           <w:hyperlink w:anchor="_Toc222910264" w:history="1">
             <w:r>
               <w:rPr>
-                <w:rStyle w:val="Hyperlink"/>
+                <w:rStyle w:val="Hipervnculo"/>
                 <w:noProof/>
               </w:rPr>
               <w:t>6.</w:t>
@@ -2120,7 +2120,7 @@
             </w:r>
             <w:r>
               <w:rPr>
-                <w:rStyle w:val="Hyperlink"/>
+                <w:rStyle w:val="Hipervnculo"/>
                 <w:noProof/>
               </w:rPr>
               <w:t>Desarrollo</w:t>
@@ -2177,7 +2177,7 @@
         </w:p>
         <w:p>
           <w:pPr>
-            <w:pStyle w:val="TOC2"/>
+            <w:pStyle w:val="TDC2"/>
             <w:tabs>
               <w:tab w:val="left" w:pos="1200"/>
               <w:tab w:val="right" w:leader="dot" w:pos="8494"/>
@@ -2195,7 +2195,7 @@
           <w:hyperlink w:anchor="_Toc222910265" w:history="1">
             <w:r>
               <w:rPr>
-                <w:rStyle w:val="Hyperlink"/>
+                <w:rStyle w:val="Hipervnculo"/>
                 <w:noProof/>
               </w:rPr>
               <w:t>6.1.</w:t>
@@ -2214,7 +2214,7 @@
             </w:r>
             <w:r>
               <w:rPr>
-                <w:rStyle w:val="Hyperlink"/>
+                <w:rStyle w:val="Hipervnculo"/>
                 <w:noProof/>
               </w:rPr>
               <w:t>Enumeración de requisitos</w:t>
@@ -2271,7 +2271,7 @@
         </w:p>
         <w:p>
           <w:pPr>
-            <w:pStyle w:val="TOC2"/>
+            <w:pStyle w:val="TDC2"/>
             <w:tabs>
               <w:tab w:val="left" w:pos="1200"/>
               <w:tab w:val="right" w:leader="dot" w:pos="8494"/>
@@ -2289,7 +2289,7 @@
           <w:hyperlink w:anchor="_Toc222910266" w:history="1">
             <w:r>
               <w:rPr>
-                <w:rStyle w:val="Hyperlink"/>
+                <w:rStyle w:val="Hipervnculo"/>
                 <w:noProof/>
               </w:rPr>
               <w:t>6.2.</w:t>
@@ -2308,7 +2308,7 @@
             </w:r>
             <w:r>
               <w:rPr>
-                <w:rStyle w:val="Hyperlink"/>
+                <w:rStyle w:val="Hipervnculo"/>
                 <w:noProof/>
               </w:rPr>
               <w:t>Diseño de la base de datos</w:t>
@@ -2365,7 +2365,7 @@
         </w:p>
         <w:p>
           <w:pPr>
-            <w:pStyle w:val="TOC2"/>
+            <w:pStyle w:val="TDC2"/>
             <w:tabs>
               <w:tab w:val="left" w:pos="1200"/>
               <w:tab w:val="right" w:leader="dot" w:pos="8494"/>
@@ -2383,7 +2383,7 @@
           <w:hyperlink w:anchor="_Toc222910267" w:history="1">
             <w:r>
               <w:rPr>
-                <w:rStyle w:val="Hyperlink"/>
+                <w:rStyle w:val="Hipervnculo"/>
                 <w:noProof/>
               </w:rPr>
               <w:t>6.3.</w:t>
@@ -2402,7 +2402,7 @@
             </w:r>
             <w:r>
               <w:rPr>
-                <w:rStyle w:val="Hyperlink"/>
+                <w:rStyle w:val="Hipervnculo"/>
                 <w:noProof/>
               </w:rPr>
               <w:t>Diagrama de Gantt</w:t>
@@ -2459,7 +2459,7 @@
         </w:p>
         <w:p>
           <w:pPr>
-            <w:pStyle w:val="TOC2"/>
+            <w:pStyle w:val="TDC2"/>
             <w:tabs>
               <w:tab w:val="left" w:pos="1200"/>
               <w:tab w:val="right" w:leader="dot" w:pos="8494"/>
@@ -2477,7 +2477,7 @@
           <w:hyperlink w:anchor="_Toc222910268" w:history="1">
             <w:r>
               <w:rPr>
-                <w:rStyle w:val="Hyperlink"/>
+                <w:rStyle w:val="Hipervnculo"/>
                 <w:noProof/>
               </w:rPr>
               <w:t>6.4.</w:t>
@@ -2496,7 +2496,7 @@
             </w:r>
             <w:r>
               <w:rPr>
-                <w:rStyle w:val="Hyperlink"/>
+                <w:rStyle w:val="Hipervnculo"/>
                 <w:noProof/>
               </w:rPr>
               <w:t>Diagrama de casos de uso</w:t>
@@ -2553,7 +2553,7 @@
         </w:p>
         <w:p>
           <w:pPr>
-            <w:pStyle w:val="TOC2"/>
+            <w:pStyle w:val="TDC2"/>
             <w:tabs>
               <w:tab w:val="left" w:pos="1200"/>
               <w:tab w:val="right" w:leader="dot" w:pos="8494"/>
@@ -2571,7 +2571,7 @@
           <w:hyperlink w:anchor="_Toc222910269" w:history="1">
             <w:r>
               <w:rPr>
-                <w:rStyle w:val="Hyperlink"/>
+                <w:rStyle w:val="Hipervnculo"/>
                 <w:noProof/>
               </w:rPr>
               <w:t>6.5.</w:t>
@@ -2590,7 +2590,7 @@
             </w:r>
             <w:r>
               <w:rPr>
-                <w:rStyle w:val="Hyperlink"/>
+                <w:rStyle w:val="Hipervnculo"/>
                 <w:noProof/>
               </w:rPr>
               <w:t>Diagrama de clases UML de la base de datos</w:t>
@@ -2647,7 +2647,7 @@
         </w:p>
         <w:p>
           <w:pPr>
-            <w:pStyle w:val="TOC2"/>
+            <w:pStyle w:val="TDC2"/>
             <w:tabs>
               <w:tab w:val="left" w:pos="1200"/>
               <w:tab w:val="right" w:leader="dot" w:pos="8494"/>
@@ -2665,7 +2665,7 @@
           <w:hyperlink w:anchor="_Toc222910270" w:history="1">
             <w:r>
               <w:rPr>
-                <w:rStyle w:val="Hyperlink"/>
+                <w:rStyle w:val="Hipervnculo"/>
                 <w:noProof/>
               </w:rPr>
               <w:t>6.6</w:t>
@@ -2684,7 +2684,7 @@
             </w:r>
             <w:r>
               <w:rPr>
-                <w:rStyle w:val="Hyperlink"/>
+                <w:rStyle w:val="Hipervnculo"/>
                 <w:noProof/>
               </w:rPr>
               <w:t>Diagrama de clases UML de la base de datos</w:t>
@@ -2741,7 +2741,7 @@
         </w:p>
         <w:p>
           <w:pPr>
-            <w:pStyle w:val="TOC2"/>
+            <w:pStyle w:val="TDC2"/>
             <w:tabs>
               <w:tab w:val="left" w:pos="1200"/>
               <w:tab w:val="right" w:leader="dot" w:pos="8494"/>
@@ -2759,7 +2759,7 @@
           <w:hyperlink w:anchor="_Toc222910271" w:history="1">
             <w:r>
               <w:rPr>
-                <w:rStyle w:val="Hyperlink"/>
+                <w:rStyle w:val="Hipervnculo"/>
                 <w:noProof/>
               </w:rPr>
               <w:t>1.1.</w:t>
@@ -2778,14 +2778,14 @@
             </w:r>
             <w:r>
               <w:rPr>
-                <w:rStyle w:val="Hyperlink"/>
+                <w:rStyle w:val="Hipervnculo"/>
                 <w:noProof/>
               </w:rPr>
               <w:t xml:space="preserve">Diagrama de flujo de navegación </w:t>
             </w:r>
             <w:r>
               <w:rPr>
-                <w:rStyle w:val="Hyperlink"/>
+                <w:rStyle w:val="Hipervnculo"/>
                 <w:b/>
                 <w:bCs/>
                 <w:noProof/>
@@ -3054,21 +3054,7 @@
         <w:rPr>
           <w:lang w:val="en-US"/>
         </w:rPr>
-        <w:t xml:space="preserve">This project focuses on the development of a mobile application for managing repairs in a technical service </w:t>
-      </w:r>
-      <w:proofErr w:type="gramStart"/>
-      <w:r>
-        <w:rPr>
-          <w:lang w:val="en-US"/>
-        </w:rPr>
-        <w:t>specialized</w:t>
-      </w:r>
-      <w:proofErr w:type="gramEnd"/>
-      <w:r>
-        <w:rPr>
-          <w:lang w:val="en-US"/>
-        </w:rPr>
-        <w:t xml:space="preserve"> in laptops and mobile phones. The application allows both users and the technical service to monitor the status of repairs and devices</w:t>
+        <w:t>This project focuses on the development of a mobile application for managing repairs in a technical service specialized in laptops and mobile phones. The application allows both users and the technical service to monitor the status of repairs and devices</w:t>
       </w:r>
       <w:r>
         <w:rPr>
@@ -3198,7 +3184,7 @@
     </w:p>
     <w:p>
       <w:pPr>
-        <w:pStyle w:val="Heading2"/>
+        <w:pStyle w:val="Ttulo2"/>
         <w:numPr>
           <w:ilvl w:val="1"/>
           <w:numId w:val="5"/>
@@ -3218,7 +3204,7 @@
     </w:p>
     <w:p>
       <w:pPr>
-        <w:pStyle w:val="ListParagraph"/>
+        <w:pStyle w:val="Prrafodelista"/>
         <w:spacing w:after="0" w:line="360" w:lineRule="auto"/>
         <w:ind w:left="360"/>
         <w:jc w:val="both"/>
@@ -3235,7 +3221,7 @@
     </w:p>
     <w:p>
       <w:pPr>
-        <w:pStyle w:val="Heading2"/>
+        <w:pStyle w:val="Ttulo2"/>
         <w:numPr>
           <w:ilvl w:val="1"/>
           <w:numId w:val="5"/>
@@ -3255,7 +3241,7 @@
     </w:p>
     <w:p>
       <w:pPr>
-        <w:pStyle w:val="ListParagraph"/>
+        <w:pStyle w:val="Prrafodelista"/>
         <w:spacing w:after="0" w:line="360" w:lineRule="auto"/>
         <w:ind w:left="360"/>
         <w:jc w:val="both"/>
@@ -3283,7 +3269,7 @@
     </w:p>
     <w:p>
       <w:pPr>
-        <w:pStyle w:val="ListParagraph"/>
+        <w:pStyle w:val="Prrafodelista"/>
         <w:spacing w:after="0" w:line="360" w:lineRule="auto"/>
         <w:ind w:left="360"/>
         <w:jc w:val="both"/>
@@ -3302,7 +3288,7 @@
     </w:p>
     <w:p>
       <w:pPr>
-        <w:pStyle w:val="ListParagraph"/>
+        <w:pStyle w:val="Prrafodelista"/>
         <w:spacing w:after="0" w:line="360" w:lineRule="auto"/>
         <w:ind w:left="360"/>
         <w:jc w:val="both"/>
@@ -3321,7 +3307,7 @@
     </w:p>
     <w:p>
       <w:pPr>
-        <w:pStyle w:val="ListParagraph"/>
+        <w:pStyle w:val="Prrafodelista"/>
         <w:spacing w:after="0" w:line="360" w:lineRule="auto"/>
         <w:ind w:left="360"/>
         <w:jc w:val="both"/>
@@ -3340,7 +3326,7 @@
     </w:p>
     <w:p>
       <w:pPr>
-        <w:pStyle w:val="ListParagraph"/>
+        <w:pStyle w:val="Prrafodelista"/>
         <w:spacing w:after="0" w:line="360" w:lineRule="auto"/>
         <w:ind w:left="360"/>
         <w:jc w:val="both"/>
@@ -3407,7 +3393,7 @@
     </w:p>
     <w:p>
       <w:pPr>
-        <w:pStyle w:val="ListParagraph"/>
+        <w:pStyle w:val="Prrafodelista"/>
         <w:spacing w:after="0" w:line="360" w:lineRule="auto"/>
         <w:ind w:left="360"/>
         <w:jc w:val="both"/>
@@ -3501,7 +3487,7 @@
     </w:p>
     <w:p>
       <w:pPr>
-        <w:pStyle w:val="Heading2"/>
+        <w:pStyle w:val="Ttulo2"/>
         <w:numPr>
           <w:ilvl w:val="1"/>
           <w:numId w:val="5"/>
@@ -3521,7 +3507,7 @@
     </w:p>
     <w:p>
       <w:pPr>
-        <w:pStyle w:val="ListParagraph"/>
+        <w:pStyle w:val="Prrafodelista"/>
         <w:spacing w:after="0" w:line="360" w:lineRule="auto"/>
         <w:ind w:left="360"/>
         <w:jc w:val="both"/>
@@ -3552,7 +3538,7 @@
     </w:p>
     <w:p>
       <w:pPr>
-        <w:pStyle w:val="ListParagraph"/>
+        <w:pStyle w:val="Prrafodelista"/>
         <w:spacing w:after="0" w:line="360" w:lineRule="auto"/>
         <w:ind w:left="360" w:firstLine="348"/>
         <w:jc w:val="both"/>
@@ -3583,7 +3569,7 @@
     </w:p>
     <w:p>
       <w:pPr>
-        <w:pStyle w:val="ListParagraph"/>
+        <w:pStyle w:val="Prrafodelista"/>
         <w:spacing w:after="0" w:line="360" w:lineRule="auto"/>
         <w:ind w:left="360" w:firstLine="348"/>
         <w:jc w:val="both"/>
@@ -3628,7 +3614,7 @@
     </w:p>
     <w:p>
       <w:pPr>
-        <w:pStyle w:val="ListParagraph"/>
+        <w:pStyle w:val="Prrafodelista"/>
         <w:spacing w:after="0" w:line="360" w:lineRule="auto"/>
         <w:ind w:left="360" w:firstLine="348"/>
         <w:jc w:val="both"/>
@@ -3651,7 +3637,7 @@
     </w:p>
     <w:p>
       <w:pPr>
-        <w:pStyle w:val="ListParagraph"/>
+        <w:pStyle w:val="Prrafodelista"/>
         <w:spacing w:after="0" w:line="360" w:lineRule="auto"/>
         <w:ind w:left="360" w:firstLine="348"/>
         <w:jc w:val="both"/>
@@ -3688,7 +3674,7 @@
     </w:p>
     <w:p>
       <w:pPr>
-        <w:pStyle w:val="ListParagraph"/>
+        <w:pStyle w:val="Prrafodelista"/>
         <w:spacing w:after="0" w:line="360" w:lineRule="auto"/>
         <w:ind w:left="360" w:firstLine="348"/>
         <w:jc w:val="both"/>
@@ -3719,7 +3705,7 @@
     </w:p>
     <w:p>
       <w:pPr>
-        <w:pStyle w:val="ListParagraph"/>
+        <w:pStyle w:val="Prrafodelista"/>
         <w:spacing w:after="0" w:line="360" w:lineRule="auto"/>
         <w:ind w:left="360" w:firstLine="348"/>
         <w:jc w:val="both"/>
@@ -3756,7 +3742,7 @@
     </w:p>
     <w:p>
       <w:pPr>
-        <w:pStyle w:val="ListParagraph"/>
+        <w:pStyle w:val="Prrafodelista"/>
         <w:spacing w:after="0" w:line="360" w:lineRule="auto"/>
         <w:ind w:left="360" w:firstLine="348"/>
         <w:jc w:val="both"/>
@@ -3788,21 +3774,7 @@
         <w:rPr>
           <w:rFonts w:ascii="Verdana" w:hAnsi="Verdana"/>
         </w:rPr>
-        <w:t xml:space="preserve">utilizado para la realizar los registros de </w:t>
-      </w:r>
-      <w:proofErr w:type="gramStart"/>
-      <w:r>
-        <w:rPr>
-          <w:rFonts w:ascii="Verdana" w:hAnsi="Verdana"/>
-        </w:rPr>
-        <w:t>usuarios</w:t>
-      </w:r>
-      <w:proofErr w:type="gramEnd"/>
-      <w:r>
-        <w:rPr>
-          <w:rFonts w:ascii="Verdana" w:hAnsi="Verdana"/>
-        </w:rPr>
-        <w:t xml:space="preserve"> así como el inicio de sesión ya que ofrece un servicio de autenticación por email y contraseña, y facilita el </w:t>
+        <w:t xml:space="preserve">utilizado para la realizar los registros de usuarios así como el inicio de sesión ya que ofrece un servicio de autenticación por email y contraseña, y facilita el </w:t>
       </w:r>
       <w:proofErr w:type="spellStart"/>
       <w:r>
@@ -3827,7 +3799,7 @@
     </w:p>
     <w:p>
       <w:pPr>
-        <w:pStyle w:val="Heading2"/>
+        <w:pStyle w:val="Ttulo2"/>
         <w:numPr>
           <w:ilvl w:val="1"/>
           <w:numId w:val="5"/>
@@ -3868,7 +3840,7 @@
     </w:p>
     <w:p>
       <w:pPr>
-        <w:pStyle w:val="Heading4"/>
+        <w:pStyle w:val="Ttulo4"/>
         <w:spacing w:before="0" w:line="360" w:lineRule="auto"/>
         <w:ind w:firstLine="708"/>
         <w:jc w:val="both"/>
@@ -3939,7 +3911,7 @@
     </w:p>
     <w:p>
       <w:pPr>
-        <w:pStyle w:val="Heading4"/>
+        <w:pStyle w:val="Ttulo4"/>
         <w:spacing w:before="0" w:line="360" w:lineRule="auto"/>
         <w:ind w:firstLine="708"/>
         <w:jc w:val="both"/>
@@ -4011,7 +3983,7 @@
     </w:p>
     <w:p>
       <w:pPr>
-        <w:pStyle w:val="Heading4"/>
+        <w:pStyle w:val="Ttulo4"/>
         <w:spacing w:before="0" w:line="360" w:lineRule="auto"/>
         <w:ind w:firstLine="708"/>
         <w:jc w:val="both"/>
@@ -4109,7 +4081,7 @@
     </w:p>
     <w:p>
       <w:pPr>
-        <w:pStyle w:val="Heading4"/>
+        <w:pStyle w:val="Ttulo4"/>
         <w:spacing w:before="0" w:line="360" w:lineRule="auto"/>
         <w:ind w:firstLine="708"/>
         <w:jc w:val="both"/>
@@ -4197,7 +4169,7 @@
     </w:p>
     <w:p>
       <w:pPr>
-        <w:pStyle w:val="Heading2"/>
+        <w:pStyle w:val="Ttulo2"/>
         <w:numPr>
           <w:ilvl w:val="1"/>
           <w:numId w:val="5"/>
@@ -4599,7 +4571,7 @@
     <w:p/>
     <w:p>
       <w:pPr>
-        <w:pStyle w:val="Heading2"/>
+        <w:pStyle w:val="Ttulo2"/>
         <w:numPr>
           <w:ilvl w:val="1"/>
           <w:numId w:val="5"/>
@@ -4764,7 +4736,7 @@
     </w:p>
     <w:p>
       <w:pPr>
-        <w:pStyle w:val="Heading2"/>
+        <w:pStyle w:val="Ttulo2"/>
         <w:numPr>
           <w:ilvl w:val="1"/>
           <w:numId w:val="5"/>
@@ -4841,7 +4813,7 @@
     </w:p>
     <w:p>
       <w:pPr>
-        <w:pStyle w:val="Heading2"/>
+        <w:pStyle w:val="Ttulo2"/>
         <w:numPr>
           <w:ilvl w:val="1"/>
           <w:numId w:val="5"/>
@@ -4929,7 +4901,7 @@
     </w:p>
     <w:p>
       <w:pPr>
-        <w:pStyle w:val="Heading2"/>
+        <w:pStyle w:val="Ttulo2"/>
         <w:numPr>
           <w:ilvl w:val="1"/>
           <w:numId w:val="5"/>
@@ -5036,7 +5008,7 @@
     </w:p>
     <w:p>
       <w:pPr>
-        <w:pStyle w:val="Heading2"/>
+        <w:pStyle w:val="Ttulo2"/>
         <w:numPr>
           <w:ilvl w:val="1"/>
           <w:numId w:val="17"/>
@@ -5075,7 +5047,7 @@
           <w:noProof/>
         </w:rPr>
         <w:drawing>
-          <wp:inline distT="0" distB="0" distL="0" distR="0" wp14:anchorId="51FA45FE" wp14:editId="6C609C5C">
+          <wp:inline distT="0" distB="0" distL="0" distR="0" wp14:anchorId="51FA45FE" wp14:editId="4AB49F2E">
             <wp:extent cx="5197290" cy="6066046"/>
             <wp:effectExtent l="0" t="0" r="3810" b="0"/>
             <wp:docPr id="1010282031" name="Imagen 5" descr="Diagrama de clases de la aplicación&#10;"/>
@@ -5119,7 +5091,7 @@
     </w:p>
     <w:p>
       <w:pPr>
-        <w:pStyle w:val="Caption"/>
+        <w:pStyle w:val="Descripcin"/>
         <w:jc w:val="center"/>
       </w:pPr>
       <w:r>
@@ -5278,7 +5250,7 @@
     </w:p>
     <w:p>
       <w:pPr>
-        <w:pStyle w:val="Heading2"/>
+        <w:pStyle w:val="Ttulo2"/>
         <w:numPr>
           <w:ilvl w:val="1"/>
           <w:numId w:val="17"/>
@@ -5288,80 +5260,89 @@
         </w:tabs>
         <w:spacing w:before="0" w:line="360" w:lineRule="auto"/>
         <w:jc w:val="both"/>
-      </w:pPr>
-      <w:bookmarkStart w:id="16" w:name="_Toc222910271"/>
-      <w:r>
-        <w:t>Diagrama de flujo de navegación</w:t>
-      </w:r>
-      <w:r>
-        <w:t xml:space="preserve"> </w:t>
-      </w:r>
-      <w:r>
         <w:rPr>
           <w:b/>
           <w:bCs/>
           <w:color w:val="auto"/>
         </w:rPr>
-        <w:t xml:space="preserve">– </w:t>
+      </w:pPr>
+      <w:bookmarkStart w:id="16" w:name="_Toc222910271"/>
+      <w:r>
+        <w:t>Diagrama de flujo de navegación</w:t>
+      </w:r>
+      <w:r>
+        <w:t xml:space="preserve"> </w:t>
       </w:r>
       <w:bookmarkEnd w:id="16"/>
-      <w:r>
-        <w:rPr>
-          <w:b/>
-          <w:bCs/>
-          <w:color w:val="auto"/>
-        </w:rPr>
-        <w:t>pendiente</w:t>
-      </w:r>
-    </w:p>
-    <w:p>
-      <w:pPr>
-        <w:pStyle w:val="Estilo1"/>
-        <w:spacing w:before="0" w:line="360" w:lineRule="auto"/>
-        <w:jc w:val="both"/>
-        <w:rPr>
-          <w:color w:val="C00000"/>
-        </w:rPr>
-      </w:pPr>
-    </w:p>
-    <w:p>
-      <w:pPr>
-        <w:pStyle w:val="NormalWeb"/>
-        <w:spacing w:after="0" w:line="360" w:lineRule="auto"/>
-        <w:ind w:left="708"/>
-        <w:jc w:val="both"/>
-        <w:rPr>
-          <w:rFonts w:ascii="Verdana" w:hAnsi="Verdana" w:cstheme="minorBidi"/>
-          <w:sz w:val="22"/>
-          <w:szCs w:val="22"/>
-        </w:rPr>
-      </w:pPr>
-    </w:p>
-    <w:p>
-      <w:pPr>
-        <w:pStyle w:val="ListParagraph"/>
-        <w:spacing w:after="0" w:line="360" w:lineRule="auto"/>
-        <w:ind w:left="360"/>
-        <w:jc w:val="both"/>
-        <w:rPr>
-          <w:rFonts w:ascii="Times New Roman" w:eastAsia="Times New Roman" w:hAnsi="Times New Roman" w:cs="Times New Roman"/>
-          <w:sz w:val="24"/>
-          <w:szCs w:val="24"/>
-          <w:lang w:eastAsia="es-ES"/>
-        </w:rPr>
-      </w:pPr>
-    </w:p>
-    <w:p>
-      <w:pPr>
-        <w:pStyle w:val="Estilo1"/>
-        <w:spacing w:before="0" w:line="360" w:lineRule="auto"/>
-        <w:ind w:left="360"/>
-        <w:jc w:val="both"/>
-        <w:rPr>
-          <w:color w:val="EE0000"/>
-        </w:rPr>
-      </w:pPr>
-    </w:p>
+    </w:p>
+    <w:p>
+      <w:pPr>
+        <w:pStyle w:val="Prrafodelista"/>
+        <w:spacing w:before="100" w:beforeAutospacing="1" w:after="100" w:afterAutospacing="1" w:line="240" w:lineRule="auto"/>
+        <w:ind w:left="462"/>
+        <w:rPr>
+          <w:rFonts w:ascii="Times New Roman" w:eastAsia="Times New Roman" w:hAnsi="Times New Roman" w:cs="Times New Roman"/>
+          <w:sz w:val="24"/>
+          <w:szCs w:val="24"/>
+          <w:lang w:eastAsia="es-ES"/>
+        </w:rPr>
+      </w:pPr>
+      <w:r>
+        <w:rPr>
+          <w:noProof/>
+          <w:lang w:eastAsia="es-ES"/>
+        </w:rPr>
+        <w:drawing>
+          <wp:inline distT="0" distB="0" distL="0" distR="0" wp14:anchorId="69DC4A81" wp14:editId="034745BC">
+            <wp:extent cx="5579745" cy="1437005"/>
+            <wp:effectExtent l="0" t="0" r="1905" b="0"/>
+            <wp:docPr id="1508159685" name="Imagen 2" descr="Diagrama&#10;&#10;El contenido generado por IA puede ser incorrecto."/>
+            <wp:cNvGraphicFramePr>
+              <a:graphicFrameLocks xmlns:a="http://schemas.openxmlformats.org/drawingml/2006/main" noChangeAspect="1"/>
+            </wp:cNvGraphicFramePr>
+            <a:graphic xmlns:a="http://schemas.openxmlformats.org/drawingml/2006/main">
+              <a:graphicData uri="http://schemas.openxmlformats.org/drawingml/2006/picture">
+                <pic:pic xmlns:pic="http://schemas.openxmlformats.org/drawingml/2006/picture">
+                  <pic:nvPicPr>
+                    <pic:cNvPr id="1508159685" name="Imagen 2" descr="Diagrama&#10;&#10;El contenido generado por IA puede ser incorrecto."/>
+                    <pic:cNvPicPr>
+                      <a:picLocks noChangeAspect="1" noChangeArrowheads="1"/>
+                    </pic:cNvPicPr>
+                  </pic:nvPicPr>
+                  <pic:blipFill>
+                    <a:blip r:embed="rId16" cstate="print">
+                      <a:extLst>
+                        <a:ext uri="{28A0092B-C50C-407E-A947-70E740481C1C}">
+                          <a14:useLocalDpi xmlns:a14="http://schemas.microsoft.com/office/drawing/2010/main" val="0"/>
+                        </a:ext>
+                      </a:extLst>
+                    </a:blip>
+                    <a:srcRect/>
+                    <a:stretch>
+                      <a:fillRect/>
+                    </a:stretch>
+                  </pic:blipFill>
+                  <pic:spPr bwMode="auto">
+                    <a:xfrm>
+                      <a:off x="0" y="0"/>
+                      <a:ext cx="5579745" cy="1437005"/>
+                    </a:xfrm>
+                    <a:prstGeom prst="rect">
+                      <a:avLst/>
+                    </a:prstGeom>
+                    <a:noFill/>
+                    <a:ln>
+                      <a:noFill/>
+                    </a:ln>
+                  </pic:spPr>
+                </pic:pic>
+              </a:graphicData>
+            </a:graphic>
+          </wp:inline>
+        </w:drawing>
+      </w:r>
+    </w:p>
+    <w:p/>
     <w:p>
       <w:pPr>
         <w:pStyle w:val="Estilo1"/>
@@ -5372,6 +5353,2352 @@
         <w:spacing w:before="0" w:line="360" w:lineRule="auto"/>
         <w:jc w:val="both"/>
         <w:rPr>
+          <w:color w:val="C00000"/>
+        </w:rPr>
+      </w:pPr>
+      <w:r>
+        <w:rPr>
+          <w:color w:val="C00000"/>
+        </w:rPr>
+        <w:t>Manual de usuario</w:t>
+      </w:r>
+    </w:p>
+    <w:p>
+      <w:pPr>
+        <w:spacing w:before="100" w:beforeAutospacing="1" w:after="0" w:line="240" w:lineRule="auto"/>
+        <w:rPr>
+          <w:rFonts w:ascii="Times New Roman" w:eastAsia="Times New Roman" w:hAnsi="Times New Roman" w:cs="Times New Roman"/>
+          <w:sz w:val="24"/>
+          <w:szCs w:val="24"/>
+          <w:lang w:eastAsia="es-ES"/>
+        </w:rPr>
+      </w:pPr>
+      <w:r>
+        <w:rPr>
+          <w:rFonts w:ascii="Times New Roman" w:eastAsia="Times New Roman" w:hAnsi="Times New Roman" w:cs="Times New Roman"/>
+          <w:sz w:val="24"/>
+          <w:szCs w:val="24"/>
+          <w:lang w:eastAsia="es-ES"/>
+        </w:rPr>
+        <w:t xml:space="preserve">El objetivo de nuestra aplicación, </w:t>
+      </w:r>
+      <w:proofErr w:type="spellStart"/>
+      <w:r>
+        <w:rPr>
+          <w:rFonts w:ascii="Times New Roman" w:eastAsia="Times New Roman" w:hAnsi="Times New Roman" w:cs="Times New Roman"/>
+          <w:sz w:val="24"/>
+          <w:szCs w:val="24"/>
+          <w:lang w:eastAsia="es-ES"/>
+        </w:rPr>
+        <w:t>ClearRepair</w:t>
+      </w:r>
+      <w:proofErr w:type="spellEnd"/>
+      <w:r>
+        <w:rPr>
+          <w:rFonts w:ascii="Times New Roman" w:eastAsia="Times New Roman" w:hAnsi="Times New Roman" w:cs="Times New Roman"/>
+          <w:sz w:val="24"/>
+          <w:szCs w:val="24"/>
+          <w:lang w:eastAsia="es-ES"/>
+        </w:rPr>
+        <w:t xml:space="preserve"> es facilitar el acceso a la información de las reparaciones del público general. Su utilización se realizará en contexto remoto y abarcará desde la solicitud de las reparaciones, visualización de presupuesto hasta el seguimiento del estado de la reparación.</w:t>
+      </w:r>
+    </w:p>
+    <w:p>
+      <w:pPr>
+        <w:spacing w:before="100" w:beforeAutospacing="1" w:after="0" w:line="240" w:lineRule="auto"/>
+        <w:rPr>
+          <w:rFonts w:ascii="Times New Roman" w:eastAsia="Times New Roman" w:hAnsi="Times New Roman" w:cs="Times New Roman"/>
+          <w:sz w:val="24"/>
+          <w:szCs w:val="24"/>
+          <w:lang w:eastAsia="es-ES"/>
+        </w:rPr>
+      </w:pPr>
+    </w:p>
+    <w:p>
+      <w:pPr>
+        <w:spacing w:before="100" w:beforeAutospacing="1" w:after="0" w:line="240" w:lineRule="auto"/>
+        <w:rPr>
+          <w:rFonts w:ascii="Times New Roman" w:eastAsia="Times New Roman" w:hAnsi="Times New Roman" w:cs="Times New Roman"/>
+          <w:sz w:val="24"/>
+          <w:szCs w:val="24"/>
+          <w:lang w:eastAsia="es-ES"/>
+        </w:rPr>
+      </w:pPr>
+      <w:r>
+        <w:rPr>
+          <w:rFonts w:ascii="Times New Roman" w:eastAsia="Times New Roman" w:hAnsi="Times New Roman" w:cs="Times New Roman"/>
+          <w:sz w:val="24"/>
+          <w:szCs w:val="24"/>
+          <w:lang w:eastAsia="es-ES"/>
+        </w:rPr>
+        <w:t>Requisitos de acceso</w:t>
+      </w:r>
+    </w:p>
+    <w:p>
+      <w:pPr>
+        <w:spacing w:before="100" w:beforeAutospacing="1" w:after="0" w:line="240" w:lineRule="auto"/>
+        <w:rPr>
+          <w:rFonts w:ascii="Times New Roman" w:eastAsia="Times New Roman" w:hAnsi="Times New Roman" w:cs="Times New Roman"/>
+          <w:sz w:val="24"/>
+          <w:szCs w:val="24"/>
+          <w:lang w:eastAsia="es-ES"/>
+        </w:rPr>
+      </w:pPr>
+    </w:p>
+    <w:p>
+      <w:pPr>
+        <w:spacing w:before="100" w:beforeAutospacing="1" w:after="0" w:line="240" w:lineRule="auto"/>
+        <w:rPr>
+          <w:rFonts w:ascii="Times New Roman" w:eastAsia="Times New Roman" w:hAnsi="Times New Roman" w:cs="Times New Roman"/>
+          <w:sz w:val="24"/>
+          <w:szCs w:val="24"/>
+          <w:lang w:eastAsia="es-ES"/>
+        </w:rPr>
+      </w:pPr>
+      <w:r>
+        <w:rPr>
+          <w:rFonts w:ascii="Times New Roman" w:eastAsia="Times New Roman" w:hAnsi="Times New Roman" w:cs="Times New Roman"/>
+          <w:sz w:val="24"/>
+          <w:szCs w:val="24"/>
+          <w:lang w:eastAsia="es-ES"/>
+        </w:rPr>
+        <w:t xml:space="preserve">El usuario precisará un móvil </w:t>
+      </w:r>
+      <w:proofErr w:type="spellStart"/>
+      <w:r>
+        <w:rPr>
+          <w:rFonts w:ascii="Times New Roman" w:eastAsia="Times New Roman" w:hAnsi="Times New Roman" w:cs="Times New Roman"/>
+          <w:sz w:val="24"/>
+          <w:szCs w:val="24"/>
+          <w:lang w:eastAsia="es-ES"/>
+        </w:rPr>
+        <w:t>android</w:t>
+      </w:r>
+      <w:proofErr w:type="spellEnd"/>
+      <w:r>
+        <w:rPr>
+          <w:rFonts w:ascii="Times New Roman" w:eastAsia="Times New Roman" w:hAnsi="Times New Roman" w:cs="Times New Roman"/>
+          <w:sz w:val="24"/>
+          <w:szCs w:val="24"/>
+          <w:lang w:eastAsia="es-ES"/>
+        </w:rPr>
+        <w:t xml:space="preserve"> y una cuenta para poder acceder.</w:t>
+      </w:r>
+    </w:p>
+    <w:p>
+      <w:pPr>
+        <w:spacing w:before="100" w:beforeAutospacing="1" w:after="0" w:line="240" w:lineRule="auto"/>
+        <w:rPr>
+          <w:rFonts w:ascii="Times New Roman" w:eastAsia="Times New Roman" w:hAnsi="Times New Roman" w:cs="Times New Roman"/>
+          <w:sz w:val="24"/>
+          <w:szCs w:val="24"/>
+          <w:lang w:eastAsia="es-ES"/>
+        </w:rPr>
+      </w:pPr>
+      <w:r>
+        <w:rPr>
+          <w:rFonts w:ascii="Times New Roman" w:eastAsia="Times New Roman" w:hAnsi="Times New Roman" w:cs="Times New Roman"/>
+          <w:sz w:val="24"/>
+          <w:szCs w:val="24"/>
+          <w:lang w:eastAsia="es-ES"/>
+        </w:rPr>
+        <w:t>El registro solicita obligatoriamente:</w:t>
+      </w:r>
+      <w:r>
+        <w:rPr>
+          <w:rFonts w:ascii="Lucida Console" w:eastAsia="Times New Roman" w:hAnsi="Lucida Console" w:cs="Times New Roman"/>
+          <w:color w:val="000000"/>
+          <w:sz w:val="20"/>
+          <w:szCs w:val="20"/>
+          <w:lang w:eastAsia="es-ES"/>
+        </w:rPr>
+        <w:t xml:space="preserve"> </w:t>
+      </w:r>
+    </w:p>
+    <w:p>
+      <w:pPr>
+        <w:numPr>
+          <w:ilvl w:val="0"/>
+          <w:numId w:val="18"/>
+        </w:numPr>
+        <w:spacing w:before="100" w:beforeAutospacing="1" w:after="0" w:line="240" w:lineRule="auto"/>
+        <w:rPr>
+          <w:rFonts w:ascii="Times New Roman" w:eastAsia="Times New Roman" w:hAnsi="Times New Roman" w:cs="Times New Roman"/>
+          <w:sz w:val="24"/>
+          <w:szCs w:val="24"/>
+          <w:lang w:eastAsia="es-ES"/>
+        </w:rPr>
+      </w:pPr>
+      <w:r>
+        <w:rPr>
+          <w:rFonts w:ascii="Liberation Serif" w:eastAsia="Times New Roman" w:hAnsi="Liberation Serif" w:cs="Liberation Serif"/>
+          <w:color w:val="000000"/>
+          <w:sz w:val="24"/>
+          <w:szCs w:val="24"/>
+          <w:lang w:eastAsia="es-ES"/>
+        </w:rPr>
+        <w:lastRenderedPageBreak/>
+        <w:t>Email</w:t>
+      </w:r>
+    </w:p>
+    <w:p>
+      <w:pPr>
+        <w:numPr>
+          <w:ilvl w:val="0"/>
+          <w:numId w:val="18"/>
+        </w:numPr>
+        <w:spacing w:before="100" w:beforeAutospacing="1" w:after="0" w:line="240" w:lineRule="auto"/>
+        <w:rPr>
+          <w:rFonts w:ascii="Times New Roman" w:eastAsia="Times New Roman" w:hAnsi="Times New Roman" w:cs="Times New Roman"/>
+          <w:sz w:val="24"/>
+          <w:szCs w:val="24"/>
+          <w:lang w:eastAsia="es-ES"/>
+        </w:rPr>
+      </w:pPr>
+      <w:r>
+        <w:rPr>
+          <w:rFonts w:ascii="Liberation Serif" w:eastAsia="Times New Roman" w:hAnsi="Liberation Serif" w:cs="Liberation Serif"/>
+          <w:color w:val="000000"/>
+          <w:sz w:val="24"/>
+          <w:szCs w:val="24"/>
+          <w:lang w:eastAsia="es-ES"/>
+        </w:rPr>
+        <w:t>Contraseña (mínimo 8 caracteres)</w:t>
+      </w:r>
+    </w:p>
+    <w:p>
+      <w:pPr>
+        <w:numPr>
+          <w:ilvl w:val="0"/>
+          <w:numId w:val="18"/>
+        </w:numPr>
+        <w:spacing w:before="100" w:beforeAutospacing="1" w:after="0" w:line="240" w:lineRule="auto"/>
+        <w:rPr>
+          <w:rFonts w:ascii="Times New Roman" w:eastAsia="Times New Roman" w:hAnsi="Times New Roman" w:cs="Times New Roman"/>
+          <w:sz w:val="24"/>
+          <w:szCs w:val="24"/>
+          <w:lang w:eastAsia="es-ES"/>
+        </w:rPr>
+      </w:pPr>
+      <w:r>
+        <w:rPr>
+          <w:rFonts w:ascii="Liberation Serif" w:eastAsia="Times New Roman" w:hAnsi="Liberation Serif" w:cs="Liberation Serif"/>
+          <w:color w:val="000000"/>
+          <w:sz w:val="24"/>
+          <w:szCs w:val="24"/>
+          <w:lang w:eastAsia="es-ES"/>
+        </w:rPr>
+        <w:t>Nombre</w:t>
+      </w:r>
+    </w:p>
+    <w:p>
+      <w:pPr>
+        <w:numPr>
+          <w:ilvl w:val="0"/>
+          <w:numId w:val="18"/>
+        </w:numPr>
+        <w:spacing w:before="100" w:beforeAutospacing="1" w:after="0" w:line="240" w:lineRule="auto"/>
+        <w:rPr>
+          <w:rFonts w:ascii="Times New Roman" w:eastAsia="Times New Roman" w:hAnsi="Times New Roman" w:cs="Times New Roman"/>
+          <w:sz w:val="24"/>
+          <w:szCs w:val="24"/>
+          <w:lang w:eastAsia="es-ES"/>
+        </w:rPr>
+      </w:pPr>
+      <w:r>
+        <w:rPr>
+          <w:rFonts w:ascii="Liberation Serif" w:eastAsia="Times New Roman" w:hAnsi="Liberation Serif" w:cs="Liberation Serif"/>
+          <w:color w:val="000000"/>
+          <w:sz w:val="24"/>
+          <w:szCs w:val="24"/>
+          <w:lang w:eastAsia="es-ES"/>
+        </w:rPr>
+        <w:t>Apellidos</w:t>
+      </w:r>
+    </w:p>
+    <w:p>
+      <w:pPr>
+        <w:numPr>
+          <w:ilvl w:val="0"/>
+          <w:numId w:val="18"/>
+        </w:numPr>
+        <w:spacing w:before="100" w:beforeAutospacing="1" w:after="0" w:line="240" w:lineRule="auto"/>
+        <w:rPr>
+          <w:rFonts w:ascii="Times New Roman" w:eastAsia="Times New Roman" w:hAnsi="Times New Roman" w:cs="Times New Roman"/>
+          <w:sz w:val="24"/>
+          <w:szCs w:val="24"/>
+          <w:lang w:eastAsia="es-ES"/>
+        </w:rPr>
+      </w:pPr>
+      <w:r>
+        <w:rPr>
+          <w:rFonts w:ascii="Liberation Serif" w:eastAsia="Times New Roman" w:hAnsi="Liberation Serif" w:cs="Liberation Serif"/>
+          <w:color w:val="000000"/>
+          <w:sz w:val="24"/>
+          <w:szCs w:val="24"/>
+          <w:lang w:eastAsia="es-ES"/>
+        </w:rPr>
+        <w:t xml:space="preserve">DNI/NIF (formato: 8 números + letra, </w:t>
+      </w:r>
+      <w:proofErr w:type="spellStart"/>
+      <w:r>
+        <w:rPr>
+          <w:rFonts w:ascii="Liberation Serif" w:eastAsia="Times New Roman" w:hAnsi="Liberation Serif" w:cs="Liberation Serif"/>
+          <w:color w:val="000000"/>
+          <w:sz w:val="24"/>
+          <w:szCs w:val="24"/>
+          <w:lang w:eastAsia="es-ES"/>
+        </w:rPr>
+        <w:t>ej</w:t>
+      </w:r>
+      <w:proofErr w:type="spellEnd"/>
+      <w:r>
+        <w:rPr>
+          <w:rFonts w:ascii="Liberation Serif" w:eastAsia="Times New Roman" w:hAnsi="Liberation Serif" w:cs="Liberation Serif"/>
+          <w:color w:val="000000"/>
+          <w:sz w:val="24"/>
+          <w:szCs w:val="24"/>
+          <w:lang w:eastAsia="es-ES"/>
+        </w:rPr>
+        <w:t>: 12345678A)</w:t>
+      </w:r>
+    </w:p>
+    <w:p>
+      <w:pPr>
+        <w:numPr>
+          <w:ilvl w:val="0"/>
+          <w:numId w:val="18"/>
+        </w:numPr>
+        <w:spacing w:before="100" w:beforeAutospacing="1" w:after="0" w:line="240" w:lineRule="auto"/>
+        <w:rPr>
+          <w:rFonts w:ascii="Times New Roman" w:eastAsia="Times New Roman" w:hAnsi="Times New Roman" w:cs="Times New Roman"/>
+          <w:sz w:val="24"/>
+          <w:szCs w:val="24"/>
+          <w:lang w:eastAsia="es-ES"/>
+        </w:rPr>
+      </w:pPr>
+      <w:r>
+        <w:rPr>
+          <w:rFonts w:ascii="Liberation Serif" w:eastAsia="Times New Roman" w:hAnsi="Liberation Serif" w:cs="Liberation Serif"/>
+          <w:color w:val="000000"/>
+          <w:sz w:val="24"/>
+          <w:szCs w:val="24"/>
+          <w:lang w:eastAsia="es-ES"/>
+        </w:rPr>
+        <w:t>Teléfono (9 números)</w:t>
+      </w:r>
+    </w:p>
+    <w:p>
+      <w:pPr>
+        <w:numPr>
+          <w:ilvl w:val="0"/>
+          <w:numId w:val="18"/>
+        </w:numPr>
+        <w:spacing w:before="100" w:beforeAutospacing="1" w:after="0" w:line="240" w:lineRule="auto"/>
+        <w:rPr>
+          <w:rFonts w:ascii="Times New Roman" w:eastAsia="Times New Roman" w:hAnsi="Times New Roman" w:cs="Times New Roman"/>
+          <w:sz w:val="24"/>
+          <w:szCs w:val="24"/>
+          <w:lang w:eastAsia="es-ES"/>
+        </w:rPr>
+      </w:pPr>
+      <w:r>
+        <w:rPr>
+          <w:rFonts w:ascii="Liberation Serif" w:eastAsia="Times New Roman" w:hAnsi="Liberation Serif" w:cs="Liberation Serif"/>
+          <w:color w:val="000000"/>
+          <w:sz w:val="24"/>
+          <w:szCs w:val="24"/>
+          <w:lang w:eastAsia="es-ES"/>
+        </w:rPr>
+        <w:t>Dirección</w:t>
+      </w:r>
+    </w:p>
+    <w:p>
+      <w:pPr>
+        <w:numPr>
+          <w:ilvl w:val="0"/>
+          <w:numId w:val="18"/>
+        </w:numPr>
+        <w:spacing w:before="100" w:beforeAutospacing="1" w:after="0" w:line="240" w:lineRule="auto"/>
+        <w:rPr>
+          <w:rFonts w:ascii="Times New Roman" w:eastAsia="Times New Roman" w:hAnsi="Times New Roman" w:cs="Times New Roman"/>
+          <w:sz w:val="24"/>
+          <w:szCs w:val="24"/>
+          <w:lang w:eastAsia="es-ES"/>
+        </w:rPr>
+      </w:pPr>
+      <w:r>
+        <w:rPr>
+          <w:rFonts w:ascii="Liberation Serif" w:eastAsia="Times New Roman" w:hAnsi="Liberation Serif" w:cs="Liberation Serif"/>
+          <w:color w:val="000000"/>
+          <w:sz w:val="24"/>
+          <w:szCs w:val="24"/>
+          <w:lang w:eastAsia="es-ES"/>
+        </w:rPr>
+        <w:t>Código Postal (5 números)</w:t>
+      </w:r>
+    </w:p>
+    <w:p>
+      <w:pPr>
+        <w:numPr>
+          <w:ilvl w:val="0"/>
+          <w:numId w:val="18"/>
+        </w:numPr>
+        <w:spacing w:before="100" w:beforeAutospacing="1" w:after="0" w:line="240" w:lineRule="auto"/>
+        <w:rPr>
+          <w:rFonts w:ascii="Times New Roman" w:eastAsia="Times New Roman" w:hAnsi="Times New Roman" w:cs="Times New Roman"/>
+          <w:sz w:val="24"/>
+          <w:szCs w:val="24"/>
+          <w:lang w:eastAsia="es-ES"/>
+        </w:rPr>
+      </w:pPr>
+      <w:r>
+        <w:rPr>
+          <w:rFonts w:ascii="Liberation Serif" w:eastAsia="Times New Roman" w:hAnsi="Liberation Serif" w:cs="Liberation Serif"/>
+          <w:color w:val="000000"/>
+          <w:sz w:val="24"/>
+          <w:szCs w:val="24"/>
+          <w:lang w:eastAsia="es-ES"/>
+        </w:rPr>
+        <w:t>Localidad</w:t>
+      </w:r>
+    </w:p>
+    <w:p>
+      <w:pPr>
+        <w:spacing w:before="100" w:beforeAutospacing="1" w:after="0" w:line="240" w:lineRule="auto"/>
+        <w:rPr>
+          <w:rFonts w:ascii="Times New Roman" w:eastAsia="Times New Roman" w:hAnsi="Times New Roman" w:cs="Times New Roman"/>
+          <w:sz w:val="24"/>
+          <w:szCs w:val="24"/>
+          <w:lang w:eastAsia="es-ES"/>
+        </w:rPr>
+      </w:pPr>
+    </w:p>
+    <w:p>
+      <w:pPr>
+        <w:spacing w:before="100" w:beforeAutospacing="1" w:after="0" w:line="240" w:lineRule="auto"/>
+        <w:rPr>
+          <w:rFonts w:ascii="Times New Roman" w:eastAsia="Times New Roman" w:hAnsi="Times New Roman" w:cs="Times New Roman"/>
+          <w:sz w:val="24"/>
+          <w:szCs w:val="24"/>
+          <w:lang w:eastAsia="es-ES"/>
+        </w:rPr>
+      </w:pPr>
+      <w:r>
+        <w:rPr>
+          <w:rFonts w:ascii="Liberation Serif" w:eastAsia="Times New Roman" w:hAnsi="Liberation Serif" w:cs="Liberation Serif"/>
+          <w:sz w:val="24"/>
+          <w:szCs w:val="24"/>
+          <w:lang w:eastAsia="es-ES"/>
+        </w:rPr>
+        <w:t xml:space="preserve">El </w:t>
+      </w:r>
+      <w:proofErr w:type="spellStart"/>
+      <w:r>
+        <w:rPr>
+          <w:rFonts w:ascii="Liberation Serif" w:eastAsia="Times New Roman" w:hAnsi="Liberation Serif" w:cs="Liberation Serif"/>
+          <w:sz w:val="24"/>
+          <w:szCs w:val="24"/>
+          <w:lang w:eastAsia="es-ES"/>
+        </w:rPr>
+        <w:t>login</w:t>
+      </w:r>
+      <w:proofErr w:type="spellEnd"/>
+      <w:r>
+        <w:rPr>
+          <w:rFonts w:ascii="Liberation Serif" w:eastAsia="Times New Roman" w:hAnsi="Liberation Serif" w:cs="Liberation Serif"/>
+          <w:sz w:val="24"/>
+          <w:szCs w:val="24"/>
+          <w:lang w:eastAsia="es-ES"/>
+        </w:rPr>
+        <w:t xml:space="preserve"> se realizará mediante:</w:t>
+      </w:r>
+    </w:p>
+    <w:p>
+      <w:pPr>
+        <w:numPr>
+          <w:ilvl w:val="0"/>
+          <w:numId w:val="19"/>
+        </w:numPr>
+        <w:spacing w:before="100" w:beforeAutospacing="1" w:after="0" w:line="240" w:lineRule="auto"/>
+        <w:rPr>
+          <w:rFonts w:ascii="Times New Roman" w:eastAsia="Times New Roman" w:hAnsi="Times New Roman" w:cs="Times New Roman"/>
+          <w:sz w:val="24"/>
+          <w:szCs w:val="24"/>
+          <w:lang w:eastAsia="es-ES"/>
+        </w:rPr>
+      </w:pPr>
+      <w:r>
+        <w:rPr>
+          <w:rFonts w:ascii="Liberation Serif" w:eastAsia="Times New Roman" w:hAnsi="Liberation Serif" w:cs="Liberation Serif"/>
+          <w:sz w:val="24"/>
+          <w:szCs w:val="24"/>
+          <w:lang w:eastAsia="es-ES"/>
+        </w:rPr>
+        <w:t>Email</w:t>
+      </w:r>
+    </w:p>
+    <w:p>
+      <w:pPr>
+        <w:numPr>
+          <w:ilvl w:val="0"/>
+          <w:numId w:val="19"/>
+        </w:numPr>
+        <w:spacing w:before="100" w:beforeAutospacing="1" w:after="0" w:line="240" w:lineRule="auto"/>
+        <w:rPr>
+          <w:rFonts w:ascii="Times New Roman" w:eastAsia="Times New Roman" w:hAnsi="Times New Roman" w:cs="Times New Roman"/>
+          <w:sz w:val="24"/>
+          <w:szCs w:val="24"/>
+          <w:lang w:eastAsia="es-ES"/>
+        </w:rPr>
+      </w:pPr>
+      <w:r>
+        <w:rPr>
+          <w:rFonts w:ascii="Liberation Serif" w:eastAsia="Times New Roman" w:hAnsi="Liberation Serif" w:cs="Liberation Serif"/>
+          <w:sz w:val="24"/>
+          <w:szCs w:val="24"/>
+          <w:lang w:eastAsia="es-ES"/>
+        </w:rPr>
+        <w:t>Contraseña</w:t>
+      </w:r>
+    </w:p>
+    <w:p>
+      <w:pPr>
+        <w:spacing w:before="100" w:beforeAutospacing="1" w:after="0" w:line="240" w:lineRule="auto"/>
+        <w:rPr>
+          <w:rFonts w:ascii="Times New Roman" w:eastAsia="Times New Roman" w:hAnsi="Times New Roman" w:cs="Times New Roman"/>
+          <w:sz w:val="24"/>
+          <w:szCs w:val="24"/>
+          <w:lang w:eastAsia="es-ES"/>
+        </w:rPr>
+      </w:pPr>
+    </w:p>
+    <w:p>
+      <w:pPr>
+        <w:spacing w:before="100" w:beforeAutospacing="1" w:after="0" w:line="240" w:lineRule="auto"/>
+        <w:rPr>
+          <w:rFonts w:ascii="Times New Roman" w:eastAsia="Times New Roman" w:hAnsi="Times New Roman" w:cs="Times New Roman"/>
+          <w:sz w:val="24"/>
+          <w:szCs w:val="24"/>
+          <w:lang w:eastAsia="es-ES"/>
+        </w:rPr>
+      </w:pPr>
+      <w:r>
+        <w:rPr>
+          <w:rFonts w:ascii="Times New Roman" w:eastAsia="Times New Roman" w:hAnsi="Times New Roman" w:cs="Times New Roman"/>
+          <w:sz w:val="24"/>
+          <w:szCs w:val="24"/>
+          <w:lang w:eastAsia="es-ES"/>
+        </w:rPr>
+        <w:t>Explicación de la aplicación:</w:t>
+      </w:r>
+      <w:r>
+        <w:rPr>
+          <w:rFonts w:ascii="Times New Roman" w:eastAsia="Times New Roman" w:hAnsi="Times New Roman" w:cs="Times New Roman"/>
+          <w:sz w:val="24"/>
+          <w:szCs w:val="24"/>
+          <w:shd w:val="clear" w:color="auto" w:fill="FFFF00"/>
+          <w:lang w:eastAsia="es-ES"/>
+        </w:rPr>
+        <w:t xml:space="preserve"> (Aquí hay que añadir pantallazos)</w:t>
+      </w:r>
+    </w:p>
+    <w:p>
+      <w:pPr>
+        <w:spacing w:before="100" w:beforeAutospacing="1" w:after="0" w:line="240" w:lineRule="auto"/>
+        <w:rPr>
+          <w:rFonts w:ascii="Times New Roman" w:eastAsia="Times New Roman" w:hAnsi="Times New Roman" w:cs="Times New Roman"/>
+          <w:sz w:val="24"/>
+          <w:szCs w:val="24"/>
+          <w:lang w:eastAsia="es-ES"/>
+        </w:rPr>
+      </w:pPr>
+    </w:p>
+    <w:p>
+      <w:pPr>
+        <w:spacing w:before="100" w:beforeAutospacing="1" w:after="0" w:line="240" w:lineRule="auto"/>
+        <w:rPr>
+          <w:rFonts w:ascii="Times New Roman" w:eastAsia="Times New Roman" w:hAnsi="Times New Roman" w:cs="Times New Roman"/>
+          <w:sz w:val="24"/>
+          <w:szCs w:val="24"/>
+          <w:lang w:eastAsia="es-ES"/>
+        </w:rPr>
+      </w:pPr>
+      <w:r>
+        <w:rPr>
+          <w:rFonts w:ascii="Times New Roman" w:eastAsia="Times New Roman" w:hAnsi="Times New Roman" w:cs="Times New Roman"/>
+          <w:sz w:val="24"/>
+          <w:szCs w:val="24"/>
+          <w:lang w:eastAsia="es-ES"/>
+        </w:rPr>
+        <w:t xml:space="preserve">Iniciamos la navegación en la pantalla de </w:t>
+      </w:r>
+      <w:proofErr w:type="spellStart"/>
+      <w:r>
+        <w:rPr>
+          <w:rFonts w:ascii="Times New Roman" w:eastAsia="Times New Roman" w:hAnsi="Times New Roman" w:cs="Times New Roman"/>
+          <w:sz w:val="24"/>
+          <w:szCs w:val="24"/>
+          <w:lang w:eastAsia="es-ES"/>
+        </w:rPr>
+        <w:t>login</w:t>
+      </w:r>
+      <w:proofErr w:type="spellEnd"/>
+      <w:r>
+        <w:rPr>
+          <w:rFonts w:ascii="Times New Roman" w:eastAsia="Times New Roman" w:hAnsi="Times New Roman" w:cs="Times New Roman"/>
+          <w:sz w:val="24"/>
+          <w:szCs w:val="24"/>
+          <w:lang w:eastAsia="es-ES"/>
+        </w:rPr>
+        <w:t xml:space="preserve">. En ella el usuario puede ver un campo para introducir el email, otro para la contraseña y un texto </w:t>
+      </w:r>
+      <w:proofErr w:type="spellStart"/>
+      <w:r>
+        <w:rPr>
+          <w:rFonts w:ascii="Times New Roman" w:eastAsia="Times New Roman" w:hAnsi="Times New Roman" w:cs="Times New Roman"/>
+          <w:sz w:val="24"/>
+          <w:szCs w:val="24"/>
+          <w:lang w:eastAsia="es-ES"/>
+        </w:rPr>
+        <w:t>clicable</w:t>
+      </w:r>
+      <w:proofErr w:type="spellEnd"/>
+      <w:r>
+        <w:rPr>
+          <w:rFonts w:ascii="Times New Roman" w:eastAsia="Times New Roman" w:hAnsi="Times New Roman" w:cs="Times New Roman"/>
+          <w:sz w:val="24"/>
+          <w:szCs w:val="24"/>
+          <w:lang w:eastAsia="es-ES"/>
+        </w:rPr>
+        <w:t xml:space="preserve"> para registrarse.</w:t>
+      </w:r>
+    </w:p>
+    <w:p>
+      <w:pPr>
+        <w:spacing w:before="100" w:beforeAutospacing="1" w:after="0" w:line="240" w:lineRule="auto"/>
+        <w:rPr>
+          <w:rFonts w:ascii="Times New Roman" w:eastAsia="Times New Roman" w:hAnsi="Times New Roman" w:cs="Times New Roman"/>
+          <w:sz w:val="24"/>
+          <w:szCs w:val="24"/>
+          <w:lang w:eastAsia="es-ES"/>
+        </w:rPr>
+      </w:pPr>
+      <w:r>
+        <w:rPr>
+          <w:rFonts w:ascii="Times New Roman" w:eastAsia="Times New Roman" w:hAnsi="Times New Roman" w:cs="Times New Roman"/>
+          <w:sz w:val="24"/>
+          <w:szCs w:val="24"/>
+          <w:lang w:eastAsia="es-ES"/>
+        </w:rPr>
+        <w:t xml:space="preserve">En el caso de que el usuario no esté previamente registrado será necesario realizar esta acción </w:t>
+      </w:r>
+      <w:proofErr w:type="spellStart"/>
+      <w:r>
+        <w:rPr>
+          <w:rFonts w:ascii="Times New Roman" w:eastAsia="Times New Roman" w:hAnsi="Times New Roman" w:cs="Times New Roman"/>
+          <w:sz w:val="24"/>
+          <w:szCs w:val="24"/>
+          <w:lang w:eastAsia="es-ES"/>
+        </w:rPr>
+        <w:t>pulsabdo</w:t>
+      </w:r>
+      <w:proofErr w:type="spellEnd"/>
+      <w:r>
+        <w:rPr>
+          <w:rFonts w:ascii="Times New Roman" w:eastAsia="Times New Roman" w:hAnsi="Times New Roman" w:cs="Times New Roman"/>
+          <w:sz w:val="24"/>
+          <w:szCs w:val="24"/>
+          <w:lang w:eastAsia="es-ES"/>
+        </w:rPr>
+        <w:t xml:space="preserve"> el texto </w:t>
+      </w:r>
+      <w:proofErr w:type="spellStart"/>
+      <w:r>
+        <w:rPr>
+          <w:rFonts w:ascii="Times New Roman" w:eastAsia="Times New Roman" w:hAnsi="Times New Roman" w:cs="Times New Roman"/>
+          <w:sz w:val="24"/>
+          <w:szCs w:val="24"/>
+          <w:lang w:eastAsia="es-ES"/>
+        </w:rPr>
+        <w:t>clicable</w:t>
+      </w:r>
+      <w:proofErr w:type="spellEnd"/>
+      <w:r>
+        <w:rPr>
+          <w:rFonts w:ascii="Times New Roman" w:eastAsia="Times New Roman" w:hAnsi="Times New Roman" w:cs="Times New Roman"/>
+          <w:sz w:val="24"/>
+          <w:szCs w:val="24"/>
+          <w:lang w:eastAsia="es-ES"/>
+        </w:rPr>
+        <w:t xml:space="preserve">. Al pulsarlo seremos redirigidos a la pantalla de registro. Allí al usuario se le muestran todos los campos necesarios para realizar el registro, un botón aceptar para validar el </w:t>
+      </w:r>
+      <w:proofErr w:type="spellStart"/>
+      <w:r>
+        <w:rPr>
+          <w:rFonts w:ascii="Times New Roman" w:eastAsia="Times New Roman" w:hAnsi="Times New Roman" w:cs="Times New Roman"/>
+          <w:sz w:val="24"/>
+          <w:szCs w:val="24"/>
+          <w:lang w:eastAsia="es-ES"/>
+        </w:rPr>
+        <w:t>regustro</w:t>
+      </w:r>
+      <w:proofErr w:type="spellEnd"/>
+      <w:r>
+        <w:rPr>
+          <w:rFonts w:ascii="Times New Roman" w:eastAsia="Times New Roman" w:hAnsi="Times New Roman" w:cs="Times New Roman"/>
+          <w:sz w:val="24"/>
+          <w:szCs w:val="24"/>
+          <w:lang w:eastAsia="es-ES"/>
+        </w:rPr>
+        <w:t xml:space="preserve"> una vez cubiertos y un texto </w:t>
+      </w:r>
+      <w:proofErr w:type="spellStart"/>
+      <w:r>
+        <w:rPr>
+          <w:rFonts w:ascii="Times New Roman" w:eastAsia="Times New Roman" w:hAnsi="Times New Roman" w:cs="Times New Roman"/>
+          <w:sz w:val="24"/>
+          <w:szCs w:val="24"/>
+          <w:lang w:eastAsia="es-ES"/>
+        </w:rPr>
+        <w:t>clicable</w:t>
+      </w:r>
+      <w:proofErr w:type="spellEnd"/>
+      <w:r>
+        <w:rPr>
+          <w:rFonts w:ascii="Times New Roman" w:eastAsia="Times New Roman" w:hAnsi="Times New Roman" w:cs="Times New Roman"/>
+          <w:sz w:val="24"/>
+          <w:szCs w:val="24"/>
+          <w:lang w:eastAsia="es-ES"/>
+        </w:rPr>
+        <w:t xml:space="preserve"> “Ya tengo cuenta”, este último redirige a la pantalla de </w:t>
+      </w:r>
+      <w:proofErr w:type="spellStart"/>
+      <w:r>
+        <w:rPr>
+          <w:rFonts w:ascii="Times New Roman" w:eastAsia="Times New Roman" w:hAnsi="Times New Roman" w:cs="Times New Roman"/>
+          <w:sz w:val="24"/>
+          <w:szCs w:val="24"/>
+          <w:lang w:eastAsia="es-ES"/>
+        </w:rPr>
+        <w:t>login</w:t>
+      </w:r>
+      <w:proofErr w:type="spellEnd"/>
+      <w:r>
+        <w:rPr>
+          <w:rFonts w:ascii="Times New Roman" w:eastAsia="Times New Roman" w:hAnsi="Times New Roman" w:cs="Times New Roman"/>
+          <w:sz w:val="24"/>
+          <w:szCs w:val="24"/>
+          <w:lang w:eastAsia="es-ES"/>
+        </w:rPr>
+        <w:t xml:space="preserve"> en caso de </w:t>
+      </w:r>
+      <w:proofErr w:type="spellStart"/>
+      <w:r>
+        <w:rPr>
+          <w:rFonts w:ascii="Times New Roman" w:eastAsia="Times New Roman" w:hAnsi="Times New Roman" w:cs="Times New Roman"/>
+          <w:sz w:val="24"/>
+          <w:szCs w:val="24"/>
+          <w:lang w:eastAsia="es-ES"/>
+        </w:rPr>
+        <w:t>click</w:t>
+      </w:r>
+      <w:proofErr w:type="spellEnd"/>
+      <w:r>
+        <w:rPr>
+          <w:rFonts w:ascii="Times New Roman" w:eastAsia="Times New Roman" w:hAnsi="Times New Roman" w:cs="Times New Roman"/>
+          <w:sz w:val="24"/>
+          <w:szCs w:val="24"/>
+          <w:lang w:eastAsia="es-ES"/>
+        </w:rPr>
+        <w:t xml:space="preserve"> accidental en el botón de registro de la ventana de Login.</w:t>
+      </w:r>
+    </w:p>
+    <w:p>
+      <w:pPr>
+        <w:spacing w:before="100" w:beforeAutospacing="1" w:after="0" w:line="240" w:lineRule="auto"/>
+        <w:rPr>
+          <w:rFonts w:ascii="Times New Roman" w:eastAsia="Times New Roman" w:hAnsi="Times New Roman" w:cs="Times New Roman"/>
+          <w:sz w:val="24"/>
+          <w:szCs w:val="24"/>
+          <w:lang w:eastAsia="es-ES"/>
+        </w:rPr>
+      </w:pPr>
+    </w:p>
+    <w:p>
+      <w:pPr>
+        <w:spacing w:before="100" w:beforeAutospacing="1" w:after="0" w:line="240" w:lineRule="auto"/>
+        <w:rPr>
+          <w:rFonts w:ascii="Times New Roman" w:eastAsia="Times New Roman" w:hAnsi="Times New Roman" w:cs="Times New Roman"/>
+          <w:sz w:val="24"/>
+          <w:szCs w:val="24"/>
+          <w:lang w:eastAsia="es-ES"/>
+        </w:rPr>
+      </w:pPr>
+      <w:r>
+        <w:rPr>
+          <w:rFonts w:ascii="Times New Roman" w:eastAsia="Times New Roman" w:hAnsi="Times New Roman" w:cs="Times New Roman"/>
+          <w:sz w:val="24"/>
+          <w:szCs w:val="24"/>
+          <w:lang w:eastAsia="es-ES"/>
+        </w:rPr>
+        <w:t>Para realizar el registro el usuario debe cubrir todos los datos teniendo cumpliendo las siguientes premisas:</w:t>
+      </w:r>
+    </w:p>
+    <w:p>
+      <w:pPr>
+        <w:spacing w:before="100" w:beforeAutospacing="1" w:after="0" w:line="240" w:lineRule="auto"/>
+        <w:rPr>
+          <w:rFonts w:ascii="Times New Roman" w:eastAsia="Times New Roman" w:hAnsi="Times New Roman" w:cs="Times New Roman"/>
+          <w:sz w:val="24"/>
+          <w:szCs w:val="24"/>
+          <w:lang w:eastAsia="es-ES"/>
+        </w:rPr>
+      </w:pPr>
+    </w:p>
+    <w:p>
+      <w:pPr>
+        <w:numPr>
+          <w:ilvl w:val="0"/>
+          <w:numId w:val="20"/>
+        </w:numPr>
+        <w:spacing w:before="100" w:beforeAutospacing="1" w:after="0" w:line="240" w:lineRule="auto"/>
+        <w:rPr>
+          <w:rFonts w:ascii="Times New Roman" w:eastAsia="Times New Roman" w:hAnsi="Times New Roman" w:cs="Times New Roman"/>
+          <w:sz w:val="24"/>
+          <w:szCs w:val="24"/>
+          <w:lang w:eastAsia="es-ES"/>
+        </w:rPr>
+      </w:pPr>
+      <w:r>
+        <w:rPr>
+          <w:rFonts w:ascii="Times New Roman" w:eastAsia="Times New Roman" w:hAnsi="Times New Roman" w:cs="Times New Roman"/>
+          <w:sz w:val="24"/>
+          <w:szCs w:val="24"/>
+          <w:lang w:eastAsia="es-ES"/>
+        </w:rPr>
+        <w:t>La contraseña debe tener mínimo 8 caracteres.</w:t>
+      </w:r>
+    </w:p>
+    <w:p>
+      <w:pPr>
+        <w:numPr>
+          <w:ilvl w:val="0"/>
+          <w:numId w:val="20"/>
+        </w:numPr>
+        <w:spacing w:before="100" w:beforeAutospacing="1" w:after="0" w:line="240" w:lineRule="auto"/>
+        <w:rPr>
+          <w:rFonts w:ascii="Times New Roman" w:eastAsia="Times New Roman" w:hAnsi="Times New Roman" w:cs="Times New Roman"/>
+          <w:sz w:val="24"/>
+          <w:szCs w:val="24"/>
+          <w:lang w:eastAsia="es-ES"/>
+        </w:rPr>
+      </w:pPr>
+      <w:r>
+        <w:rPr>
+          <w:rFonts w:ascii="Times New Roman" w:eastAsia="Times New Roman" w:hAnsi="Times New Roman" w:cs="Times New Roman"/>
+          <w:sz w:val="24"/>
+          <w:szCs w:val="24"/>
+          <w:lang w:eastAsia="es-ES"/>
+        </w:rPr>
+        <w:t>El DNI/NIF debe tener el formato de 8 números + letra</w:t>
+      </w:r>
+    </w:p>
+    <w:p>
+      <w:pPr>
+        <w:numPr>
+          <w:ilvl w:val="0"/>
+          <w:numId w:val="20"/>
+        </w:numPr>
+        <w:spacing w:before="100" w:beforeAutospacing="1" w:after="0" w:line="240" w:lineRule="auto"/>
+        <w:rPr>
+          <w:rFonts w:ascii="Times New Roman" w:eastAsia="Times New Roman" w:hAnsi="Times New Roman" w:cs="Times New Roman"/>
+          <w:sz w:val="24"/>
+          <w:szCs w:val="24"/>
+          <w:lang w:eastAsia="es-ES"/>
+        </w:rPr>
+      </w:pPr>
+      <w:r>
+        <w:rPr>
+          <w:rFonts w:ascii="Times New Roman" w:eastAsia="Times New Roman" w:hAnsi="Times New Roman" w:cs="Times New Roman"/>
+          <w:sz w:val="24"/>
+          <w:szCs w:val="24"/>
+          <w:lang w:eastAsia="es-ES"/>
+        </w:rPr>
+        <w:t>El número de teléfono debe tener 9 dígitos</w:t>
+      </w:r>
+    </w:p>
+    <w:p>
+      <w:pPr>
+        <w:numPr>
+          <w:ilvl w:val="0"/>
+          <w:numId w:val="20"/>
+        </w:numPr>
+        <w:spacing w:before="100" w:beforeAutospacing="1" w:after="0" w:line="240" w:lineRule="auto"/>
+        <w:rPr>
+          <w:rFonts w:ascii="Times New Roman" w:eastAsia="Times New Roman" w:hAnsi="Times New Roman" w:cs="Times New Roman"/>
+          <w:sz w:val="24"/>
+          <w:szCs w:val="24"/>
+          <w:lang w:eastAsia="es-ES"/>
+        </w:rPr>
+      </w:pPr>
+      <w:r>
+        <w:rPr>
+          <w:rFonts w:ascii="Times New Roman" w:eastAsia="Times New Roman" w:hAnsi="Times New Roman" w:cs="Times New Roman"/>
+          <w:sz w:val="24"/>
+          <w:szCs w:val="24"/>
+          <w:lang w:eastAsia="es-ES"/>
+        </w:rPr>
+        <w:t xml:space="preserve">El código postal debe </w:t>
+      </w:r>
+      <w:proofErr w:type="spellStart"/>
+      <w:r>
+        <w:rPr>
+          <w:rFonts w:ascii="Times New Roman" w:eastAsia="Times New Roman" w:hAnsi="Times New Roman" w:cs="Times New Roman"/>
+          <w:sz w:val="24"/>
+          <w:szCs w:val="24"/>
+          <w:lang w:eastAsia="es-ES"/>
+        </w:rPr>
+        <w:t>tner</w:t>
+      </w:r>
+      <w:proofErr w:type="spellEnd"/>
+      <w:r>
+        <w:rPr>
+          <w:rFonts w:ascii="Times New Roman" w:eastAsia="Times New Roman" w:hAnsi="Times New Roman" w:cs="Times New Roman"/>
+          <w:sz w:val="24"/>
+          <w:szCs w:val="24"/>
+          <w:lang w:eastAsia="es-ES"/>
+        </w:rPr>
+        <w:t xml:space="preserve"> 5 dígitos.</w:t>
+      </w:r>
+    </w:p>
+    <w:p>
+      <w:pPr>
+        <w:numPr>
+          <w:ilvl w:val="0"/>
+          <w:numId w:val="20"/>
+        </w:numPr>
+        <w:spacing w:before="100" w:beforeAutospacing="1" w:after="0" w:line="240" w:lineRule="auto"/>
+        <w:rPr>
+          <w:rFonts w:ascii="Times New Roman" w:eastAsia="Times New Roman" w:hAnsi="Times New Roman" w:cs="Times New Roman"/>
+          <w:sz w:val="24"/>
+          <w:szCs w:val="24"/>
+          <w:lang w:eastAsia="es-ES"/>
+        </w:rPr>
+      </w:pPr>
+      <w:r>
+        <w:rPr>
+          <w:rFonts w:ascii="Times New Roman" w:eastAsia="Times New Roman" w:hAnsi="Times New Roman" w:cs="Times New Roman"/>
+          <w:sz w:val="24"/>
+          <w:szCs w:val="24"/>
+          <w:lang w:eastAsia="es-ES"/>
+        </w:rPr>
+        <w:t>Todos los campos son obligatorios</w:t>
+      </w:r>
+    </w:p>
+    <w:p>
+      <w:pPr>
+        <w:spacing w:before="100" w:beforeAutospacing="1" w:after="0" w:line="240" w:lineRule="auto"/>
+        <w:rPr>
+          <w:rFonts w:ascii="Times New Roman" w:eastAsia="Times New Roman" w:hAnsi="Times New Roman" w:cs="Times New Roman"/>
+          <w:sz w:val="24"/>
+          <w:szCs w:val="24"/>
+          <w:lang w:eastAsia="es-ES"/>
+        </w:rPr>
+      </w:pPr>
+    </w:p>
+    <w:p>
+      <w:pPr>
+        <w:spacing w:before="100" w:beforeAutospacing="1" w:after="0" w:line="240" w:lineRule="auto"/>
+        <w:rPr>
+          <w:rFonts w:ascii="Times New Roman" w:eastAsia="Times New Roman" w:hAnsi="Times New Roman" w:cs="Times New Roman"/>
+          <w:sz w:val="24"/>
+          <w:szCs w:val="24"/>
+          <w:lang w:eastAsia="es-ES"/>
+        </w:rPr>
+      </w:pPr>
+      <w:r>
+        <w:rPr>
+          <w:rFonts w:ascii="Times New Roman" w:eastAsia="Times New Roman" w:hAnsi="Times New Roman" w:cs="Times New Roman"/>
+          <w:sz w:val="24"/>
+          <w:szCs w:val="24"/>
+          <w:lang w:eastAsia="es-ES"/>
+        </w:rPr>
+        <w:t xml:space="preserve">Una vez cubiertos todos los campos el usuario debe pulsar el botón aceptar y será redirigido nuevamente a la ventana de Login, donde podrá autenticarse con su email y </w:t>
+      </w:r>
+      <w:r>
+        <w:rPr>
+          <w:rFonts w:ascii="Times New Roman" w:eastAsia="Times New Roman" w:hAnsi="Times New Roman" w:cs="Times New Roman"/>
+          <w:sz w:val="24"/>
+          <w:szCs w:val="24"/>
+          <w:lang w:eastAsia="es-ES"/>
+        </w:rPr>
+        <w:lastRenderedPageBreak/>
+        <w:t xml:space="preserve">contraseña utilizando los campos habilitados para ello. Una vez pulsado el botón “Entrar”, si el email y la contraseña son correctos, se le mostrará la pantalla de gestión del usuario en la que se le muestran varias </w:t>
+      </w:r>
+      <w:proofErr w:type="spellStart"/>
+      <w:r>
+        <w:rPr>
+          <w:rFonts w:ascii="Times New Roman" w:eastAsia="Times New Roman" w:hAnsi="Times New Roman" w:cs="Times New Roman"/>
+          <w:sz w:val="24"/>
+          <w:szCs w:val="24"/>
+          <w:lang w:eastAsia="es-ES"/>
+        </w:rPr>
+        <w:t>cards</w:t>
+      </w:r>
+      <w:proofErr w:type="spellEnd"/>
+      <w:r>
+        <w:rPr>
+          <w:rFonts w:ascii="Times New Roman" w:eastAsia="Times New Roman" w:hAnsi="Times New Roman" w:cs="Times New Roman"/>
+          <w:sz w:val="24"/>
+          <w:szCs w:val="24"/>
+          <w:lang w:eastAsia="es-ES"/>
+        </w:rPr>
+        <w:t xml:space="preserve"> con los apartados principales de la aplicación “Mis equipos”, “Mis reparaciones”, “Mis presupuestos”</w:t>
+      </w:r>
+    </w:p>
+    <w:p>
+      <w:pPr>
+        <w:spacing w:before="100" w:beforeAutospacing="1" w:after="0" w:line="240" w:lineRule="auto"/>
+        <w:rPr>
+          <w:rFonts w:ascii="Times New Roman" w:eastAsia="Times New Roman" w:hAnsi="Times New Roman" w:cs="Times New Roman"/>
+          <w:sz w:val="24"/>
+          <w:szCs w:val="24"/>
+          <w:lang w:eastAsia="es-ES"/>
+        </w:rPr>
+      </w:pPr>
+      <w:r>
+        <w:rPr>
+          <w:rFonts w:ascii="Times New Roman" w:eastAsia="Times New Roman" w:hAnsi="Times New Roman" w:cs="Times New Roman"/>
+          <w:sz w:val="24"/>
+          <w:szCs w:val="24"/>
+          <w:lang w:eastAsia="es-ES"/>
+        </w:rPr>
+        <w:t xml:space="preserve">Así mismo se muestra una </w:t>
+      </w:r>
+      <w:proofErr w:type="spellStart"/>
+      <w:r>
+        <w:rPr>
+          <w:rFonts w:ascii="Times New Roman" w:eastAsia="Times New Roman" w:hAnsi="Times New Roman" w:cs="Times New Roman"/>
+          <w:sz w:val="24"/>
+          <w:szCs w:val="24"/>
+          <w:lang w:eastAsia="es-ES"/>
+        </w:rPr>
+        <w:t>BottonBar</w:t>
+      </w:r>
+      <w:proofErr w:type="spellEnd"/>
+      <w:r>
+        <w:rPr>
+          <w:rFonts w:ascii="Times New Roman" w:eastAsia="Times New Roman" w:hAnsi="Times New Roman" w:cs="Times New Roman"/>
+          <w:sz w:val="24"/>
+          <w:szCs w:val="24"/>
+          <w:lang w:eastAsia="es-ES"/>
+        </w:rPr>
+        <w:t xml:space="preserve"> de acceso rápido “Mis equipos”, “Mis reparaciones”, “Mis notificaciones” y “Mi perfil”</w:t>
+      </w:r>
+    </w:p>
+    <w:p>
+      <w:pPr>
+        <w:spacing w:before="100" w:beforeAutospacing="1" w:after="0" w:line="240" w:lineRule="auto"/>
+        <w:rPr>
+          <w:rFonts w:ascii="Times New Roman" w:eastAsia="Times New Roman" w:hAnsi="Times New Roman" w:cs="Times New Roman"/>
+          <w:sz w:val="24"/>
+          <w:szCs w:val="24"/>
+          <w:lang w:eastAsia="es-ES"/>
+        </w:rPr>
+      </w:pPr>
+      <w:r>
+        <w:rPr>
+          <w:rFonts w:ascii="Times New Roman" w:eastAsia="Times New Roman" w:hAnsi="Times New Roman" w:cs="Times New Roman"/>
+          <w:sz w:val="24"/>
+          <w:szCs w:val="24"/>
+          <w:lang w:eastAsia="es-ES"/>
+        </w:rPr>
+        <w:t xml:space="preserve">Al pulsar la </w:t>
+      </w:r>
+      <w:proofErr w:type="spellStart"/>
+      <w:r>
+        <w:rPr>
+          <w:rFonts w:ascii="Times New Roman" w:eastAsia="Times New Roman" w:hAnsi="Times New Roman" w:cs="Times New Roman"/>
+          <w:sz w:val="24"/>
+          <w:szCs w:val="24"/>
+          <w:lang w:eastAsia="es-ES"/>
+        </w:rPr>
+        <w:t>card</w:t>
+      </w:r>
+      <w:proofErr w:type="spellEnd"/>
+      <w:r>
+        <w:rPr>
+          <w:rFonts w:ascii="Times New Roman" w:eastAsia="Times New Roman" w:hAnsi="Times New Roman" w:cs="Times New Roman"/>
+          <w:sz w:val="24"/>
+          <w:szCs w:val="24"/>
+          <w:lang w:eastAsia="es-ES"/>
+        </w:rPr>
+        <w:t xml:space="preserve"> de “Mis Equipos” se abre un </w:t>
+      </w:r>
+      <w:proofErr w:type="spellStart"/>
+      <w:r>
+        <w:rPr>
+          <w:rFonts w:ascii="Times New Roman" w:eastAsia="Times New Roman" w:hAnsi="Times New Roman" w:cs="Times New Roman"/>
+          <w:sz w:val="24"/>
+          <w:szCs w:val="24"/>
+          <w:lang w:eastAsia="es-ES"/>
+        </w:rPr>
+        <w:t>deplegable</w:t>
+      </w:r>
+      <w:proofErr w:type="spellEnd"/>
+      <w:r>
+        <w:rPr>
+          <w:rFonts w:ascii="Times New Roman" w:eastAsia="Times New Roman" w:hAnsi="Times New Roman" w:cs="Times New Roman"/>
+          <w:sz w:val="24"/>
+          <w:szCs w:val="24"/>
+          <w:lang w:eastAsia="es-ES"/>
+        </w:rPr>
+        <w:t xml:space="preserve"> con los equipos del usuario, dónde puede ver la siguiente información de sus equipos:</w:t>
+      </w:r>
+    </w:p>
+    <w:p>
+      <w:pPr>
+        <w:spacing w:before="100" w:beforeAutospacing="1" w:after="0" w:line="240" w:lineRule="auto"/>
+        <w:rPr>
+          <w:rFonts w:ascii="Times New Roman" w:eastAsia="Times New Roman" w:hAnsi="Times New Roman" w:cs="Times New Roman"/>
+          <w:sz w:val="24"/>
+          <w:szCs w:val="24"/>
+          <w:lang w:eastAsia="es-ES"/>
+        </w:rPr>
+      </w:pPr>
+    </w:p>
+    <w:p>
+      <w:pPr>
+        <w:spacing w:before="100" w:beforeAutospacing="1" w:after="0" w:line="240" w:lineRule="auto"/>
+        <w:rPr>
+          <w:rFonts w:ascii="Times New Roman" w:eastAsia="Times New Roman" w:hAnsi="Times New Roman" w:cs="Times New Roman"/>
+          <w:sz w:val="24"/>
+          <w:szCs w:val="24"/>
+          <w:lang w:eastAsia="es-ES"/>
+        </w:rPr>
+      </w:pPr>
+    </w:p>
+    <w:p>
+      <w:pPr>
+        <w:spacing w:before="100" w:beforeAutospacing="1" w:after="0" w:line="240" w:lineRule="auto"/>
+        <w:rPr>
+          <w:rFonts w:ascii="Times New Roman" w:eastAsia="Times New Roman" w:hAnsi="Times New Roman" w:cs="Times New Roman"/>
+          <w:sz w:val="24"/>
+          <w:szCs w:val="24"/>
+          <w:lang w:eastAsia="es-ES"/>
+        </w:rPr>
+      </w:pPr>
+      <w:r>
+        <w:rPr>
+          <w:rFonts w:ascii="Times New Roman" w:eastAsia="Times New Roman" w:hAnsi="Times New Roman" w:cs="Times New Roman"/>
+          <w:sz w:val="24"/>
+          <w:szCs w:val="24"/>
+          <w:lang w:eastAsia="es-ES"/>
+        </w:rPr>
+        <w:t>Se muestra también un botón de añadir equipos que te abre un desplegable donde el usuario puede introducir la información de su equipo y opcionalmente el motivo de la avería. (EN PROCESO)</w:t>
+      </w:r>
+    </w:p>
+    <w:p>
+      <w:pPr>
+        <w:spacing w:before="100" w:beforeAutospacing="1" w:after="0" w:line="240" w:lineRule="auto"/>
+        <w:rPr>
+          <w:rFonts w:ascii="Times New Roman" w:eastAsia="Times New Roman" w:hAnsi="Times New Roman" w:cs="Times New Roman"/>
+          <w:sz w:val="24"/>
+          <w:szCs w:val="24"/>
+          <w:lang w:eastAsia="es-ES"/>
+        </w:rPr>
+      </w:pPr>
+    </w:p>
+    <w:p>
+      <w:pPr>
+        <w:spacing w:before="100" w:beforeAutospacing="1" w:after="0" w:line="240" w:lineRule="auto"/>
+        <w:rPr>
+          <w:rFonts w:ascii="Times New Roman" w:eastAsia="Times New Roman" w:hAnsi="Times New Roman" w:cs="Times New Roman"/>
+          <w:sz w:val="24"/>
+          <w:szCs w:val="24"/>
+          <w:lang w:eastAsia="es-ES"/>
+        </w:rPr>
+      </w:pPr>
+      <w:r>
+        <w:rPr>
+          <w:rFonts w:ascii="Times New Roman" w:eastAsia="Times New Roman" w:hAnsi="Times New Roman" w:cs="Times New Roman"/>
+          <w:sz w:val="24"/>
+          <w:szCs w:val="24"/>
+          <w:lang w:eastAsia="es-ES"/>
+        </w:rPr>
+        <w:t xml:space="preserve">Al pulsar el </w:t>
+      </w:r>
+      <w:proofErr w:type="spellStart"/>
+      <w:r>
+        <w:rPr>
+          <w:rFonts w:ascii="Times New Roman" w:eastAsia="Times New Roman" w:hAnsi="Times New Roman" w:cs="Times New Roman"/>
+          <w:sz w:val="24"/>
+          <w:szCs w:val="24"/>
+          <w:lang w:eastAsia="es-ES"/>
+        </w:rPr>
+        <w:t>card</w:t>
+      </w:r>
+      <w:proofErr w:type="spellEnd"/>
+      <w:r>
+        <w:rPr>
+          <w:rFonts w:ascii="Times New Roman" w:eastAsia="Times New Roman" w:hAnsi="Times New Roman" w:cs="Times New Roman"/>
+          <w:sz w:val="24"/>
+          <w:szCs w:val="24"/>
+          <w:lang w:eastAsia="es-ES"/>
+        </w:rPr>
+        <w:t xml:space="preserve"> de “Mis reparaciones” se abre un desplegable con las reparaciones de usuario, en esta sección puede ver todas sus reparaciones y haciendo </w:t>
+      </w:r>
+      <w:proofErr w:type="spellStart"/>
+      <w:r>
+        <w:rPr>
+          <w:rFonts w:ascii="Times New Roman" w:eastAsia="Times New Roman" w:hAnsi="Times New Roman" w:cs="Times New Roman"/>
+          <w:sz w:val="24"/>
+          <w:szCs w:val="24"/>
+          <w:lang w:eastAsia="es-ES"/>
+        </w:rPr>
+        <w:t>click</w:t>
+      </w:r>
+      <w:proofErr w:type="spellEnd"/>
+      <w:r>
+        <w:rPr>
+          <w:rFonts w:ascii="Times New Roman" w:eastAsia="Times New Roman" w:hAnsi="Times New Roman" w:cs="Times New Roman"/>
+          <w:sz w:val="24"/>
+          <w:szCs w:val="24"/>
+          <w:lang w:eastAsia="es-ES"/>
+        </w:rPr>
+        <w:t xml:space="preserve"> puede entrar al detalle de las mismas, </w:t>
+      </w:r>
+      <w:proofErr w:type="spellStart"/>
+      <w:r>
+        <w:rPr>
+          <w:rFonts w:ascii="Times New Roman" w:eastAsia="Times New Roman" w:hAnsi="Times New Roman" w:cs="Times New Roman"/>
+          <w:sz w:val="24"/>
+          <w:szCs w:val="24"/>
+          <w:lang w:eastAsia="es-ES"/>
+        </w:rPr>
+        <w:t>incluído</w:t>
+      </w:r>
+      <w:proofErr w:type="spellEnd"/>
+      <w:r>
+        <w:rPr>
+          <w:rFonts w:ascii="Times New Roman" w:eastAsia="Times New Roman" w:hAnsi="Times New Roman" w:cs="Times New Roman"/>
+          <w:sz w:val="24"/>
+          <w:szCs w:val="24"/>
+          <w:lang w:eastAsia="es-ES"/>
+        </w:rPr>
+        <w:t xml:space="preserve"> la fase en la que se encuentra la reparación.</w:t>
+      </w:r>
+    </w:p>
+    <w:p>
+      <w:pPr>
+        <w:spacing w:before="100" w:beforeAutospacing="1" w:after="0" w:line="240" w:lineRule="auto"/>
+        <w:rPr>
+          <w:rFonts w:ascii="Times New Roman" w:eastAsia="Times New Roman" w:hAnsi="Times New Roman" w:cs="Times New Roman"/>
+          <w:sz w:val="24"/>
+          <w:szCs w:val="24"/>
+          <w:lang w:eastAsia="es-ES"/>
+        </w:rPr>
+      </w:pPr>
+      <w:r>
+        <w:rPr>
+          <w:rFonts w:ascii="Times New Roman" w:eastAsia="Times New Roman" w:hAnsi="Times New Roman" w:cs="Times New Roman"/>
+          <w:sz w:val="24"/>
+          <w:szCs w:val="24"/>
+          <w:lang w:eastAsia="es-ES"/>
+        </w:rPr>
+        <w:t>Los estados posibles son “En estudio”, “Presupuestada”, “En reparación”, “Finalizada por el usuario”, “Listo para recoger” y “Finalizada”</w:t>
+      </w:r>
+    </w:p>
+    <w:p>
+      <w:pPr>
+        <w:spacing w:before="100" w:beforeAutospacing="1" w:after="0" w:line="240" w:lineRule="auto"/>
+        <w:rPr>
+          <w:rFonts w:ascii="Times New Roman" w:eastAsia="Times New Roman" w:hAnsi="Times New Roman" w:cs="Times New Roman"/>
+          <w:sz w:val="24"/>
+          <w:szCs w:val="24"/>
+          <w:lang w:eastAsia="es-ES"/>
+        </w:rPr>
+      </w:pPr>
+    </w:p>
+    <w:p>
+      <w:pPr>
+        <w:numPr>
+          <w:ilvl w:val="0"/>
+          <w:numId w:val="21"/>
+        </w:numPr>
+        <w:spacing w:before="100" w:beforeAutospacing="1" w:after="0" w:line="240" w:lineRule="auto"/>
+        <w:rPr>
+          <w:rFonts w:ascii="Times New Roman" w:eastAsia="Times New Roman" w:hAnsi="Times New Roman" w:cs="Times New Roman"/>
+          <w:sz w:val="24"/>
+          <w:szCs w:val="24"/>
+          <w:lang w:eastAsia="es-ES"/>
+        </w:rPr>
+      </w:pPr>
+      <w:r>
+        <w:rPr>
+          <w:rFonts w:ascii="Times New Roman" w:eastAsia="Times New Roman" w:hAnsi="Times New Roman" w:cs="Times New Roman"/>
+          <w:sz w:val="24"/>
+          <w:szCs w:val="24"/>
+          <w:lang w:eastAsia="es-ES"/>
+        </w:rPr>
+        <w:t>Pendiente→ La reparación ha sido creada pero no tiene un técnico asignado.</w:t>
+      </w:r>
+    </w:p>
+    <w:p>
+      <w:pPr>
+        <w:numPr>
+          <w:ilvl w:val="0"/>
+          <w:numId w:val="21"/>
+        </w:numPr>
+        <w:spacing w:before="100" w:beforeAutospacing="1" w:after="0" w:line="240" w:lineRule="auto"/>
+        <w:rPr>
+          <w:rFonts w:ascii="Times New Roman" w:eastAsia="Times New Roman" w:hAnsi="Times New Roman" w:cs="Times New Roman"/>
+          <w:sz w:val="24"/>
+          <w:szCs w:val="24"/>
+          <w:lang w:eastAsia="es-ES"/>
+        </w:rPr>
+      </w:pPr>
+      <w:r>
+        <w:rPr>
+          <w:rFonts w:ascii="Times New Roman" w:eastAsia="Times New Roman" w:hAnsi="Times New Roman" w:cs="Times New Roman"/>
+          <w:sz w:val="24"/>
+          <w:szCs w:val="24"/>
+          <w:lang w:eastAsia="es-ES"/>
+        </w:rPr>
+        <w:t>Asignada→ La reparación tiene un técnico asignado que en breve estudiará el caso y enviará un presupuesto.</w:t>
+      </w:r>
+    </w:p>
+    <w:p>
+      <w:pPr>
+        <w:numPr>
+          <w:ilvl w:val="0"/>
+          <w:numId w:val="21"/>
+        </w:numPr>
+        <w:spacing w:before="100" w:beforeAutospacing="1" w:after="0" w:line="240" w:lineRule="auto"/>
+        <w:rPr>
+          <w:rFonts w:ascii="Times New Roman" w:eastAsia="Times New Roman" w:hAnsi="Times New Roman" w:cs="Times New Roman"/>
+          <w:sz w:val="24"/>
+          <w:szCs w:val="24"/>
+          <w:lang w:eastAsia="es-ES"/>
+        </w:rPr>
+      </w:pPr>
+      <w:r>
+        <w:rPr>
+          <w:rFonts w:ascii="Times New Roman" w:eastAsia="Times New Roman" w:hAnsi="Times New Roman" w:cs="Times New Roman"/>
+          <w:sz w:val="24"/>
+          <w:szCs w:val="24"/>
+          <w:lang w:eastAsia="es-ES"/>
+        </w:rPr>
+        <w:t>Presupuestada→ El usuario recibe el presupuesto y el puede aceptarlo o rechazarlo. Si lo rechaza la reparación pasa a “Finalizada por el usuario”</w:t>
+      </w:r>
+    </w:p>
+    <w:p>
+      <w:pPr>
+        <w:numPr>
+          <w:ilvl w:val="0"/>
+          <w:numId w:val="21"/>
+        </w:numPr>
+        <w:spacing w:before="100" w:beforeAutospacing="1" w:after="0" w:line="240" w:lineRule="auto"/>
+        <w:rPr>
+          <w:rFonts w:ascii="Times New Roman" w:eastAsia="Times New Roman" w:hAnsi="Times New Roman" w:cs="Times New Roman"/>
+          <w:sz w:val="24"/>
+          <w:szCs w:val="24"/>
+          <w:lang w:eastAsia="es-ES"/>
+        </w:rPr>
+      </w:pPr>
+      <w:r>
+        <w:rPr>
+          <w:rFonts w:ascii="Times New Roman" w:eastAsia="Times New Roman" w:hAnsi="Times New Roman" w:cs="Times New Roman"/>
+          <w:sz w:val="24"/>
+          <w:szCs w:val="24"/>
+          <w:lang w:eastAsia="es-ES"/>
+        </w:rPr>
+        <w:t>En reparación→ El equipo realiza la reparación</w:t>
+      </w:r>
+    </w:p>
+    <w:p>
+      <w:pPr>
+        <w:numPr>
+          <w:ilvl w:val="0"/>
+          <w:numId w:val="21"/>
+        </w:numPr>
+        <w:spacing w:before="100" w:beforeAutospacing="1" w:after="0" w:line="240" w:lineRule="auto"/>
+        <w:rPr>
+          <w:rFonts w:ascii="Times New Roman" w:eastAsia="Times New Roman" w:hAnsi="Times New Roman" w:cs="Times New Roman"/>
+          <w:sz w:val="24"/>
+          <w:szCs w:val="24"/>
+          <w:lang w:eastAsia="es-ES"/>
+        </w:rPr>
+      </w:pPr>
+      <w:r>
+        <w:rPr>
+          <w:rFonts w:ascii="Times New Roman" w:eastAsia="Times New Roman" w:hAnsi="Times New Roman" w:cs="Times New Roman"/>
+          <w:sz w:val="24"/>
+          <w:szCs w:val="24"/>
+          <w:lang w:eastAsia="es-ES"/>
+        </w:rPr>
+        <w:t>Listo para recoger→ El equipo está reparado y el cliente puede pasar a tienda a recoger el dispositivo.</w:t>
+      </w:r>
+    </w:p>
+    <w:p>
+      <w:pPr>
+        <w:numPr>
+          <w:ilvl w:val="0"/>
+          <w:numId w:val="21"/>
+        </w:numPr>
+        <w:spacing w:before="100" w:beforeAutospacing="1" w:after="0" w:line="240" w:lineRule="auto"/>
+        <w:rPr>
+          <w:rFonts w:ascii="Times New Roman" w:eastAsia="Times New Roman" w:hAnsi="Times New Roman" w:cs="Times New Roman"/>
+          <w:sz w:val="24"/>
+          <w:szCs w:val="24"/>
+          <w:lang w:eastAsia="es-ES"/>
+        </w:rPr>
+      </w:pPr>
+      <w:r>
+        <w:rPr>
+          <w:rFonts w:ascii="Times New Roman" w:eastAsia="Times New Roman" w:hAnsi="Times New Roman" w:cs="Times New Roman"/>
+          <w:sz w:val="24"/>
+          <w:szCs w:val="24"/>
+          <w:lang w:eastAsia="es-ES"/>
+        </w:rPr>
+        <w:t>Finalizada→ El equipo reparado ha sido recogido en tienda por el usuario.</w:t>
+      </w:r>
+    </w:p>
+    <w:p>
+      <w:pPr>
+        <w:numPr>
+          <w:ilvl w:val="0"/>
+          <w:numId w:val="21"/>
+        </w:numPr>
+        <w:spacing w:beforeAutospacing="1" w:after="0" w:afterAutospacing="1" w:line="240" w:lineRule="auto"/>
+        <w:rPr>
+          <w:rFonts w:ascii="Times New Roman" w:eastAsia="Times New Roman" w:hAnsi="Times New Roman" w:cs="Times New Roman"/>
+          <w:sz w:val="24"/>
+          <w:szCs w:val="24"/>
+          <w:lang w:eastAsia="es-ES"/>
+        </w:rPr>
+      </w:pPr>
+    </w:p>
+    <w:p>
+      <w:pPr>
+        <w:spacing w:before="100" w:beforeAutospacing="1" w:after="0" w:line="240" w:lineRule="auto"/>
+        <w:rPr>
+          <w:rFonts w:ascii="Times New Roman" w:eastAsia="Times New Roman" w:hAnsi="Times New Roman" w:cs="Times New Roman"/>
+          <w:sz w:val="24"/>
+          <w:szCs w:val="24"/>
+          <w:lang w:eastAsia="es-ES"/>
+        </w:rPr>
+      </w:pPr>
+      <w:r>
+        <w:rPr>
+          <w:rFonts w:ascii="Times New Roman" w:eastAsia="Times New Roman" w:hAnsi="Times New Roman" w:cs="Times New Roman"/>
+          <w:sz w:val="24"/>
+          <w:szCs w:val="24"/>
+          <w:lang w:eastAsia="es-ES"/>
+        </w:rPr>
+        <w:t xml:space="preserve">(Este </w:t>
+      </w:r>
+      <w:proofErr w:type="spellStart"/>
+      <w:r>
+        <w:rPr>
+          <w:rFonts w:ascii="Times New Roman" w:eastAsia="Times New Roman" w:hAnsi="Times New Roman" w:cs="Times New Roman"/>
+          <w:sz w:val="24"/>
+          <w:szCs w:val="24"/>
+          <w:lang w:eastAsia="es-ES"/>
+        </w:rPr>
+        <w:t>card</w:t>
+      </w:r>
+      <w:proofErr w:type="spellEnd"/>
+      <w:r>
+        <w:rPr>
+          <w:rFonts w:ascii="Times New Roman" w:eastAsia="Times New Roman" w:hAnsi="Times New Roman" w:cs="Times New Roman"/>
+          <w:sz w:val="24"/>
+          <w:szCs w:val="24"/>
+          <w:lang w:eastAsia="es-ES"/>
+        </w:rPr>
+        <w:t xml:space="preserve"> también incluye un botón “Añadir reparación” desde donde puede abrir una solicitud de reparación para uno de sus equipos.) EN PRÓXIMAS ACTUALIZACIONES</w:t>
+      </w:r>
+    </w:p>
+    <w:p>
+      <w:pPr>
+        <w:spacing w:before="100" w:beforeAutospacing="1" w:after="0" w:line="240" w:lineRule="auto"/>
+        <w:rPr>
+          <w:rFonts w:ascii="Times New Roman" w:eastAsia="Times New Roman" w:hAnsi="Times New Roman" w:cs="Times New Roman"/>
+          <w:sz w:val="24"/>
+          <w:szCs w:val="24"/>
+          <w:lang w:eastAsia="es-ES"/>
+        </w:rPr>
+      </w:pPr>
+    </w:p>
+    <w:p>
+      <w:pPr>
+        <w:spacing w:before="100" w:beforeAutospacing="1" w:after="0" w:line="240" w:lineRule="auto"/>
+        <w:rPr>
+          <w:rFonts w:ascii="Times New Roman" w:eastAsia="Times New Roman" w:hAnsi="Times New Roman" w:cs="Times New Roman"/>
+          <w:sz w:val="24"/>
+          <w:szCs w:val="24"/>
+          <w:lang w:eastAsia="es-ES"/>
+        </w:rPr>
+      </w:pPr>
+      <w:r>
+        <w:rPr>
+          <w:rFonts w:ascii="Times New Roman" w:eastAsia="Times New Roman" w:hAnsi="Times New Roman" w:cs="Times New Roman"/>
+          <w:sz w:val="24"/>
+          <w:szCs w:val="24"/>
+          <w:lang w:eastAsia="es-ES"/>
+        </w:rPr>
+        <w:t xml:space="preserve">Al pulsar el </w:t>
+      </w:r>
+      <w:proofErr w:type="spellStart"/>
+      <w:r>
+        <w:rPr>
+          <w:rFonts w:ascii="Times New Roman" w:eastAsia="Times New Roman" w:hAnsi="Times New Roman" w:cs="Times New Roman"/>
+          <w:sz w:val="24"/>
+          <w:szCs w:val="24"/>
+          <w:lang w:eastAsia="es-ES"/>
+        </w:rPr>
+        <w:t>card</w:t>
+      </w:r>
+      <w:proofErr w:type="spellEnd"/>
+      <w:r>
+        <w:rPr>
+          <w:rFonts w:ascii="Times New Roman" w:eastAsia="Times New Roman" w:hAnsi="Times New Roman" w:cs="Times New Roman"/>
+          <w:sz w:val="24"/>
+          <w:szCs w:val="24"/>
+          <w:lang w:eastAsia="es-ES"/>
+        </w:rPr>
+        <w:t xml:space="preserve"> de “Mis presupuestos” el usuario puede ver los presupuestos de todas sus reparaciones. En el caso de que tenga algún presupuesto pendiente de aceptación al hacer </w:t>
+      </w:r>
+      <w:proofErr w:type="spellStart"/>
+      <w:r>
+        <w:rPr>
+          <w:rFonts w:ascii="Times New Roman" w:eastAsia="Times New Roman" w:hAnsi="Times New Roman" w:cs="Times New Roman"/>
+          <w:sz w:val="24"/>
+          <w:szCs w:val="24"/>
+          <w:lang w:eastAsia="es-ES"/>
+        </w:rPr>
+        <w:t>clcick</w:t>
+      </w:r>
+      <w:proofErr w:type="spellEnd"/>
+      <w:r>
+        <w:rPr>
+          <w:rFonts w:ascii="Times New Roman" w:eastAsia="Times New Roman" w:hAnsi="Times New Roman" w:cs="Times New Roman"/>
+          <w:sz w:val="24"/>
+          <w:szCs w:val="24"/>
+          <w:lang w:eastAsia="es-ES"/>
+        </w:rPr>
+        <w:t xml:space="preserve"> sobre la reparación se le mostrará un mensaje con el presupuesto y los botones “Confirmar” y “Rechazar”. Si el usuario pulsa “Confirmar” El estado de la reparación </w:t>
+      </w:r>
+      <w:r>
+        <w:rPr>
+          <w:rFonts w:ascii="Times New Roman" w:eastAsia="Times New Roman" w:hAnsi="Times New Roman" w:cs="Times New Roman"/>
+          <w:sz w:val="24"/>
+          <w:szCs w:val="24"/>
+          <w:lang w:eastAsia="es-ES"/>
+        </w:rPr>
+        <w:lastRenderedPageBreak/>
+        <w:t>cambiará a “En reparación” y si pulsa “Rechazar” cambiará a “Rechazada”, en cuyo caso se dará por finalizada la reparación y el servicio técnico quedará en espera de que el cliente pase a recoger su equipo a las instalaciones.</w:t>
+      </w:r>
+    </w:p>
+    <w:p>
+      <w:pPr>
+        <w:spacing w:before="100" w:beforeAutospacing="1" w:after="0" w:line="240" w:lineRule="auto"/>
+        <w:rPr>
+          <w:rFonts w:ascii="Times New Roman" w:eastAsia="Times New Roman" w:hAnsi="Times New Roman" w:cs="Times New Roman"/>
+          <w:sz w:val="24"/>
+          <w:szCs w:val="24"/>
+          <w:lang w:eastAsia="es-ES"/>
+        </w:rPr>
+      </w:pPr>
+      <w:r>
+        <w:rPr>
+          <w:rFonts w:ascii="Times New Roman" w:eastAsia="Times New Roman" w:hAnsi="Times New Roman" w:cs="Times New Roman"/>
+          <w:sz w:val="24"/>
+          <w:szCs w:val="24"/>
+          <w:lang w:eastAsia="es-ES"/>
+        </w:rPr>
+        <w:t>Manual del usuario Técnico</w:t>
+      </w:r>
+    </w:p>
+    <w:p>
+      <w:pPr>
+        <w:spacing w:before="100" w:beforeAutospacing="1" w:after="0" w:line="240" w:lineRule="auto"/>
+        <w:rPr>
+          <w:rFonts w:ascii="Times New Roman" w:eastAsia="Times New Roman" w:hAnsi="Times New Roman" w:cs="Times New Roman"/>
+          <w:sz w:val="24"/>
+          <w:szCs w:val="24"/>
+          <w:lang w:eastAsia="es-ES"/>
+        </w:rPr>
+      </w:pPr>
+      <w:r>
+        <w:rPr>
+          <w:rFonts w:ascii="Times New Roman" w:eastAsia="Times New Roman" w:hAnsi="Times New Roman" w:cs="Times New Roman"/>
+          <w:sz w:val="24"/>
+          <w:szCs w:val="24"/>
+          <w:lang w:eastAsia="es-ES"/>
+        </w:rPr>
+        <w:t>Requisitos de acceso</w:t>
+      </w:r>
+    </w:p>
+    <w:p>
+      <w:pPr>
+        <w:spacing w:before="100" w:beforeAutospacing="1" w:after="0" w:line="240" w:lineRule="auto"/>
+        <w:rPr>
+          <w:rFonts w:ascii="Times New Roman" w:eastAsia="Times New Roman" w:hAnsi="Times New Roman" w:cs="Times New Roman"/>
+          <w:sz w:val="24"/>
+          <w:szCs w:val="24"/>
+          <w:lang w:eastAsia="es-ES"/>
+        </w:rPr>
+      </w:pPr>
+    </w:p>
+    <w:p>
+      <w:pPr>
+        <w:spacing w:before="100" w:beforeAutospacing="1" w:after="0" w:line="240" w:lineRule="auto"/>
+        <w:rPr>
+          <w:rFonts w:ascii="Times New Roman" w:eastAsia="Times New Roman" w:hAnsi="Times New Roman" w:cs="Times New Roman"/>
+          <w:sz w:val="24"/>
+          <w:szCs w:val="24"/>
+          <w:lang w:eastAsia="es-ES"/>
+        </w:rPr>
+      </w:pPr>
+      <w:r>
+        <w:rPr>
+          <w:rFonts w:ascii="Times New Roman" w:eastAsia="Times New Roman" w:hAnsi="Times New Roman" w:cs="Times New Roman"/>
+          <w:sz w:val="24"/>
+          <w:szCs w:val="24"/>
+          <w:lang w:eastAsia="es-ES"/>
+        </w:rPr>
+        <w:t xml:space="preserve">El usuario precisará un móvil </w:t>
+      </w:r>
+      <w:proofErr w:type="spellStart"/>
+      <w:r>
+        <w:rPr>
+          <w:rFonts w:ascii="Times New Roman" w:eastAsia="Times New Roman" w:hAnsi="Times New Roman" w:cs="Times New Roman"/>
+          <w:sz w:val="24"/>
+          <w:szCs w:val="24"/>
+          <w:lang w:eastAsia="es-ES"/>
+        </w:rPr>
+        <w:t>android</w:t>
+      </w:r>
+      <w:proofErr w:type="spellEnd"/>
+      <w:r>
+        <w:rPr>
+          <w:rFonts w:ascii="Times New Roman" w:eastAsia="Times New Roman" w:hAnsi="Times New Roman" w:cs="Times New Roman"/>
+          <w:sz w:val="24"/>
+          <w:szCs w:val="24"/>
+          <w:lang w:eastAsia="es-ES"/>
+        </w:rPr>
+        <w:t xml:space="preserve"> y una cuenta para poder acceder.</w:t>
+      </w:r>
+    </w:p>
+    <w:p>
+      <w:pPr>
+        <w:spacing w:before="100" w:beforeAutospacing="1" w:after="0" w:line="240" w:lineRule="auto"/>
+        <w:rPr>
+          <w:rFonts w:ascii="Times New Roman" w:eastAsia="Times New Roman" w:hAnsi="Times New Roman" w:cs="Times New Roman"/>
+          <w:sz w:val="24"/>
+          <w:szCs w:val="24"/>
+          <w:lang w:eastAsia="es-ES"/>
+        </w:rPr>
+      </w:pPr>
+      <w:r>
+        <w:rPr>
+          <w:rFonts w:ascii="Times New Roman" w:eastAsia="Times New Roman" w:hAnsi="Times New Roman" w:cs="Times New Roman"/>
+          <w:sz w:val="24"/>
+          <w:szCs w:val="24"/>
+          <w:lang w:eastAsia="es-ES"/>
+        </w:rPr>
+        <w:t>El registro solicita obligatoriamente:</w:t>
+      </w:r>
+      <w:r>
+        <w:rPr>
+          <w:rFonts w:ascii="Lucida Console" w:eastAsia="Times New Roman" w:hAnsi="Lucida Console" w:cs="Times New Roman"/>
+          <w:color w:val="000000"/>
+          <w:sz w:val="20"/>
+          <w:szCs w:val="20"/>
+          <w:lang w:eastAsia="es-ES"/>
+        </w:rPr>
+        <w:t xml:space="preserve"> </w:t>
+      </w:r>
+    </w:p>
+    <w:p>
+      <w:pPr>
+        <w:numPr>
+          <w:ilvl w:val="0"/>
+          <w:numId w:val="18"/>
+        </w:numPr>
+        <w:spacing w:before="100" w:beforeAutospacing="1" w:after="0" w:line="240" w:lineRule="auto"/>
+        <w:rPr>
+          <w:rFonts w:ascii="Times New Roman" w:eastAsia="Times New Roman" w:hAnsi="Times New Roman" w:cs="Times New Roman"/>
+          <w:sz w:val="24"/>
+          <w:szCs w:val="24"/>
+          <w:lang w:eastAsia="es-ES"/>
+        </w:rPr>
+      </w:pPr>
+      <w:r>
+        <w:rPr>
+          <w:rFonts w:ascii="Liberation Serif" w:eastAsia="Times New Roman" w:hAnsi="Liberation Serif" w:cs="Liberation Serif"/>
+          <w:color w:val="000000"/>
+          <w:sz w:val="24"/>
+          <w:szCs w:val="24"/>
+          <w:lang w:eastAsia="es-ES"/>
+        </w:rPr>
+        <w:t>Email</w:t>
+      </w:r>
+    </w:p>
+    <w:p>
+      <w:pPr>
+        <w:numPr>
+          <w:ilvl w:val="0"/>
+          <w:numId w:val="18"/>
+        </w:numPr>
+        <w:spacing w:before="100" w:beforeAutospacing="1" w:after="0" w:line="240" w:lineRule="auto"/>
+        <w:rPr>
+          <w:rFonts w:ascii="Times New Roman" w:eastAsia="Times New Roman" w:hAnsi="Times New Roman" w:cs="Times New Roman"/>
+          <w:sz w:val="24"/>
+          <w:szCs w:val="24"/>
+          <w:lang w:eastAsia="es-ES"/>
+        </w:rPr>
+      </w:pPr>
+      <w:r>
+        <w:rPr>
+          <w:rFonts w:ascii="Liberation Serif" w:eastAsia="Times New Roman" w:hAnsi="Liberation Serif" w:cs="Liberation Serif"/>
+          <w:color w:val="000000"/>
+          <w:sz w:val="24"/>
+          <w:szCs w:val="24"/>
+          <w:lang w:eastAsia="es-ES"/>
+        </w:rPr>
+        <w:t>Contraseña (mínimo 8 caracteres)</w:t>
+      </w:r>
+    </w:p>
+    <w:p>
+      <w:pPr>
+        <w:numPr>
+          <w:ilvl w:val="0"/>
+          <w:numId w:val="18"/>
+        </w:numPr>
+        <w:spacing w:before="100" w:beforeAutospacing="1" w:after="0" w:line="240" w:lineRule="auto"/>
+        <w:rPr>
+          <w:rFonts w:ascii="Times New Roman" w:eastAsia="Times New Roman" w:hAnsi="Times New Roman" w:cs="Times New Roman"/>
+          <w:sz w:val="24"/>
+          <w:szCs w:val="24"/>
+          <w:lang w:eastAsia="es-ES"/>
+        </w:rPr>
+      </w:pPr>
+      <w:r>
+        <w:rPr>
+          <w:rFonts w:ascii="Liberation Serif" w:eastAsia="Times New Roman" w:hAnsi="Liberation Serif" w:cs="Liberation Serif"/>
+          <w:color w:val="000000"/>
+          <w:sz w:val="24"/>
+          <w:szCs w:val="24"/>
+          <w:lang w:eastAsia="es-ES"/>
+        </w:rPr>
+        <w:t>Nombre</w:t>
+      </w:r>
+    </w:p>
+    <w:p>
+      <w:pPr>
+        <w:numPr>
+          <w:ilvl w:val="0"/>
+          <w:numId w:val="18"/>
+        </w:numPr>
+        <w:spacing w:before="100" w:beforeAutospacing="1" w:after="0" w:line="240" w:lineRule="auto"/>
+        <w:rPr>
+          <w:rFonts w:ascii="Times New Roman" w:eastAsia="Times New Roman" w:hAnsi="Times New Roman" w:cs="Times New Roman"/>
+          <w:sz w:val="24"/>
+          <w:szCs w:val="24"/>
+          <w:lang w:eastAsia="es-ES"/>
+        </w:rPr>
+      </w:pPr>
+      <w:r>
+        <w:rPr>
+          <w:rFonts w:ascii="Liberation Serif" w:eastAsia="Times New Roman" w:hAnsi="Liberation Serif" w:cs="Liberation Serif"/>
+          <w:color w:val="000000"/>
+          <w:sz w:val="24"/>
+          <w:szCs w:val="24"/>
+          <w:lang w:eastAsia="es-ES"/>
+        </w:rPr>
+        <w:t>Apellidos</w:t>
+      </w:r>
+    </w:p>
+    <w:p>
+      <w:pPr>
+        <w:numPr>
+          <w:ilvl w:val="0"/>
+          <w:numId w:val="18"/>
+        </w:numPr>
+        <w:spacing w:before="100" w:beforeAutospacing="1" w:after="0" w:line="240" w:lineRule="auto"/>
+        <w:rPr>
+          <w:rFonts w:ascii="Times New Roman" w:eastAsia="Times New Roman" w:hAnsi="Times New Roman" w:cs="Times New Roman"/>
+          <w:sz w:val="24"/>
+          <w:szCs w:val="24"/>
+          <w:lang w:eastAsia="es-ES"/>
+        </w:rPr>
+      </w:pPr>
+      <w:r>
+        <w:rPr>
+          <w:rFonts w:ascii="Liberation Serif" w:eastAsia="Times New Roman" w:hAnsi="Liberation Serif" w:cs="Liberation Serif"/>
+          <w:color w:val="000000"/>
+          <w:sz w:val="24"/>
+          <w:szCs w:val="24"/>
+          <w:lang w:eastAsia="es-ES"/>
+        </w:rPr>
+        <w:t xml:space="preserve">DNI/NIF (formato: 8 números + letra, </w:t>
+      </w:r>
+      <w:proofErr w:type="spellStart"/>
+      <w:r>
+        <w:rPr>
+          <w:rFonts w:ascii="Liberation Serif" w:eastAsia="Times New Roman" w:hAnsi="Liberation Serif" w:cs="Liberation Serif"/>
+          <w:color w:val="000000"/>
+          <w:sz w:val="24"/>
+          <w:szCs w:val="24"/>
+          <w:lang w:eastAsia="es-ES"/>
+        </w:rPr>
+        <w:t>ej</w:t>
+      </w:r>
+      <w:proofErr w:type="spellEnd"/>
+      <w:r>
+        <w:rPr>
+          <w:rFonts w:ascii="Liberation Serif" w:eastAsia="Times New Roman" w:hAnsi="Liberation Serif" w:cs="Liberation Serif"/>
+          <w:color w:val="000000"/>
+          <w:sz w:val="24"/>
+          <w:szCs w:val="24"/>
+          <w:lang w:eastAsia="es-ES"/>
+        </w:rPr>
+        <w:t>: 12345678A)</w:t>
+      </w:r>
+    </w:p>
+    <w:p>
+      <w:pPr>
+        <w:numPr>
+          <w:ilvl w:val="0"/>
+          <w:numId w:val="18"/>
+        </w:numPr>
+        <w:spacing w:before="100" w:beforeAutospacing="1" w:after="0" w:line="240" w:lineRule="auto"/>
+        <w:rPr>
+          <w:rFonts w:ascii="Times New Roman" w:eastAsia="Times New Roman" w:hAnsi="Times New Roman" w:cs="Times New Roman"/>
+          <w:sz w:val="24"/>
+          <w:szCs w:val="24"/>
+          <w:lang w:eastAsia="es-ES"/>
+        </w:rPr>
+      </w:pPr>
+      <w:r>
+        <w:rPr>
+          <w:rFonts w:ascii="Liberation Serif" w:eastAsia="Times New Roman" w:hAnsi="Liberation Serif" w:cs="Liberation Serif"/>
+          <w:color w:val="000000"/>
+          <w:sz w:val="24"/>
+          <w:szCs w:val="24"/>
+          <w:lang w:eastAsia="es-ES"/>
+        </w:rPr>
+        <w:t>Teléfono (9 números)</w:t>
+      </w:r>
+    </w:p>
+    <w:p>
+      <w:pPr>
+        <w:numPr>
+          <w:ilvl w:val="0"/>
+          <w:numId w:val="18"/>
+        </w:numPr>
+        <w:spacing w:before="100" w:beforeAutospacing="1" w:after="0" w:line="240" w:lineRule="auto"/>
+        <w:rPr>
+          <w:rFonts w:ascii="Times New Roman" w:eastAsia="Times New Roman" w:hAnsi="Times New Roman" w:cs="Times New Roman"/>
+          <w:sz w:val="24"/>
+          <w:szCs w:val="24"/>
+          <w:lang w:eastAsia="es-ES"/>
+        </w:rPr>
+      </w:pPr>
+      <w:r>
+        <w:rPr>
+          <w:rFonts w:ascii="Liberation Serif" w:eastAsia="Times New Roman" w:hAnsi="Liberation Serif" w:cs="Liberation Serif"/>
+          <w:color w:val="000000"/>
+          <w:sz w:val="24"/>
+          <w:szCs w:val="24"/>
+          <w:lang w:eastAsia="es-ES"/>
+        </w:rPr>
+        <w:t>Dirección</w:t>
+      </w:r>
+    </w:p>
+    <w:p>
+      <w:pPr>
+        <w:numPr>
+          <w:ilvl w:val="0"/>
+          <w:numId w:val="18"/>
+        </w:numPr>
+        <w:spacing w:before="100" w:beforeAutospacing="1" w:after="0" w:line="240" w:lineRule="auto"/>
+        <w:rPr>
+          <w:rFonts w:ascii="Times New Roman" w:eastAsia="Times New Roman" w:hAnsi="Times New Roman" w:cs="Times New Roman"/>
+          <w:sz w:val="24"/>
+          <w:szCs w:val="24"/>
+          <w:lang w:eastAsia="es-ES"/>
+        </w:rPr>
+      </w:pPr>
+      <w:r>
+        <w:rPr>
+          <w:rFonts w:ascii="Liberation Serif" w:eastAsia="Times New Roman" w:hAnsi="Liberation Serif" w:cs="Liberation Serif"/>
+          <w:color w:val="000000"/>
+          <w:sz w:val="24"/>
+          <w:szCs w:val="24"/>
+          <w:lang w:eastAsia="es-ES"/>
+        </w:rPr>
+        <w:t>Código Postal (5 números)</w:t>
+      </w:r>
+    </w:p>
+    <w:p>
+      <w:pPr>
+        <w:numPr>
+          <w:ilvl w:val="0"/>
+          <w:numId w:val="18"/>
+        </w:numPr>
+        <w:spacing w:before="100" w:beforeAutospacing="1" w:after="0" w:line="240" w:lineRule="auto"/>
+        <w:rPr>
+          <w:rFonts w:ascii="Times New Roman" w:eastAsia="Times New Roman" w:hAnsi="Times New Roman" w:cs="Times New Roman"/>
+          <w:sz w:val="24"/>
+          <w:szCs w:val="24"/>
+          <w:lang w:eastAsia="es-ES"/>
+        </w:rPr>
+      </w:pPr>
+      <w:r>
+        <w:rPr>
+          <w:rFonts w:ascii="Liberation Serif" w:eastAsia="Times New Roman" w:hAnsi="Liberation Serif" w:cs="Liberation Serif"/>
+          <w:color w:val="000000"/>
+          <w:sz w:val="24"/>
+          <w:szCs w:val="24"/>
+          <w:lang w:eastAsia="es-ES"/>
+        </w:rPr>
+        <w:t>Localidad</w:t>
+      </w:r>
+    </w:p>
+    <w:p>
+      <w:pPr>
+        <w:spacing w:before="100" w:beforeAutospacing="1" w:after="0" w:line="240" w:lineRule="auto"/>
+        <w:rPr>
+          <w:rFonts w:ascii="Times New Roman" w:eastAsia="Times New Roman" w:hAnsi="Times New Roman" w:cs="Times New Roman"/>
+          <w:sz w:val="24"/>
+          <w:szCs w:val="24"/>
+          <w:lang w:eastAsia="es-ES"/>
+        </w:rPr>
+      </w:pPr>
+    </w:p>
+    <w:p>
+      <w:pPr>
+        <w:spacing w:before="100" w:beforeAutospacing="1" w:after="0" w:line="240" w:lineRule="auto"/>
+        <w:rPr>
+          <w:rFonts w:ascii="Times New Roman" w:eastAsia="Times New Roman" w:hAnsi="Times New Roman" w:cs="Times New Roman"/>
+          <w:sz w:val="24"/>
+          <w:szCs w:val="24"/>
+          <w:lang w:eastAsia="es-ES"/>
+        </w:rPr>
+      </w:pPr>
+      <w:r>
+        <w:rPr>
+          <w:rFonts w:ascii="Liberation Serif" w:eastAsia="Times New Roman" w:hAnsi="Liberation Serif" w:cs="Liberation Serif"/>
+          <w:sz w:val="24"/>
+          <w:szCs w:val="24"/>
+          <w:lang w:eastAsia="es-ES"/>
+        </w:rPr>
+        <w:t xml:space="preserve">El </w:t>
+      </w:r>
+      <w:proofErr w:type="spellStart"/>
+      <w:r>
+        <w:rPr>
+          <w:rFonts w:ascii="Liberation Serif" w:eastAsia="Times New Roman" w:hAnsi="Liberation Serif" w:cs="Liberation Serif"/>
+          <w:sz w:val="24"/>
+          <w:szCs w:val="24"/>
+          <w:lang w:eastAsia="es-ES"/>
+        </w:rPr>
+        <w:t>login</w:t>
+      </w:r>
+      <w:proofErr w:type="spellEnd"/>
+      <w:r>
+        <w:rPr>
+          <w:rFonts w:ascii="Liberation Serif" w:eastAsia="Times New Roman" w:hAnsi="Liberation Serif" w:cs="Liberation Serif"/>
+          <w:sz w:val="24"/>
+          <w:szCs w:val="24"/>
+          <w:lang w:eastAsia="es-ES"/>
+        </w:rPr>
+        <w:t xml:space="preserve"> se realizará mediante:</w:t>
+      </w:r>
+    </w:p>
+    <w:p>
+      <w:pPr>
+        <w:numPr>
+          <w:ilvl w:val="0"/>
+          <w:numId w:val="19"/>
+        </w:numPr>
+        <w:spacing w:before="100" w:beforeAutospacing="1" w:after="0" w:line="240" w:lineRule="auto"/>
+        <w:rPr>
+          <w:rFonts w:ascii="Times New Roman" w:eastAsia="Times New Roman" w:hAnsi="Times New Roman" w:cs="Times New Roman"/>
+          <w:sz w:val="24"/>
+          <w:szCs w:val="24"/>
+          <w:lang w:eastAsia="es-ES"/>
+        </w:rPr>
+      </w:pPr>
+      <w:r>
+        <w:rPr>
+          <w:rFonts w:ascii="Liberation Serif" w:eastAsia="Times New Roman" w:hAnsi="Liberation Serif" w:cs="Liberation Serif"/>
+          <w:sz w:val="24"/>
+          <w:szCs w:val="24"/>
+          <w:lang w:eastAsia="es-ES"/>
+        </w:rPr>
+        <w:t>Email</w:t>
+      </w:r>
+    </w:p>
+    <w:p>
+      <w:pPr>
+        <w:numPr>
+          <w:ilvl w:val="0"/>
+          <w:numId w:val="19"/>
+        </w:numPr>
+        <w:spacing w:before="100" w:beforeAutospacing="1" w:after="0" w:line="240" w:lineRule="auto"/>
+        <w:rPr>
+          <w:rFonts w:ascii="Times New Roman" w:eastAsia="Times New Roman" w:hAnsi="Times New Roman" w:cs="Times New Roman"/>
+          <w:sz w:val="24"/>
+          <w:szCs w:val="24"/>
+          <w:lang w:eastAsia="es-ES"/>
+        </w:rPr>
+      </w:pPr>
+      <w:r>
+        <w:rPr>
+          <w:rFonts w:ascii="Liberation Serif" w:eastAsia="Times New Roman" w:hAnsi="Liberation Serif" w:cs="Liberation Serif"/>
+          <w:sz w:val="24"/>
+          <w:szCs w:val="24"/>
+          <w:lang w:eastAsia="es-ES"/>
+        </w:rPr>
+        <w:t>Contraseña</w:t>
+      </w:r>
+    </w:p>
+    <w:p>
+      <w:pPr>
+        <w:spacing w:before="100" w:beforeAutospacing="1" w:after="0" w:line="240" w:lineRule="auto"/>
+        <w:rPr>
+          <w:rFonts w:ascii="Times New Roman" w:eastAsia="Times New Roman" w:hAnsi="Times New Roman" w:cs="Times New Roman"/>
+          <w:sz w:val="24"/>
+          <w:szCs w:val="24"/>
+          <w:lang w:eastAsia="es-ES"/>
+        </w:rPr>
+      </w:pPr>
+    </w:p>
+    <w:p>
+      <w:pPr>
+        <w:spacing w:before="100" w:beforeAutospacing="1" w:after="0" w:line="240" w:lineRule="auto"/>
+        <w:rPr>
+          <w:rFonts w:ascii="Times New Roman" w:eastAsia="Times New Roman" w:hAnsi="Times New Roman" w:cs="Times New Roman"/>
+          <w:sz w:val="24"/>
+          <w:szCs w:val="24"/>
+          <w:lang w:eastAsia="es-ES"/>
+        </w:rPr>
+      </w:pPr>
+    </w:p>
+    <w:p>
+      <w:pPr>
+        <w:spacing w:before="100" w:beforeAutospacing="1" w:after="0" w:line="240" w:lineRule="auto"/>
+        <w:rPr>
+          <w:rFonts w:ascii="Times New Roman" w:eastAsia="Times New Roman" w:hAnsi="Times New Roman" w:cs="Times New Roman"/>
+          <w:sz w:val="24"/>
+          <w:szCs w:val="24"/>
+          <w:lang w:eastAsia="es-ES"/>
+        </w:rPr>
+      </w:pPr>
+      <w:r>
+        <w:rPr>
+          <w:rFonts w:ascii="Times New Roman" w:eastAsia="Times New Roman" w:hAnsi="Times New Roman" w:cs="Times New Roman"/>
+          <w:sz w:val="24"/>
+          <w:szCs w:val="24"/>
+          <w:lang w:eastAsia="es-ES"/>
+        </w:rPr>
+        <w:t xml:space="preserve">Iniciamos la navegación en la pantalla de </w:t>
+      </w:r>
+      <w:proofErr w:type="spellStart"/>
+      <w:r>
+        <w:rPr>
+          <w:rFonts w:ascii="Times New Roman" w:eastAsia="Times New Roman" w:hAnsi="Times New Roman" w:cs="Times New Roman"/>
+          <w:sz w:val="24"/>
+          <w:szCs w:val="24"/>
+          <w:lang w:eastAsia="es-ES"/>
+        </w:rPr>
+        <w:t>login</w:t>
+      </w:r>
+      <w:proofErr w:type="spellEnd"/>
+      <w:r>
+        <w:rPr>
+          <w:rFonts w:ascii="Times New Roman" w:eastAsia="Times New Roman" w:hAnsi="Times New Roman" w:cs="Times New Roman"/>
+          <w:sz w:val="24"/>
+          <w:szCs w:val="24"/>
+          <w:lang w:eastAsia="es-ES"/>
+        </w:rPr>
+        <w:t xml:space="preserve">. En ella el usuario puede ver un campo para introducir el email, otro para la contraseña y un texto </w:t>
+      </w:r>
+      <w:proofErr w:type="spellStart"/>
+      <w:r>
+        <w:rPr>
+          <w:rFonts w:ascii="Times New Roman" w:eastAsia="Times New Roman" w:hAnsi="Times New Roman" w:cs="Times New Roman"/>
+          <w:sz w:val="24"/>
+          <w:szCs w:val="24"/>
+          <w:lang w:eastAsia="es-ES"/>
+        </w:rPr>
+        <w:t>clicable</w:t>
+      </w:r>
+      <w:proofErr w:type="spellEnd"/>
+      <w:r>
+        <w:rPr>
+          <w:rFonts w:ascii="Times New Roman" w:eastAsia="Times New Roman" w:hAnsi="Times New Roman" w:cs="Times New Roman"/>
+          <w:sz w:val="24"/>
+          <w:szCs w:val="24"/>
+          <w:lang w:eastAsia="es-ES"/>
+        </w:rPr>
+        <w:t xml:space="preserve"> para registrarse.</w:t>
+      </w:r>
+      <w:r>
+        <w:rPr>
+          <w:rFonts w:ascii="Times New Roman" w:eastAsia="Times New Roman" w:hAnsi="Times New Roman" w:cs="Times New Roman"/>
+          <w:sz w:val="24"/>
+          <w:szCs w:val="24"/>
+          <w:lang w:eastAsia="es-ES"/>
+        </w:rPr>
+        <w:t xml:space="preserve"> Sin embargo no será posible crear una cuenta de técnico desde el botón de “Regístrese”. Si es usted técnico y no posee una cuenta y contraseña de empresa, póngase en contacto con el administrador.</w:t>
+      </w:r>
+    </w:p>
+    <w:p>
+      <w:pPr>
+        <w:spacing w:before="100" w:beforeAutospacing="1" w:after="0" w:line="240" w:lineRule="auto"/>
+        <w:rPr>
+          <w:rFonts w:ascii="Times New Roman" w:eastAsia="Times New Roman" w:hAnsi="Times New Roman" w:cs="Times New Roman"/>
+          <w:sz w:val="24"/>
+          <w:szCs w:val="24"/>
+          <w:lang w:eastAsia="es-ES"/>
+        </w:rPr>
+      </w:pPr>
+    </w:p>
+    <w:p>
+      <w:pPr>
+        <w:spacing w:before="100" w:beforeAutospacing="1" w:after="0" w:line="240" w:lineRule="auto"/>
+        <w:rPr>
+          <w:rFonts w:ascii="Times New Roman" w:eastAsia="Times New Roman" w:hAnsi="Times New Roman" w:cs="Times New Roman"/>
+          <w:sz w:val="24"/>
+          <w:szCs w:val="24"/>
+          <w:lang w:eastAsia="es-ES"/>
+        </w:rPr>
+      </w:pPr>
+    </w:p>
+    <w:p>
+      <w:pPr>
+        <w:spacing w:before="100" w:beforeAutospacing="1" w:after="0" w:line="240" w:lineRule="auto"/>
+        <w:rPr>
+          <w:rFonts w:ascii="Times New Roman" w:eastAsia="Times New Roman" w:hAnsi="Times New Roman" w:cs="Times New Roman"/>
+          <w:sz w:val="24"/>
+          <w:szCs w:val="24"/>
+          <w:lang w:eastAsia="es-ES"/>
+        </w:rPr>
+      </w:pPr>
+    </w:p>
+    <w:p>
+      <w:pPr>
+        <w:pStyle w:val="Textomemoria"/>
+      </w:pPr>
+    </w:p>
+    <w:p>
+      <w:pPr>
+        <w:pStyle w:val="Textomemoria"/>
+      </w:pPr>
+    </w:p>
+    <w:p>
+      <w:pPr>
+        <w:pStyle w:val="Textomemoria"/>
+      </w:pPr>
+    </w:p>
+    <w:p>
+      <w:pPr>
+        <w:pStyle w:val="NormalWeb"/>
+        <w:spacing w:after="0" w:line="360" w:lineRule="auto"/>
+        <w:ind w:left="708"/>
+        <w:jc w:val="both"/>
+        <w:rPr>
+          <w:rFonts w:ascii="Verdana" w:hAnsi="Verdana" w:cstheme="minorBidi"/>
+          <w:sz w:val="22"/>
+          <w:szCs w:val="22"/>
+        </w:rPr>
+      </w:pPr>
+    </w:p>
+    <w:p>
+      <w:pPr>
+        <w:pStyle w:val="Prrafodelista"/>
+        <w:spacing w:after="0" w:line="360" w:lineRule="auto"/>
+        <w:ind w:left="360"/>
+        <w:jc w:val="both"/>
+        <w:rPr>
+          <w:rFonts w:ascii="Times New Roman" w:eastAsia="Times New Roman" w:hAnsi="Times New Roman" w:cs="Times New Roman"/>
+          <w:sz w:val="24"/>
+          <w:szCs w:val="24"/>
+          <w:lang w:eastAsia="es-ES"/>
+        </w:rPr>
+      </w:pPr>
+    </w:p>
+    <w:p>
+      <w:pPr>
+        <w:pStyle w:val="Estilo1"/>
+        <w:numPr>
+          <w:ilvl w:val="0"/>
+          <w:numId w:val="5"/>
+        </w:numPr>
+        <w:spacing w:before="0" w:line="360" w:lineRule="auto"/>
+        <w:jc w:val="both"/>
+        <w:rPr>
+          <w:color w:val="EE0000"/>
+        </w:rPr>
+      </w:pPr>
+      <w:r>
+        <w:rPr>
+          <w:color w:val="EE0000"/>
+        </w:rPr>
+        <w:t>Logotipo y diseño de la aplicación</w:t>
+      </w:r>
+    </w:p>
+    <w:p>
+      <w:pPr>
+        <w:pStyle w:val="Estilo1"/>
+        <w:spacing w:before="0" w:line="360" w:lineRule="auto"/>
+        <w:ind w:left="360"/>
+        <w:jc w:val="both"/>
+        <w:rPr>
+          <w:color w:val="EE0000"/>
+        </w:rPr>
+      </w:pPr>
+      <w:r>
+        <w:rPr>
+          <w:color w:val="EE0000"/>
+        </w:rPr>
+        <w:t>8.1 Diseño del logotipo</w:t>
+      </w:r>
+    </w:p>
+    <w:p>
+      <w:pPr>
+        <w:pStyle w:val="Textomemoria"/>
+      </w:pPr>
+      <w:r>
+        <w:tab/>
+        <w:t>El equipo se decantó por un diseño llamativo que transmitiese minuciosidad, profesionalidad y energía.</w:t>
+      </w:r>
+    </w:p>
+    <w:p>
+      <w:pPr>
+        <w:pStyle w:val="Textomemoria"/>
+      </w:pPr>
+      <w:r>
+        <w:rPr>
+          <w:noProof/>
+        </w:rPr>
+        <w:drawing>
+          <wp:inline distT="0" distB="0" distL="0" distR="0" wp14:anchorId="22127795" wp14:editId="6FF95166">
+            <wp:extent cx="4305300" cy="4305300"/>
+            <wp:effectExtent l="0" t="0" r="0" b="0"/>
+            <wp:docPr id="1786034540" name="Picture 2" descr="Logotipo&#10;&#10;El contenido generado por IA puede ser incorrecto."/>
+            <wp:cNvGraphicFramePr>
+              <a:graphicFrameLocks xmlns:a="http://schemas.openxmlformats.org/drawingml/2006/main" noChangeAspect="1"/>
+            </wp:cNvGraphicFramePr>
+            <a:graphic xmlns:a="http://schemas.openxmlformats.org/drawingml/2006/main">
+              <a:graphicData uri="http://schemas.openxmlformats.org/drawingml/2006/picture">
+                <pic:pic xmlns:pic="http://schemas.openxmlformats.org/drawingml/2006/picture">
+                  <pic:nvPicPr>
+                    <pic:cNvPr id="1786034540" name="Picture 2" descr="Logotipo&#10;&#10;El contenido generado por IA puede ser incorrecto."/>
+                    <pic:cNvPicPr>
+                      <a:picLocks noChangeAspect="1" noChangeArrowheads="1"/>
+                    </pic:cNvPicPr>
+                  </pic:nvPicPr>
+                  <pic:blipFill>
+                    <a:blip r:embed="rId9" cstate="print">
+                      <a:extLst>
+                        <a:ext uri="{28A0092B-C50C-407E-A947-70E740481C1C}">
+                          <a14:useLocalDpi xmlns:a14="http://schemas.microsoft.com/office/drawing/2010/main" val="0"/>
+                        </a:ext>
+                      </a:extLst>
+                    </a:blip>
+                    <a:srcRect/>
+                    <a:stretch>
+                      <a:fillRect/>
+                    </a:stretch>
+                  </pic:blipFill>
+                  <pic:spPr bwMode="auto">
+                    <a:xfrm>
+                      <a:off x="0" y="0"/>
+                      <a:ext cx="4305300" cy="4305300"/>
+                    </a:xfrm>
+                    <a:prstGeom prst="rect">
+                      <a:avLst/>
+                    </a:prstGeom>
+                    <a:noFill/>
+                    <a:ln>
+                      <a:noFill/>
+                    </a:ln>
+                  </pic:spPr>
+                </pic:pic>
+              </a:graphicData>
+            </a:graphic>
+          </wp:inline>
+        </w:drawing>
+      </w:r>
+    </w:p>
+    <w:p>
+      <w:pPr>
+        <w:pStyle w:val="Estilo1"/>
+        <w:spacing w:before="0" w:line="360" w:lineRule="auto"/>
+        <w:ind w:left="360"/>
+        <w:jc w:val="both"/>
+        <w:rPr>
+          <w:color w:val="EE0000"/>
+        </w:rPr>
+      </w:pPr>
+      <w:r>
+        <w:rPr>
+          <w:color w:val="EE0000"/>
+        </w:rPr>
+        <w:t>8.2 Interfaces de la aplicación</w:t>
+      </w:r>
+    </w:p>
+    <w:p>
+      <w:pPr>
+        <w:pStyle w:val="Estilo1"/>
+        <w:spacing w:before="0" w:line="360" w:lineRule="auto"/>
+        <w:ind w:left="360"/>
+        <w:jc w:val="both"/>
+        <w:rPr>
+          <w:color w:val="EE0000"/>
+        </w:rPr>
+      </w:pPr>
+    </w:p>
+    <w:p>
+      <w:pPr>
+        <w:pStyle w:val="Estilo1"/>
+        <w:spacing w:before="0" w:line="360" w:lineRule="auto"/>
+        <w:ind w:left="360"/>
+        <w:jc w:val="both"/>
+        <w:rPr>
+          <w:color w:val="EE0000"/>
+          <w:u w:val="single"/>
+        </w:rPr>
+      </w:pPr>
+    </w:p>
+    <w:p>
+      <w:pPr>
+        <w:pStyle w:val="Estilo1"/>
+        <w:spacing w:before="0" w:line="360" w:lineRule="auto"/>
+        <w:ind w:left="360"/>
+        <w:jc w:val="both"/>
+        <w:rPr>
+          <w:color w:val="EE0000"/>
+        </w:rPr>
+      </w:pPr>
+    </w:p>
+    <w:p>
+      <w:pPr>
+        <w:pStyle w:val="Estilo1"/>
+        <w:numPr>
+          <w:ilvl w:val="0"/>
+          <w:numId w:val="5"/>
+        </w:numPr>
+        <w:spacing w:before="0" w:line="360" w:lineRule="auto"/>
+        <w:jc w:val="both"/>
+        <w:rPr>
           <w:color w:val="EE0000"/>
         </w:rPr>
       </w:pPr>
@@ -5424,10 +7751,10 @@
         </w:rPr>
         <w:t xml:space="preserve"> Google. </w:t>
       </w:r>
-      <w:hyperlink r:id="rId16" w:history="1">
+      <w:hyperlink r:id="rId17" w:history="1">
         <w:r>
           <w:rPr>
-            <w:rStyle w:val="Hyperlink"/>
+            <w:rStyle w:val="Hipervnculo"/>
             <w:lang w:val="en-US"/>
           </w:rPr>
           <w:t>https://developer.android.com/guide/navigation/navcontroller?hl=es-419</w:t>
@@ -5483,10 +7810,10 @@
         </w:rPr>
         <w:t xml:space="preserve">]. YouTube. </w:t>
       </w:r>
-      <w:hyperlink r:id="rId17" w:history="1">
+      <w:hyperlink r:id="rId18" w:history="1">
         <w:r>
           <w:rPr>
-            <w:rStyle w:val="Hyperlink"/>
+            <w:rStyle w:val="Hipervnculo"/>
             <w:lang w:val="en-US"/>
           </w:rPr>
           <w:t>https://www.youtube.com/watch?v=flL3NcVNuJo</w:t>
@@ -5590,10 +7917,10 @@
         </w:rPr>
         <w:t xml:space="preserve">YouTube. </w:t>
       </w:r>
-      <w:hyperlink r:id="rId18" w:history="1">
+      <w:hyperlink r:id="rId19" w:history="1">
         <w:r>
           <w:rPr>
-            <w:rStyle w:val="Hyperlink"/>
+            <w:rStyle w:val="Hipervnculo"/>
             <w:lang w:val="en-US"/>
           </w:rPr>
           <w:t>https://www.youtube.com/watch?v=eNuaMn4ukdo</w:t>
@@ -5619,7 +7946,6 @@
         <w:rPr>
           <w:lang w:val="en-US"/>
         </w:rPr>
-        <w:lastRenderedPageBreak/>
         <w:t xml:space="preserve">Android Developers. (s. f.). </w:t>
       </w:r>
       <w:r>
@@ -5636,10 +7962,10 @@
         </w:rPr>
         <w:t xml:space="preserve">. Google. </w:t>
       </w:r>
-      <w:hyperlink r:id="rId19" w:history="1">
+      <w:hyperlink r:id="rId20" w:history="1">
         <w:r>
           <w:rPr>
-            <w:rStyle w:val="Hyperlink"/>
+            <w:rStyle w:val="Hipervnculo"/>
             <w:lang w:val="en-US"/>
           </w:rPr>
           <w:t>https://developer.android.com/develop/ui/compose/state?hl=es-419</w:t>
@@ -5681,10 +8007,10 @@
         </w:rPr>
         <w:t xml:space="preserve">Google. </w:t>
       </w:r>
-      <w:hyperlink r:id="rId20" w:history="1">
+      <w:hyperlink r:id="rId21" w:history="1">
         <w:r>
           <w:rPr>
-            <w:rStyle w:val="Hyperlink"/>
+            <w:rStyle w:val="Hipervnculo"/>
             <w:lang w:val="en-US"/>
           </w:rPr>
           <w:t>https://developer.android.com/develop/ui/compose/text/user-input?hl=es-419&amp;textfield=state-based</w:t>
@@ -5726,10 +8052,10 @@
         </w:rPr>
         <w:t xml:space="preserve">Google. </w:t>
       </w:r>
-      <w:hyperlink r:id="rId21" w:history="1">
+      <w:hyperlink r:id="rId22" w:history="1">
         <w:r>
           <w:rPr>
-            <w:rStyle w:val="Hyperlink"/>
+            <w:rStyle w:val="Hipervnculo"/>
             <w:lang w:val="en-US"/>
           </w:rPr>
           <w:t>https://firebase.google.com/docs/auth/android/password-auth</w:t>
@@ -5768,10 +8094,10 @@
         </w:rPr>
         <w:t xml:space="preserve">. Google. </w:t>
       </w:r>
-      <w:hyperlink r:id="rId22" w:history="1">
+      <w:hyperlink r:id="rId23" w:history="1">
         <w:r>
           <w:rPr>
-            <w:rStyle w:val="Hyperlink"/>
+            <w:rStyle w:val="Hipervnculo"/>
           </w:rPr>
           <w:t>https://firebase.google.com/docs/database?hl=es-419</w:t>
         </w:r>
@@ -5861,10 +8187,10 @@
         </w:rPr>
         <w:t xml:space="preserve">Google. </w:t>
       </w:r>
-      <w:hyperlink r:id="rId23" w:history="1">
+      <w:hyperlink r:id="rId24" w:history="1">
         <w:r>
           <w:rPr>
-            <w:rStyle w:val="Hyperlink"/>
+            <w:rStyle w:val="Hipervnculo"/>
             <w:lang w:val="en-US"/>
           </w:rPr>
           <w:t>https://firebase.google.com/docs/database/android/start?hl=es-419</w:t>
@@ -5910,10 +8236,10 @@
         </w:rPr>
         <w:t xml:space="preserve">Google. </w:t>
       </w:r>
-      <w:hyperlink r:id="rId24" w:history="1">
+      <w:hyperlink r:id="rId25" w:history="1">
         <w:r>
           <w:rPr>
-            <w:rStyle w:val="Hyperlink"/>
+            <w:rStyle w:val="Hipervnculo"/>
             <w:lang w:val="en-US"/>
           </w:rPr>
           <w:t>https://firebase.google.com/docs/database/android/read-and-write</w:t>
@@ -5986,10 +8312,10 @@
         </w:rPr>
         <w:t xml:space="preserve">). </w:t>
       </w:r>
-      <w:hyperlink r:id="rId25" w:history="1">
+      <w:hyperlink r:id="rId26" w:history="1">
         <w:r>
           <w:rPr>
-            <w:rStyle w:val="Hyperlink"/>
+            <w:rStyle w:val="Hipervnculo"/>
           </w:rPr>
           <w:t>https://www.tutorialesprogramacionya.com/composeya/detalleconcepto.php?punto=12&amp;codigo=12&amp;inicio=0</w:t>
         </w:r>
@@ -6045,7 +8371,7 @@
           <w:sdtContent>
             <w:p>
               <w:pPr>
-                <w:pStyle w:val="Heading1"/>
+                <w:pStyle w:val="Ttulo1"/>
               </w:pPr>
             </w:p>
             <w:p/>
@@ -6120,7 +8446,7 @@
       </w:pPr>
     </w:p>
     <w:sectPr>
-      <w:footerReference w:type="default" r:id="rId26"/>
+      <w:footerReference w:type="default" r:id="rId27"/>
       <w:pgSz w:w="11906" w:h="16838"/>
       <w:pgMar w:top="1418" w:right="1418" w:bottom="1418" w:left="1701" w:header="709" w:footer="709" w:gutter="0"/>
       <w:pgNumType w:start="1"/>
@@ -6160,7 +8486,7 @@
 <w:ftr xmlns:wpc="http://schemas.microsoft.com/office/word/2010/wordprocessingCanvas" xmlns:cx="http://schemas.microsoft.com/office/drawing/2014/chartex" xmlns:cx1="http://schemas.microsoft.com/office/drawing/2015/9/8/chartex" xmlns:cx2="http://schemas.microsoft.com/office/drawing/2015/10/21/chartex" xmlns:cx3="http://schemas.microsoft.com/office/drawing/2016/5/9/chartex" xmlns:cx4="http://schemas.microsoft.com/office/drawing/2016/5/10/chartex" xmlns:cx5="http://schemas.microsoft.com/office/drawing/2016/5/11/chartex" xmlns:cx6="http://schemas.microsoft.com/office/drawing/2016/5/12/chartex" xmlns:cx7="http://schemas.microsoft.com/office/drawing/2016/5/13/chartex" xmlns:cx8="http://schemas.microsoft.com/office/drawing/2016/5/14/chartex" xmlns:mc="http://schemas.openxmlformats.org/markup-compatibility/2006" xmlns:aink="http://schemas.microsoft.com/office/drawing/2016/ink" xmlns:am3d="http://schemas.microsoft.com/office/drawing/2017/model3d" xmlns:o="urn:schemas-microsoft-com:office:office" xmlns:oel="http://schemas.microsoft.com/office/2019/extlst" xmlns:r="http://schemas.openxmlformats.org/officeDocument/2006/relationships" xmlns:m="http://schemas.openxmlformats.org/officeDocument/2006/math" xmlns:v="urn:schemas-microsoft-com:vml" xmlns:wp14="http://schemas.microsoft.com/office/word/2010/wordprocessingDrawing" xmlns:wp="http://schemas.openxmlformats.org/drawingml/2006/wordprocessingDrawing" xmlns:w10="urn:schemas-microsoft-com:office:word" xmlns:w="http://schemas.openxmlformats.org/wordprocessingml/2006/main" xmlns:w14="http://schemas.microsoft.com/office/word/2010/wordml" xmlns:w15="http://schemas.microsoft.com/office/word/2012/wordml" xmlns:w16cex="http://schemas.microsoft.com/office/word/2018/wordml/cex" xmlns:w16cid="http://schemas.microsoft.com/office/word/2016/wordml/cid" xmlns:w16="http://schemas.microsoft.com/office/word/2018/wordml" xmlns:w16du="http://schemas.microsoft.com/office/word/2023/wordml/word16du" xmlns:w16sdtdh="http://schemas.microsoft.com/office/word/2020/wordml/sdtdatahash" xmlns:w16sdtfl="http://schemas.microsoft.com/office/word/2024/wordml/sdtformatlock" xmlns:w16se="http://schemas.microsoft.com/office/word/2015/wordml/symex" xmlns:wpg="http://schemas.microsoft.com/office/word/2010/wordprocessingGroup" xmlns:wpi="http://schemas.microsoft.com/office/word/2010/wordprocessingInk" xmlns:wne="http://schemas.microsoft.com/office/word/2006/wordml" xmlns:wps="http://schemas.microsoft.com/office/word/2010/wordprocessingShape" mc:Ignorable="w14 w15 w16se w16cid w16 w16cex w16sdtdh w16sdtfl w16du wp14">
   <w:p>
     <w:pPr>
-      <w:pStyle w:val="Footer"/>
+      <w:pStyle w:val="Piedepgina"/>
     </w:pPr>
   </w:p>
 </w:ftr>
@@ -6184,7 +8510,7 @@
     <w:sdtContent>
       <w:p>
         <w:pPr>
-          <w:pStyle w:val="Footer"/>
+          <w:pStyle w:val="Piedepgina"/>
           <w:jc w:val="center"/>
         </w:pPr>
         <w:r>
@@ -6213,7 +8539,7 @@
   </w:sdt>
   <w:p>
     <w:pPr>
-      <w:pStyle w:val="Footer"/>
+      <w:pStyle w:val="Piedepgina"/>
     </w:pPr>
   </w:p>
 </w:ftr>
@@ -6448,6 +8774,155 @@
     </w:lvl>
   </w:abstractNum>
   <w:abstractNum w:abstractNumId="2" w15:restartNumberingAfterBreak="0">
+    <w:nsid w:val="06773CA6"/>
+    <w:multiLevelType w:val="multilevel"/>
+    <w:tmpl w:val="C23029D2"/>
+    <w:lvl w:ilvl="0">
+      <w:start w:val="1"/>
+      <w:numFmt w:val="bullet"/>
+      <w:lvlText w:val=""/>
+      <w:lvlJc w:val="left"/>
+      <w:pPr>
+        <w:tabs>
+          <w:tab w:val="num" w:pos="720"/>
+        </w:tabs>
+        <w:ind w:left="720" w:hanging="360"/>
+      </w:pPr>
+      <w:rPr>
+        <w:rFonts w:ascii="Symbol" w:hAnsi="Symbol" w:hint="default"/>
+        <w:sz w:val="20"/>
+      </w:rPr>
+    </w:lvl>
+    <w:lvl w:ilvl="1" w:tentative="1">
+      <w:start w:val="1"/>
+      <w:numFmt w:val="bullet"/>
+      <w:lvlText w:val="o"/>
+      <w:lvlJc w:val="left"/>
+      <w:pPr>
+        <w:tabs>
+          <w:tab w:val="num" w:pos="1440"/>
+        </w:tabs>
+        <w:ind w:left="1440" w:hanging="360"/>
+      </w:pPr>
+      <w:rPr>
+        <w:rFonts w:ascii="Courier New" w:hAnsi="Courier New" w:hint="default"/>
+        <w:sz w:val="20"/>
+      </w:rPr>
+    </w:lvl>
+    <w:lvl w:ilvl="2" w:tentative="1">
+      <w:start w:val="1"/>
+      <w:numFmt w:val="bullet"/>
+      <w:lvlText w:val=""/>
+      <w:lvlJc w:val="left"/>
+      <w:pPr>
+        <w:tabs>
+          <w:tab w:val="num" w:pos="2160"/>
+        </w:tabs>
+        <w:ind w:left="2160" w:hanging="360"/>
+      </w:pPr>
+      <w:rPr>
+        <w:rFonts w:ascii="Wingdings" w:hAnsi="Wingdings" w:hint="default"/>
+        <w:sz w:val="20"/>
+      </w:rPr>
+    </w:lvl>
+    <w:lvl w:ilvl="3" w:tentative="1">
+      <w:start w:val="1"/>
+      <w:numFmt w:val="bullet"/>
+      <w:lvlText w:val=""/>
+      <w:lvlJc w:val="left"/>
+      <w:pPr>
+        <w:tabs>
+          <w:tab w:val="num" w:pos="2880"/>
+        </w:tabs>
+        <w:ind w:left="2880" w:hanging="360"/>
+      </w:pPr>
+      <w:rPr>
+        <w:rFonts w:ascii="Wingdings" w:hAnsi="Wingdings" w:hint="default"/>
+        <w:sz w:val="20"/>
+      </w:rPr>
+    </w:lvl>
+    <w:lvl w:ilvl="4" w:tentative="1">
+      <w:start w:val="1"/>
+      <w:numFmt w:val="bullet"/>
+      <w:lvlText w:val=""/>
+      <w:lvlJc w:val="left"/>
+      <w:pPr>
+        <w:tabs>
+          <w:tab w:val="num" w:pos="3600"/>
+        </w:tabs>
+        <w:ind w:left="3600" w:hanging="360"/>
+      </w:pPr>
+      <w:rPr>
+        <w:rFonts w:ascii="Wingdings" w:hAnsi="Wingdings" w:hint="default"/>
+        <w:sz w:val="20"/>
+      </w:rPr>
+    </w:lvl>
+    <w:lvl w:ilvl="5" w:tentative="1">
+      <w:start w:val="1"/>
+      <w:numFmt w:val="bullet"/>
+      <w:lvlText w:val=""/>
+      <w:lvlJc w:val="left"/>
+      <w:pPr>
+        <w:tabs>
+          <w:tab w:val="num" w:pos="4320"/>
+        </w:tabs>
+        <w:ind w:left="4320" w:hanging="360"/>
+      </w:pPr>
+      <w:rPr>
+        <w:rFonts w:ascii="Wingdings" w:hAnsi="Wingdings" w:hint="default"/>
+        <w:sz w:val="20"/>
+      </w:rPr>
+    </w:lvl>
+    <w:lvl w:ilvl="6" w:tentative="1">
+      <w:start w:val="1"/>
+      <w:numFmt w:val="bullet"/>
+      <w:lvlText w:val=""/>
+      <w:lvlJc w:val="left"/>
+      <w:pPr>
+        <w:tabs>
+          <w:tab w:val="num" w:pos="5040"/>
+        </w:tabs>
+        <w:ind w:left="5040" w:hanging="360"/>
+      </w:pPr>
+      <w:rPr>
+        <w:rFonts w:ascii="Wingdings" w:hAnsi="Wingdings" w:hint="default"/>
+        <w:sz w:val="20"/>
+      </w:rPr>
+    </w:lvl>
+    <w:lvl w:ilvl="7" w:tentative="1">
+      <w:start w:val="1"/>
+      <w:numFmt w:val="bullet"/>
+      <w:lvlText w:val=""/>
+      <w:lvlJc w:val="left"/>
+      <w:pPr>
+        <w:tabs>
+          <w:tab w:val="num" w:pos="5760"/>
+        </w:tabs>
+        <w:ind w:left="5760" w:hanging="360"/>
+      </w:pPr>
+      <w:rPr>
+        <w:rFonts w:ascii="Wingdings" w:hAnsi="Wingdings" w:hint="default"/>
+        <w:sz w:val="20"/>
+      </w:rPr>
+    </w:lvl>
+    <w:lvl w:ilvl="8" w:tentative="1">
+      <w:start w:val="1"/>
+      <w:numFmt w:val="bullet"/>
+      <w:lvlText w:val=""/>
+      <w:lvlJc w:val="left"/>
+      <w:pPr>
+        <w:tabs>
+          <w:tab w:val="num" w:pos="6480"/>
+        </w:tabs>
+        <w:ind w:left="6480" w:hanging="360"/>
+      </w:pPr>
+      <w:rPr>
+        <w:rFonts w:ascii="Wingdings" w:hAnsi="Wingdings" w:hint="default"/>
+        <w:sz w:val="20"/>
+      </w:rPr>
+    </w:lvl>
+  </w:abstractNum>
+  <w:abstractNum w:abstractNumId="3" w15:restartNumberingAfterBreak="0">
     <w:nsid w:val="072A102C"/>
     <w:multiLevelType w:val="multilevel"/>
     <w:tmpl w:val="DAF8F170"/>
@@ -6533,7 +9008,7 @@
       </w:pPr>
     </w:lvl>
   </w:abstractNum>
-  <w:abstractNum w:abstractNumId="3" w15:restartNumberingAfterBreak="0">
+  <w:abstractNum w:abstractNumId="4" w15:restartNumberingAfterBreak="0">
     <w:nsid w:val="08B255E1"/>
     <w:multiLevelType w:val="multilevel"/>
     <w:tmpl w:val="DAF8F170"/>
@@ -6619,7 +9094,7 @@
       </w:pPr>
     </w:lvl>
   </w:abstractNum>
-  <w:abstractNum w:abstractNumId="4" w15:restartNumberingAfterBreak="0">
+  <w:abstractNum w:abstractNumId="5" w15:restartNumberingAfterBreak="0">
     <w:nsid w:val="0AF9227D"/>
     <w:multiLevelType w:val="hybridMultilevel"/>
     <w:tmpl w:val="F39079C4"/>
@@ -6731,7 +9206,7 @@
       </w:rPr>
     </w:lvl>
   </w:abstractNum>
-  <w:abstractNum w:abstractNumId="5" w15:restartNumberingAfterBreak="0">
+  <w:abstractNum w:abstractNumId="6" w15:restartNumberingAfterBreak="0">
     <w:nsid w:val="0B027818"/>
     <w:multiLevelType w:val="multilevel"/>
     <w:tmpl w:val="0C0A001F"/>
@@ -6844,7 +9319,7 @@
       </w:rPr>
     </w:lvl>
   </w:abstractNum>
-  <w:abstractNum w:abstractNumId="6" w15:restartNumberingAfterBreak="0">
+  <w:abstractNum w:abstractNumId="7" w15:restartNumberingAfterBreak="0">
     <w:nsid w:val="0D774925"/>
     <w:multiLevelType w:val="multilevel"/>
     <w:tmpl w:val="0C0A001F"/>
@@ -6930,7 +9405,7 @@
       </w:pPr>
     </w:lvl>
   </w:abstractNum>
-  <w:abstractNum w:abstractNumId="7" w15:restartNumberingAfterBreak="0">
+  <w:abstractNum w:abstractNumId="8" w15:restartNumberingAfterBreak="0">
     <w:nsid w:val="10360ED3"/>
     <w:multiLevelType w:val="hybridMultilevel"/>
     <w:tmpl w:val="FC46B520"/>
@@ -7019,7 +9494,7 @@
       </w:pPr>
     </w:lvl>
   </w:abstractNum>
-  <w:abstractNum w:abstractNumId="8" w15:restartNumberingAfterBreak="0">
+  <w:abstractNum w:abstractNumId="9" w15:restartNumberingAfterBreak="0">
     <w:nsid w:val="16185900"/>
     <w:multiLevelType w:val="hybridMultilevel"/>
     <w:tmpl w:val="5F58324A"/>
@@ -7105,7 +9580,7 @@
       </w:pPr>
     </w:lvl>
   </w:abstractNum>
-  <w:abstractNum w:abstractNumId="9" w15:restartNumberingAfterBreak="0">
+  <w:abstractNum w:abstractNumId="10" w15:restartNumberingAfterBreak="0">
     <w:nsid w:val="24E17392"/>
     <w:multiLevelType w:val="multilevel"/>
     <w:tmpl w:val="B9E41576"/>
@@ -7226,7 +9701,156 @@
       </w:rPr>
     </w:lvl>
   </w:abstractNum>
-  <w:abstractNum w:abstractNumId="10" w15:restartNumberingAfterBreak="0">
+  <w:abstractNum w:abstractNumId="11" w15:restartNumberingAfterBreak="0">
+    <w:nsid w:val="2BB75485"/>
+    <w:multiLevelType w:val="multilevel"/>
+    <w:tmpl w:val="5442DB84"/>
+    <w:lvl w:ilvl="0">
+      <w:start w:val="1"/>
+      <w:numFmt w:val="bullet"/>
+      <w:lvlText w:val=""/>
+      <w:lvlJc w:val="left"/>
+      <w:pPr>
+        <w:tabs>
+          <w:tab w:val="num" w:pos="720"/>
+        </w:tabs>
+        <w:ind w:left="720" w:hanging="360"/>
+      </w:pPr>
+      <w:rPr>
+        <w:rFonts w:ascii="Symbol" w:hAnsi="Symbol" w:hint="default"/>
+        <w:sz w:val="20"/>
+      </w:rPr>
+    </w:lvl>
+    <w:lvl w:ilvl="1" w:tentative="1">
+      <w:start w:val="1"/>
+      <w:numFmt w:val="bullet"/>
+      <w:lvlText w:val="o"/>
+      <w:lvlJc w:val="left"/>
+      <w:pPr>
+        <w:tabs>
+          <w:tab w:val="num" w:pos="1440"/>
+        </w:tabs>
+        <w:ind w:left="1440" w:hanging="360"/>
+      </w:pPr>
+      <w:rPr>
+        <w:rFonts w:ascii="Courier New" w:hAnsi="Courier New" w:hint="default"/>
+        <w:sz w:val="20"/>
+      </w:rPr>
+    </w:lvl>
+    <w:lvl w:ilvl="2" w:tentative="1">
+      <w:start w:val="1"/>
+      <w:numFmt w:val="bullet"/>
+      <w:lvlText w:val=""/>
+      <w:lvlJc w:val="left"/>
+      <w:pPr>
+        <w:tabs>
+          <w:tab w:val="num" w:pos="2160"/>
+        </w:tabs>
+        <w:ind w:left="2160" w:hanging="360"/>
+      </w:pPr>
+      <w:rPr>
+        <w:rFonts w:ascii="Wingdings" w:hAnsi="Wingdings" w:hint="default"/>
+        <w:sz w:val="20"/>
+      </w:rPr>
+    </w:lvl>
+    <w:lvl w:ilvl="3" w:tentative="1">
+      <w:start w:val="1"/>
+      <w:numFmt w:val="bullet"/>
+      <w:lvlText w:val=""/>
+      <w:lvlJc w:val="left"/>
+      <w:pPr>
+        <w:tabs>
+          <w:tab w:val="num" w:pos="2880"/>
+        </w:tabs>
+        <w:ind w:left="2880" w:hanging="360"/>
+      </w:pPr>
+      <w:rPr>
+        <w:rFonts w:ascii="Wingdings" w:hAnsi="Wingdings" w:hint="default"/>
+        <w:sz w:val="20"/>
+      </w:rPr>
+    </w:lvl>
+    <w:lvl w:ilvl="4" w:tentative="1">
+      <w:start w:val="1"/>
+      <w:numFmt w:val="bullet"/>
+      <w:lvlText w:val=""/>
+      <w:lvlJc w:val="left"/>
+      <w:pPr>
+        <w:tabs>
+          <w:tab w:val="num" w:pos="3600"/>
+        </w:tabs>
+        <w:ind w:left="3600" w:hanging="360"/>
+      </w:pPr>
+      <w:rPr>
+        <w:rFonts w:ascii="Wingdings" w:hAnsi="Wingdings" w:hint="default"/>
+        <w:sz w:val="20"/>
+      </w:rPr>
+    </w:lvl>
+    <w:lvl w:ilvl="5" w:tentative="1">
+      <w:start w:val="1"/>
+      <w:numFmt w:val="bullet"/>
+      <w:lvlText w:val=""/>
+      <w:lvlJc w:val="left"/>
+      <w:pPr>
+        <w:tabs>
+          <w:tab w:val="num" w:pos="4320"/>
+        </w:tabs>
+        <w:ind w:left="4320" w:hanging="360"/>
+      </w:pPr>
+      <w:rPr>
+        <w:rFonts w:ascii="Wingdings" w:hAnsi="Wingdings" w:hint="default"/>
+        <w:sz w:val="20"/>
+      </w:rPr>
+    </w:lvl>
+    <w:lvl w:ilvl="6" w:tentative="1">
+      <w:start w:val="1"/>
+      <w:numFmt w:val="bullet"/>
+      <w:lvlText w:val=""/>
+      <w:lvlJc w:val="left"/>
+      <w:pPr>
+        <w:tabs>
+          <w:tab w:val="num" w:pos="5040"/>
+        </w:tabs>
+        <w:ind w:left="5040" w:hanging="360"/>
+      </w:pPr>
+      <w:rPr>
+        <w:rFonts w:ascii="Wingdings" w:hAnsi="Wingdings" w:hint="default"/>
+        <w:sz w:val="20"/>
+      </w:rPr>
+    </w:lvl>
+    <w:lvl w:ilvl="7" w:tentative="1">
+      <w:start w:val="1"/>
+      <w:numFmt w:val="bullet"/>
+      <w:lvlText w:val=""/>
+      <w:lvlJc w:val="left"/>
+      <w:pPr>
+        <w:tabs>
+          <w:tab w:val="num" w:pos="5760"/>
+        </w:tabs>
+        <w:ind w:left="5760" w:hanging="360"/>
+      </w:pPr>
+      <w:rPr>
+        <w:rFonts w:ascii="Wingdings" w:hAnsi="Wingdings" w:hint="default"/>
+        <w:sz w:val="20"/>
+      </w:rPr>
+    </w:lvl>
+    <w:lvl w:ilvl="8" w:tentative="1">
+      <w:start w:val="1"/>
+      <w:numFmt w:val="bullet"/>
+      <w:lvlText w:val=""/>
+      <w:lvlJc w:val="left"/>
+      <w:pPr>
+        <w:tabs>
+          <w:tab w:val="num" w:pos="6480"/>
+        </w:tabs>
+        <w:ind w:left="6480" w:hanging="360"/>
+      </w:pPr>
+      <w:rPr>
+        <w:rFonts w:ascii="Wingdings" w:hAnsi="Wingdings" w:hint="default"/>
+        <w:sz w:val="20"/>
+      </w:rPr>
+    </w:lvl>
+  </w:abstractNum>
+  <w:abstractNum w:abstractNumId="12" w15:restartNumberingAfterBreak="0">
     <w:nsid w:val="39801D78"/>
     <w:multiLevelType w:val="hybridMultilevel"/>
     <w:tmpl w:val="EB2CBD46"/>
@@ -7315,7 +9939,7 @@
       </w:pPr>
     </w:lvl>
   </w:abstractNum>
-  <w:abstractNum w:abstractNumId="11" w15:restartNumberingAfterBreak="0">
+  <w:abstractNum w:abstractNumId="13" w15:restartNumberingAfterBreak="0">
     <w:nsid w:val="3AC4255F"/>
     <w:multiLevelType w:val="hybridMultilevel"/>
     <w:tmpl w:val="14F202A4"/>
@@ -7404,7 +10028,7 @@
       </w:pPr>
     </w:lvl>
   </w:abstractNum>
-  <w:abstractNum w:abstractNumId="12" w15:restartNumberingAfterBreak="0">
+  <w:abstractNum w:abstractNumId="14" w15:restartNumberingAfterBreak="0">
     <w:nsid w:val="41360226"/>
     <w:multiLevelType w:val="hybridMultilevel"/>
     <w:tmpl w:val="98825662"/>
@@ -7516,7 +10140,7 @@
       </w:rPr>
     </w:lvl>
   </w:abstractNum>
-  <w:abstractNum w:abstractNumId="13" w15:restartNumberingAfterBreak="0">
+  <w:abstractNum w:abstractNumId="15" w15:restartNumberingAfterBreak="0">
     <w:nsid w:val="45AC27D2"/>
     <w:multiLevelType w:val="hybridMultilevel"/>
     <w:tmpl w:val="B6BAA71E"/>
@@ -7629,7 +10253,7 @@
       </w:rPr>
     </w:lvl>
   </w:abstractNum>
-  <w:abstractNum w:abstractNumId="14" w15:restartNumberingAfterBreak="0">
+  <w:abstractNum w:abstractNumId="16" w15:restartNumberingAfterBreak="0">
     <w:nsid w:val="46767291"/>
     <w:multiLevelType w:val="hybridMultilevel"/>
     <w:tmpl w:val="07B88058"/>
@@ -7715,7 +10339,156 @@
       </w:pPr>
     </w:lvl>
   </w:abstractNum>
-  <w:abstractNum w:abstractNumId="15" w15:restartNumberingAfterBreak="0">
+  <w:abstractNum w:abstractNumId="17" w15:restartNumberingAfterBreak="0">
+    <w:nsid w:val="46B84580"/>
+    <w:multiLevelType w:val="multilevel"/>
+    <w:tmpl w:val="14E86ED4"/>
+    <w:lvl w:ilvl="0">
+      <w:start w:val="1"/>
+      <w:numFmt w:val="bullet"/>
+      <w:lvlText w:val=""/>
+      <w:lvlJc w:val="left"/>
+      <w:pPr>
+        <w:tabs>
+          <w:tab w:val="num" w:pos="720"/>
+        </w:tabs>
+        <w:ind w:left="720" w:hanging="360"/>
+      </w:pPr>
+      <w:rPr>
+        <w:rFonts w:ascii="Symbol" w:hAnsi="Symbol" w:hint="default"/>
+        <w:sz w:val="20"/>
+      </w:rPr>
+    </w:lvl>
+    <w:lvl w:ilvl="1" w:tentative="1">
+      <w:start w:val="1"/>
+      <w:numFmt w:val="bullet"/>
+      <w:lvlText w:val="o"/>
+      <w:lvlJc w:val="left"/>
+      <w:pPr>
+        <w:tabs>
+          <w:tab w:val="num" w:pos="1440"/>
+        </w:tabs>
+        <w:ind w:left="1440" w:hanging="360"/>
+      </w:pPr>
+      <w:rPr>
+        <w:rFonts w:ascii="Courier New" w:hAnsi="Courier New" w:hint="default"/>
+        <w:sz w:val="20"/>
+      </w:rPr>
+    </w:lvl>
+    <w:lvl w:ilvl="2" w:tentative="1">
+      <w:start w:val="1"/>
+      <w:numFmt w:val="bullet"/>
+      <w:lvlText w:val=""/>
+      <w:lvlJc w:val="left"/>
+      <w:pPr>
+        <w:tabs>
+          <w:tab w:val="num" w:pos="2160"/>
+        </w:tabs>
+        <w:ind w:left="2160" w:hanging="360"/>
+      </w:pPr>
+      <w:rPr>
+        <w:rFonts w:ascii="Wingdings" w:hAnsi="Wingdings" w:hint="default"/>
+        <w:sz w:val="20"/>
+      </w:rPr>
+    </w:lvl>
+    <w:lvl w:ilvl="3" w:tentative="1">
+      <w:start w:val="1"/>
+      <w:numFmt w:val="bullet"/>
+      <w:lvlText w:val=""/>
+      <w:lvlJc w:val="left"/>
+      <w:pPr>
+        <w:tabs>
+          <w:tab w:val="num" w:pos="2880"/>
+        </w:tabs>
+        <w:ind w:left="2880" w:hanging="360"/>
+      </w:pPr>
+      <w:rPr>
+        <w:rFonts w:ascii="Wingdings" w:hAnsi="Wingdings" w:hint="default"/>
+        <w:sz w:val="20"/>
+      </w:rPr>
+    </w:lvl>
+    <w:lvl w:ilvl="4" w:tentative="1">
+      <w:start w:val="1"/>
+      <w:numFmt w:val="bullet"/>
+      <w:lvlText w:val=""/>
+      <w:lvlJc w:val="left"/>
+      <w:pPr>
+        <w:tabs>
+          <w:tab w:val="num" w:pos="3600"/>
+        </w:tabs>
+        <w:ind w:left="3600" w:hanging="360"/>
+      </w:pPr>
+      <w:rPr>
+        <w:rFonts w:ascii="Wingdings" w:hAnsi="Wingdings" w:hint="default"/>
+        <w:sz w:val="20"/>
+      </w:rPr>
+    </w:lvl>
+    <w:lvl w:ilvl="5" w:tentative="1">
+      <w:start w:val="1"/>
+      <w:numFmt w:val="bullet"/>
+      <w:lvlText w:val=""/>
+      <w:lvlJc w:val="left"/>
+      <w:pPr>
+        <w:tabs>
+          <w:tab w:val="num" w:pos="4320"/>
+        </w:tabs>
+        <w:ind w:left="4320" w:hanging="360"/>
+      </w:pPr>
+      <w:rPr>
+        <w:rFonts w:ascii="Wingdings" w:hAnsi="Wingdings" w:hint="default"/>
+        <w:sz w:val="20"/>
+      </w:rPr>
+    </w:lvl>
+    <w:lvl w:ilvl="6" w:tentative="1">
+      <w:start w:val="1"/>
+      <w:numFmt w:val="bullet"/>
+      <w:lvlText w:val=""/>
+      <w:lvlJc w:val="left"/>
+      <w:pPr>
+        <w:tabs>
+          <w:tab w:val="num" w:pos="5040"/>
+        </w:tabs>
+        <w:ind w:left="5040" w:hanging="360"/>
+      </w:pPr>
+      <w:rPr>
+        <w:rFonts w:ascii="Wingdings" w:hAnsi="Wingdings" w:hint="default"/>
+        <w:sz w:val="20"/>
+      </w:rPr>
+    </w:lvl>
+    <w:lvl w:ilvl="7" w:tentative="1">
+      <w:start w:val="1"/>
+      <w:numFmt w:val="bullet"/>
+      <w:lvlText w:val=""/>
+      <w:lvlJc w:val="left"/>
+      <w:pPr>
+        <w:tabs>
+          <w:tab w:val="num" w:pos="5760"/>
+        </w:tabs>
+        <w:ind w:left="5760" w:hanging="360"/>
+      </w:pPr>
+      <w:rPr>
+        <w:rFonts w:ascii="Wingdings" w:hAnsi="Wingdings" w:hint="default"/>
+        <w:sz w:val="20"/>
+      </w:rPr>
+    </w:lvl>
+    <w:lvl w:ilvl="8" w:tentative="1">
+      <w:start w:val="1"/>
+      <w:numFmt w:val="bullet"/>
+      <w:lvlText w:val=""/>
+      <w:lvlJc w:val="left"/>
+      <w:pPr>
+        <w:tabs>
+          <w:tab w:val="num" w:pos="6480"/>
+        </w:tabs>
+        <w:ind w:left="6480" w:hanging="360"/>
+      </w:pPr>
+      <w:rPr>
+        <w:rFonts w:ascii="Wingdings" w:hAnsi="Wingdings" w:hint="default"/>
+        <w:sz w:val="20"/>
+      </w:rPr>
+    </w:lvl>
+  </w:abstractNum>
+  <w:abstractNum w:abstractNumId="18" w15:restartNumberingAfterBreak="0">
     <w:nsid w:val="582D00AC"/>
     <w:multiLevelType w:val="hybridMultilevel"/>
     <w:tmpl w:val="FD124986"/>
@@ -7835,7 +10608,156 @@
       </w:rPr>
     </w:lvl>
   </w:abstractNum>
-  <w:abstractNum w:abstractNumId="16" w15:restartNumberingAfterBreak="0">
+  <w:abstractNum w:abstractNumId="19" w15:restartNumberingAfterBreak="0">
+    <w:nsid w:val="629D7ADB"/>
+    <w:multiLevelType w:val="multilevel"/>
+    <w:tmpl w:val="E3B2BCA2"/>
+    <w:lvl w:ilvl="0">
+      <w:start w:val="1"/>
+      <w:numFmt w:val="bullet"/>
+      <w:lvlText w:val=""/>
+      <w:lvlJc w:val="left"/>
+      <w:pPr>
+        <w:tabs>
+          <w:tab w:val="num" w:pos="720"/>
+        </w:tabs>
+        <w:ind w:left="720" w:hanging="360"/>
+      </w:pPr>
+      <w:rPr>
+        <w:rFonts w:ascii="Symbol" w:hAnsi="Symbol" w:hint="default"/>
+        <w:sz w:val="20"/>
+      </w:rPr>
+    </w:lvl>
+    <w:lvl w:ilvl="1" w:tentative="1">
+      <w:start w:val="1"/>
+      <w:numFmt w:val="bullet"/>
+      <w:lvlText w:val="o"/>
+      <w:lvlJc w:val="left"/>
+      <w:pPr>
+        <w:tabs>
+          <w:tab w:val="num" w:pos="1440"/>
+        </w:tabs>
+        <w:ind w:left="1440" w:hanging="360"/>
+      </w:pPr>
+      <w:rPr>
+        <w:rFonts w:ascii="Courier New" w:hAnsi="Courier New" w:hint="default"/>
+        <w:sz w:val="20"/>
+      </w:rPr>
+    </w:lvl>
+    <w:lvl w:ilvl="2" w:tentative="1">
+      <w:start w:val="1"/>
+      <w:numFmt w:val="bullet"/>
+      <w:lvlText w:val=""/>
+      <w:lvlJc w:val="left"/>
+      <w:pPr>
+        <w:tabs>
+          <w:tab w:val="num" w:pos="2160"/>
+        </w:tabs>
+        <w:ind w:left="2160" w:hanging="360"/>
+      </w:pPr>
+      <w:rPr>
+        <w:rFonts w:ascii="Wingdings" w:hAnsi="Wingdings" w:hint="default"/>
+        <w:sz w:val="20"/>
+      </w:rPr>
+    </w:lvl>
+    <w:lvl w:ilvl="3" w:tentative="1">
+      <w:start w:val="1"/>
+      <w:numFmt w:val="bullet"/>
+      <w:lvlText w:val=""/>
+      <w:lvlJc w:val="left"/>
+      <w:pPr>
+        <w:tabs>
+          <w:tab w:val="num" w:pos="2880"/>
+        </w:tabs>
+        <w:ind w:left="2880" w:hanging="360"/>
+      </w:pPr>
+      <w:rPr>
+        <w:rFonts w:ascii="Wingdings" w:hAnsi="Wingdings" w:hint="default"/>
+        <w:sz w:val="20"/>
+      </w:rPr>
+    </w:lvl>
+    <w:lvl w:ilvl="4" w:tentative="1">
+      <w:start w:val="1"/>
+      <w:numFmt w:val="bullet"/>
+      <w:lvlText w:val=""/>
+      <w:lvlJc w:val="left"/>
+      <w:pPr>
+        <w:tabs>
+          <w:tab w:val="num" w:pos="3600"/>
+        </w:tabs>
+        <w:ind w:left="3600" w:hanging="360"/>
+      </w:pPr>
+      <w:rPr>
+        <w:rFonts w:ascii="Wingdings" w:hAnsi="Wingdings" w:hint="default"/>
+        <w:sz w:val="20"/>
+      </w:rPr>
+    </w:lvl>
+    <w:lvl w:ilvl="5" w:tentative="1">
+      <w:start w:val="1"/>
+      <w:numFmt w:val="bullet"/>
+      <w:lvlText w:val=""/>
+      <w:lvlJc w:val="left"/>
+      <w:pPr>
+        <w:tabs>
+          <w:tab w:val="num" w:pos="4320"/>
+        </w:tabs>
+        <w:ind w:left="4320" w:hanging="360"/>
+      </w:pPr>
+      <w:rPr>
+        <w:rFonts w:ascii="Wingdings" w:hAnsi="Wingdings" w:hint="default"/>
+        <w:sz w:val="20"/>
+      </w:rPr>
+    </w:lvl>
+    <w:lvl w:ilvl="6" w:tentative="1">
+      <w:start w:val="1"/>
+      <w:numFmt w:val="bullet"/>
+      <w:lvlText w:val=""/>
+      <w:lvlJc w:val="left"/>
+      <w:pPr>
+        <w:tabs>
+          <w:tab w:val="num" w:pos="5040"/>
+        </w:tabs>
+        <w:ind w:left="5040" w:hanging="360"/>
+      </w:pPr>
+      <w:rPr>
+        <w:rFonts w:ascii="Wingdings" w:hAnsi="Wingdings" w:hint="default"/>
+        <w:sz w:val="20"/>
+      </w:rPr>
+    </w:lvl>
+    <w:lvl w:ilvl="7" w:tentative="1">
+      <w:start w:val="1"/>
+      <w:numFmt w:val="bullet"/>
+      <w:lvlText w:val=""/>
+      <w:lvlJc w:val="left"/>
+      <w:pPr>
+        <w:tabs>
+          <w:tab w:val="num" w:pos="5760"/>
+        </w:tabs>
+        <w:ind w:left="5760" w:hanging="360"/>
+      </w:pPr>
+      <w:rPr>
+        <w:rFonts w:ascii="Wingdings" w:hAnsi="Wingdings" w:hint="default"/>
+        <w:sz w:val="20"/>
+      </w:rPr>
+    </w:lvl>
+    <w:lvl w:ilvl="8" w:tentative="1">
+      <w:start w:val="1"/>
+      <w:numFmt w:val="bullet"/>
+      <w:lvlText w:val=""/>
+      <w:lvlJc w:val="left"/>
+      <w:pPr>
+        <w:tabs>
+          <w:tab w:val="num" w:pos="6480"/>
+        </w:tabs>
+        <w:ind w:left="6480" w:hanging="360"/>
+      </w:pPr>
+      <w:rPr>
+        <w:rFonts w:ascii="Wingdings" w:hAnsi="Wingdings" w:hint="default"/>
+        <w:sz w:val="20"/>
+      </w:rPr>
+    </w:lvl>
+  </w:abstractNum>
+  <w:abstractNum w:abstractNumId="20" w15:restartNumberingAfterBreak="0">
     <w:nsid w:val="71E245E0"/>
     <w:multiLevelType w:val="multilevel"/>
     <w:tmpl w:val="EDB61152"/>
@@ -7949,55 +10871,67 @@
     </w:lvl>
   </w:abstractNum>
   <w:num w:numId="1" w16cid:durableId="1917937008">
-    <w:abstractNumId w:val="15"/>
+    <w:abstractNumId w:val="18"/>
   </w:num>
   <w:num w:numId="2" w16cid:durableId="2057073281">
-    <w:abstractNumId w:val="9"/>
+    <w:abstractNumId w:val="10"/>
   </w:num>
   <w:num w:numId="3" w16cid:durableId="1868373036">
-    <w:abstractNumId w:val="5"/>
+    <w:abstractNumId w:val="6"/>
   </w:num>
   <w:num w:numId="4" w16cid:durableId="911045009">
-    <w:abstractNumId w:val="6"/>
+    <w:abstractNumId w:val="7"/>
   </w:num>
   <w:num w:numId="5" w16cid:durableId="1120874265">
-    <w:abstractNumId w:val="2"/>
+    <w:abstractNumId w:val="3"/>
   </w:num>
   <w:num w:numId="6" w16cid:durableId="1288855345">
     <w:abstractNumId w:val="0"/>
   </w:num>
   <w:num w:numId="7" w16cid:durableId="1453088802">
-    <w:abstractNumId w:val="13"/>
+    <w:abstractNumId w:val="15"/>
   </w:num>
   <w:num w:numId="8" w16cid:durableId="1464690908">
-    <w:abstractNumId w:val="8"/>
+    <w:abstractNumId w:val="9"/>
   </w:num>
   <w:num w:numId="9" w16cid:durableId="1924947596">
     <w:abstractNumId w:val="1"/>
   </w:num>
   <w:num w:numId="10" w16cid:durableId="1341590872">
+    <w:abstractNumId w:val="14"/>
+  </w:num>
+  <w:num w:numId="11" w16cid:durableId="1028019830">
+    <w:abstractNumId w:val="5"/>
+  </w:num>
+  <w:num w:numId="12" w16cid:durableId="1327710450">
+    <w:abstractNumId w:val="8"/>
+  </w:num>
+  <w:num w:numId="13" w16cid:durableId="1602294469">
+    <w:abstractNumId w:val="13"/>
+  </w:num>
+  <w:num w:numId="14" w16cid:durableId="605893345">
     <w:abstractNumId w:val="12"/>
   </w:num>
-  <w:num w:numId="11" w16cid:durableId="1028019830">
+  <w:num w:numId="15" w16cid:durableId="2040469636">
+    <w:abstractNumId w:val="16"/>
+  </w:num>
+  <w:num w:numId="16" w16cid:durableId="1498840191">
     <w:abstractNumId w:val="4"/>
   </w:num>
-  <w:num w:numId="12" w16cid:durableId="1327710450">
-    <w:abstractNumId w:val="7"/>
+  <w:num w:numId="17" w16cid:durableId="1764299614">
+    <w:abstractNumId w:val="20"/>
   </w:num>
-  <w:num w:numId="13" w16cid:durableId="1602294469">
+  <w:num w:numId="18" w16cid:durableId="529951279">
+    <w:abstractNumId w:val="17"/>
+  </w:num>
+  <w:num w:numId="19" w16cid:durableId="267856918">
+    <w:abstractNumId w:val="19"/>
+  </w:num>
+  <w:num w:numId="20" w16cid:durableId="1817914064">
+    <w:abstractNumId w:val="2"/>
+  </w:num>
+  <w:num w:numId="21" w16cid:durableId="2133859829">
     <w:abstractNumId w:val="11"/>
-  </w:num>
-  <w:num w:numId="14" w16cid:durableId="605893345">
-    <w:abstractNumId w:val="10"/>
-  </w:num>
-  <w:num w:numId="15" w16cid:durableId="2040469636">
-    <w:abstractNumId w:val="14"/>
-  </w:num>
-  <w:num w:numId="16" w16cid:durableId="1498840191">
-    <w:abstractNumId w:val="3"/>
-  </w:num>
-  <w:num w:numId="17" w16cid:durableId="1764299614">
-    <w:abstractNumId w:val="16"/>
   </w:num>
 </w:numbering>
 </file>
@@ -8400,13 +11334,13 @@
   <w:style w:type="paragraph" w:default="1" w:styleId="Normal">
     <w:name w:val="Normal"/>
     <w:qFormat/>
-    <w:rsid w:val="00C82473"/>
+    <w:rsid w:val="00FC5C67"/>
   </w:style>
-  <w:style w:type="paragraph" w:styleId="Heading1">
+  <w:style w:type="paragraph" w:styleId="Ttulo1">
     <w:name w:val="heading 1"/>
     <w:basedOn w:val="Normal"/>
     <w:next w:val="Normal"/>
-    <w:link w:val="Heading1Char"/>
+    <w:link w:val="Ttulo1Car"/>
     <w:uiPriority w:val="9"/>
     <w:qFormat/>
     <w:rsid w:val="00014B39"/>
@@ -8423,11 +11357,11 @@
       <w:szCs w:val="32"/>
     </w:rPr>
   </w:style>
-  <w:style w:type="paragraph" w:styleId="Heading2">
+  <w:style w:type="paragraph" w:styleId="Ttulo2">
     <w:name w:val="heading 2"/>
     <w:basedOn w:val="Normal"/>
     <w:next w:val="Normal"/>
-    <w:link w:val="Heading2Char"/>
+    <w:link w:val="Ttulo2Car"/>
     <w:uiPriority w:val="9"/>
     <w:unhideWhenUsed/>
     <w:qFormat/>
@@ -8445,11 +11379,11 @@
       <w:szCs w:val="26"/>
     </w:rPr>
   </w:style>
-  <w:style w:type="paragraph" w:styleId="Heading3">
+  <w:style w:type="paragraph" w:styleId="Ttulo3">
     <w:name w:val="heading 3"/>
     <w:basedOn w:val="Normal"/>
     <w:next w:val="Normal"/>
-    <w:link w:val="Heading3Char"/>
+    <w:link w:val="Ttulo3Car"/>
     <w:uiPriority w:val="9"/>
     <w:semiHidden/>
     <w:unhideWhenUsed/>
@@ -8468,11 +11402,11 @@
       <w:szCs w:val="24"/>
     </w:rPr>
   </w:style>
-  <w:style w:type="paragraph" w:styleId="Heading4">
+  <w:style w:type="paragraph" w:styleId="Ttulo4">
     <w:name w:val="heading 4"/>
     <w:basedOn w:val="Normal"/>
     <w:next w:val="Normal"/>
-    <w:link w:val="Heading4Char"/>
+    <w:link w:val="Ttulo4Car"/>
     <w:uiPriority w:val="9"/>
     <w:semiHidden/>
     <w:unhideWhenUsed/>
@@ -8491,13 +11425,13 @@
       <w:color w:val="2F5496" w:themeColor="accent1" w:themeShade="BF"/>
     </w:rPr>
   </w:style>
-  <w:style w:type="character" w:default="1" w:styleId="DefaultParagraphFont">
+  <w:style w:type="character" w:default="1" w:styleId="Fuentedeprrafopredeter">
     <w:name w:val="Default Paragraph Font"/>
     <w:uiPriority w:val="1"/>
     <w:semiHidden/>
     <w:unhideWhenUsed/>
   </w:style>
-  <w:style w:type="table" w:default="1" w:styleId="TableNormal">
+  <w:style w:type="table" w:default="1" w:styleId="Tablanormal">
     <w:name w:val="Normal Table"/>
     <w:uiPriority w:val="99"/>
     <w:semiHidden/>
@@ -8512,16 +11446,16 @@
       </w:tblCellMar>
     </w:tblPr>
   </w:style>
-  <w:style w:type="numbering" w:default="1" w:styleId="NoList">
+  <w:style w:type="numbering" w:default="1" w:styleId="Sinlista">
     <w:name w:val="No List"/>
     <w:uiPriority w:val="99"/>
     <w:semiHidden/>
     <w:unhideWhenUsed/>
   </w:style>
-  <w:style w:type="character" w:customStyle="1" w:styleId="Heading1Char">
-    <w:name w:val="Heading 1 Char"/>
-    <w:basedOn w:val="DefaultParagraphFont"/>
-    <w:link w:val="Heading1"/>
+  <w:style w:type="character" w:customStyle="1" w:styleId="Ttulo1Car">
+    <w:name w:val="Título 1 Car"/>
+    <w:basedOn w:val="Fuentedeprrafopredeter"/>
+    <w:link w:val="Ttulo1"/>
     <w:uiPriority w:val="9"/>
     <w:rsid w:val="00014B39"/>
     <w:rPr>
@@ -8533,7 +11467,7 @@
   </w:style>
   <w:style w:type="paragraph" w:customStyle="1" w:styleId="Estilo1">
     <w:name w:val="Estilo1"/>
-    <w:basedOn w:val="Heading1"/>
+    <w:basedOn w:val="Ttulo1"/>
     <w:link w:val="Estilo1Car"/>
     <w:qFormat/>
     <w:rsid w:val="00014B39"/>
@@ -8543,7 +11477,7 @@
   </w:style>
   <w:style w:type="character" w:customStyle="1" w:styleId="Estilo1Car">
     <w:name w:val="Estilo1 Car"/>
-    <w:basedOn w:val="Heading1Char"/>
+    <w:basedOn w:val="Ttulo1Car"/>
     <w:link w:val="Estilo1"/>
     <w:rsid w:val="00014B39"/>
     <w:rPr>
@@ -8553,7 +11487,7 @@
       <w:szCs w:val="32"/>
     </w:rPr>
   </w:style>
-  <w:style w:type="paragraph" w:styleId="ListParagraph">
+  <w:style w:type="paragraph" w:styleId="Prrafodelista">
     <w:name w:val="List Paragraph"/>
     <w:basedOn w:val="Normal"/>
     <w:uiPriority w:val="34"/>
@@ -8576,17 +11510,17 @@
   </w:style>
   <w:style w:type="character" w:customStyle="1" w:styleId="TextomemoriaCar">
     <w:name w:val="Texto memoria Car"/>
-    <w:basedOn w:val="DefaultParagraphFont"/>
+    <w:basedOn w:val="Fuentedeprrafopredeter"/>
     <w:link w:val="Textomemoria"/>
     <w:rsid w:val="00310023"/>
     <w:rPr>
       <w:rFonts w:ascii="Verdana" w:hAnsi="Verdana"/>
     </w:rPr>
   </w:style>
-  <w:style w:type="paragraph" w:styleId="Header">
+  <w:style w:type="paragraph" w:styleId="Encabezado">
     <w:name w:val="header"/>
     <w:basedOn w:val="Normal"/>
-    <w:link w:val="HeaderChar"/>
+    <w:link w:val="EncabezadoCar"/>
     <w:uiPriority w:val="99"/>
     <w:unhideWhenUsed/>
     <w:rsid w:val="00B13784"/>
@@ -8598,17 +11532,17 @@
       <w:spacing w:after="0" w:line="240" w:lineRule="auto"/>
     </w:pPr>
   </w:style>
-  <w:style w:type="character" w:customStyle="1" w:styleId="HeaderChar">
-    <w:name w:val="Header Char"/>
-    <w:basedOn w:val="DefaultParagraphFont"/>
-    <w:link w:val="Header"/>
+  <w:style w:type="character" w:customStyle="1" w:styleId="EncabezadoCar">
+    <w:name w:val="Encabezado Car"/>
+    <w:basedOn w:val="Fuentedeprrafopredeter"/>
+    <w:link w:val="Encabezado"/>
     <w:uiPriority w:val="99"/>
     <w:rsid w:val="00B13784"/>
   </w:style>
-  <w:style w:type="paragraph" w:styleId="Footer">
+  <w:style w:type="paragraph" w:styleId="Piedepgina">
     <w:name w:val="footer"/>
     <w:basedOn w:val="Normal"/>
-    <w:link w:val="FooterChar"/>
+    <w:link w:val="PiedepginaCar"/>
     <w:uiPriority w:val="99"/>
     <w:unhideWhenUsed/>
     <w:rsid w:val="00B13784"/>
@@ -8620,16 +11554,16 @@
       <w:spacing w:after="0" w:line="240" w:lineRule="auto"/>
     </w:pPr>
   </w:style>
-  <w:style w:type="character" w:customStyle="1" w:styleId="FooterChar">
-    <w:name w:val="Footer Char"/>
-    <w:basedOn w:val="DefaultParagraphFont"/>
-    <w:link w:val="Footer"/>
+  <w:style w:type="character" w:customStyle="1" w:styleId="PiedepginaCar">
+    <w:name w:val="Pie de página Car"/>
+    <w:basedOn w:val="Fuentedeprrafopredeter"/>
+    <w:link w:val="Piedepgina"/>
     <w:uiPriority w:val="99"/>
     <w:rsid w:val="00B13784"/>
   </w:style>
-  <w:style w:type="paragraph" w:styleId="TOCHeading">
+  <w:style w:type="paragraph" w:styleId="TtuloTDC">
     <w:name w:val="TOC Heading"/>
-    <w:basedOn w:val="Heading1"/>
+    <w:basedOn w:val="Ttulo1"/>
     <w:next w:val="Normal"/>
     <w:uiPriority w:val="39"/>
     <w:unhideWhenUsed/>
@@ -8642,7 +11576,7 @@
       <w:lang w:eastAsia="es-ES"/>
     </w:rPr>
   </w:style>
-  <w:style w:type="paragraph" w:styleId="TOC1">
+  <w:style w:type="paragraph" w:styleId="TDC1">
     <w:name w:val="toc 1"/>
     <w:basedOn w:val="Normal"/>
     <w:next w:val="Normal"/>
@@ -8654,9 +11588,9 @@
       <w:spacing w:after="100"/>
     </w:pPr>
   </w:style>
-  <w:style w:type="character" w:styleId="Hyperlink">
+  <w:style w:type="character" w:styleId="Hipervnculo">
     <w:name w:val="Hyperlink"/>
-    <w:basedOn w:val="DefaultParagraphFont"/>
+    <w:basedOn w:val="Fuentedeprrafopredeter"/>
     <w:uiPriority w:val="99"/>
     <w:unhideWhenUsed/>
     <w:rsid w:val="00B13784"/>
@@ -8678,9 +11612,9 @@
       <w:szCs w:val="24"/>
     </w:rPr>
   </w:style>
-  <w:style w:type="character" w:styleId="Strong">
+  <w:style w:type="character" w:styleId="Textoennegrita">
     <w:name w:val="Strong"/>
-    <w:basedOn w:val="DefaultParagraphFont"/>
+    <w:basedOn w:val="Fuentedeprrafopredeter"/>
     <w:uiPriority w:val="22"/>
     <w:qFormat/>
     <w:rsid w:val="00DC441B"/>
@@ -8689,10 +11623,10 @@
       <w:bCs/>
     </w:rPr>
   </w:style>
-  <w:style w:type="character" w:customStyle="1" w:styleId="Heading4Char">
-    <w:name w:val="Heading 4 Char"/>
-    <w:basedOn w:val="DefaultParagraphFont"/>
-    <w:link w:val="Heading4"/>
+  <w:style w:type="character" w:customStyle="1" w:styleId="Ttulo4Car">
+    <w:name w:val="Título 4 Car"/>
+    <w:basedOn w:val="Fuentedeprrafopredeter"/>
+    <w:link w:val="Ttulo4"/>
     <w:uiPriority w:val="9"/>
     <w:semiHidden/>
     <w:rsid w:val="00DC441B"/>
@@ -8703,7 +11637,7 @@
       <w:color w:val="2F5496" w:themeColor="accent1" w:themeShade="BF"/>
     </w:rPr>
   </w:style>
-  <w:style w:type="paragraph" w:styleId="TOC2">
+  <w:style w:type="paragraph" w:styleId="TDC2">
     <w:name w:val="toc 2"/>
     <w:basedOn w:val="Normal"/>
     <w:next w:val="Normal"/>
@@ -8720,7 +11654,7 @@
       <w:lang w:val="en-US"/>
     </w:rPr>
   </w:style>
-  <w:style w:type="paragraph" w:styleId="TOC3">
+  <w:style w:type="paragraph" w:styleId="TDC3">
     <w:name w:val="toc 3"/>
     <w:basedOn w:val="Normal"/>
     <w:next w:val="Normal"/>
@@ -8737,7 +11671,7 @@
       <w:lang w:val="en-US"/>
     </w:rPr>
   </w:style>
-  <w:style w:type="paragraph" w:styleId="TOC5">
+  <w:style w:type="paragraph" w:styleId="TDC5">
     <w:name w:val="toc 5"/>
     <w:basedOn w:val="Normal"/>
     <w:next w:val="Normal"/>
@@ -8751,10 +11685,10 @@
       <w:ind w:left="880"/>
     </w:pPr>
   </w:style>
-  <w:style w:type="character" w:customStyle="1" w:styleId="Heading2Char">
-    <w:name w:val="Heading 2 Char"/>
-    <w:basedOn w:val="DefaultParagraphFont"/>
-    <w:link w:val="Heading2"/>
+  <w:style w:type="character" w:customStyle="1" w:styleId="Ttulo2Car">
+    <w:name w:val="Título 2 Car"/>
+    <w:basedOn w:val="Fuentedeprrafopredeter"/>
+    <w:link w:val="Ttulo2"/>
     <w:uiPriority w:val="9"/>
     <w:rsid w:val="00FA3C79"/>
     <w:rPr>
@@ -8764,10 +11698,10 @@
       <w:szCs w:val="26"/>
     </w:rPr>
   </w:style>
-  <w:style w:type="character" w:customStyle="1" w:styleId="Heading3Char">
-    <w:name w:val="Heading 3 Char"/>
-    <w:basedOn w:val="DefaultParagraphFont"/>
-    <w:link w:val="Heading3"/>
+  <w:style w:type="character" w:customStyle="1" w:styleId="Ttulo3Car">
+    <w:name w:val="Título 3 Car"/>
+    <w:basedOn w:val="Fuentedeprrafopredeter"/>
+    <w:link w:val="Ttulo3"/>
     <w:uiPriority w:val="9"/>
     <w:semiHidden/>
     <w:rsid w:val="00D7623B"/>
@@ -8778,7 +11712,7 @@
       <w:szCs w:val="24"/>
     </w:rPr>
   </w:style>
-  <w:style w:type="paragraph" w:styleId="Caption">
+  <w:style w:type="paragraph" w:styleId="Descripcin">
     <w:name w:val="caption"/>
     <w:basedOn w:val="Normal"/>
     <w:next w:val="Normal"/>
@@ -8797,9 +11731,9 @@
       <w:szCs w:val="18"/>
     </w:rPr>
   </w:style>
-  <w:style w:type="character" w:styleId="Emphasis">
+  <w:style w:type="character" w:styleId="nfasis">
     <w:name w:val="Emphasis"/>
-    <w:basedOn w:val="DefaultParagraphFont"/>
+    <w:basedOn w:val="Fuentedeprrafopredeter"/>
     <w:uiPriority w:val="20"/>
     <w:qFormat/>
     <w:rsid w:val="00C82473"/>
@@ -8808,9 +11742,9 @@
       <w:iCs/>
     </w:rPr>
   </w:style>
-  <w:style w:type="character" w:styleId="UnresolvedMention">
+  <w:style w:type="character" w:styleId="Mencinsinresolver">
     <w:name w:val="Unresolved Mention"/>
-    <w:basedOn w:val="DefaultParagraphFont"/>
+    <w:basedOn w:val="Fuentedeprrafopredeter"/>
     <w:uiPriority w:val="99"/>
     <w:semiHidden/>
     <w:unhideWhenUsed/>
@@ -8820,7 +11754,7 @@
       <w:shd w:val="clear" w:color="auto" w:fill="E1DFDD"/>
     </w:rPr>
   </w:style>
-  <w:style w:type="paragraph" w:styleId="Bibliography">
+  <w:style w:type="paragraph" w:styleId="Bibliografa">
     <w:name w:val="Bibliography"/>
     <w:basedOn w:val="Normal"/>
     <w:next w:val="Normal"/>

</xml_diff>